<commit_message>
Valuing Prospects: Thomas's 13 notes; age reported as age now; builder and figures v2.1
Thomas's commented copy is committed as the record of his notes, with his two edits carried into the
builder. Age is reported as his age on September 15 of the valuation season (his option A): the same
values and age discount as before; only the reported production coefficient moves, and the figure script
refits and checks this against the live fit. Draft position for slot, NHLe, root mean squared error,
production forms named by their terms, the season fits as a full set of interaction terms, arrival as a
share of all picks, the star value figure in three panels, the age-centring argument cut from Section 2,
and the missing prospect-seasons tied to the 2007 draft's short record. To be run on the laptop.

Co-Authored-By: Claude Opus 5.5 <noreply@anthropic.com>
Claude-Session: https://claude.ai/code/session_018Rnb7cpNjzP8nSE7LngcMb
</commit_message>
<xml_diff>
--- a/40_DOCS/Supervisor_Drafts/Valuing Prospects.docx
+++ b/40_DOCS/Supervisor_Drafts/Valuing Prospects.docx
@@ -45,7 +45,13 @@
         <w:spacing w:before="60" w:after="120" w:line="276" w:lineRule="auto"/>
       </w:pPr>
       <w:r>
-        <w:t>Six drafted players of 2007 to 2017 died before reaching the NHL, while their clubs still controlled them (Table 1). They are left out of every fit in this document and of the draft pick curve. Their careers ended for a reason no draft slot or scoring record can predict, and the NHL compensates a club whose unsigned draftee dies with a draft pick, so the club does not bear the full loss. Left in, each would count as a prospect with zero surplus in each season after his death; Alexei Cherepanov's seasons from D+3 to D+5 would carry his 2007-08 KHL scoring, 44.1 NHL-equivalent points per 82 games, against an outcome of zero. A player who died after his club's control had ended stays in: Adam Comrie (2008, #80) died in 2020, two years after his control ended.</w:t>
+        <w:t>Six drafted players of 2007 to 2017 died before reaching the NHL, while their clubs still controlled them (Table 1). They are left out of every fit in this document and of the draft pick curve. Left in, each would count as a prospect with zero surplus in each season after his death</w:t>
+      </w:r>
+      <w:r>
+        <w:t>.</w:t>
+      </w:r>
+      <w:r>
+        <w:t xml:space="preserve"> </w:t>
       </w:r>
     </w:p>
     <w:p>
@@ -965,11 +971,7 @@
         <w:spacing w:before="60" w:after="120" w:line="276" w:lineRule="auto"/>
       </w:pPr>
       <w:r>
-        <w:t xml:space="preserve">The answer depends on when drafted players reach the NHL. Of the 2,316 drafted players, 997 (43.0%) played an NHL season of 10 or more games (a goaltender, an NHL game) before their club's control ended. When they </w:t>
-      </w:r>
-      <w:r>
-        <w:lastRenderedPageBreak/>
-        <w:t>arrived depends on where they were drafted (Figure 1). Of the top-ten picks who reached the NHL, 36.7% did so in D+1, 77.1% by D+2 and 90.8% by D+3. Of the picks from rounds 3 to 7 who reached it, 20.2% had done so by D+3 and 43.9% by D+4. A top pick who is still a prospect in D+4 is therefore unusual, and later picks reach the NHL later.</w:t>
+        <w:t>The answer depends on when drafted players reach the NHL. Of the 2,316 drafted players, 997 (43.0%) played an NHL season of 10 or more games (a goaltender, an NHL game) before their club's control ended. When they arrived depends on where they were drafted (Figure 1). Of the top-ten picks who reached the NHL, 36.7% did so in D+1, 77.1% by D+2 and 90.8% by D+3. Of the picks from rounds 3 to 7 who reached it, 20.2% had done so by D+3 and 43.9% by D+4. A top pick who is still a prospect in D+4 is therefore unusual, and later picks reach the NHL later.</w:t>
       </w:r>
     </w:p>
     <w:p>
@@ -985,6 +987,7 @@
           <w:sz w:val="20"/>
           <w:szCs w:val="20"/>
         </w:rPr>
+        <w:lastRenderedPageBreak/>
         <w:t>Figure 1. When drafted players reach the NHL</w:t>
       </w:r>
       <w:commentRangeEnd w:id="0"/>
@@ -1024,7 +1027,7 @@
                     </pic:cNvPicPr>
                   </pic:nvPicPr>
                   <pic:blipFill>
-                    <a:blip r:embed="rId11"/>
+                    <a:blip r:embed="rId12"/>
                     <a:srcRect/>
                     <a:stretch>
                       <a:fillRect/>
@@ -1102,7 +1105,6 @@
           <w:sz w:val="20"/>
           <w:szCs w:val="20"/>
         </w:rPr>
-        <w:lastRenderedPageBreak/>
         <w:t>Table 2. The star value for a player still a prospect, by season</w:t>
       </w:r>
     </w:p>
@@ -2626,6 +2628,7 @@
         <w:spacing w:before="60" w:after="120" w:line="276" w:lineRule="auto"/>
       </w:pPr>
       <w:r>
+        <w:lastRenderedPageBreak/>
         <w:t>A prospect keeps most of his slot's value through D+3 ($17.61 million in D+2 and $15.75 million in D+3) and loses most of it over the next two seasons ($8.89 million in D+4 and $2.01 million from D+5 on). Each estimate differs from zero at the 1% level; the largest p-value is 0.002, from D+5 on. The value falls sharply after D+3 because of who is left. By D+4, nearly each top pick who will reach the NHL has done so, so the prospects still unproven are mostly later picks and the top picks who missed: of the 110 top-ten picks of 2007-2017, 26 were still prospects in D+3 and 11 in D+4. Among the prospects left, the slot no longer separates the players who will succeed from those who will not.</w:t>
       </w:r>
     </w:p>
@@ -2711,7 +2714,6 @@
           <w:sz w:val="20"/>
           <w:szCs w:val="20"/>
         </w:rPr>
-        <w:lastRenderedPageBreak/>
         <w:t>Figure 2. The star value by season, and three simpler rules</w:t>
       </w:r>
       <w:commentRangeEnd w:id="2"/>
@@ -2751,7 +2753,7 @@
                     </pic:cNvPicPr>
                   </pic:nvPicPr>
                   <pic:blipFill>
-                    <a:blip r:embed="rId12"/>
+                    <a:blip r:embed="rId13"/>
                     <a:srcRect/>
                     <a:stretch>
                       <a:fillRect/>
@@ -2798,6 +2800,7 @@
           <w:sz w:val="20"/>
           <w:szCs w:val="20"/>
         </w:rPr>
+        <w:lastRenderedPageBreak/>
         <w:t>Table 3. Each rule for the star value against the adopted one</w:t>
       </w:r>
     </w:p>
@@ -3798,11 +3801,7 @@
         <w:spacing w:before="60" w:after="120" w:line="276" w:lineRule="auto"/>
       </w:pPr>
       <w:r>
-        <w:t xml:space="preserve">A prospect drafted from 2007 to 2017 is valued from a fit that contains his own outcome. Leaving one draft out of the fit at a time moves the star value within $16.60 million to $19.39 million in D+1 and $7.02 million to $9.69 </w:t>
-      </w:r>
-      <w:r>
-        <w:lastRenderedPageBreak/>
-        <w:t>million in D+4, and moves the 197 traded drafted prospects from $70.39 million to $69.23 million under the adopted model. The value with his draft left out is reported beside each traded prospect's value. Refitting without each prospect's own draft as the main value was rejected for two reasons. It would take eleven fits for each season, and the prospect values would no longer use the same star value as the draft picks traded beside them.</w:t>
+        <w:t>A prospect drafted from 2007 to 2017 is valued from a fit that contains his own outcome. Leaving one draft out of the fit at a time moves the star value within $16.60 million to $19.39 million in D+1 and $7.02 million to $9.69 million in D+4, and moves the 197 traded drafted prospects from $70.39 million to $69.23 million under the adopted model. The value with his draft left out is reported beside each traded prospect's value. Refitting without each prospect's own draft as the main value was rejected for two reasons. It would take eleven fits for each season, and the prospect values would no longer use the same star value as the draft picks traded beside them.</w:t>
       </w:r>
     </w:p>
     <w:p>
@@ -3827,7 +3826,11 @@
         <w:spacing w:before="60" w:after="120" w:line="276" w:lineRule="auto"/>
       </w:pPr>
       <w:r>
-        <w:t>Scoring in different leagues is put on one scale with Patrick Bacon's NHL equivalency (NHLe) factors. A league's factor is the number of NHL points that one point in that league and season is worth. Bacon estimates the factors from players who played a full season in one league and the next full season in another, after adjusting the first season's scoring for the improvement a year of age brings. Leagues with few direct moves between them are linked through intermediate leagues, for example the KHL to the AHL to the NHL. The factors are re-estimated on a rolling four-season window, so a league's factor changes over time (Bacon, hockeystats.com/draft/guide). Figure 3 shows the ten leagues that the 2007-2017 draftees played in most in their draft season, which together hold 84.0% of those draft seasons. For example, an OHL point was worth 0.136 NHL points in 2006-07 and 0.120 in 2025-26, and an SHL point 0.455 and 0.411.</w:t>
+        <w:t>Scoring in different leagues is put on one scale with Patrick Bacon's NHL equivalency (NHLe) factors. A league's factor is the number of NHL points that one point in that league and season is worth. Bacon estimates the factors from players who played a full season in one league and the next full season in another, after adjusting the first season's scoring for the improvement a year of age brings. Leagues with few direct moves between them are linked through intermediate leagues, for example the KHL to the AHL to the NHL. The factors are re-</w:t>
+      </w:r>
+      <w:r>
+        <w:lastRenderedPageBreak/>
+        <w:t>estimated on a rolling four-season window, so a league's factor changes over time (Bacon, hockeystats.com/draft/guide). Figure 3 shows the ten leagues that the 2007-2017 draftees played in most in their draft season, which together hold 84.0% of those draft seasons. For example, an OHL point was worth 0.136 NHL points in 2006-07 and 0.120 in 2025-26, and an SHL point 0.455 and 0.411.</w:t>
       </w:r>
     </w:p>
     <w:p>
@@ -3872,7 +3875,7 @@
                     </pic:cNvPicPr>
                   </pic:nvPicPr>
                   <pic:blipFill>
-                    <a:blip r:embed="rId13"/>
+                    <a:blip r:embed="rId14"/>
                     <a:srcRect/>
                     <a:stretch>
                       <a:fillRect/>
@@ -3912,18 +3915,29 @@
         <w:spacing w:before="60" w:after="120" w:line="276" w:lineRule="auto"/>
       </w:pPr>
       <w:r>
-        <w:rPr>
-          <w:b/>
-          <w:bCs/>
-        </w:rPr>
-        <w:t>The measure.</w:t>
+        <w:t xml:space="preserve">A season's production is the player's points, </w:t>
       </w:r>
       <w:r>
-        <w:t xml:space="preserve"> A season's production is the player's points, from Elite Prospects, times his league-season's NHLe factor, per 82 games, counted for seasons of 10 or more games. His production level weights his three seasons </w:t>
+        <w:t xml:space="preserve">sourced </w:t>
       </w:r>
       <w:r>
-        <w:lastRenderedPageBreak/>
-        <w:t>before the valuation season 50/30/20, most recent first, rescaled over the seasons he has. A prospect with no eligible season (3.9% of prospect-seasons) gets an indicator for having no record, so missing data is not read as zero scoring. Most of those prospect-seasons are in D+1 (88) and from D+5 on (409); only 17 fall in D+2 to D+4 (1 in D+3), so the indicator's coefficient in those seasons rests on very few players. The median level rises from 5.7 NHL-equivalent points per 82 in D+1 to 9.6 from D+5 on.</w:t>
+        <w:t xml:space="preserve">from Elite Prospects, times his league-season's NHLe factor, per 82 games, counted for seasons of 10 or more games. His production level weights his three seasons before the valuation season 50/30/20, most recent first, rescaled over the seasons he has. A prospect with no eligible season (3.9% of prospect-seasons) gets an indicator for having no record, so missing data is not read as zero scoring. </w:t>
+      </w:r>
+      <w:commentRangeStart w:id="3"/>
+      <w:r>
+        <w:t xml:space="preserve">Most of those prospect-seasons </w:t>
+      </w:r>
+      <w:commentRangeEnd w:id="3"/>
+      <w:r>
+        <w:rPr>
+          <w:rStyle w:val="CommentReference"/>
+          <w:sz w:val="21"/>
+          <w:szCs w:val="21"/>
+        </w:rPr>
+        <w:commentReference w:id="3"/>
+      </w:r>
+      <w:r>
+        <w:t>are in D+1 (88) and from D+5 on (409); only 17 fall in D+2 to D+4 (1 in D+3), so the indicator's coefficient in those seasons rests on very few players. The median level rises from 5.7 NHL-equivalent points per 82 in D+1 to 9.6 from D+5 on.</w:t>
       </w:r>
     </w:p>
     <w:p>
@@ -6200,9 +6214,10 @@
           <w:sz w:val="18"/>
           <w:szCs w:val="18"/>
         </w:rPr>
+        <w:lastRenderedPageBreak/>
         <w:t xml:space="preserve">Each number from the second column to the last season column is a held-out error: the </w:t>
       </w:r>
-      <w:commentRangeStart w:id="3"/>
+      <w:commentRangeStart w:id="4"/>
       <w:r>
         <w:rPr>
           <w:color w:val="52514E"/>
@@ -6211,7 +6226,7 @@
         </w:rPr>
         <w:t>root mean squared miss</w:t>
       </w:r>
-      <w:commentRangeEnd w:id="3"/>
+      <w:commentRangeEnd w:id="4"/>
       <w:r>
         <w:rPr>
           <w:rStyle w:val="CommentReference"/>
@@ -6219,7 +6234,7 @@
           <w:sz w:val="18"/>
           <w:szCs w:val="18"/>
         </w:rPr>
-        <w:commentReference w:id="3"/>
+        <w:commentReference w:id="4"/>
       </w:r>
       <w:r>
         <w:rPr>
@@ -6263,21 +6278,37 @@
       <w:r>
         <w:t xml:space="preserve">The straight-line version lets each additional </w:t>
       </w:r>
-      <w:commentRangeStart w:id="4"/>
+      <w:commentRangeStart w:id="5"/>
       <w:r>
         <w:t xml:space="preserve">NHL-equivalent </w:t>
       </w:r>
-      <w:commentRangeEnd w:id="4"/>
+      <w:commentRangeEnd w:id="5"/>
       <w:r>
         <w:rPr>
           <w:rStyle w:val="CommentReference"/>
           <w:sz w:val="21"/>
           <w:szCs w:val="21"/>
         </w:rPr>
-        <w:commentReference w:id="4"/>
+        <w:commentReference w:id="5"/>
       </w:r>
       <w:r>
-        <w:t>point add the same dollars. The curved version adds the square of the production level, so each point adds more the higher a prospect already scores. I chose the curved version because most of a pick's surplus comes from the few players who become stars. The star probability makes value rise faster than in proportion across draft slots, but it is fixed by the slot and does not move with a prospect's scoring. Within a slot, a straight line raises the highest scorers, who are the prospects most likely to become stars, by the same amount per point as each other prospect; the curve lets their value rise faster.</w:t>
+        <w:t xml:space="preserve">point add the same dollars. The curved version adds the square of the production level, so each point adds more the higher a prospect already scores. I chose the curved version because most of a pick's surplus comes from the few players who become stars. The star probability makes value rise faster than in proportion across draft slots, but it is fixed by the slot and does not move with a prospect's scoring. Within a slot, a straight line raises the highest scorers, who are the prospects most likely to become stars, by the same amount per point as each other prospect; </w:t>
+      </w:r>
+      <w:commentRangeStart w:id="6"/>
+      <w:r>
+        <w:t xml:space="preserve">the curve </w:t>
+      </w:r>
+      <w:commentRangeEnd w:id="6"/>
+      <w:r>
+        <w:rPr>
+          <w:rStyle w:val="CommentReference"/>
+          <w:sz w:val="21"/>
+          <w:szCs w:val="21"/>
+        </w:rPr>
+        <w:commentReference w:id="6"/>
+      </w:r>
+      <w:r>
+        <w:t>lets their value rise faster.</w:t>
       </w:r>
     </w:p>
     <w:p>
@@ -6285,11 +6316,7 @@
         <w:spacing w:before="60" w:after="120" w:line="276" w:lineRule="auto"/>
       </w:pPr>
       <w:r>
-        <w:t xml:space="preserve">The curve has the lower held-out error in each season (Table 4) and improves on the slot alone by 2.14%, against 0.57% for the straight line. Compared directly with the straight line, the curve is better with one-sided p = 0.042 with the slot in each season, and p = 0.024 in the adopted model with age (Table 5). The squared term is significant in each season from D+1 to D+4 of the adopted model (p &lt; 0.001, Table 9). Most of the uncertainty comes from one draft. Elite Prospects scoring and the NHLe factors begin in 2006-07, so a 2007 draftee's D+1 </w:t>
-      </w:r>
-      <w:r>
-        <w:lastRenderedPageBreak/>
-        <w:t>production rests on at most one season, against two or three for later drafts. Without the 2007 draft, the curve beats the straight line with p &lt; 0.001.</w:t>
+        <w:t>The curve has the lower held-out error in each season (Table 4) and improves on the slot alone by 2.14%, against 0.57% for the straight line. Compared directly with the straight line, the curve is better with one-sided p = 0.042 with the slot in each season, and p = 0.024 in the adopted model with age (Table 5). The squared term is significant in each season from D+1 to D+4 of the adopted model (p &lt; 0.001, Table 9). Most of the uncertainty comes from one draft. Elite Prospects scoring and the NHLe factors begin in 2006-07, so a 2007 draftee's D+1 production rests on at most one season, against two or three for later drafts. Without the 2007 draft, the curve beats the straight line with p &lt; 0.001.</w:t>
       </w:r>
     </w:p>
     <w:p>
@@ -7591,20 +7618,36 @@
         <w:spacing w:before="60" w:after="120" w:line="276" w:lineRule="auto"/>
       </w:pPr>
       <w:r>
-        <w:t xml:space="preserve">Production squared alone, without the straight production term, predicts about as well as the full curve (2.1819 against 2.1803; the curve is better with p = 0.355). It was not adopted for two reasons. Without its own production term, </w:t>
+        <w:t xml:space="preserve">Production squared alone, </w:t>
       </w:r>
-      <w:commentRangeStart w:id="5"/>
+      <w:commentRangeStart w:id="7"/>
       <w:r>
-        <w:t>the model's value of scoring depends on where age is centred: a joint test that the production term is zero in each season gives p = 0.063 with age measured from 18, and p = 0.003 with age measured from 18.5</w:t>
+        <w:t>without the straight production term, predicts about as well as the full curve (2.1819 against 2.1803; the curve is better with p = 0.355</w:t>
       </w:r>
-      <w:commentRangeEnd w:id="5"/>
+      <w:commentRangeEnd w:id="7"/>
       <w:r>
         <w:rPr>
           <w:rStyle w:val="CommentReference"/>
           <w:sz w:val="21"/>
           <w:szCs w:val="21"/>
         </w:rPr>
-        <w:commentReference w:id="5"/>
+        <w:commentReference w:id="7"/>
+      </w:r>
+      <w:r>
+        <w:t xml:space="preserve">). It was not adopted for two reasons. Without its own production term, </w:t>
+      </w:r>
+      <w:commentRangeStart w:id="8"/>
+      <w:r>
+        <w:t>the model's value of scoring depends on where age is centred: a joint test that the production term is zero in each season gives p = 0.063 with age measured from 18, and p = 0.003 with age measured from 18.5</w:t>
+      </w:r>
+      <w:commentRangeEnd w:id="8"/>
+      <w:r>
+        <w:rPr>
+          <w:rStyle w:val="CommentReference"/>
+          <w:sz w:val="21"/>
+          <w:szCs w:val="21"/>
+        </w:rPr>
+        <w:commentReference w:id="8"/>
       </w:r>
       <w:r>
         <w:t>. The full curve gives the same values whatever the centre. It would also raise the 197 traded prospects' value from $70.39 million to $82.11 million without predicting better.</w:t>
@@ -7622,6 +7665,7 @@
           <w:sz w:val="20"/>
           <w:szCs w:val="20"/>
         </w:rPr>
+        <w:lastRenderedPageBreak/>
         <w:t>Figure 4. A #20 pick in D+2: value against production, before age</w:t>
       </w:r>
     </w:p>
@@ -7652,7 +7696,7 @@
                     </pic:cNvPicPr>
                   </pic:nvPicPr>
                   <pic:blipFill>
-                    <a:blip r:embed="rId14"/>
+                    <a:blip r:embed="rId15"/>
                     <a:srcRect/>
                     <a:stretch>
                       <a:fillRect/>
@@ -7692,11 +7736,7 @@
         <w:spacing w:before="60" w:after="120" w:line="276" w:lineRule="auto"/>
       </w:pPr>
       <w:r>
-        <w:t xml:space="preserve">Below 12.6 points, which is above the 75th percentile, the curved line sits under the straight one; the largest gap is $0.56 million, at 6.1 points. The curved line also dips slightly before it rises, because the production coefficient is negative. With the squared term in the model, that coefficient alone is not the value of an extra point. In the D+2 regression of Figure 4, an extra point adds -0.112 + 2 × 0.0133 × production million dollars, which is positive above 4.2 points; the 25th percentile of production in D+2 is 4.6 points. The negative coefficient therefore sets where the curve bottoms out, near the bottom of the production range, and is not evidence that a little scoring </w:t>
-      </w:r>
-      <w:r>
-        <w:lastRenderedPageBreak/>
-        <w:t>lowers a prospect's value. The gap between the two versions there is small next to the held-out error of about $3 million in D+1 and D+2.</w:t>
+        <w:t>Below 12.6 points, which is above the 75th percentile, the curved line sits under the straight one; the largest gap is $0.56 million, at 6.1 points. The curved line also dips slightly before it rises, because the production coefficient is negative. With the squared term in the model, that coefficient alone is not the value of an extra point. In the D+2 regression of Figure 4, an extra point adds -0.112 + 2 × 0.0133 × production million dollars, which is positive above 4.2 points; the 25th percentile of production in D+2 is 4.6 points. The negative coefficient therefore sets where the curve bottoms out, near the bottom of the production range, and is not evidence that a little scoring lowers a prospect's value. The gap between the two versions there is small next to the held-out error of about $3 million in D+1 and D+2.</w:t>
       </w:r>
     </w:p>
     <w:p>
@@ -7713,7 +7753,23 @@
         <w:spacing w:before="60" w:after="120" w:line="276" w:lineRule="auto"/>
       </w:pPr>
       <w:r>
-        <w:t xml:space="preserve">Once production is in the model, the slot stops carrying information in D+4 (Table 6). Its coefficient is $0.94 million (standard error 1.86, p = 0.613) in D+4 and -$0.76 million (standard error 0.35, p = 0.028) from D+5 on. A negative weight on the slot would value a top pick below a later pick with the same production, </w:t>
+        <w:t xml:space="preserve">Once production is in the model, the </w:t>
+      </w:r>
+      <w:commentRangeStart w:id="9"/>
+      <w:r>
+        <w:t xml:space="preserve">slot </w:t>
+      </w:r>
+      <w:commentRangeEnd w:id="9"/>
+      <w:r>
+        <w:rPr>
+          <w:rStyle w:val="CommentReference"/>
+          <w:sz w:val="21"/>
+          <w:szCs w:val="21"/>
+        </w:rPr>
+        <w:commentReference w:id="9"/>
+      </w:r>
+      <w:r>
+        <w:t xml:space="preserve">stops carrying information in D+4 (Table 6). Its coefficient is $0.94 million (standard error 1.86, p = 0.613) in D+4 and -$0.76 million (standard error 0.35, p = 0.028) from D+5 on. A negative weight on the slot would value a top pick below a later pick with the same production, </w:t>
       </w:r>
       <w:r>
         <w:t>which makes no logical sense</w:t>
@@ -7734,6 +7790,7 @@
           <w:sz w:val="20"/>
           <w:szCs w:val="20"/>
         </w:rPr>
+        <w:lastRenderedPageBreak/>
         <w:t>Table 6. Slot and curved production in each season, before age</w:t>
       </w:r>
     </w:p>
@@ -8843,7 +8900,6 @@
           <w:sz w:val="20"/>
           <w:szCs w:val="20"/>
         </w:rPr>
-        <w:lastRenderedPageBreak/>
         <w:t>Table 7. The production measure's settings</w:t>
       </w:r>
     </w:p>
@@ -9607,6 +9663,7 @@
         <w:keepNext/>
       </w:pPr>
       <w:r>
+        <w:lastRenderedPageBreak/>
         <w:t>3. Age</w:t>
       </w:r>
     </w:p>
@@ -9614,6 +9671,7 @@
       <w:pPr>
         <w:spacing w:before="60" w:after="120" w:line="276" w:lineRule="auto"/>
       </w:pPr>
+      <w:commentRangeStart w:id="10"/>
       <w:r>
         <w:t>A player who scores at a given rate at 18 is commonly rated a better prospect than one who scores at the same rate at 20. This section tests whether the data agree. Age enters as years past first eligibility, which is the player's age on September 15 of the autumn after his draft, less 18. A player is first eligible for the draft in the year he is 18 by September 15, so on that date after his first draft he is between 18.0 and 19.0: the measure runs from 0 to 1 for a player drafted at his first opportunity, from 1 to 2 for one drafted a year later, and so on (from 0.00 to 3.67 in the data). It is how old the player was when he was drafted.</w:t>
       </w:r>
@@ -9624,6 +9682,15 @@
       </w:pPr>
       <w:r>
         <w:t>Each season's regression compares prospects who are the same number of seasons past their draft. Within one season, a prospect's current age is his age at the draft plus that number of seasons, so a prospect who is a year older now was also drafted a year older, and one measure covers both. Time since the draft never enters a regression as a variable: it is the same for each prospect in a season's fit. Across all seasons, a prospect's current age and his seasons since the draft move together almost one for one (correlation 0.960), which is why current age is not used. Years past first eligibility is nearly unrelated to seasons since the draft (correlation 0.024), and the age term overlaps little with the other terms in each season's regression: its variance inflation factor is at most 1.9, where 1 means no overlap. The largest overlap in the model is between production and its square (variance inflation factor 9.2 to 10.3), which is usual for a squared term; it widens both terms' standard errors, and both remain significant from D+1 to D+4.</w:t>
+      </w:r>
+      <w:commentRangeEnd w:id="10"/>
+      <w:r>
+        <w:rPr>
+          <w:rStyle w:val="CommentReference"/>
+          <w:sz w:val="21"/>
+          <w:szCs w:val="21"/>
+        </w:rPr>
+        <w:commentReference w:id="10"/>
       </w:r>
     </w:p>
     <w:p>
@@ -10610,7 +10677,6 @@
           <w:sz w:val="18"/>
           <w:szCs w:val="18"/>
         </w:rPr>
-        <w:lastRenderedPageBreak/>
         <w:t>Held-out error as in Table 4. Each candidate keeps the production model of Section 2 and adds the age term shown; its one-sided p-value compares it with the production model without age. With both terms, the comparison against the age discount alone gives p = 0.608.</w:t>
       </w:r>
     </w:p>
@@ -10628,7 +10694,23 @@
         <w:spacing w:before="60" w:after="120" w:line="276" w:lineRule="auto"/>
       </w:pPr>
       <w:r>
-        <w:t>Two forms were tested. Age as a flat amount subtracts the same dollars for each year past first eligibility, whatever the player scores. Age discounting production makes each point of production worth less the older the player was when drafted: each year past first eligibility lowers the value of each point by a fixed amount. In D+2 that amount is $0.064 million (Table 9), so of two prospects with 10 points, the one drafted a year older is worth $0.64 million less. Both forms are reliable improvements (one-sided p = 0.006 and 0.0015), and the discount improves held-out error more (-0.74% against -0.29%). I chose the discount because it is the larger gain and it measures what age was included for, which is how much a player's scoring says about him given his age. Using both terms is worse than the discount alone (-0.69% against -0.74%; p = 0.608 that it is better). The flat term also changes sign once the discount is in (Table B5), which shows the two terms measure the same thing.</w:t>
+        <w:t xml:space="preserve">Two forms were tested. Age as a flat amount subtracts the same dollars for each year past first eligibility, whatever the player scores. </w:t>
+      </w:r>
+      <w:commentRangeStart w:id="11"/>
+      <w:r>
+        <w:t>Age discounting production makes each point of production worth less the older the player was when drafted</w:t>
+      </w:r>
+      <w:commentRangeEnd w:id="11"/>
+      <w:r>
+        <w:rPr>
+          <w:rStyle w:val="CommentReference"/>
+          <w:sz w:val="21"/>
+          <w:szCs w:val="21"/>
+        </w:rPr>
+        <w:commentReference w:id="11"/>
+      </w:r>
+      <w:r>
+        <w:t>: each year past first eligibility lowers the value of each point by a fixed amount. In D+2 that amount is $0.064 million (Table 9), so of two prospects with 10 points, the one drafted a year older is worth $0.64 million less. Both forms are reliable improvements (one-sided p = 0.006 and 0.0015), and the discount improves held-out error more (-0.74% against -0.29%). I chose the discount because it is the larger gain and it measures what age was included for, which is how much a player's scoring says about him given his age. Using both terms is worse than the discount alone (-0.69% against -0.74%; p = 0.608 that it is better). The flat term also changes sign once the discount is in (Table B5), which shows the two terms measure the same thing.</w:t>
       </w:r>
     </w:p>
     <w:p>
@@ -10651,6 +10733,7 @@
           <w:sz w:val="20"/>
           <w:szCs w:val="20"/>
         </w:rPr>
+        <w:lastRenderedPageBreak/>
         <w:t>Figure 5. A #20 pick in D+2: the age discount</w:t>
       </w:r>
     </w:p>
@@ -10681,7 +10764,7 @@
                     </pic:cNvPicPr>
                   </pic:nvPicPr>
                   <pic:blipFill>
-                    <a:blip r:embed="rId15"/>
+                    <a:blip r:embed="rId16"/>
                     <a:srcRect/>
                     <a:stretch>
                       <a:fillRect/>
@@ -10892,7 +10975,6 @@
           <w:sz w:val="20"/>
           <w:szCs w:val="20"/>
         </w:rPr>
-        <w:lastRenderedPageBreak/>
         <w:t>Table 9. The adopted model: regression by season</w:t>
       </w:r>
     </w:p>
@@ -12786,6 +12868,7 @@
         <w:spacing w:before="60" w:after="120" w:line="276" w:lineRule="auto"/>
       </w:pPr>
       <w:r>
+        <w:lastRenderedPageBreak/>
         <w:t>Table 10 shows the D+2 regression built up one term at a time, in the order of this document: the slot alone, then production, then its square, then age. Each column adds one term to the column before it, on the same prospect-seasons; Appendix B gives the same table for each other season.</w:t>
       </w:r>
     </w:p>
@@ -14107,7 +14190,6 @@
           <w:sz w:val="20"/>
           <w:szCs w:val="20"/>
         </w:rPr>
-        <w:lastRenderedPageBreak/>
         <w:t>Table 11. Nick Suzuki's value, term by term</w:t>
       </w:r>
     </w:p>
@@ -15343,7 +15425,23 @@
         <w:spacing w:before="60" w:after="120" w:line="276" w:lineRule="auto"/>
       </w:pPr>
       <w:r>
-        <w:t>His scoring raises his value from $2.99 million on his slot to $4.23 million. The production model without age values him at $3.53 million. His own age term is small (-$0.10M), but adding age changes the other coefficients: once older prospects' scoring is discounted, the production terms describe the scoring of a player drafted at 18, which is worth more. For Suzuki, drafted at 18.1, that adds $0.70 million.</w:t>
+        <w:t xml:space="preserve">His scoring raises his value from $2.99 million on his slot to $4.23 million. The production model without age values him at $3.53 million. His own age term is small (-$0.10M), but adding age changes the other coefficients: once older prospects' scoring is discounted, </w:t>
+      </w:r>
+      <w:commentRangeStart w:id="12"/>
+      <w:r>
+        <w:t xml:space="preserve">the production terms describe the scoring of a player drafted at 18, which is worth more. </w:t>
+      </w:r>
+      <w:commentRangeEnd w:id="12"/>
+      <w:r>
+        <w:rPr>
+          <w:rStyle w:val="CommentReference"/>
+          <w:sz w:val="21"/>
+          <w:szCs w:val="21"/>
+        </w:rPr>
+        <w:commentReference w:id="12"/>
+      </w:r>
+      <w:r>
+        <w:t>For Suzuki, drafted at 18.1, that adds $0.70 million.</w:t>
       </w:r>
     </w:p>
     <w:p>
@@ -15352,6 +15450,7 @@
         <w:keepNext/>
       </w:pPr>
       <w:r>
+        <w:lastRenderedPageBreak/>
         <w:t>4. The Traded Prospects</w:t>
       </w:r>
     </w:p>
@@ -16370,11 +16469,7 @@
         <w:spacing w:before="60" w:after="120" w:line="276" w:lineRule="auto"/>
       </w:pPr>
       <w:r>
-        <w:t xml:space="preserve">A value can be below zero. Of the 197 drafted prospects, 66 are valued below zero, -$4.08 million in total; of all 250 prospects valued, 82 are, the lowest at -$0.48 million. A value below zero means that prospects with that </w:t>
-      </w:r>
-      <w:r>
-        <w:lastRenderedPageBreak/>
-        <w:t>profile, a low scorer from a late slot, delivered slightly negative surplus on average in the data: when such players reach the NHL, their cost tends to exceed the value of the wins they deliver. Negative careers count, as in the draft pick curve.</w:t>
+        <w:t>A value can be below zero. Of the 197 drafted prospects, 66 are valued below zero, -$4.08 million in total; of all 250 prospects valued, 82 are, the lowest at -$0.48 million. A value below zero means that prospects with that profile, a low scorer from a late slot, delivered slightly negative surplus on average in the data: when such players reach the NHL, their cost tends to exceed the value of the wins they deliver. Negative careers count, as in the draft pick curve.</w:t>
       </w:r>
     </w:p>
     <w:p>
@@ -16389,6 +16484,7 @@
           <w:sz w:val="20"/>
           <w:szCs w:val="20"/>
         </w:rPr>
+        <w:lastRenderedPageBreak/>
         <w:t>Figure 6. Production raises some prospects well above their slot's value and lowers others</w:t>
       </w:r>
     </w:p>
@@ -16419,7 +16515,7 @@
                     </pic:cNvPicPr>
                   </pic:nvPicPr>
                   <pic:blipFill>
-                    <a:blip r:embed="rId16"/>
+                    <a:blip r:embed="rId17"/>
                     <a:srcRect/>
                     <a:stretch>
                       <a:fillRect/>
@@ -19179,11 +19275,7 @@
         <w:spacing w:before="60" w:after="120" w:line="276" w:lineRule="auto"/>
       </w:pPr>
       <w:r>
-        <w:t xml:space="preserve">An undrafted player has no draft rights, so a club holds his NHL rights only through an NHL contract; an undrafted player on a minor-league contract is worth nothing to an NHL club in this currency. The 53 undrafted </w:t>
-      </w:r>
-      <w:r>
-        <w:lastRenderedPageBreak/>
-        <w:t>prospects on NHL contracts are valued by the same model with the star probability set to zero, with seasons counted from the first draft at which they were eligible. They total $5.93 million; the largest is Brennan Menell at $0.67 million.</w:t>
+        <w:t>An undrafted player has no draft rights, so a club holds his NHL rights only through an NHL contract; an undrafted player on a minor-league contract is worth nothing to an NHL club in this currency. The 53 undrafted prospects on NHL contracts are valued by the same model with the star probability set to zero, with seasons counted from the first draft at which they were eligible. They total $5.93 million; the largest is Brennan Menell at $0.67 million.</w:t>
       </w:r>
     </w:p>
     <w:p>
@@ -19191,6 +19283,7 @@
         <w:spacing w:before="60" w:after="120" w:line="276" w:lineRule="auto"/>
       </w:pPr>
       <w:r>
+        <w:lastRenderedPageBreak/>
         <w:t>Each was in D+5 or later at his trade (counted from his first eligible draft), where the slot is not in the model, so the zero star probability changes none of their values. It would matter only for an undrafted player traded in D+1 to D+3, and there zero is the defensible value: each club passed on him at the draft, so his chance of becoming a star is below the last pick's. Two limitations do matter. First, the fit uses drafted players only, so the model assumes an undrafted scorer turns production into NHL surplus at the rate a drafted one does. Undrafted prospects on NHL contracts are players a club chose to sign. The drafted prospects the model learns from include many whose rights lapsed and who delivered nothing, so the model probably undervalues undrafted prospects. The contract records begin in 2018-19, so the data cannot separate the drafted prospects of 2007-2017 who were under NHL contracts. Second, the model has no age term from D+5 on, because age adds nothing there among drafted players. An undrafted 22-year-old and a 25-year-old with the same scoring therefore receive the same value until club control ends at 27.</w:t>
       </w:r>
     </w:p>
@@ -19993,7 +20086,6 @@
         <w:keepNext/>
       </w:pPr>
       <w:r>
-        <w:lastRenderedPageBreak/>
         <w:t>Appendix B. The Regressions Built Up One Term at a Time</w:t>
       </w:r>
     </w:p>
@@ -21283,6 +21375,7 @@
           <w:sz w:val="18"/>
           <w:szCs w:val="18"/>
         </w:rPr>
+        <w:lastRenderedPageBreak/>
         <w:t>As Table 10.</w:t>
       </w:r>
     </w:p>
@@ -23861,7 +23954,6 @@
           <w:sz w:val="18"/>
           <w:szCs w:val="18"/>
         </w:rPr>
-        <w:lastRenderedPageBreak/>
         <w:t>As Table 10. In the adopted model the slot is out from D+4, so column (4) drops the slot.</w:t>
       </w:r>
     </w:p>
@@ -25166,6 +25258,7 @@
           <w:sz w:val="20"/>
           <w:szCs w:val="20"/>
         </w:rPr>
+        <w:lastRenderedPageBreak/>
         <w:t>Table B5. The age terms in each tested form</w:t>
       </w:r>
     </w:p>
@@ -26135,7 +26228,7 @@
       </w:r>
     </w:p>
     <w:sectPr>
-      <w:footerReference w:type="default" r:id="rId17"/>
+      <w:footerReference w:type="default" r:id="rId18"/>
       <w:pgSz w:w="12240" w:h="15840"/>
       <w:pgMar w:top="1300" w:right="1300" w:bottom="1300" w:left="1300" w:header="708" w:footer="708" w:gutter="0"/>
       <w:cols w:space="720"/>
@@ -26195,7 +26288,23 @@
       </w:r>
     </w:p>
   </w:comment>
-  <w:comment w:id="3" w:author="Thomas Mihaljevic" w:date="2026-10-15T15:06:00Z" w:initials="TM">
+  <w:comment w:id="3" w:author="Thomas Mihaljevic" w:date="2026-10-15T16:11:00Z" w:initials="TM">
+    <w:p>
+      <w:pPr>
+        <w:pStyle w:val="CommentText"/>
+      </w:pPr>
+      <w:r>
+        <w:rPr>
+          <w:rStyle w:val="CommentReference"/>
+        </w:rPr>
+        <w:annotationRef/>
+      </w:r>
+      <w:r>
+        <w:t>Missing prospects seasons</w:t>
+      </w:r>
+    </w:p>
+  </w:comment>
+  <w:comment w:id="4" w:author="Thomas Mihaljevic" w:date="2026-10-15T15:06:00Z" w:initials="TM">
     <w:p>
       <w:pPr>
         <w:pStyle w:val="CommentText"/>
@@ -26211,7 +26320,7 @@
       </w:r>
     </w:p>
   </w:comment>
-  <w:comment w:id="4" w:author="Thomas Mihaljevic" w:date="2026-10-15T15:08:00Z" w:initials="TM">
+  <w:comment w:id="5" w:author="Thomas Mihaljevic" w:date="2026-10-15T15:08:00Z" w:initials="TM">
     <w:p>
       <w:pPr>
         <w:pStyle w:val="CommentText"/>
@@ -26227,7 +26336,7 @@
       </w:r>
     </w:p>
   </w:comment>
-  <w:comment w:id="5" w:author="Thomas Mihaljevic" w:date="2026-10-15T15:12:00Z" w:initials="TM">
+  <w:comment w:id="6" w:author="Thomas Mihaljevic" w:date="2026-10-15T16:14:00Z" w:initials="TM">
     <w:p>
       <w:pPr>
         <w:pStyle w:val="CommentText"/>
@@ -26239,7 +26348,103 @@
         <w:annotationRef/>
       </w:r>
       <w:r>
-        <w:t>I don’t know what this is saying</w:t>
+        <w:t>“the curve” is not a meaningful word. The whole thing is a curve. You mean “The production squared term”</w:t>
+      </w:r>
+    </w:p>
+  </w:comment>
+  <w:comment w:id="7" w:author="Thomas Mihaljevic" w:date="2026-10-15T16:17:00Z" w:initials="TM">
+    <w:p>
+      <w:pPr>
+        <w:pStyle w:val="CommentText"/>
+      </w:pPr>
+      <w:r>
+        <w:rPr>
+          <w:rStyle w:val="CommentReference"/>
+        </w:rPr>
+        <w:annotationRef/>
+      </w:r>
+      <w:r>
+        <w:t>This sentence is a good illustration about why being specific and consistent is extremely important. What is the difference between “full curve” and “the curve”? The full sentence (I think) should read something like “Production squared alone, removing the linear production term, predicts about as well as a regression with both the linear and squared production terms (2.1819 against 2.1803; the squared production only regression is better with p = 0.355). You need to scan the entire document for confusing wording like this. You need to be specific and consistent.</w:t>
+      </w:r>
+    </w:p>
+  </w:comment>
+  <w:comment w:id="8" w:author="Thomas Mihaljevic" w:date="2026-10-15T15:12:00Z" w:initials="TM">
+    <w:p>
+      <w:pPr>
+        <w:pStyle w:val="CommentText"/>
+      </w:pPr>
+      <w:r>
+        <w:rPr>
+          <w:rStyle w:val="CommentReference"/>
+        </w:rPr>
+        <w:annotationRef/>
+      </w:r>
+      <w:r>
+        <w:t>I don’t know what this is saying. Why are we talking about age here at all? It’s very confusing</w:t>
+      </w:r>
+    </w:p>
+  </w:comment>
+  <w:comment w:id="9" w:author="Thomas Mihaljevic" w:date="2026-10-15T16:22:00Z" w:initials="TM">
+    <w:p>
+      <w:pPr>
+        <w:pStyle w:val="CommentText"/>
+      </w:pPr>
+      <w:r>
+        <w:rPr>
+          <w:rStyle w:val="CommentReference"/>
+        </w:rPr>
+        <w:annotationRef/>
+      </w:r>
+      <w:r>
+        <w:t xml:space="preserve">This is another instance where specificity helps. Of course “slot” refers to draft position, but personally I don’t like “slot” because it feels non-specific and also “the slot” is a common hockey term that is completely unrelated to the draft. It should be “Draft position” throughout </w:t>
+      </w:r>
+    </w:p>
+  </w:comment>
+  <w:comment w:id="10" w:author="Thomas Mihaljevic" w:date="2026-10-15T16:29:00Z" w:initials="TM">
+    <w:p>
+      <w:pPr>
+        <w:pStyle w:val="CommentText"/>
+      </w:pPr>
+      <w:r>
+        <w:rPr>
+          <w:rStyle w:val="CommentReference"/>
+        </w:rPr>
+        <w:annotationRef/>
+      </w:r>
+      <w:r>
+        <w:t>I still think the wording here is clunky. I would recommend giving me rewrite options in chat. I think it is just generally difficult to understand what the metric used for age is and how it is different than any other potential metric</w:t>
+      </w:r>
+    </w:p>
+  </w:comment>
+  <w:comment w:id="11" w:author="Thomas Mihaljevic" w:date="2026-10-15T16:35:00Z" w:initials="TM">
+    <w:p>
+      <w:pPr>
+        <w:pStyle w:val="CommentText"/>
+      </w:pPr>
+      <w:r>
+        <w:rPr>
+          <w:rStyle w:val="CommentReference"/>
+        </w:rPr>
+        <w:annotationRef/>
+      </w:r>
+      <w:r>
+        <w:t>Again this seems to be not how it should work? What is important is that a player who is 20’s equivalent production is worth less than an 18 year olds production. An 18 year old’s should always be worth more than the 20 year olds all else being equal</w:t>
+      </w:r>
+    </w:p>
+  </w:comment>
+  <w:comment w:id="12" w:author="Thomas Mihaljevic" w:date="2026-10-15T16:39:00Z" w:initials="TM">
+    <w:p>
+      <w:pPr>
+        <w:pStyle w:val="CommentText"/>
+      </w:pPr>
+      <w:r>
+        <w:rPr>
+          <w:rStyle w:val="CommentReference"/>
+        </w:rPr>
+        <w:annotationRef/>
+      </w:r>
+      <w:r>
+        <w:t xml:space="preserve">Again this seems to be wrong because don’t we care about the age that the production comes from? Not the age a player was drafted at </w:t>
       </w:r>
     </w:p>
   </w:comment>
@@ -26251,9 +26456,16 @@
   <w15:commentEx w15:paraId="0E0D1070" w15:done="0"/>
   <w15:commentEx w15:paraId="4F9E1AE0" w15:done="0"/>
   <w15:commentEx w15:paraId="0F87A793" w15:done="0"/>
+  <w15:commentEx w15:paraId="363CD3F9" w15:done="0"/>
   <w15:commentEx w15:paraId="06476867" w15:done="0"/>
   <w15:commentEx w15:paraId="251D02FC" w15:done="0"/>
+  <w15:commentEx w15:paraId="610EA236" w15:done="0"/>
+  <w15:commentEx w15:paraId="5C4CF7AE" w15:done="0"/>
   <w15:commentEx w15:paraId="52A3BBA8" w15:done="0"/>
+  <w15:commentEx w15:paraId="546F3FC3" w15:done="0"/>
+  <w15:commentEx w15:paraId="55223A8B" w15:done="0"/>
+  <w15:commentEx w15:paraId="0CD4D32A" w15:done="0"/>
+  <w15:commentEx w15:paraId="54EB0354" w15:done="0"/>
 </w15:commentsEx>
 </file>
 
@@ -26262,9 +26474,16 @@
   <w16cex:commentExtensible w16cex:durableId="42311AFE" w16cex:dateUtc="2026-10-15T18:38:00Z"/>
   <w16cex:commentExtensible w16cex:durableId="139A72E9" w16cex:dateUtc="2026-10-15T18:42:00Z"/>
   <w16cex:commentExtensible w16cex:durableId="651DF7CF" w16cex:dateUtc="2026-10-15T18:43:00Z"/>
+  <w16cex:commentExtensible w16cex:durableId="7D9CF133" w16cex:dateUtc="2026-10-15T20:11:00Z"/>
   <w16cex:commentExtensible w16cex:durableId="60A77EF1" w16cex:dateUtc="2026-10-15T19:06:00Z"/>
   <w16cex:commentExtensible w16cex:durableId="6D9B4EEA" w16cex:dateUtc="2026-10-15T19:08:00Z"/>
+  <w16cex:commentExtensible w16cex:durableId="29D38BEF" w16cex:dateUtc="2026-10-15T20:14:00Z"/>
+  <w16cex:commentExtensible w16cex:durableId="361040B7" w16cex:dateUtc="2026-10-15T20:17:00Z"/>
   <w16cex:commentExtensible w16cex:durableId="1F3BDFC7" w16cex:dateUtc="2026-10-15T19:12:00Z"/>
+  <w16cex:commentExtensible w16cex:durableId="0E83A35C" w16cex:dateUtc="2026-10-15T20:22:00Z"/>
+  <w16cex:commentExtensible w16cex:durableId="2E68A7C4" w16cex:dateUtc="2026-10-15T20:29:00Z"/>
+  <w16cex:commentExtensible w16cex:durableId="3DEEF638" w16cex:dateUtc="2026-10-15T20:35:00Z"/>
+  <w16cex:commentExtensible w16cex:durableId="608119E7" w16cex:dateUtc="2026-10-15T20:39:00Z"/>
 </w16cex:commentsExtensible>
 </file>
 
@@ -26273,9 +26492,16 @@
   <w16cid:commentId w16cid:paraId="0E0D1070" w16cid:durableId="42311AFE"/>
   <w16cid:commentId w16cid:paraId="4F9E1AE0" w16cid:durableId="139A72E9"/>
   <w16cid:commentId w16cid:paraId="0F87A793" w16cid:durableId="651DF7CF"/>
+  <w16cid:commentId w16cid:paraId="363CD3F9" w16cid:durableId="7D9CF133"/>
   <w16cid:commentId w16cid:paraId="06476867" w16cid:durableId="60A77EF1"/>
   <w16cid:commentId w16cid:paraId="251D02FC" w16cid:durableId="6D9B4EEA"/>
+  <w16cid:commentId w16cid:paraId="610EA236" w16cid:durableId="29D38BEF"/>
+  <w16cid:commentId w16cid:paraId="5C4CF7AE" w16cid:durableId="361040B7"/>
   <w16cid:commentId w16cid:paraId="52A3BBA8" w16cid:durableId="1F3BDFC7"/>
+  <w16cid:commentId w16cid:paraId="546F3FC3" w16cid:durableId="0E83A35C"/>
+  <w16cid:commentId w16cid:paraId="55223A8B" w16cid:durableId="2E68A7C4"/>
+  <w16cid:commentId w16cid:paraId="0CD4D32A" w16cid:durableId="3DEEF638"/>
+  <w16cid:commentId w16cid:paraId="54EB0354" w16cid:durableId="608119E7"/>
 </w16cid:commentsIds>
 </file>
 
@@ -27509,4 +27735,16 @@
   <a:objectDefaults/>
   <a:extraClrSchemeLst/>
 </a:theme>
+</file>
+
+<file path=customXml/item1.xml><?xml version="1.0" encoding="utf-8"?>
+<b:Sources xmlns:b="http://schemas.openxmlformats.org/officeDocument/2006/bibliography" xmlns="http://schemas.openxmlformats.org/officeDocument/2006/bibliography" SelectedStyle="\APASixthEditionOfficeOnline.xsl" StyleName="APA" Version="6"/>
+</file>
+
+<file path=customXml/itemProps1.xml><?xml version="1.0" encoding="utf-8"?>
+<ds:datastoreItem xmlns:ds="http://schemas.openxmlformats.org/officeDocument/2006/customXml" ds:itemID="{A4A4C8D6-BF63-47D1-BC9E-1CF158AB1B25}">
+  <ds:schemaRefs>
+    <ds:schemaRef ds:uri="http://schemas.openxmlformats.org/officeDocument/2006/bibliography"/>
+  </ds:schemaRefs>
+</ds:datastoreItem>
 </file>
</xml_diff>

<commit_message>
Valuing Prospects: "alternative" for "rule" in Figure 2 and Table 3 (Thomas)
Figure 2's title and in-panel label, Table 3's title, header and caption. Builder and figures v2.3; rebuilt, every guard passes.

Co-Authored-By: Claude Opus 5.5 <noreply@anthropic.com>
</commit_message>
<xml_diff>
--- a/40_DOCS/Supervisor_Drafts/Valuing Prospects.docx
+++ b/40_DOCS/Supervisor_Drafts/Valuing Prospects.docx
@@ -2993,7 +2993,7 @@
           <w:sz w:val="20"/>
           <w:szCs w:val="20"/>
         </w:rPr>
-        <w:t xml:space="preserve">Figure 2. The star value by season, and three simpler rules</w:t>
+        <w:t xml:space="preserve">Figure 2. The star value by season, and three rejected alternatives</w:t>
       </w:r>
     </w:p>
     <w:p>
@@ -3069,7 +3069,7 @@
           <w:sz w:val="20"/>
           <w:szCs w:val="20"/>
         </w:rPr>
-        <w:t xml:space="preserve">Table 3. Each rule for the star value against the adopted one</w:t>
+        <w:t xml:space="preserve">Table 3. Each alternative for the star value against the adopted one</w:t>
       </w:r>
     </w:p>
     <w:tbl>
@@ -3126,7 +3126,7 @@
                 <w:sz w:val="17"/>
                 <w:szCs w:val="17"/>
               </w:rPr>
-              <w:t xml:space="preserve">Rule</w:t>
+              <w:t xml:space="preserve">Alternative</w:t>
             </w:r>
           </w:p>
         </w:tc>
@@ -4125,7 +4125,7 @@
           <w:sz w:val="18"/>
           <w:szCs w:val="18"/>
         </w:rPr>
-        <w:t xml:space="preserve">Held-out error: each draft is predicted from a fit without it, and the error is the root mean squared error in millions of dollars of remaining surplus per prospect-season, over 14,718 prospect-seasons; lower is better, and the lowest is in bold. One-sided p: the 11 drafts are redrawn with replacement 2,000 times, and p is the share of redraws in which the adopted rule's total squared error is not lower than the other rule's. It is one-sided because the question is directional: is the adopted rule better?</w:t>
+        <w:t xml:space="preserve">Held-out error: each draft is predicted from a fit without it, and the error is the root mean squared error in millions of dollars of remaining surplus per prospect-season, over 14,718 prospect-seasons; lower is better, and the lowest is in bold. One-sided p: the 11 drafts are redrawn with replacement 2,000 times, and p is the share of redraws in which the adopted model's total squared error is not lower than the alternative's. It is one-sided because the question is directional: is the adopted model better?</w:t>
       </w:r>
     </w:p>
     <w:p>

</xml_diff>

<commit_message>
Pick curve and prospect model: no intercept and no draft dummies (Thomas); Valuing Prospects v2.5
The sum-to-zero draft-year columns are removed from every fit in pick_curve.py v1.7, prospect_values.py v1.10 and the seven tests the document reads. Star value 18.04 (unchanged to the cent), traded picks $401.6M, traded prospects $75.60M (was $76.31M). Every guard passes. The no-record term is now exactly zero from D+4 on (each such prospect delivered nothing); its p-value is shown as undefined and the document's sentence is rewritten, with a build guard.

Co-Authored-By: Claude Opus 5.5 <noreply@anthropic.com>
</commit_message>
<xml_diff>
--- a/40_DOCS/Supervisor_Drafts/Valuing Prospects.docx
+++ b/40_DOCS/Supervisor_Drafts/Valuing Prospects.docx
@@ -1070,7 +1070,7 @@
           <w:sz w:val="18"/>
           <w:szCs w:val="18"/>
         </w:rPr>
-        <w:t xml:space="preserve">Drafted players of 2007 to 2017 who never played an NHL season and died before their club's control would have ended, from Wikipedia's list of ice hockey players who died during their careers, each matched to the draft records by draft year and overall pick. Leaving them out moves the star value at the draft from $18.02 million to $18.04 million.</w:t>
+        <w:t xml:space="preserve">Drafted players of 2007 to 2017 who never played an NHL season and died before their club's control would have ended, from Wikipedia's list of ice hockey players who died during their careers, each matched to the draft records by draft year and overall pick. Leaving them out moves the star value at the draft from $18.03 million to $18.04 million.</w:t>
       </w:r>
     </w:p>
     <w:p>
@@ -1192,7 +1192,7 @@
         <w:rPr>
           <w:rFonts w:ascii="Calibri" w:cs="Calibri" w:eastAsia="Calibri" w:hAnsi="Calibri"/>
         </w:rPr>
-        <w:t xml:space="preserve">To measure how the value of draft position changes, I regressed each prospect's remaining surplus on the star probability for his draft position, interacted with an indicator for each season from D+1 to D+4 and one for D+5 onwards, using every season in which a drafted player was still a prospect. The coefficient for each season is that season's star value, which is what a prospect still unproven in that season would be worth if he were certain to become a star. As in the draft pick curve, a dummy variable for each draft year lets a draft sit above or below the average. The draft effects average zero and there is no overall intercept, so each star value describes an average draft.</w:t>
+        <w:t xml:space="preserve">To measure how the value of draft position changes, I regressed each prospect's remaining surplus on the star probability for his draft position, interacted with an indicator for each season from D+1 to D+4 and one for D+5 onwards, using every season in which a drafted player was still a prospect. The coefficient for each season is that season's star value, which is what a prospect still unproven in that season would be worth if he were certain to become a star. As in the draft pick curve, the regression has no intercept, so a draft position with no star probability is worth zero.</w:t>
       </w:r>
     </w:p>
     <w:p>
@@ -1208,7 +1208,7 @@
           <w:sz w:val="23"/>
           <w:szCs w:val="23"/>
         </w:rPr>
-        <w:t xml:space="preserve">remaining surplus  =  star value for D+n  ×  star probability  +  draft-year effect  +  error</w:t>
+        <w:t xml:space="preserve">remaining surplus  =  star value for D+n  ×  star probability  +  error</w:t>
       </w:r>
     </w:p>
     <w:p>
@@ -1219,7 +1219,7 @@
         <w:rPr>
           <w:rFonts w:ascii="Calibri" w:cs="Calibri" w:eastAsia="Calibri" w:hAnsi="Calibri"/>
         </w:rPr>
-        <w:t xml:space="preserve">A prospect is valued at the average draft, where the draft-year effect is zero:</w:t>
+        <w:t xml:space="preserve">A prospect still unproven in season D+n is therefore valued as:</w:t>
       </w:r>
     </w:p>
     <w:p>
@@ -1246,7 +1246,7 @@
         <w:rPr>
           <w:rFonts w:ascii="Calibri" w:cs="Calibri" w:eastAsia="Calibri" w:hAnsi="Calibri"/>
         </w:rPr>
-        <w:t xml:space="preserve">For example, a #10 pick (star probability 21.2%) who is still a prospect in D+3 is worth 0.212 × $15.75 million = $3.34 million.</w:t>
+        <w:t xml:space="preserve">For example, a #10 pick (star probability 21.2%) who is still a prospect in D+3 is worth 0.212 × $15.74 million = $3.34 million.</w:t>
       </w:r>
     </w:p>
     <w:p>
@@ -1663,7 +1663,7 @@
                 <w:sz w:val="17"/>
                 <w:szCs w:val="17"/>
               </w:rPr>
-              <w:t xml:space="preserve">$18.04M (1.73)</w:t>
+              <w:t xml:space="preserve">$18.04M (1.75)</w:t>
             </w:r>
           </w:p>
         </w:tc>
@@ -1729,7 +1729,7 @@
                 <w:sz w:val="17"/>
                 <w:szCs w:val="17"/>
               </w:rPr>
-              <w:t xml:space="preserve">$13.48M</w:t>
+              <w:t xml:space="preserve">$13.49M</w:t>
             </w:r>
           </w:p>
         </w:tc>
@@ -1762,7 +1762,7 @@
                 <w:sz w:val="17"/>
                 <w:szCs w:val="17"/>
               </w:rPr>
-              <w:t xml:space="preserve">$3.82M</w:t>
+              <w:t xml:space="preserve">$3.83M</w:t>
             </w:r>
           </w:p>
         </w:tc>
@@ -1932,7 +1932,7 @@
                 <w:sz w:val="17"/>
                 <w:szCs w:val="17"/>
               </w:rPr>
-              <w:t xml:space="preserve">$17.61M (1.77)</w:t>
+              <w:t xml:space="preserve">$17.67M (1.79)</w:t>
             </w:r>
           </w:p>
         </w:tc>
@@ -1998,7 +1998,7 @@
                 <w:sz w:val="17"/>
                 <w:szCs w:val="17"/>
               </w:rPr>
-              <w:t xml:space="preserve">$13.16M</w:t>
+              <w:t xml:space="preserve">$13.21M</w:t>
             </w:r>
           </w:p>
         </w:tc>
@@ -2031,7 +2031,7 @@
                 <w:sz w:val="17"/>
                 <w:szCs w:val="17"/>
               </w:rPr>
-              <w:t xml:space="preserve">$3.73M</w:t>
+              <w:t xml:space="preserve">$3.75M</w:t>
             </w:r>
           </w:p>
         </w:tc>
@@ -2201,7 +2201,7 @@
                 <w:sz w:val="17"/>
                 <w:szCs w:val="17"/>
               </w:rPr>
-              <w:t xml:space="preserve">$15.75M (2.17)</w:t>
+              <w:t xml:space="preserve">$15.74M (2.20)</w:t>
             </w:r>
           </w:p>
         </w:tc>
@@ -2267,7 +2267,7 @@
                 <w:sz w:val="17"/>
                 <w:szCs w:val="17"/>
               </w:rPr>
-              <w:t xml:space="preserve">$11.77M</w:t>
+              <w:t xml:space="preserve">$11.76M</w:t>
             </w:r>
           </w:p>
         </w:tc>
@@ -2470,7 +2470,7 @@
                 <w:sz w:val="17"/>
                 <w:szCs w:val="17"/>
               </w:rPr>
-              <w:t xml:space="preserve">$8.89M (1.71)</w:t>
+              <w:t xml:space="preserve">$8.79M (1.72)</w:t>
             </w:r>
           </w:p>
         </w:tc>
@@ -2536,7 +2536,7 @@
                 <w:sz w:val="17"/>
                 <w:szCs w:val="17"/>
               </w:rPr>
-              <w:t xml:space="preserve">$6.65M</w:t>
+              <w:t xml:space="preserve">$6.57M</w:t>
             </w:r>
           </w:p>
         </w:tc>
@@ -2569,7 +2569,7 @@
                 <w:sz w:val="17"/>
                 <w:szCs w:val="17"/>
               </w:rPr>
-              <w:t xml:space="preserve">$1.89M</w:t>
+              <w:t xml:space="preserve">$1.86M</w:t>
             </w:r>
           </w:p>
         </w:tc>
@@ -2602,7 +2602,7 @@
                 <w:sz w:val="17"/>
                 <w:szCs w:val="17"/>
               </w:rPr>
-              <w:t xml:space="preserve">$0.66M</w:t>
+              <w:t xml:space="preserve">$0.65M</w:t>
             </w:r>
           </w:p>
         </w:tc>
@@ -2739,7 +2739,7 @@
                 <w:sz w:val="17"/>
                 <w:szCs w:val="17"/>
               </w:rPr>
-              <w:t xml:space="preserve">$2.01M (0.66)</w:t>
+              <w:t xml:space="preserve">$1.94M (0.66)</w:t>
             </w:r>
           </w:p>
         </w:tc>
@@ -2772,7 +2772,7 @@
                 <w:sz w:val="17"/>
                 <w:szCs w:val="17"/>
               </w:rPr>
-              <w:t xml:space="preserve">0.002</w:t>
+              <w:t xml:space="preserve">0.003</w:t>
             </w:r>
           </w:p>
         </w:tc>
@@ -2805,7 +2805,7 @@
                 <w:sz w:val="17"/>
                 <w:szCs w:val="17"/>
               </w:rPr>
-              <w:t xml:space="preserve">$1.51M</w:t>
+              <w:t xml:space="preserve">$1.45M</w:t>
             </w:r>
           </w:p>
         </w:tc>
@@ -2838,7 +2838,7 @@
                 <w:sz w:val="17"/>
                 <w:szCs w:val="17"/>
               </w:rPr>
-              <w:t xml:space="preserve">$0.43M</w:t>
+              <w:t xml:space="preserve">$0.41M</w:t>
             </w:r>
           </w:p>
         </w:tc>
@@ -2871,7 +2871,7 @@
                 <w:sz w:val="17"/>
                 <w:szCs w:val="17"/>
               </w:rPr>
-              <w:t xml:space="preserve">$0.15M</w:t>
+              <w:t xml:space="preserve">$0.14M</w:t>
             </w:r>
           </w:p>
         </w:tc>
@@ -2932,7 +2932,7 @@
         <w:rPr>
           <w:rFonts w:ascii="Calibri" w:cs="Calibri" w:eastAsia="Calibri" w:hAnsi="Calibri"/>
         </w:rPr>
-        <w:t xml:space="preserve">A prospect keeps most of his draft position's value through D+3 ($17.61 million in D+2 and $15.75 million in D+3) and loses most of it over the next two seasons ($8.89 million in D+4 and $2.01 million from D+5 on). Each estimate is statistically significant at the 1% level; the largest p-value is 0.002, from D+5 on. The value falls sharply after D+3 because of who is left. By D+4, nearly each top pick who will reach the NHL has done so, so the prospects still unproven are mostly later picks and the top picks who missed: of the 110 top-ten picks of 2007-2017, 26 were still prospects in D+3 and 11 in D+4. Among the prospects left, draft position no longer separates the players who will succeed from those who will not.</w:t>
+        <w:t xml:space="preserve">A prospect keeps most of his draft position's value through D+3 ($17.67 million in D+2 and $15.74 million in D+3) and loses most of it over the next two seasons ($8.79 million in D+4 and $1.94 million from D+5 on). Each estimate is statistically significant at the 1% level; the largest p-value is 0.003, from D+5 on. The value falls sharply after D+3 because of who is left. By D+4, nearly each top pick who will reach the NHL has done so, so the prospects still unproven are mostly later picks and the top picks who missed: of the 110 top-ten picks of 2007-2017, 26 were still prospects in D+3 and 11 in D+4. Among the prospects left, draft position no longer separates the players who will succeed from those who will not.</w:t>
       </w:r>
     </w:p>
     <w:p>
@@ -2972,7 +2972,7 @@
         <w:rPr>
           <w:rFonts w:ascii="Calibri" w:cs="Calibri" w:eastAsia="Calibri" w:hAnsi="Calibri"/>
         </w:rPr>
-        <w:t xml:space="preserve">One value for every season, the draft-day value kept for as long as a player remains a prospect (fitted: $14.85 million).</w:t>
+        <w:t xml:space="preserve">One value for every season, the draft-day value kept for as long as a player remains a prospect (fitted: $14.83 million).</w:t>
       </w:r>
     </w:p>
     <w:p>
@@ -2988,7 +2988,7 @@
         <w:rPr>
           <w:rFonts w:ascii="Calibri" w:cs="Calibri" w:eastAsia="Calibri" w:hAnsi="Calibri"/>
         </w:rPr>
-        <w:t xml:space="preserve">A straight-line decline: the star value equals a starting value plus a fixed change for each season since the draft. This is one regression with a single interaction term, star probability × seasons since the draft. Fitted: $18.90 million in D+1, falling $2.89 million a season.</w:t>
+        <w:t xml:space="preserve">A straight-line decline: the star value equals a starting value plus a fixed change for each season since the draft. This is one regression with a single interaction term, star probability × seasons since the draft. Fitted: $18.92 million in D+1, falling $2.91 million a season.</w:t>
       </w:r>
     </w:p>
     <w:p>
@@ -3004,7 +3004,7 @@
         <w:rPr>
           <w:rFonts w:ascii="Calibri" w:cs="Calibri" w:eastAsia="Calibri" w:hAnsi="Calibri"/>
         </w:rPr>
-        <w:t xml:space="preserve">The same percentage decline each season: the value keeps a fixed share of itself each season. Fitted: $19.13 million in D+1, keeping 80.0% each season.</w:t>
+        <w:t xml:space="preserve">The same percentage decline each season: the value keeps a fixed share of itself each season. Fitted: $19.16 million in D+1, keeping 79.9% each season.</w:t>
       </w:r>
     </w:p>
     <w:p>
@@ -3394,7 +3394,7 @@
                 <w:sz w:val="17"/>
                 <w:szCs w:val="17"/>
               </w:rPr>
-              <w:t xml:space="preserve">2.4115</w:t>
+              <w:t xml:space="preserve">2.4116</w:t>
             </w:r>
           </w:p>
         </w:tc>
@@ -3460,7 +3460,7 @@
                 <w:sz w:val="17"/>
                 <w:szCs w:val="17"/>
               </w:rPr>
-              <w:t xml:space="preserve">2.01</w:t>
+              <w:t xml:space="preserve">1.94</w:t>
             </w:r>
           </w:p>
         </w:tc>
@@ -3493,7 +3493,7 @@
                 <w:sz w:val="17"/>
                 <w:szCs w:val="17"/>
               </w:rPr>
-              <w:t xml:space="preserve">58.30</w:t>
+              <w:t xml:space="preserve">57.99</w:t>
             </w:r>
           </w:p>
         </w:tc>
@@ -3597,7 +3597,7 @@
                 <w:sz w:val="17"/>
                 <w:szCs w:val="17"/>
               </w:rPr>
-              <w:t xml:space="preserve">2.4345</w:t>
+              <w:t xml:space="preserve">2.4346</w:t>
             </w:r>
           </w:p>
         </w:tc>
@@ -3663,7 +3663,7 @@
                 <w:sz w:val="17"/>
                 <w:szCs w:val="17"/>
               </w:rPr>
-              <w:t xml:space="preserve">14.85</w:t>
+              <w:t xml:space="preserve">14.83</w:t>
             </w:r>
           </w:p>
         </w:tc>
@@ -3696,7 +3696,7 @@
                 <w:sz w:val="17"/>
                 <w:szCs w:val="17"/>
               </w:rPr>
-              <w:t xml:space="preserve">107.29</w:t>
+              <w:t xml:space="preserve">107.19</w:t>
             </w:r>
           </w:p>
         </w:tc>
@@ -3833,7 +3833,7 @@
                 <w:sz w:val="17"/>
                 <w:szCs w:val="17"/>
               </w:rPr>
-              <w:t xml:space="preserve">0.333</w:t>
+              <w:t xml:space="preserve">0.339</w:t>
             </w:r>
           </w:p>
         </w:tc>
@@ -3866,7 +3866,7 @@
                 <w:sz w:val="17"/>
                 <w:szCs w:val="17"/>
               </w:rPr>
-              <w:t xml:space="preserve">7.36</w:t>
+              <w:t xml:space="preserve">7.30</w:t>
             </w:r>
           </w:p>
         </w:tc>
@@ -3899,7 +3899,7 @@
                 <w:sz w:val="17"/>
                 <w:szCs w:val="17"/>
               </w:rPr>
-              <w:t xml:space="preserve">66.45</w:t>
+              <w:t xml:space="preserve">66.14</w:t>
             </w:r>
           </w:p>
         </w:tc>
@@ -4003,7 +4003,7 @@
                 <w:sz w:val="17"/>
                 <w:szCs w:val="17"/>
               </w:rPr>
-              <w:t xml:space="preserve">2.4145</w:t>
+              <w:t xml:space="preserve">2.4146</w:t>
             </w:r>
           </w:p>
         </w:tc>
@@ -4036,7 +4036,7 @@
                 <w:sz w:val="17"/>
                 <w:szCs w:val="17"/>
               </w:rPr>
-              <w:t xml:space="preserve">0.105</w:t>
+              <w:t xml:space="preserve">0.107</w:t>
             </w:r>
           </w:p>
         </w:tc>
@@ -4069,7 +4069,7 @@
                 <w:sz w:val="17"/>
                 <w:szCs w:val="17"/>
               </w:rPr>
-              <w:t xml:space="preserve">7.84</w:t>
+              <w:t xml:space="preserve">7.80</w:t>
             </w:r>
           </w:p>
         </w:tc>
@@ -4102,7 +4102,7 @@
                 <w:sz w:val="17"/>
                 <w:szCs w:val="17"/>
               </w:rPr>
-              <w:t xml:space="preserve">71.22</w:t>
+              <w:t xml:space="preserve">71.03</w:t>
             </w:r>
           </w:p>
         </w:tc>
@@ -4163,7 +4163,7 @@
         <w:rPr>
           <w:rFonts w:ascii="Calibri" w:cs="Calibri" w:eastAsia="Calibri" w:hAnsi="Calibri"/>
         </w:rPr>
-        <w:t xml:space="preserve">One value for every season predicts worse than a separate value for each season (p &lt; 0.001). The straight-line and same-percentage declines predict about as well (p = 0.333 and 0.105), so the choice does not rest on prediction. I chose a separate value for each season for two reasons. First, it imposes no shape on the decline, and the estimates hold through D+3 and then fall, which matches when top picks reach the NHL (Figure 1). Second, the straight-line decline keeps falling past zero: from D+8 it values a top pick below a late pick, and it values 16 of the 197 traded prospects below zero.</w:t>
+        <w:t xml:space="preserve">One value for every season predicts worse than a separate value for each season (p &lt; 0.001). The straight-line and same-percentage declines predict about as well (p = 0.339 and 0.107), so the choice does not rest on prediction. I chose a separate value for each season for two reasons. First, it imposes no shape on the decline, and the estimates hold through D+3 and then fall, which matches when top picks reach the NHL (Figure 1). Second, the straight-line decline keeps falling past zero: from D+8 it values a top pick below a late pick, and it values 16 of the 197 traded prospects below zero.</w:t>
       </w:r>
     </w:p>
     <w:p>
@@ -4728,7 +4728,7 @@
                 <w:sz w:val="17"/>
                 <w:szCs w:val="17"/>
               </w:rPr>
-              <w:t xml:space="preserve">2.2450</w:t>
+              <w:t xml:space="preserve">2.2451</w:t>
             </w:r>
           </w:p>
         </w:tc>
@@ -4827,7 +4827,7 @@
                 <w:sz w:val="17"/>
                 <w:szCs w:val="17"/>
               </w:rPr>
-              <w:t xml:space="preserve">3.0446</w:t>
+              <w:t xml:space="preserve">3.0448</w:t>
             </w:r>
           </w:p>
         </w:tc>
@@ -4893,7 +4893,7 @@
                 <w:sz w:val="17"/>
                 <w:szCs w:val="17"/>
               </w:rPr>
-              <w:t xml:space="preserve">2.0747</w:t>
+              <w:t xml:space="preserve">2.0746</w:t>
             </w:r>
           </w:p>
         </w:tc>
@@ -5030,7 +5030,7 @@
                 <w:sz w:val="17"/>
                 <w:szCs w:val="17"/>
               </w:rPr>
-              <w:t xml:space="preserve">2.3134</w:t>
+              <w:t xml:space="preserve">2.3133</w:t>
             </w:r>
           </w:p>
         </w:tc>
@@ -5129,7 +5129,7 @@
                 <w:sz w:val="17"/>
                 <w:szCs w:val="17"/>
               </w:rPr>
-              <w:t xml:space="preserve">3.1247</w:t>
+              <w:t xml:space="preserve">3.1245</w:t>
             </w:r>
           </w:p>
         </w:tc>
@@ -5162,7 +5162,7 @@
                 <w:sz w:val="17"/>
                 <w:szCs w:val="17"/>
               </w:rPr>
-              <w:t xml:space="preserve">2.6931</w:t>
+              <w:t xml:space="preserve">2.6930</w:t>
             </w:r>
           </w:p>
         </w:tc>
@@ -5365,7 +5365,7 @@
                 <w:sz w:val="17"/>
                 <w:szCs w:val="17"/>
               </w:rPr>
-              <w:t xml:space="preserve">-0.57%</w:t>
+              <w:t xml:space="preserve">-0.58%</w:t>
             </w:r>
           </w:p>
         </w:tc>
@@ -5431,7 +5431,7 @@
                 <w:sz w:val="17"/>
                 <w:szCs w:val="17"/>
               </w:rPr>
-              <w:t xml:space="preserve">3.0280</w:t>
+              <w:t xml:space="preserve">3.0279</w:t>
             </w:r>
           </w:p>
         </w:tc>
@@ -5464,7 +5464,7 @@
                 <w:sz w:val="17"/>
                 <w:szCs w:val="17"/>
               </w:rPr>
-              <w:t xml:space="preserve">2.6719</w:t>
+              <w:t xml:space="preserve">2.6718</w:t>
             </w:r>
           </w:p>
         </w:tc>
@@ -5563,7 +5563,7 @@
                 <w:sz w:val="17"/>
                 <w:szCs w:val="17"/>
               </w:rPr>
-              <w:t xml:space="preserve">0.028</w:t>
+              <w:t xml:space="preserve">0.025</w:t>
             </w:r>
           </w:p>
         </w:tc>
@@ -5634,7 +5634,7 @@
                 <w:sz w:val="17"/>
                 <w:szCs w:val="17"/>
               </w:rPr>
-              <w:t xml:space="preserve">2.2314</w:t>
+              <w:t xml:space="preserve">2.2313</w:t>
             </w:r>
           </w:p>
         </w:tc>
@@ -5700,7 +5700,7 @@
                 <w:sz w:val="17"/>
                 <w:szCs w:val="17"/>
               </w:rPr>
-              <w:t xml:space="preserve">3.3094</w:t>
+              <w:t xml:space="preserve">3.3093</w:t>
             </w:r>
           </w:p>
         </w:tc>
@@ -5733,7 +5733,7 @@
                 <w:sz w:val="17"/>
                 <w:szCs w:val="17"/>
               </w:rPr>
-              <w:t xml:space="preserve">3.0308</w:t>
+              <w:t xml:space="preserve">3.0307</w:t>
             </w:r>
           </w:p>
         </w:tc>
@@ -5766,7 +5766,7 @@
                 <w:sz w:val="17"/>
                 <w:szCs w:val="17"/>
               </w:rPr>
-              <w:t xml:space="preserve">2.6751</w:t>
+              <w:t xml:space="preserve">2.6749</w:t>
             </w:r>
           </w:p>
         </w:tc>
@@ -5865,7 +5865,7 @@
                 <w:sz w:val="17"/>
                 <w:szCs w:val="17"/>
               </w:rPr>
-              <w:t xml:space="preserve">0.045</w:t>
+              <w:t xml:space="preserve">0.044</w:t>
             </w:r>
           </w:p>
         </w:tc>
@@ -5936,7 +5936,7 @@
                 <w:sz w:val="17"/>
                 <w:szCs w:val="17"/>
               </w:rPr>
-              <w:t xml:space="preserve">2.1970</w:t>
+              <w:t xml:space="preserve">2.1968</w:t>
             </w:r>
           </w:p>
         </w:tc>
@@ -5969,7 +5969,7 @@
                 <w:sz w:val="17"/>
                 <w:szCs w:val="17"/>
               </w:rPr>
-              <w:t xml:space="preserve">-2.14%</w:t>
+              <w:t xml:space="preserve">-2.15%</w:t>
             </w:r>
           </w:p>
         </w:tc>
@@ -6002,7 +6002,7 @@
                 <w:sz w:val="17"/>
                 <w:szCs w:val="17"/>
               </w:rPr>
-              <w:t xml:space="preserve">3.2775</w:t>
+              <w:t xml:space="preserve">3.2774</w:t>
             </w:r>
           </w:p>
         </w:tc>
@@ -6035,7 +6035,7 @@
                 <w:sz w:val="17"/>
                 <w:szCs w:val="17"/>
               </w:rPr>
-              <w:t xml:space="preserve">2.9770</w:t>
+              <w:t xml:space="preserve">2.9765</w:t>
             </w:r>
           </w:p>
         </w:tc>
@@ -6068,7 +6068,7 @@
                 <w:sz w:val="17"/>
                 <w:szCs w:val="17"/>
               </w:rPr>
-              <w:t xml:space="preserve">2.6175</w:t>
+              <w:t xml:space="preserve">2.6170</w:t>
             </w:r>
           </w:p>
         </w:tc>
@@ -6101,7 +6101,7 @@
                 <w:sz w:val="17"/>
                 <w:szCs w:val="17"/>
               </w:rPr>
-              <w:t xml:space="preserve">2.0050</w:t>
+              <w:t xml:space="preserve">2.0048</w:t>
             </w:r>
           </w:p>
         </w:tc>
@@ -6134,7 +6134,7 @@
                 <w:sz w:val="17"/>
                 <w:szCs w:val="17"/>
               </w:rPr>
-              <w:t xml:space="preserve">0.7390</w:t>
+              <w:t xml:space="preserve">0.7389</w:t>
             </w:r>
           </w:p>
         </w:tc>
@@ -6167,7 +6167,7 @@
                 <w:sz w:val="17"/>
                 <w:szCs w:val="17"/>
               </w:rPr>
-              <w:t xml:space="preserve">0.026</w:t>
+              <w:t xml:space="preserve">0.025</w:t>
             </w:r>
           </w:p>
         </w:tc>
@@ -6238,7 +6238,7 @@
                 <w:sz w:val="17"/>
                 <w:szCs w:val="17"/>
               </w:rPr>
-              <w:t xml:space="preserve">2.2637</w:t>
+              <w:t xml:space="preserve">2.2635</w:t>
             </w:r>
           </w:p>
         </w:tc>
@@ -6271,7 +6271,7 @@
                 <w:sz w:val="17"/>
                 <w:szCs w:val="17"/>
               </w:rPr>
-              <w:t xml:space="preserve">+0.83%</w:t>
+              <w:t xml:space="preserve">+0.82%</w:t>
             </w:r>
           </w:p>
         </w:tc>
@@ -6304,7 +6304,7 @@
                 <w:sz w:val="17"/>
                 <w:szCs w:val="17"/>
               </w:rPr>
-              <w:t xml:space="preserve">3.4548</w:t>
+              <w:t xml:space="preserve">3.4549</w:t>
             </w:r>
           </w:p>
         </w:tc>
@@ -6337,7 +6337,7 @@
                 <w:sz w:val="17"/>
                 <w:szCs w:val="17"/>
               </w:rPr>
-              <w:t xml:space="preserve">3.0708</w:t>
+              <w:t xml:space="preserve">3.0703</w:t>
             </w:r>
           </w:p>
         </w:tc>
@@ -6370,7 +6370,7 @@
                 <w:sz w:val="17"/>
                 <w:szCs w:val="17"/>
               </w:rPr>
-              <w:t xml:space="preserve">2.6457</w:t>
+              <w:t xml:space="preserve">2.6453</w:t>
             </w:r>
           </w:p>
         </w:tc>
@@ -6403,7 +6403,7 @@
                 <w:sz w:val="17"/>
                 <w:szCs w:val="17"/>
               </w:rPr>
-              <w:t xml:space="preserve">2.0017</w:t>
+              <w:t xml:space="preserve">2.0015</w:t>
             </w:r>
           </w:p>
         </w:tc>
@@ -6469,7 +6469,7 @@
                 <w:sz w:val="17"/>
                 <w:szCs w:val="17"/>
               </w:rPr>
-              <w:t xml:space="preserve">0.691</w:t>
+              <w:t xml:space="preserve">0.692</w:t>
             </w:r>
           </w:p>
         </w:tc>
@@ -6540,7 +6540,7 @@
                 <w:sz w:val="17"/>
                 <w:szCs w:val="17"/>
               </w:rPr>
-              <w:t xml:space="preserve">2.1966</w:t>
+              <w:t xml:space="preserve">2.1964</w:t>
             </w:r>
           </w:p>
         </w:tc>
@@ -6573,7 +6573,7 @@
                 <w:sz w:val="17"/>
                 <w:szCs w:val="17"/>
               </w:rPr>
-              <w:t xml:space="preserve">-2.16%</w:t>
+              <w:t xml:space="preserve">-2.17%</w:t>
             </w:r>
           </w:p>
         </w:tc>
@@ -6606,7 +6606,7 @@
                 <w:sz w:val="17"/>
                 <w:szCs w:val="17"/>
               </w:rPr>
-              <w:t xml:space="preserve">3.2775</w:t>
+              <w:t xml:space="preserve">3.2774</w:t>
             </w:r>
           </w:p>
         </w:tc>
@@ -6639,7 +6639,7 @@
                 <w:sz w:val="17"/>
                 <w:szCs w:val="17"/>
               </w:rPr>
-              <w:t xml:space="preserve">2.9770</w:t>
+              <w:t xml:space="preserve">2.9765</w:t>
             </w:r>
           </w:p>
         </w:tc>
@@ -6672,7 +6672,7 @@
                 <w:sz w:val="17"/>
                 <w:szCs w:val="17"/>
               </w:rPr>
-              <w:t xml:space="preserve">2.6175</w:t>
+              <w:t xml:space="preserve">2.6170</w:t>
             </w:r>
           </w:p>
         </w:tc>
@@ -6705,7 +6705,7 @@
                 <w:sz w:val="17"/>
                 <w:szCs w:val="17"/>
               </w:rPr>
-              <w:t xml:space="preserve">2.0017</w:t>
+              <w:t xml:space="preserve">2.0015</w:t>
             </w:r>
           </w:p>
         </w:tc>
@@ -6771,7 +6771,7 @@
                 <w:sz w:val="17"/>
                 <w:szCs w:val="17"/>
               </w:rPr>
-              <w:t xml:space="preserve">0.025</w:t>
+              <w:t xml:space="preserve">0.024</w:t>
             </w:r>
           </w:p>
         </w:tc>
@@ -6812,7 +6812,7 @@
         <w:rPr>
           <w:rFonts w:ascii="Calibri" w:cs="Calibri" w:eastAsia="Calibri" w:hAnsi="Calibri"/>
         </w:rPr>
-        <w:t xml:space="preserve">Linear production alone predicts worse than draft position alone (+3.04% in held-out error; one-sided p = 0.995), so production does not replace draft position at the draft. Added to draft position, production lowers the error in each season, and the improvement is statistically significant at the 5% level both for linear production (p = 0.028) and for linear and squared production (p = 0.026). Undrafted prospects, who have no draft position, use the adopted model with the star probability set to zero (Section 4).</w:t>
+        <w:t xml:space="preserve">Linear production alone predicts worse than draft position alone (+3.04% in held-out error; one-sided p = 0.995), so production does not replace draft position at the draft. Added to draft position, production lowers the error in each season, and the improvement is statistically significant at the 5% level both for linear production (p = 0.025) and for linear and squared production (p = 0.025). Undrafted prospects, who have no draft position, use the adopted model with the star probability set to zero (Section 4).</w:t>
       </w:r>
     </w:p>
     <w:p>
@@ -6847,7 +6847,7 @@
         <w:rPr>
           <w:rFonts w:ascii="Calibri" w:cs="Calibri" w:eastAsia="Calibri" w:hAnsi="Calibri"/>
         </w:rPr>
-        <w:t xml:space="preserve">Linear and squared production has the lower held-out error in each season (Table 4) and improves on draft position alone by 2.14%, against 0.57% for linear production. Compared directly with linear production, adding the squared term is better with one-sided p = 0.042 with draft position in each season, and p = 0.024 in the adopted model with age (Table 5). The production squared term is statistically significant in each season from D+1 to D+4 of the adopted model (p &lt; 0.001, Table 9). Most of the uncertainty comes from the 2007 draft. Elite Prospects scoring and the NHLe factors begin in 2006-07, so a 2007 draftee's D+1 production rests on his draft season alone, against up to three seasons for later drafts. Without the 2007 draft, linear and squared production beats linear production with p &lt; 0.001.</w:t>
+        <w:t xml:space="preserve">Linear and squared production has the lower held-out error in each season (Table 4) and improves on draft position alone by 2.15%, against 0.58% for linear production. Compared directly with linear production, adding the squared term is better with one-sided p = 0.037 with draft position in each season, and p = 0.022 in the adopted model with age (Table 5). The production squared term is statistically significant in each season from D+1 to D+4 of the adopted model (p &lt; 0.001, Table 9). Most of the uncertainty comes from the 2007 draft. Elite Prospects scoring and the NHLe factors begin in 2006-07, so a 2007 draftee's D+1 production rests on his draft season alone, against up to three seasons for later drafts. Without the 2007 draft, linear and squared production beats linear production with p &lt; 0.001.</w:t>
       </w:r>
     </w:p>
     <w:p>
@@ -7400,7 +7400,7 @@
                 <w:sz w:val="17"/>
                 <w:szCs w:val="17"/>
               </w:rPr>
-              <w:t xml:space="preserve">2.6592</w:t>
+              <w:t xml:space="preserve">2.6591</w:t>
             </w:r>
           </w:p>
         </w:tc>
@@ -7433,7 +7433,7 @@
                 <w:sz w:val="17"/>
                 <w:szCs w:val="17"/>
               </w:rPr>
-              <w:t xml:space="preserve">2.0325</w:t>
+              <w:t xml:space="preserve">2.0326</w:t>
             </w:r>
           </w:p>
         </w:tc>
@@ -7565,7 +7565,7 @@
                 <w:sz w:val="17"/>
                 <w:szCs w:val="17"/>
               </w:rPr>
-              <w:t xml:space="preserve">79.25</w:t>
+              <w:t xml:space="preserve">78.71</w:t>
             </w:r>
           </w:p>
         </w:tc>
@@ -7636,7 +7636,7 @@
                 <w:sz w:val="17"/>
                 <w:szCs w:val="17"/>
               </w:rPr>
-              <w:t xml:space="preserve">2.1803</w:t>
+              <w:t xml:space="preserve">2.1801</w:t>
             </w:r>
           </w:p>
         </w:tc>
@@ -7669,7 +7669,7 @@
                 <w:sz w:val="17"/>
                 <w:szCs w:val="17"/>
               </w:rPr>
-              <w:t xml:space="preserve">3.2579</w:t>
+              <w:t xml:space="preserve">3.2580</w:t>
             </w:r>
           </w:p>
         </w:tc>
@@ -7702,7 +7702,7 @@
                 <w:sz w:val="17"/>
                 <w:szCs w:val="17"/>
               </w:rPr>
-              <w:t xml:space="preserve">2.9492</w:t>
+              <w:t xml:space="preserve">2.9489</w:t>
             </w:r>
           </w:p>
         </w:tc>
@@ -7735,7 +7735,7 @@
                 <w:sz w:val="17"/>
                 <w:szCs w:val="17"/>
               </w:rPr>
-              <w:t xml:space="preserve">2.5906</w:t>
+              <w:t xml:space="preserve">2.5902</w:t>
             </w:r>
           </w:p>
         </w:tc>
@@ -7768,7 +7768,7 @@
                 <w:sz w:val="17"/>
                 <w:szCs w:val="17"/>
               </w:rPr>
-              <w:t xml:space="preserve">1.9913</w:t>
+              <w:t xml:space="preserve">1.9910</w:t>
             </w:r>
           </w:p>
         </w:tc>
@@ -7834,7 +7834,7 @@
                 <w:sz w:val="17"/>
                 <w:szCs w:val="17"/>
               </w:rPr>
-              <w:t xml:space="preserve">0.010</w:t>
+              <w:t xml:space="preserve">0.0080</w:t>
             </w:r>
           </w:p>
         </w:tc>
@@ -7867,7 +7867,7 @@
                 <w:sz w:val="17"/>
                 <w:szCs w:val="17"/>
               </w:rPr>
-              <w:t xml:space="preserve">vs linear 0.024</w:t>
+              <w:t xml:space="preserve">vs linear 0.022</w:t>
             </w:r>
           </w:p>
         </w:tc>
@@ -7900,7 +7900,7 @@
                 <w:sz w:val="17"/>
                 <w:szCs w:val="17"/>
               </w:rPr>
-              <w:t xml:space="preserve">70.39</w:t>
+              <w:t xml:space="preserve">69.82</w:t>
             </w:r>
           </w:p>
         </w:tc>
@@ -7971,7 +7971,7 @@
                 <w:sz w:val="17"/>
                 <w:szCs w:val="17"/>
               </w:rPr>
-              <w:t xml:space="preserve">2.1819</w:t>
+              <w:t xml:space="preserve">2.1818</w:t>
             </w:r>
           </w:p>
         </w:tc>
@@ -8037,7 +8037,7 @@
                 <w:sz w:val="17"/>
                 <w:szCs w:val="17"/>
               </w:rPr>
-              <w:t xml:space="preserve">2.9517</w:t>
+              <w:t xml:space="preserve">2.9514</w:t>
             </w:r>
           </w:p>
         </w:tc>
@@ -8070,7 +8070,7 @@
                 <w:sz w:val="17"/>
                 <w:szCs w:val="17"/>
               </w:rPr>
-              <w:t xml:space="preserve">2.5947</w:t>
+              <w:t xml:space="preserve">2.5944</w:t>
             </w:r>
           </w:p>
         </w:tc>
@@ -8169,7 +8169,7 @@
                 <w:sz w:val="17"/>
                 <w:szCs w:val="17"/>
               </w:rPr>
-              <w:t xml:space="preserve">0.0040</w:t>
+              <w:t xml:space="preserve">0.0020</w:t>
             </w:r>
           </w:p>
         </w:tc>
@@ -8202,7 +8202,7 @@
                 <w:sz w:val="17"/>
                 <w:szCs w:val="17"/>
               </w:rPr>
-              <w:t xml:space="preserve">vs linear and squared 0.645</w:t>
+              <w:t xml:space="preserve">vs linear and squared 0.655</w:t>
             </w:r>
           </w:p>
         </w:tc>
@@ -8235,7 +8235,7 @@
                 <w:sz w:val="17"/>
                 <w:szCs w:val="17"/>
               </w:rPr>
-              <w:t xml:space="preserve">82.11</w:t>
+              <w:t xml:space="preserve">81.36</w:t>
             </w:r>
           </w:p>
         </w:tc>
@@ -8263,7 +8263,7 @@
         <w:rPr>
           <w:rFonts w:ascii="Calibri" w:cs="Calibri" w:eastAsia="Calibri" w:hAnsi="Calibri"/>
         </w:rPr>
-        <w:t xml:space="preserve">Production squared alone, without the linear production term, predicts about as well as the regression with both the linear and the squared production terms (held-out error 2.1819 against 2.1803; the regression with both terms is better with one-sided p = 0.355, which is not statistically significant). It was not adopted because it would raise the 197 traded prospects' value from $70.39 million to $82.11 million without predicting better.</w:t>
+        <w:t xml:space="preserve">Production squared alone, without the linear production term, predicts about as well as the regression with both the linear and the squared production terms (held-out error 2.1818 against 2.1801; the regression with both terms is better with one-sided p = 0.344, which is not statistically significant). It was not adopted because it would raise the 197 traded prospects' value from $69.82 million to $81.36 million without predicting better.</w:t>
       </w:r>
     </w:p>
     <w:p>
@@ -8350,7 +8350,7 @@
         <w:rPr>
           <w:rFonts w:ascii="Calibri" w:cs="Calibri" w:eastAsia="Calibri" w:hAnsi="Calibri"/>
         </w:rPr>
-        <w:t xml:space="preserve">Up to 12.6 points (above the 75th percentile), the line with the squared term sits below the linear one, by at most $0.56 million, and it dips slightly before it rises. The dip comes from the negative linear coefficient, which, with the squared term in the model, is not the value of an extra point: in D+2 an extra point adds -0.112 + 2 × 0.0133 × production million dollars, which is positive above 4.2 points, below the 25th percentile of 4.6. The negative coefficient sets where the value bottoms out; it is not evidence that a little scoring lowers a prospect's value.</w:t>
+        <w:t xml:space="preserve">Up to 12.6 points (above the 75th percentile), the line with the squared term sits below the linear one, by at most $0.56 million, and it dips slightly before it rises. The dip comes from the negative linear coefficient, which, with the squared term in the model, is not the value of an extra point: in D+2 an extra point adds -0.111 + 2 × 0.0131 × production million dollars, which is positive above 4.2 points, below the 25th percentile of 4.6. The negative coefficient sets where the value bottoms out; it is not evidence that a little scoring lowers a prospect's value.</w:t>
       </w:r>
     </w:p>
     <w:p>
@@ -8374,7 +8374,7 @@
         <w:rPr>
           <w:rFonts w:ascii="Calibri" w:cs="Calibri" w:eastAsia="Calibri" w:hAnsi="Calibri"/>
         </w:rPr>
-        <w:t xml:space="preserve">Once production is in the model, draft position stops carrying information in D+4 (Table 6). Its coefficient is $0.94 million (standard error 1.86, p = 0.613) in D+4 and -$0.76 million (standard error 0.35, p = 0.028) from D+5 on. A negative weight on draft position would value a top pick below a later pick with the same production, which makes no logical sense. The adopted model keeps draft position from D+1 to D+3 and uses production alone from D+4. This drops one parameter in each later season at no cost: the held-out error is 2.1966 against 2.1970 with draft position kept throughout.</w:t>
+        <w:t xml:space="preserve">Once production is in the model, draft position stops carrying information in D+4 (Table 6). Its coefficient is $0.86 million (standard error 1.88, p = 0.645) in D+4 and -$0.82 million (standard error 0.33, p = 0.014) from D+5 on. A negative weight on draft position would value a top pick below a later pick with the same production, which makes no logical sense. The adopted model keeps draft position from D+1 to D+3 and uses production alone from D+4. This drops one parameter in each later season at no cost: the held-out error is 2.1964 against 2.1968 with draft position kept throughout.</w:t>
       </w:r>
     </w:p>
     <w:p>
@@ -8688,7 +8688,7 @@
                 <w:sz w:val="17"/>
                 <w:szCs w:val="17"/>
               </w:rPr>
-              <w:t xml:space="preserve">13.273 (1.790) [&lt;0.001]</w:t>
+              <w:t xml:space="preserve">13.399 (1.824) [&lt;0.001]</w:t>
             </w:r>
           </w:p>
         </w:tc>
@@ -8721,7 +8721,7 @@
                 <w:sz w:val="17"/>
                 <w:szCs w:val="17"/>
               </w:rPr>
-              <w:t xml:space="preserve">12.357 (2.210) [&lt;0.001]</w:t>
+              <w:t xml:space="preserve">12.545 (2.236) [&lt;0.001]</w:t>
             </w:r>
           </w:p>
         </w:tc>
@@ -8754,7 +8754,7 @@
                 <w:sz w:val="17"/>
                 <w:szCs w:val="17"/>
               </w:rPr>
-              <w:t xml:space="preserve">9.905 (3.017) [0.001]</w:t>
+              <w:t xml:space="preserve">9.994 (3.046) [0.001]</w:t>
             </w:r>
           </w:p>
         </w:tc>
@@ -8787,7 +8787,7 @@
                 <w:sz w:val="17"/>
                 <w:szCs w:val="17"/>
               </w:rPr>
-              <w:t xml:space="preserve">0.941 (1.858) [0.613]</w:t>
+              <w:t xml:space="preserve">0.864 (1.877) [0.645]</w:t>
             </w:r>
           </w:p>
         </w:tc>
@@ -8820,7 +8820,7 @@
                 <w:sz w:val="17"/>
                 <w:szCs w:val="17"/>
               </w:rPr>
-              <w:t xml:space="preserve">-0.761 (0.347) [0.028]</w:t>
+              <w:t xml:space="preserve">-0.824 (0.334) [0.014]</w:t>
             </w:r>
           </w:p>
         </w:tc>
@@ -8891,7 +8891,7 @@
                 <w:sz w:val="17"/>
                 <w:szCs w:val="17"/>
               </w:rPr>
-              <w:t xml:space="preserve">-0.131 (0.050) [0.009]</w:t>
+              <w:t xml:space="preserve">-0.127 (0.050) [0.011]</w:t>
             </w:r>
           </w:p>
         </w:tc>
@@ -8924,7 +8924,7 @@
                 <w:sz w:val="17"/>
                 <w:szCs w:val="17"/>
               </w:rPr>
-              <w:t xml:space="preserve">-0.112 (0.034) [0.001]</w:t>
+              <w:t xml:space="preserve">-0.111 (0.035) [0.001]</w:t>
             </w:r>
           </w:p>
         </w:tc>
@@ -8957,7 +8957,7 @@
                 <w:sz w:val="17"/>
                 <w:szCs w:val="17"/>
               </w:rPr>
-              <w:t xml:space="preserve">-0.095 (0.027) [&lt;0.001]</w:t>
+              <w:t xml:space="preserve">-0.094 (0.027) [&lt;0.001]</w:t>
             </w:r>
           </w:p>
         </w:tc>
@@ -8990,7 +8990,7 @@
                 <w:sz w:val="17"/>
                 <w:szCs w:val="17"/>
               </w:rPr>
-              <w:t xml:space="preserve">-0.055 (0.022) [0.012]</w:t>
+              <w:t xml:space="preserve">-0.054 (0.022) [0.014]</w:t>
             </w:r>
           </w:p>
         </w:tc>
@@ -9023,7 +9023,7 @@
                 <w:sz w:val="17"/>
                 <w:szCs w:val="17"/>
               </w:rPr>
-              <w:t xml:space="preserve">-0.013 (0.009) [0.153]</w:t>
+              <w:t xml:space="preserve">-0.013 (0.009) [0.170]</w:t>
             </w:r>
           </w:p>
         </w:tc>
@@ -9094,7 +9094,7 @@
                 <w:sz w:val="17"/>
                 <w:szCs w:val="17"/>
               </w:rPr>
-              <w:t xml:space="preserve">0.0185 (0.0051) [&lt;0.001]</w:t>
+              <w:t xml:space="preserve">0.0180 (0.0051) [&lt;0.001]</w:t>
             </w:r>
           </w:p>
         </w:tc>
@@ -9127,7 +9127,7 @@
                 <w:sz w:val="17"/>
                 <w:szCs w:val="17"/>
               </w:rPr>
-              <w:t xml:space="preserve">0.0133 (0.0030) [&lt;0.001]</w:t>
+              <w:t xml:space="preserve">0.0131 (0.0031) [&lt;0.001]</w:t>
             </w:r>
           </w:p>
         </w:tc>
@@ -9160,7 +9160,7 @@
                 <w:sz w:val="17"/>
                 <w:szCs w:val="17"/>
               </w:rPr>
-              <w:t xml:space="preserve">0.0091 (0.0021) [&lt;0.001]</w:t>
+              <w:t xml:space="preserve">0.0090 (0.0021) [&lt;0.001]</w:t>
             </w:r>
           </w:p>
         </w:tc>
@@ -9193,7 +9193,7 @@
                 <w:sz w:val="17"/>
                 <w:szCs w:val="17"/>
               </w:rPr>
-              <w:t xml:space="preserve">0.0057 (0.0016) [&lt;0.001]</w:t>
+              <w:t xml:space="preserve">0.0056 (0.0016) [&lt;0.001]</w:t>
             </w:r>
           </w:p>
         </w:tc>
@@ -9226,7 +9226,7 @@
                 <w:sz w:val="17"/>
                 <w:szCs w:val="17"/>
               </w:rPr>
-              <w:t xml:space="preserve">0.0011 (0.0006) [0.071]</w:t>
+              <w:t xml:space="preserve">0.0011 (0.0006) [0.079]</w:t>
             </w:r>
           </w:p>
         </w:tc>
@@ -9297,7 +9297,7 @@
                 <w:sz w:val="17"/>
                 <w:szCs w:val="17"/>
               </w:rPr>
-              <w:t xml:space="preserve">-0.186 (0.117) [0.114]</w:t>
+              <w:t xml:space="preserve">-0.261 (0.111) [0.018]</w:t>
             </w:r>
           </w:p>
         </w:tc>
@@ -9330,7 +9330,7 @@
                 <w:sz w:val="17"/>
                 <w:szCs w:val="17"/>
               </w:rPr>
-              <w:t xml:space="preserve">-0.181 (0.116) [0.118]</w:t>
+              <w:t xml:space="preserve">-0.166 (0.071) [0.019]</w:t>
             </w:r>
           </w:p>
         </w:tc>
@@ -9363,7 +9363,7 @@
                 <w:sz w:val="17"/>
                 <w:szCs w:val="17"/>
               </w:rPr>
-              <w:t xml:space="preserve">0.154 (0.157) [0.329]</w:t>
+              <w:t xml:space="preserve">-0.051 (0.015) [0.001]</w:t>
             </w:r>
           </w:p>
         </w:tc>
@@ -9396,7 +9396,7 @@
                 <w:sz w:val="17"/>
                 <w:szCs w:val="17"/>
               </w:rPr>
-              <w:t xml:space="preserve">-0.026 (0.092) [0.781]</w:t>
+              <w:t xml:space="preserve">-0.010 (0.023) [0.650]</w:t>
             </w:r>
           </w:p>
         </w:tc>
@@ -9429,7 +9429,7 @@
                 <w:sz w:val="17"/>
                 <w:szCs w:val="17"/>
               </w:rPr>
-              <w:t xml:space="preserve">0.012 (0.007) [0.100]</w:t>
+              <w:t xml:space="preserve">0.012 (0.005) [0.014]</w:t>
             </w:r>
           </w:p>
         </w:tc>
@@ -9446,7 +9446,7 @@
           <w:sz w:val="18"/>
           <w:szCs w:val="18"/>
         </w:rPr>
-        <w:t xml:space="preserve">Dependent variable: remaining surplus in millions of dollars at the 2025-26 cap. Each cell gives the coefficient, its standard error clustered by player in parentheses and its two-sided p-value in brackets. The table is one regression with the full set of interaction terms: each column holds that season's coefficients. Each draft's level is allowed for (not shown), so the coefficients describe an average draft. Draft position's coefficient is statistically significant at the 5% level from D+1 to D+3, not in D+4, and negative and statistically significant from D+5 on (the paragraph before this table). From D+5 on, neither production term is statistically significant at the 5% level on its own.</w:t>
+        <w:t xml:space="preserve">Dependent variable: remaining surplus in millions of dollars at the 2025-26 cap. Each cell gives the coefficient, its standard error clustered by player in parentheses and its two-sided p-value in brackets. The table is one regression with the full set of interaction terms: each column holds that season's coefficients. Draft position's coefficient is statistically significant at the 5% level from D+1 to D+3, not in D+4, and negative and statistically significant from D+5 on (the paragraph before this table). From D+5 on, neither production term is statistically significant at the 5% level on its own.</w:t>
       </w:r>
     </w:p>
     <w:p>
@@ -9470,7 +9470,7 @@
         <w:rPr>
           <w:rFonts w:ascii="Calibri" w:cs="Calibri" w:eastAsia="Calibri" w:hAnsi="Calibri"/>
         </w:rPr>
-        <w:t xml:space="preserve">A separate production rate for defencemen was tested. It changes the held-out error by -0.03% against linear production with one rate, and its improvement over draft position alone is less consistent across drafts (one-sided p = 0.045 against 0.028). One rate is kept.</w:t>
+        <w:t xml:space="preserve">A separate production rate for defencemen was tested. It changes the held-out error by -0.04% against linear production with one rate, and its improvement over draft position alone is less consistent across drafts (one-sided p = 0.044 against 0.025). One rate is kept.</w:t>
       </w:r>
     </w:p>
     <w:p>
@@ -10423,7 +10423,7 @@
         <w:rPr>
           <w:rFonts w:ascii="Calibri" w:cs="Calibri" w:eastAsia="Calibri" w:hAnsi="Calibri"/>
         </w:rPr>
-        <w:t xml:space="preserve">Each setting is applied identically to each candidate in Table 4. The no-record indicator is not statistically significant in any season (p from 0.206 to 0.933, Table 9); it is kept so that a missing record does not move a prospect's value.</w:t>
+        <w:t xml:space="preserve">Each setting is applied identically to each candidate in Table 4. The no-record indicator gives a prospect without a record what such prospects went on to deliver in his season. It is not statistically significant at the 5% level in D+1 or D+2 (p = 0.054 and 0.083, Table 9), and in D+3 it rests on a single prospect-season. From D+4 on it is exactly zero, with no p-value, because none of the 414 prospect-seasons without a record in those seasons delivered any surplus. It is kept so that missing data is not read as zero scoring.</w:t>
       </w:r>
     </w:p>
     <w:p>
@@ -10737,7 +10737,7 @@
                 <w:sz w:val="17"/>
                 <w:szCs w:val="17"/>
               </w:rPr>
-              <w:t xml:space="preserve">2.1966</w:t>
+              <w:t xml:space="preserve">2.1964</w:t>
             </w:r>
           </w:p>
         </w:tc>
@@ -10803,7 +10803,7 @@
                 <w:sz w:val="17"/>
                 <w:szCs w:val="17"/>
               </w:rPr>
-              <w:t xml:space="preserve">-2.16%</w:t>
+              <w:t xml:space="preserve">-2.17%</w:t>
             </w:r>
           </w:p>
         </w:tc>
@@ -10907,7 +10907,7 @@
                 <w:sz w:val="17"/>
                 <w:szCs w:val="17"/>
               </w:rPr>
-              <w:t xml:space="preserve">2.1903</w:t>
+              <w:t xml:space="preserve">2.1901</w:t>
             </w:r>
           </w:p>
         </w:tc>
@@ -10973,7 +10973,7 @@
                 <w:sz w:val="17"/>
                 <w:szCs w:val="17"/>
               </w:rPr>
-              <w:t xml:space="preserve">-2.44%</w:t>
+              <w:t xml:space="preserve">-2.45%</w:t>
             </w:r>
           </w:p>
         </w:tc>
@@ -11006,7 +11006,7 @@
                 <w:sz w:val="17"/>
                 <w:szCs w:val="17"/>
               </w:rPr>
-              <w:t xml:space="preserve">0.0060</w:t>
+              <w:t xml:space="preserve">0.0055</w:t>
             </w:r>
           </w:p>
         </w:tc>
@@ -11077,7 +11077,7 @@
                 <w:sz w:val="17"/>
                 <w:szCs w:val="17"/>
               </w:rPr>
-              <w:t xml:space="preserve">2.1804</w:t>
+              <w:t xml:space="preserve">2.1802</w:t>
             </w:r>
           </w:p>
         </w:tc>
@@ -11143,7 +11143,7 @@
                 <w:sz w:val="17"/>
                 <w:szCs w:val="17"/>
               </w:rPr>
-              <w:t xml:space="preserve">-2.88%</w:t>
+              <w:t xml:space="preserve">-2.89%</w:t>
             </w:r>
           </w:p>
         </w:tc>
@@ -11247,7 +11247,7 @@
                 <w:sz w:val="17"/>
                 <w:szCs w:val="17"/>
               </w:rPr>
-              <w:t xml:space="preserve">2.1814</w:t>
+              <w:t xml:space="preserve">2.1812</w:t>
             </w:r>
           </w:p>
         </w:tc>
@@ -11313,7 +11313,7 @@
                 <w:sz w:val="17"/>
                 <w:szCs w:val="17"/>
               </w:rPr>
-              <w:t xml:space="preserve">-2.83%</w:t>
+              <w:t xml:space="preserve">-2.84%</w:t>
             </w:r>
           </w:p>
         </w:tc>
@@ -11346,7 +11346,7 @@
                 <w:sz w:val="17"/>
                 <w:szCs w:val="17"/>
               </w:rPr>
-              <w:t xml:space="preserve">0.025</w:t>
+              <w:t xml:space="preserve">0.021</w:t>
             </w:r>
           </w:p>
         </w:tc>
@@ -11417,7 +11417,7 @@
                 <w:sz w:val="17"/>
                 <w:szCs w:val="17"/>
               </w:rPr>
-              <w:t xml:space="preserve">2.1803</w:t>
+              <w:t xml:space="preserve">2.1801</w:t>
             </w:r>
           </w:p>
         </w:tc>
@@ -11483,7 +11483,7 @@
                 <w:sz w:val="17"/>
                 <w:szCs w:val="17"/>
               </w:rPr>
-              <w:t xml:space="preserve">-2.88%</w:t>
+              <w:t xml:space="preserve">-2.89%</w:t>
             </w:r>
           </w:p>
         </w:tc>
@@ -11533,7 +11533,7 @@
           <w:sz w:val="18"/>
           <w:szCs w:val="18"/>
         </w:rPr>
-        <w:t xml:space="preserve">Held-out error as in Table 4. Each candidate keeps the adopted model of Section 2 (draft position in D+1 to D+3, linear and squared production, the no-record indicator) and adds the age term shown; its one-sided p-value compares it with that model. With both terms, the comparison against the age discount alone gives p = 0.608.</w:t>
+        <w:t xml:space="preserve">Held-out error as in Table 4. Each candidate keeps the adopted model of Section 2 (draft position in D+1 to D+3, linear and squared production, the no-record indicator) and adds the age term shown; its one-sided p-value compares it with that model. With both terms, the comparison against the age discount alone gives p = 0.605.</w:t>
       </w:r>
     </w:p>
     <w:p>
@@ -11557,7 +11557,7 @@
         <w:rPr>
           <w:rFonts w:ascii="Calibri" w:cs="Calibri" w:eastAsia="Calibri" w:hAnsi="Calibri"/>
         </w:rPr>
-        <w:t xml:space="preserve">Two forms were tested. Age as a flat amount subtracts the same dollars for each year of age, whatever the player scores. Age discounting production makes each point of production worth less the older the player was when he scored it: each year of age lowers the value of each point by a fixed amount. In D+2 that amount is $0.064 million (Table 9), so of two prospects with 10 points, the one who is a year older, and so scored them a year older, is worth $0.64 million less. Both forms are statistically significant improvements (one-sided p = 0.006 and 0.0015), and the discount improves held-out error more (-0.74% against -0.29%). I chose the discount because it is the larger gain and it measures what age was included for, which is how much a player's scoring says about him given his age. Using both terms is worse than the discount alone (-0.69% against -0.74%; p = 0.608 that it is better). The flat term also changes sign once the discount is in (Table B5), which shows the two terms measure the same thing.</w:t>
+        <w:t xml:space="preserve">Two forms were tested. Age as a flat amount subtracts the same dollars for each year of age, whatever the player scores. Age discounting production makes each point of production worth less the older the player was when he scored it: each year of age lowers the value of each point by a fixed amount. In D+2 that amount is $0.063 million (Table 9), so of two prospects with 10 points, the one who is a year older, and so scored them a year older, is worth $0.63 million less. Both forms are statistically significant improvements (one-sided p = 0.005 and 0.0015), and the discount improves held-out error more (-0.74% against -0.29%). I chose the discount because it is the larger gain and it measures what age was included for, which is how much a player's scoring says about him given his age. Using both terms is worse than the discount alone (-0.69% against -0.74%; p = 0.605 that it is better). The flat term also changes sign once the discount is in (Table B5), which shows the two terms measure the same thing.</w:t>
       </w:r>
     </w:p>
     <w:p>
@@ -12074,7 +12074,7 @@
                 <w:sz w:val="17"/>
                 <w:szCs w:val="17"/>
               </w:rPr>
-              <w:t xml:space="preserve">11.163 (1.991) [&lt;0.001]</w:t>
+              <w:t xml:space="preserve">11.350 (2.030) [&lt;0.001]</w:t>
             </w:r>
           </w:p>
         </w:tc>
@@ -12107,7 +12107,7 @@
                 <w:sz w:val="17"/>
                 <w:szCs w:val="17"/>
               </w:rPr>
-              <w:t xml:space="preserve">9.799 (2.443) [&lt;0.001]</w:t>
+              <w:t xml:space="preserve">10.029 (2.469) [&lt;0.001]</w:t>
             </w:r>
           </w:p>
         </w:tc>
@@ -12140,7 +12140,7 @@
                 <w:sz w:val="17"/>
                 <w:szCs w:val="17"/>
               </w:rPr>
-              <w:t xml:space="preserve">7.394 (3.315) [0.026]</w:t>
+              <w:t xml:space="preserve">7.525 (3.341) [0.024]</w:t>
             </w:r>
           </w:p>
         </w:tc>
@@ -12277,7 +12277,7 @@
                 <w:sz w:val="17"/>
                 <w:szCs w:val="17"/>
               </w:rPr>
-              <w:t xml:space="preserve">-0.079 (0.047) [0.091]</w:t>
+              <w:t xml:space="preserve">-0.076 (0.047) [0.109]</w:t>
             </w:r>
           </w:p>
         </w:tc>
@@ -12310,7 +12310,7 @@
                 <w:sz w:val="17"/>
                 <w:szCs w:val="17"/>
               </w:rPr>
-              <w:t xml:space="preserve">-0.001 (0.035) [0.972]</w:t>
+              <w:t xml:space="preserve">-0.002 (0.036) [0.958]</w:t>
             </w:r>
           </w:p>
         </w:tc>
@@ -12343,7 +12343,7 @@
                 <w:sz w:val="17"/>
                 <w:szCs w:val="17"/>
               </w:rPr>
-              <w:t xml:space="preserve">0.043 (0.039) [0.264]</w:t>
+              <w:t xml:space="preserve">0.043 (0.038) [0.262]</w:t>
             </w:r>
           </w:p>
         </w:tc>
@@ -12376,7 +12376,7 @@
                 <w:sz w:val="17"/>
                 <w:szCs w:val="17"/>
               </w:rPr>
-              <w:t xml:space="preserve">0.044 (0.029) [0.133]</w:t>
+              <w:t xml:space="preserve">0.045 (0.029) [0.119]</w:t>
             </w:r>
           </w:p>
         </w:tc>
@@ -12409,7 +12409,7 @@
                 <w:sz w:val="17"/>
                 <w:szCs w:val="17"/>
               </w:rPr>
-              <w:t xml:space="preserve">-0.016 (0.009) [0.082]</w:t>
+              <w:t xml:space="preserve">-0.016 (0.009) [0.091]</w:t>
             </w:r>
           </w:p>
         </w:tc>
@@ -12480,7 +12480,7 @@
                 <w:sz w:val="17"/>
                 <w:szCs w:val="17"/>
               </w:rPr>
-              <w:t xml:space="preserve">0.0223 (0.0056) [&lt;0.001]</w:t>
+              <w:t xml:space="preserve">0.0216 (0.0057) [&lt;0.001]</w:t>
             </w:r>
           </w:p>
         </w:tc>
@@ -12513,7 +12513,7 @@
                 <w:sz w:val="17"/>
                 <w:szCs w:val="17"/>
               </w:rPr>
-              <w:t xml:space="preserve">0.0156 (0.0035) [&lt;0.001]</w:t>
+              <w:t xml:space="preserve">0.0153 (0.0036) [&lt;0.001]</w:t>
             </w:r>
           </w:p>
         </w:tc>
@@ -12546,7 +12546,7 @@
                 <w:sz w:val="17"/>
                 <w:szCs w:val="17"/>
               </w:rPr>
-              <w:t xml:space="preserve">0.0103 (0.0021) [&lt;0.001]</w:t>
+              <w:t xml:space="preserve">0.0101 (0.0022) [&lt;0.001]</w:t>
             </w:r>
           </w:p>
         </w:tc>
@@ -12579,7 +12579,7 @@
                 <w:sz w:val="17"/>
                 <w:szCs w:val="17"/>
               </w:rPr>
-              <w:t xml:space="preserve">0.0059 (0.0016) [&lt;0.001]</w:t>
+              <w:t xml:space="preserve">0.0058 (0.0017) [&lt;0.001]</w:t>
             </w:r>
           </w:p>
         </w:tc>
@@ -12612,7 +12612,7 @@
                 <w:sz w:val="17"/>
                 <w:szCs w:val="17"/>
               </w:rPr>
-              <w:t xml:space="preserve">0.0012 (0.0006) [0.056]</w:t>
+              <w:t xml:space="preserve">0.0012 (0.0006) [0.063]</w:t>
             </w:r>
           </w:p>
         </w:tc>
@@ -12683,7 +12683,7 @@
                 <w:sz w:val="17"/>
                 <w:szCs w:val="17"/>
               </w:rPr>
-              <w:t xml:space="preserve">-0.138 (0.116) [0.235]</w:t>
+              <w:t xml:space="preserve">-0.210 (0.109) [0.054]</w:t>
             </w:r>
           </w:p>
         </w:tc>
@@ -12716,7 +12716,7 @@
                 <w:sz w:val="17"/>
                 <w:szCs w:val="17"/>
               </w:rPr>
-              <w:t xml:space="preserve">-0.146 (0.115) [0.206]</w:t>
+              <w:t xml:space="preserve">-0.122 (0.070) [0.083]</w:t>
             </w:r>
           </w:p>
         </w:tc>
@@ -12749,7 +12749,7 @@
                 <w:sz w:val="17"/>
                 <w:szCs w:val="17"/>
               </w:rPr>
-              <w:t xml:space="preserve">0.187 (0.160) [0.243]</w:t>
+              <w:t xml:space="preserve">-0.038 (0.017) [0.024]</w:t>
             </w:r>
           </w:p>
         </w:tc>
@@ -12782,7 +12782,7 @@
                 <w:sz w:val="17"/>
                 <w:szCs w:val="17"/>
               </w:rPr>
-              <w:t xml:space="preserve">-0.007 (0.088) [0.933]</w:t>
+              <w:t xml:space="preserve">0.000 (0.000) [–]</w:t>
             </w:r>
           </w:p>
         </w:tc>
@@ -12815,7 +12815,7 @@
                 <w:sz w:val="17"/>
                 <w:szCs w:val="17"/>
               </w:rPr>
-              <w:t xml:space="preserve">0.001 (0.005) [0.841]</w:t>
+              <w:t xml:space="preserve">0.000 (0.000) [–]</w:t>
             </w:r>
           </w:p>
         </w:tc>
@@ -12886,7 +12886,7 @@
                 <w:sz w:val="17"/>
                 <w:szCs w:val="17"/>
               </w:rPr>
-              <w:t xml:space="preserve">-0.077 (0.021) [&lt;0.001]</w:t>
+              <w:t xml:space="preserve">-0.075 (0.021) [&lt;0.001]</w:t>
             </w:r>
           </w:p>
         </w:tc>
@@ -12919,7 +12919,7 @@
                 <w:sz w:val="17"/>
                 <w:szCs w:val="17"/>
               </w:rPr>
-              <w:t xml:space="preserve">-0.064 (0.015) [&lt;0.001]</w:t>
+              <w:t xml:space="preserve">-0.063 (0.015) [&lt;0.001]</w:t>
             </w:r>
           </w:p>
         </w:tc>
@@ -12952,7 +12952,7 @@
                 <w:sz w:val="17"/>
                 <w:szCs w:val="17"/>
               </w:rPr>
-              <w:t xml:space="preserve">-0.051 (0.012) [&lt;0.001]</w:t>
+              <w:t xml:space="preserve">-0.050 (0.012) [&lt;0.001]</w:t>
             </w:r>
           </w:p>
         </w:tc>
@@ -13698,7 +13698,7 @@
                 <w:sz w:val="17"/>
                 <w:szCs w:val="17"/>
               </w:rPr>
-              <w:t xml:space="preserve">0.302</w:t>
+              <w:t xml:space="preserve">0.292</w:t>
             </w:r>
           </w:p>
         </w:tc>
@@ -13731,7 +13731,7 @@
                 <w:sz w:val="17"/>
                 <w:szCs w:val="17"/>
               </w:rPr>
-              <w:t xml:space="preserve">0.229</w:t>
+              <w:t xml:space="preserve">0.219</w:t>
             </w:r>
           </w:p>
         </w:tc>
@@ -13764,7 +13764,7 @@
                 <w:sz w:val="17"/>
                 <w:szCs w:val="17"/>
               </w:rPr>
-              <w:t xml:space="preserve">0.167</w:t>
+              <w:t xml:space="preserve">0.157</w:t>
             </w:r>
           </w:p>
         </w:tc>
@@ -13797,7 +13797,7 @@
                 <w:sz w:val="17"/>
                 <w:szCs w:val="17"/>
               </w:rPr>
-              <w:t xml:space="preserve">0.114</w:t>
+              <w:t xml:space="preserve">0.107</w:t>
             </w:r>
           </w:p>
         </w:tc>
@@ -13830,7 +13830,7 @@
                 <w:sz w:val="17"/>
                 <w:szCs w:val="17"/>
               </w:rPr>
-              <w:t xml:space="preserve">0.043</w:t>
+              <w:t xml:space="preserve">0.034</w:t>
             </w:r>
           </w:p>
         </w:tc>
@@ -14137,7 +14137,7 @@
                 <w:sz w:val="17"/>
                 <w:szCs w:val="17"/>
               </w:rPr>
-              <w:t xml:space="preserve">16.635 (1.777) [&lt;0.001]</w:t>
+              <w:t xml:space="preserve">16.692 (1.803) [&lt;0.001]</w:t>
             </w:r>
           </w:p>
         </w:tc>
@@ -14170,7 +14170,7 @@
                 <w:sz w:val="17"/>
                 <w:szCs w:val="17"/>
               </w:rPr>
-              <w:t xml:space="preserve">12.910 (2.230) [&lt;0.001]</w:t>
+              <w:t xml:space="preserve">13.064 (2.261) [&lt;0.001]</w:t>
             </w:r>
           </w:p>
         </w:tc>
@@ -14203,7 +14203,7 @@
                 <w:sz w:val="17"/>
                 <w:szCs w:val="17"/>
               </w:rPr>
-              <w:t xml:space="preserve">12.357 (2.210) [&lt;0.001]</w:t>
+              <w:t xml:space="preserve">12.545 (2.236) [&lt;0.001]</w:t>
             </w:r>
           </w:p>
         </w:tc>
@@ -14236,7 +14236,7 @@
                 <w:sz w:val="17"/>
                 <w:szCs w:val="17"/>
               </w:rPr>
-              <w:t xml:space="preserve">9.799 (2.443) [&lt;0.001]</w:t>
+              <w:t xml:space="preserve">10.029 (2.469) [&lt;0.001]</w:t>
             </w:r>
           </w:p>
         </w:tc>
@@ -14340,7 +14340,7 @@
                 <w:sz w:val="17"/>
                 <w:szCs w:val="17"/>
               </w:rPr>
-              <w:t xml:space="preserve">0.052 (0.014) [&lt;0.001]</w:t>
+              <w:t xml:space="preserve">0.051 (0.014) [&lt;0.001]</w:t>
             </w:r>
           </w:p>
         </w:tc>
@@ -14373,7 +14373,7 @@
                 <w:sz w:val="17"/>
                 <w:szCs w:val="17"/>
               </w:rPr>
-              <w:t xml:space="preserve">-0.112 (0.034) [0.001]</w:t>
+              <w:t xml:space="preserve">-0.111 (0.035) [0.001]</w:t>
             </w:r>
           </w:p>
         </w:tc>
@@ -14406,7 +14406,7 @@
                 <w:sz w:val="17"/>
                 <w:szCs w:val="17"/>
               </w:rPr>
-              <w:t xml:space="preserve">-0.001 (0.035) [0.972]</w:t>
+              <w:t xml:space="preserve">-0.002 (0.036) [0.958]</w:t>
             </w:r>
           </w:p>
         </w:tc>
@@ -14543,7 +14543,7 @@
                 <w:sz w:val="17"/>
                 <w:szCs w:val="17"/>
               </w:rPr>
-              <w:t xml:space="preserve">0.0133 (0.0030) [&lt;0.001]</w:t>
+              <w:t xml:space="preserve">0.0131 (0.0031) [&lt;0.001]</w:t>
             </w:r>
           </w:p>
         </w:tc>
@@ -14576,7 +14576,7 @@
                 <w:sz w:val="17"/>
                 <w:szCs w:val="17"/>
               </w:rPr>
-              <w:t xml:space="preserve">0.0156 (0.0035) [&lt;0.001]</w:t>
+              <w:t xml:space="preserve">0.0153 (0.0036) [&lt;0.001]</w:t>
             </w:r>
           </w:p>
         </w:tc>
@@ -14680,7 +14680,7 @@
                 <w:sz w:val="17"/>
                 <w:szCs w:val="17"/>
               </w:rPr>
-              <w:t xml:space="preserve">-0.189 (0.114) [0.096]</w:t>
+              <w:t xml:space="preserve">-0.176 (0.072) [0.015]</w:t>
             </w:r>
           </w:p>
         </w:tc>
@@ -14713,7 +14713,7 @@
                 <w:sz w:val="17"/>
                 <w:szCs w:val="17"/>
               </w:rPr>
-              <w:t xml:space="preserve">-0.181 (0.116) [0.118]</w:t>
+              <w:t xml:space="preserve">-0.166 (0.071) [0.019]</w:t>
             </w:r>
           </w:p>
         </w:tc>
@@ -14746,7 +14746,7 @@
                 <w:sz w:val="17"/>
                 <w:szCs w:val="17"/>
               </w:rPr>
-              <w:t xml:space="preserve">-0.146 (0.115) [0.206]</w:t>
+              <w:t xml:space="preserve">-0.122 (0.070) [0.083]</w:t>
             </w:r>
           </w:p>
         </w:tc>
@@ -14916,7 +14916,7 @@
                 <w:sz w:val="17"/>
                 <w:szCs w:val="17"/>
               </w:rPr>
-              <w:t xml:space="preserve">-0.064 (0.015) [&lt;0.001]</w:t>
+              <w:t xml:space="preserve">-0.063 (0.015) [&lt;0.001]</w:t>
             </w:r>
           </w:p>
         </w:tc>
@@ -15157,7 +15157,7 @@
                 <w:sz w:val="17"/>
                 <w:szCs w:val="17"/>
               </w:rPr>
-              <w:t xml:space="preserve">0.167</w:t>
+              <w:t xml:space="preserve">0.159</w:t>
             </w:r>
           </w:p>
         </w:tc>
@@ -15190,7 +15190,7 @@
                 <w:sz w:val="17"/>
                 <w:szCs w:val="17"/>
               </w:rPr>
-              <w:t xml:space="preserve">0.179</w:t>
+              <w:t xml:space="preserve">0.170</w:t>
             </w:r>
           </w:p>
         </w:tc>
@@ -15223,7 +15223,7 @@
                 <w:sz w:val="17"/>
                 <w:szCs w:val="17"/>
               </w:rPr>
-              <w:t xml:space="preserve">0.213</w:t>
+              <w:t xml:space="preserve">0.204</w:t>
             </w:r>
           </w:p>
         </w:tc>
@@ -15256,7 +15256,7 @@
                 <w:sz w:val="17"/>
                 <w:szCs w:val="17"/>
               </w:rPr>
-              <w:t xml:space="preserve">0.229</w:t>
+              <w:t xml:space="preserve">0.219</w:t>
             </w:r>
           </w:p>
         </w:tc>
@@ -15574,7 +15574,7 @@
                 <w:sz w:val="17"/>
                 <w:szCs w:val="17"/>
               </w:rPr>
-              <w:t xml:space="preserve">9.799</w:t>
+              <w:t xml:space="preserve">10.029</w:t>
             </w:r>
           </w:p>
         </w:tc>
@@ -15607,7 +15607,7 @@
                 <w:sz w:val="17"/>
                 <w:szCs w:val="17"/>
               </w:rPr>
-              <w:t xml:space="preserve">$1.67M</w:t>
+              <w:t xml:space="preserve">$1.70M</w:t>
             </w:r>
           </w:p>
         </w:tc>
@@ -15711,7 +15711,7 @@
                 <w:sz w:val="17"/>
                 <w:szCs w:val="17"/>
               </w:rPr>
-              <w:t xml:space="preserve">-0.001</w:t>
+              <w:t xml:space="preserve">-0.002</w:t>
             </w:r>
           </w:p>
         </w:tc>
@@ -15744,7 +15744,7 @@
                 <w:sz w:val="17"/>
                 <w:szCs w:val="17"/>
               </w:rPr>
-              <w:t xml:space="preserve">-$0.02M</w:t>
+              <w:t xml:space="preserve">-$0.03M</w:t>
             </w:r>
           </w:p>
         </w:tc>
@@ -15848,7 +15848,7 @@
                 <w:sz w:val="17"/>
                 <w:szCs w:val="17"/>
               </w:rPr>
-              <w:t xml:space="preserve">0.0156</w:t>
+              <w:t xml:space="preserve">0.0153</w:t>
             </w:r>
           </w:p>
         </w:tc>
@@ -15881,7 +15881,7 @@
                 <w:sz w:val="17"/>
                 <w:szCs w:val="17"/>
               </w:rPr>
-              <w:t xml:space="preserve">$3.67M</w:t>
+              <w:t xml:space="preserve">$3.62M</w:t>
             </w:r>
           </w:p>
         </w:tc>
@@ -15985,7 +15985,7 @@
                 <w:sz w:val="17"/>
                 <w:szCs w:val="17"/>
               </w:rPr>
-              <w:t xml:space="preserve">-0.146</w:t>
+              <w:t xml:space="preserve">-0.122</w:t>
             </w:r>
           </w:p>
         </w:tc>
@@ -16122,7 +16122,7 @@
                 <w:sz w:val="17"/>
                 <w:szCs w:val="17"/>
               </w:rPr>
-              <w:t xml:space="preserve">-0.064</w:t>
+              <w:t xml:space="preserve">-0.063</w:t>
             </w:r>
           </w:p>
         </w:tc>
@@ -16155,7 +16155,7 @@
                 <w:sz w:val="17"/>
                 <w:szCs w:val="17"/>
               </w:rPr>
-              <w:t xml:space="preserve">-$1.09M</w:t>
+              <w:t xml:space="preserve">-$1.07M</w:t>
             </w:r>
           </w:p>
         </w:tc>
@@ -16276,7 +16276,7 @@
                 <w:sz w:val="17"/>
                 <w:szCs w:val="17"/>
               </w:rPr>
-              <w:t xml:space="preserve">$4.23M</w:t>
+              <w:t xml:space="preserve">$4.22M</w:t>
             </w:r>
           </w:p>
         </w:tc>
@@ -16510,7 +16510,7 @@
                 <w:sz w:val="17"/>
                 <w:szCs w:val="17"/>
               </w:rPr>
-              <w:t xml:space="preserve">$2.99M</w:t>
+              <w:t xml:space="preserve">$3.00M</w:t>
             </w:r>
           </w:p>
         </w:tc>
@@ -16627,7 +16627,7 @@
                 <w:sz w:val="17"/>
                 <w:szCs w:val="17"/>
               </w:rPr>
-              <w:t xml:space="preserve">$4.02M</w:t>
+              <w:t xml:space="preserve">$4.00M</w:t>
             </w:r>
           </w:p>
         </w:tc>
@@ -16644,7 +16644,7 @@
           <w:sz w:val="18"/>
           <w:szCs w:val="18"/>
         </w:rPr>
-        <w:t xml:space="preserve">Millions of dollars at the 2025-26 cap. Contributions are input times coefficient and sum to the adopted value. His production of 15.37 enters squared as 15.37² = 236.11; his age less 18 is 1.10. The production and squared terms are read together: his 15.37 points add -$0.02M + $3.67M = $3.66M.</w:t>
+        <w:t xml:space="preserve">Millions of dollars at the 2025-26 cap. Contributions are input times coefficient and sum to the adopted value. His production of 15.37 enters squared as 15.37² = 236.11; his age less 18 is 1.10. The production and squared terms are read together: his 15.37 points add -$0.03M + $3.62M = $3.59M.</w:t>
       </w:r>
     </w:p>
     <w:p>
@@ -16655,7 +16655,7 @@
         <w:rPr>
           <w:rFonts w:ascii="Calibri" w:cs="Calibri" w:eastAsia="Calibri" w:hAnsi="Calibri"/>
         </w:rPr>
-        <w:t xml:space="preserve">His scoring raises his value from $2.99 million on his draft position to $4.23 million. The production model without age values him at $3.53 million, so age adds $0.70 million. Age adds value because Suzuki is among the youngest a D+2 prospect can be, and the model discounts each point by the age at which it was scored.</w:t>
+        <w:t xml:space="preserve">His scoring raises his value from $3.00 million on his draft position to $4.22 million. The production model without age values him at $3.53 million, so age adds $0.69 million. Age adds value because Suzuki is among the youngest a D+2 prospect can be, and the model discounts each point by the age at which it was scored.</w:t>
       </w:r>
     </w:p>
     <w:p>
@@ -16679,7 +16679,7 @@
         <w:rPr>
           <w:rFonts w:ascii="Calibri" w:cs="Calibri" w:eastAsia="Calibri" w:hAnsi="Calibri"/>
         </w:rPr>
-        <w:t xml:space="preserve">From July 2017 to March 2022, clubs traded 197 drafted prospects (170 different players, as some were traded more than once) and 53 undrafted prospects. The adopted model values them at $76.31 million: $70.39 million for the drafted prospects and $5.93 million for the undrafted. Table 12 values the same 197 drafted prospects under each alternative considered above, so each decision's effect can be read in dollars on the same assets.</w:t>
+        <w:t xml:space="preserve">From July 2017 to March 2022, clubs traded 197 drafted prospects (170 different players, as some were traded more than once) and 53 undrafted prospects. The adopted model values them at $75.60 million: $69.82 million for the drafted prospects and $5.78 million for the undrafted. Table 12 values the same 197 drafted prospects under each alternative considered above, so each decision's effect can be read in dollars on the same assets.</w:t>
       </w:r>
     </w:p>
     <w:p>
@@ -16888,7 +16888,7 @@
                 <w:sz w:val="17"/>
                 <w:szCs w:val="17"/>
               </w:rPr>
-              <w:t xml:space="preserve">$130.35M</w:t>
+              <w:t xml:space="preserve">$130.37M</w:t>
             </w:r>
           </w:p>
         </w:tc>
@@ -16921,7 +16921,7 @@
                 <w:sz w:val="17"/>
                 <w:szCs w:val="17"/>
               </w:rPr>
-              <w:t xml:space="preserve">$59.96M</w:t>
+              <w:t xml:space="preserve">$60.55M</w:t>
             </w:r>
           </w:p>
         </w:tc>
@@ -16992,7 +16992,7 @@
                 <w:sz w:val="17"/>
                 <w:szCs w:val="17"/>
               </w:rPr>
-              <w:t xml:space="preserve">$58.30M</w:t>
+              <w:t xml:space="preserve">$57.99M</w:t>
             </w:r>
           </w:p>
         </w:tc>
@@ -17025,7 +17025,7 @@
                 <w:sz w:val="17"/>
                 <w:szCs w:val="17"/>
               </w:rPr>
-              <w:t xml:space="preserve">-$12.08M</w:t>
+              <w:t xml:space="preserve">-$11.82M</w:t>
             </w:r>
           </w:p>
         </w:tc>
@@ -17096,7 +17096,7 @@
                 <w:sz w:val="17"/>
                 <w:szCs w:val="17"/>
               </w:rPr>
-              <w:t xml:space="preserve">$75.80M</w:t>
+              <w:t xml:space="preserve">$75.28M</w:t>
             </w:r>
           </w:p>
         </w:tc>
@@ -17129,7 +17129,7 @@
                 <w:sz w:val="17"/>
                 <w:szCs w:val="17"/>
               </w:rPr>
-              <w:t xml:space="preserve">$5.41M</w:t>
+              <w:t xml:space="preserve">$5.46M</w:t>
             </w:r>
           </w:p>
         </w:tc>
@@ -17200,7 +17200,7 @@
                 <w:sz w:val="17"/>
                 <w:szCs w:val="17"/>
               </w:rPr>
-              <w:t xml:space="preserve">$67.21M</w:t>
+              <w:t xml:space="preserve">$66.67M</w:t>
             </w:r>
           </w:p>
         </w:tc>
@@ -17233,7 +17233,7 @@
                 <w:sz w:val="17"/>
                 <w:szCs w:val="17"/>
               </w:rPr>
-              <w:t xml:space="preserve">-$3.18M</w:t>
+              <w:t xml:space="preserve">-$3.15M</w:t>
             </w:r>
           </w:p>
         </w:tc>
@@ -17304,7 +17304,7 @@
                 <w:sz w:val="17"/>
                 <w:szCs w:val="17"/>
               </w:rPr>
-              <w:t xml:space="preserve">$67.73M</w:t>
+              <w:t xml:space="preserve">$67.22M</w:t>
             </w:r>
           </w:p>
         </w:tc>
@@ -17337,7 +17337,7 @@
                 <w:sz w:val="17"/>
                 <w:szCs w:val="17"/>
               </w:rPr>
-              <w:t xml:space="preserve">-$2.65M</w:t>
+              <w:t xml:space="preserve">-$2.60M</w:t>
             </w:r>
           </w:p>
         </w:tc>
@@ -17408,7 +17408,7 @@
                 <w:sz w:val="17"/>
                 <w:szCs w:val="17"/>
               </w:rPr>
-              <w:t xml:space="preserve">$69.95M</w:t>
+              <w:t xml:space="preserve">$69.37M</w:t>
             </w:r>
           </w:p>
         </w:tc>
@@ -17441,7 +17441,7 @@
                 <w:sz w:val="17"/>
                 <w:szCs w:val="17"/>
               </w:rPr>
-              <w:t xml:space="preserve">-$0.43M</w:t>
+              <w:t xml:space="preserve">-$0.45M</w:t>
             </w:r>
           </w:p>
         </w:tc>
@@ -17512,7 +17512,7 @@
                 <w:sz w:val="17"/>
                 <w:szCs w:val="17"/>
               </w:rPr>
-              <w:t xml:space="preserve">$70.69M</w:t>
+              <w:t xml:space="preserve">$70.17M</w:t>
             </w:r>
           </w:p>
         </w:tc>
@@ -17545,7 +17545,7 @@
                 <w:sz w:val="17"/>
                 <w:szCs w:val="17"/>
               </w:rPr>
-              <w:t xml:space="preserve">$0.31M</w:t>
+              <w:t xml:space="preserve">$0.35M</w:t>
             </w:r>
           </w:p>
         </w:tc>
@@ -17618,7 +17618,7 @@
                 <w:sz w:val="17"/>
                 <w:szCs w:val="17"/>
               </w:rPr>
-              <w:t xml:space="preserve">$70.39M</w:t>
+              <w:t xml:space="preserve">$69.82M</w:t>
             </w:r>
           </w:p>
         </w:tc>
@@ -17723,7 +17723,7 @@
                 <w:sz w:val="17"/>
                 <w:szCs w:val="17"/>
               </w:rPr>
-              <w:t xml:space="preserve">$69.23M</w:t>
+              <w:t xml:space="preserve">$68.61M</w:t>
             </w:r>
           </w:p>
         </w:tc>
@@ -17756,7 +17756,7 @@
                 <w:sz w:val="17"/>
                 <w:szCs w:val="17"/>
               </w:rPr>
-              <w:t xml:space="preserve">-$1.16M</w:t>
+              <w:t xml:space="preserve">-$1.20M</w:t>
             </w:r>
           </w:p>
         </w:tc>
@@ -17784,7 +17784,7 @@
         <w:rPr>
           <w:rFonts w:ascii="Calibri" w:cs="Calibri" w:eastAsia="Calibri" w:hAnsi="Calibri"/>
         </w:rPr>
-        <w:t xml:space="preserve">Production and age change many prospects' values. Moving from draft position alone to the adopted model moves 63 of the 197 values by $0.25 million or more and leaves 10 of the 20 most valuable prospects in the top 20 (rank correlation 0.552).</w:t>
+        <w:t xml:space="preserve">Production and age change many prospects' values. Moving from draft position alone to the adopted model moves 60 of the 197 values by $0.25 million or more and leaves 10 of the 20 most valuable prospects in the top 20 (rank correlation 0.553).</w:t>
       </w:r>
     </w:p>
     <w:p>
@@ -17795,7 +17795,7 @@
         <w:rPr>
           <w:rFonts w:ascii="Calibri" w:cs="Calibri" w:eastAsia="Calibri" w:hAnsi="Calibri"/>
         </w:rPr>
-        <w:t xml:space="preserve">A value can be below zero. Of the 197 drafted prospects, 66 are valued below zero, -$4.08 million in total; of all 250 prospects valued, 82 are, the lowest at -$0.48 million. A value below zero means that prospects with that profile, a low scorer from a late draft position, delivered slightly negative surplus on average in the data: when such players reach the NHL, their cost tends to exceed the value of the wins they deliver. Negative careers count, as in the draft pick curve.</w:t>
+        <w:t xml:space="preserve">A value can be below zero. Of the 197 drafted prospects, 66 are valued below zero, -$4.02 million in total; of all 250 prospects valued, 82 are, the lowest at -$0.47 million. A value below zero means that prospects with that profile, a low scorer from a late draft position, delivered slightly negative surplus on average in the data: when such players reach the NHL, their cost tends to exceed the value of the wins they deliver. Negative careers count, as in the draft pick curve.</w:t>
       </w:r>
     </w:p>
     <w:p>
@@ -18420,7 +18420,7 @@
                 <w:sz w:val="17"/>
                 <w:szCs w:val="17"/>
               </w:rPr>
-              <w:t xml:space="preserve">$2.99M</w:t>
+              <w:t xml:space="preserve">$3.00M</w:t>
             </w:r>
           </w:p>
         </w:tc>
@@ -18453,7 +18453,7 @@
                 <w:sz w:val="17"/>
                 <w:szCs w:val="17"/>
               </w:rPr>
-              <w:t xml:space="preserve">$4.23M</w:t>
+              <w:t xml:space="preserve">$4.22M</w:t>
             </w:r>
           </w:p>
         </w:tc>
@@ -18722,7 +18722,7 @@
                 <w:sz w:val="17"/>
                 <w:szCs w:val="17"/>
               </w:rPr>
-              <w:t xml:space="preserve">$2.75M</w:t>
+              <w:t xml:space="preserve">$2.71M</w:t>
             </w:r>
           </w:p>
         </w:tc>
@@ -18991,7 +18991,7 @@
                 <w:sz w:val="17"/>
                 <w:szCs w:val="17"/>
               </w:rPr>
-              <w:t xml:space="preserve">$2.48M</w:t>
+              <w:t xml:space="preserve">$2.46M</w:t>
             </w:r>
           </w:p>
         </w:tc>
@@ -19260,7 +19260,7 @@
                 <w:sz w:val="17"/>
                 <w:szCs w:val="17"/>
               </w:rPr>
-              <w:t xml:space="preserve">$2.46M</w:t>
+              <w:t xml:space="preserve">$2.41M</w:t>
             </w:r>
           </w:p>
         </w:tc>
@@ -19529,7 +19529,7 @@
                 <w:sz w:val="17"/>
                 <w:szCs w:val="17"/>
               </w:rPr>
-              <w:t xml:space="preserve">$2.29M</w:t>
+              <w:t xml:space="preserve">$2.26M</w:t>
             </w:r>
           </w:p>
         </w:tc>
@@ -19765,7 +19765,7 @@
                 <w:sz w:val="17"/>
                 <w:szCs w:val="17"/>
               </w:rPr>
-              <w:t xml:space="preserve">$0.51M</w:t>
+              <w:t xml:space="preserve">$0.50M</w:t>
             </w:r>
           </w:p>
         </w:tc>
@@ -19798,7 +19798,7 @@
                 <w:sz w:val="17"/>
                 <w:szCs w:val="17"/>
               </w:rPr>
-              <w:t xml:space="preserve">$2.28M</w:t>
+              <w:t xml:space="preserve">$2.25M</w:t>
             </w:r>
           </w:p>
         </w:tc>
@@ -20067,7 +20067,7 @@
                 <w:sz w:val="17"/>
                 <w:szCs w:val="17"/>
               </w:rPr>
-              <w:t xml:space="preserve">$2.05M</w:t>
+              <w:t xml:space="preserve">$2.01M</w:t>
             </w:r>
           </w:p>
         </w:tc>
@@ -20303,7 +20303,7 @@
                 <w:sz w:val="17"/>
                 <w:szCs w:val="17"/>
               </w:rPr>
-              <w:t xml:space="preserve">$2.64M</w:t>
+              <w:t xml:space="preserve">$2.65M</w:t>
             </w:r>
           </w:p>
         </w:tc>
@@ -20336,7 +20336,7 @@
                 <w:sz w:val="17"/>
                 <w:szCs w:val="17"/>
               </w:rPr>
-              <w:t xml:space="preserve">$1.99M</w:t>
+              <w:t xml:space="preserve">$2.01M</w:t>
             </w:r>
           </w:p>
         </w:tc>
@@ -20572,7 +20572,7 @@
                 <w:sz w:val="17"/>
                 <w:szCs w:val="17"/>
               </w:rPr>
-              <w:t xml:space="preserve">$1.65M</w:t>
+              <w:t xml:space="preserve">$1.66M</w:t>
             </w:r>
           </w:p>
         </w:tc>
@@ -20643,7 +20643,7 @@
                 <w:sz w:val="17"/>
                 <w:szCs w:val="17"/>
               </w:rPr>
-              <w:t xml:space="preserve">2019-02-22</w:t>
+              <w:t xml:space="preserve">2018-02-26</w:t>
             </w:r>
           </w:p>
         </w:tc>
@@ -20676,7 +20676,7 @@
                 <w:sz w:val="17"/>
                 <w:szCs w:val="17"/>
               </w:rPr>
-              <w:t xml:space="preserve">Vitaly Abramov</w:t>
+              <w:t xml:space="preserve">Brett Howden</w:t>
             </w:r>
           </w:p>
         </w:tc>
@@ -20709,7 +20709,7 @@
                 <w:sz w:val="17"/>
                 <w:szCs w:val="17"/>
               </w:rPr>
-              <w:t xml:space="preserve">2016 #65</w:t>
+              <w:t xml:space="preserve">2016 #27</w:t>
             </w:r>
           </w:p>
         </w:tc>
@@ -20742,7 +20742,7 @@
                 <w:sz w:val="17"/>
                 <w:szCs w:val="17"/>
               </w:rPr>
-              <w:t xml:space="preserve">D+3</w:t>
+              <w:t xml:space="preserve">D+2</w:t>
             </w:r>
           </w:p>
         </w:tc>
@@ -20775,7 +20775,7 @@
                 <w:sz w:val="17"/>
                 <w:szCs w:val="17"/>
               </w:rPr>
-              <w:t xml:space="preserve">16.6</w:t>
+              <w:t xml:space="preserve">11.6</w:t>
             </w:r>
           </w:p>
         </w:tc>
@@ -20808,7 +20808,7 @@
                 <w:sz w:val="17"/>
                 <w:szCs w:val="17"/>
               </w:rPr>
-              <w:t xml:space="preserve">20.4</w:t>
+              <w:t xml:space="preserve">19.5</w:t>
             </w:r>
           </w:p>
         </w:tc>
@@ -20841,7 +20841,7 @@
                 <w:sz w:val="17"/>
                 <w:szCs w:val="17"/>
               </w:rPr>
-              <w:t xml:space="preserve">$0.58M</w:t>
+              <w:t xml:space="preserve">$1.54M</w:t>
             </w:r>
           </w:p>
         </w:tc>
@@ -20874,7 +20874,7 @@
                 <w:sz w:val="17"/>
                 <w:szCs w:val="17"/>
               </w:rPr>
-              <w:t xml:space="preserve">$1.84M</w:t>
+              <w:t xml:space="preserve">$1.83M</w:t>
             </w:r>
           </w:p>
         </w:tc>
@@ -20915,7 +20915,7 @@
         <w:rPr>
           <w:rFonts w:ascii="Calibri" w:cs="Calibri" w:eastAsia="Calibri" w:hAnsi="Calibri"/>
         </w:rPr>
-        <w:t xml:space="preserve">An undrafted player has no draft rights, so a club holds his NHL rights only through an NHL contract; an undrafted player on a minor-league contract is worth nothing to an NHL club in this currency. The 53 undrafted prospects on NHL contracts are valued by the same model with the star probability set to zero, with seasons counted from the first draft at which they were eligible. They total $5.93 million; the largest is Brennan Menell at $0.67 million.</w:t>
+        <w:t xml:space="preserve">An undrafted player has no draft rights, so a club holds his NHL rights only through an NHL contract; an undrafted player on a minor-league contract is worth nothing to an NHL club in this currency. The 53 undrafted prospects on NHL contracts are valued by the same model with the star probability set to zero, with seasons counted from the first draft at which they were eligible. They total $5.78 million; the largest is Brennan Menell at $0.65 million.</w:t>
       </w:r>
     </w:p>
     <w:p>
@@ -21641,7 +21641,7 @@
                 <w:sz w:val="17"/>
                 <w:szCs w:val="17"/>
               </w:rPr>
-              <w:t xml:space="preserve">53 assets, $5.93M</w:t>
+              <w:t xml:space="preserve">53 assets, $5.78M</w:t>
             </w:r>
           </w:p>
         </w:tc>
@@ -22106,7 +22106,7 @@
                 <w:sz w:val="17"/>
                 <w:szCs w:val="17"/>
               </w:rPr>
-              <w:t xml:space="preserve">17.534 (1.746) [&lt;0.001]</w:t>
+              <w:t xml:space="preserve">17.540 (1.769) [&lt;0.001]</w:t>
             </w:r>
           </w:p>
         </w:tc>
@@ -22139,7 +22139,7 @@
                 <w:sz w:val="17"/>
                 <w:szCs w:val="17"/>
               </w:rPr>
-              <w:t xml:space="preserve">15.398 (2.064) [&lt;0.001]</w:t>
+              <w:t xml:space="preserve">15.432 (2.094) [&lt;0.001]</w:t>
             </w:r>
           </w:p>
         </w:tc>
@@ -22172,7 +22172,7 @@
                 <w:sz w:val="17"/>
                 <w:szCs w:val="17"/>
               </w:rPr>
-              <w:t xml:space="preserve">13.273 (1.790) [&lt;0.001]</w:t>
+              <w:t xml:space="preserve">13.399 (1.824) [&lt;0.001]</w:t>
             </w:r>
           </w:p>
         </w:tc>
@@ -22205,7 +22205,7 @@
                 <w:sz w:val="17"/>
                 <w:szCs w:val="17"/>
               </w:rPr>
-              <w:t xml:space="preserve">11.163 (1.991) [&lt;0.001]</w:t>
+              <w:t xml:space="preserve">11.350 (2.030) [&lt;0.001]</w:t>
             </w:r>
           </w:p>
         </w:tc>
@@ -22342,7 +22342,7 @@
                 <w:sz w:val="17"/>
                 <w:szCs w:val="17"/>
               </w:rPr>
-              <w:t xml:space="preserve">-0.131 (0.050) [0.009]</w:t>
+              <w:t xml:space="preserve">-0.127 (0.050) [0.011]</w:t>
             </w:r>
           </w:p>
         </w:tc>
@@ -22375,7 +22375,7 @@
                 <w:sz w:val="17"/>
                 <w:szCs w:val="17"/>
               </w:rPr>
-              <w:t xml:space="preserve">-0.079 (0.047) [0.091]</w:t>
+              <w:t xml:space="preserve">-0.076 (0.047) [0.109]</w:t>
             </w:r>
           </w:p>
         </w:tc>
@@ -22512,7 +22512,7 @@
                 <w:sz w:val="17"/>
                 <w:szCs w:val="17"/>
               </w:rPr>
-              <w:t xml:space="preserve">0.0185 (0.0051) [&lt;0.001]</w:t>
+              <w:t xml:space="preserve">0.0180 (0.0051) [&lt;0.001]</w:t>
             </w:r>
           </w:p>
         </w:tc>
@@ -22545,7 +22545,7 @@
                 <w:sz w:val="17"/>
                 <w:szCs w:val="17"/>
               </w:rPr>
-              <w:t xml:space="preserve">0.0223 (0.0056) [&lt;0.001]</w:t>
+              <w:t xml:space="preserve">0.0216 (0.0057) [&lt;0.001]</w:t>
             </w:r>
           </w:p>
         </w:tc>
@@ -22649,7 +22649,7 @@
                 <w:sz w:val="17"/>
                 <w:szCs w:val="17"/>
               </w:rPr>
-              <w:t xml:space="preserve">-0.254 (0.122) [0.037]</w:t>
+              <w:t xml:space="preserve">-0.312 (0.118) [0.008]</w:t>
             </w:r>
           </w:p>
         </w:tc>
@@ -22682,7 +22682,7 @@
                 <w:sz w:val="17"/>
                 <w:szCs w:val="17"/>
               </w:rPr>
-              <w:t xml:space="preserve">-0.186 (0.117) [0.114]</w:t>
+              <w:t xml:space="preserve">-0.261 (0.111) [0.018]</w:t>
             </w:r>
           </w:p>
         </w:tc>
@@ -22715,7 +22715,7 @@
                 <w:sz w:val="17"/>
                 <w:szCs w:val="17"/>
               </w:rPr>
-              <w:t xml:space="preserve">-0.138 (0.116) [0.235]</w:t>
+              <w:t xml:space="preserve">-0.210 (0.109) [0.054]</w:t>
             </w:r>
           </w:p>
         </w:tc>
@@ -22885,7 +22885,7 @@
                 <w:sz w:val="17"/>
                 <w:szCs w:val="17"/>
               </w:rPr>
-              <w:t xml:space="preserve">-0.077 (0.021) [&lt;0.001]</w:t>
+              <w:t xml:space="preserve">-0.075 (0.021) [&lt;0.001]</w:t>
             </w:r>
           </w:p>
         </w:tc>
@@ -23126,7 +23126,7 @@
                 <w:sz w:val="17"/>
                 <w:szCs w:val="17"/>
               </w:rPr>
-              <w:t xml:space="preserve">0.257</w:t>
+              <w:t xml:space="preserve">0.248</w:t>
             </w:r>
           </w:p>
         </w:tc>
@@ -23159,7 +23159,7 @@
                 <w:sz w:val="17"/>
                 <w:szCs w:val="17"/>
               </w:rPr>
-              <w:t xml:space="preserve">0.263</w:t>
+              <w:t xml:space="preserve">0.254</w:t>
             </w:r>
           </w:p>
         </w:tc>
@@ -23192,7 +23192,7 @@
                 <w:sz w:val="17"/>
                 <w:szCs w:val="17"/>
               </w:rPr>
-              <w:t xml:space="preserve">0.291</w:t>
+              <w:t xml:space="preserve">0.281</w:t>
             </w:r>
           </w:p>
         </w:tc>
@@ -23225,7 +23225,7 @@
                 <w:sz w:val="17"/>
                 <w:szCs w:val="17"/>
               </w:rPr>
-              <w:t xml:space="preserve">0.302</w:t>
+              <w:t xml:space="preserve">0.292</w:t>
             </w:r>
           </w:p>
         </w:tc>
@@ -23521,7 +23521,7 @@
                 <w:sz w:val="17"/>
                 <w:szCs w:val="17"/>
               </w:rPr>
-              <w:t xml:space="preserve">13.892 (2.207) [&lt;0.001]</w:t>
+              <w:t xml:space="preserve">13.884 (2.236) [&lt;0.001]</w:t>
             </w:r>
           </w:p>
         </w:tc>
@@ -23554,7 +23554,7 @@
                 <w:sz w:val="17"/>
                 <w:szCs w:val="17"/>
               </w:rPr>
-              <w:t xml:space="preserve">9.248 (3.048) [0.002]</w:t>
+              <w:t xml:space="preserve">9.328 (3.078) [0.002]</w:t>
             </w:r>
           </w:p>
         </w:tc>
@@ -23587,7 +23587,7 @@
                 <w:sz w:val="17"/>
                 <w:szCs w:val="17"/>
               </w:rPr>
-              <w:t xml:space="preserve">9.905 (3.017) [0.001]</w:t>
+              <w:t xml:space="preserve">9.994 (3.046) [0.001]</w:t>
             </w:r>
           </w:p>
         </w:tc>
@@ -23620,7 +23620,7 @@
                 <w:sz w:val="17"/>
                 <w:szCs w:val="17"/>
               </w:rPr>
-              <w:t xml:space="preserve">7.394 (3.315) [0.026]</w:t>
+              <w:t xml:space="preserve">7.525 (3.341) [0.024]</w:t>
             </w:r>
           </w:p>
         </w:tc>
@@ -23724,7 +23724,7 @@
                 <w:sz w:val="17"/>
                 <w:szCs w:val="17"/>
               </w:rPr>
-              <w:t xml:space="preserve">0.040 (0.013) [0.002]</w:t>
+              <w:t xml:space="preserve">0.039 (0.013) [0.003]</w:t>
             </w:r>
           </w:p>
         </w:tc>
@@ -23757,7 +23757,7 @@
                 <w:sz w:val="17"/>
                 <w:szCs w:val="17"/>
               </w:rPr>
-              <w:t xml:space="preserve">-0.095 (0.027) [&lt;0.001]</w:t>
+              <w:t xml:space="preserve">-0.094 (0.027) [&lt;0.001]</w:t>
             </w:r>
           </w:p>
         </w:tc>
@@ -23790,7 +23790,7 @@
                 <w:sz w:val="17"/>
                 <w:szCs w:val="17"/>
               </w:rPr>
-              <w:t xml:space="preserve">0.043 (0.039) [0.264]</w:t>
+              <w:t xml:space="preserve">0.043 (0.038) [0.262]</w:t>
             </w:r>
           </w:p>
         </w:tc>
@@ -23927,7 +23927,7 @@
                 <w:sz w:val="17"/>
                 <w:szCs w:val="17"/>
               </w:rPr>
-              <w:t xml:space="preserve">0.0091 (0.0021) [&lt;0.001]</w:t>
+              <w:t xml:space="preserve">0.0090 (0.0021) [&lt;0.001]</w:t>
             </w:r>
           </w:p>
         </w:tc>
@@ -23960,7 +23960,7 @@
                 <w:sz w:val="17"/>
                 <w:szCs w:val="17"/>
               </w:rPr>
-              <w:t xml:space="preserve">0.0103 (0.0021) [&lt;0.001]</w:t>
+              <w:t xml:space="preserve">0.0101 (0.0022) [&lt;0.001]</w:t>
             </w:r>
           </w:p>
         </w:tc>
@@ -24064,7 +24064,7 @@
                 <w:sz w:val="17"/>
                 <w:szCs w:val="17"/>
               </w:rPr>
-              <w:t xml:space="preserve">0.124 (0.160) [0.439]</w:t>
+              <w:t xml:space="preserve">-0.047 (0.016) [0.002]</w:t>
             </w:r>
           </w:p>
         </w:tc>
@@ -24097,7 +24097,7 @@
                 <w:sz w:val="17"/>
                 <w:szCs w:val="17"/>
               </w:rPr>
-              <w:t xml:space="preserve">0.154 (0.157) [0.329]</w:t>
+              <w:t xml:space="preserve">-0.051 (0.015) [0.001]</w:t>
             </w:r>
           </w:p>
         </w:tc>
@@ -24130,7 +24130,7 @@
                 <w:sz w:val="17"/>
                 <w:szCs w:val="17"/>
               </w:rPr>
-              <w:t xml:space="preserve">0.187 (0.160) [0.243]</w:t>
+              <w:t xml:space="preserve">-0.038 (0.017) [0.024]</w:t>
             </w:r>
           </w:p>
         </w:tc>
@@ -24300,7 +24300,7 @@
                 <w:sz w:val="17"/>
                 <w:szCs w:val="17"/>
               </w:rPr>
-              <w:t xml:space="preserve">-0.051 (0.012) [&lt;0.001]</w:t>
+              <w:t xml:space="preserve">-0.050 (0.012) [&lt;0.001]</w:t>
             </w:r>
           </w:p>
         </w:tc>
@@ -24541,7 +24541,7 @@
                 <w:sz w:val="17"/>
                 <w:szCs w:val="17"/>
               </w:rPr>
-              <w:t xml:space="preserve">0.093</w:t>
+              <w:t xml:space="preserve">0.085</w:t>
             </w:r>
           </w:p>
         </w:tc>
@@ -24574,7 +24574,7 @@
                 <w:sz w:val="17"/>
                 <w:szCs w:val="17"/>
               </w:rPr>
-              <w:t xml:space="preserve">0.107</w:t>
+              <w:t xml:space="preserve">0.098</w:t>
             </w:r>
           </w:p>
         </w:tc>
@@ -24607,7 +24607,7 @@
                 <w:sz w:val="17"/>
                 <w:szCs w:val="17"/>
               </w:rPr>
-              <w:t xml:space="preserve">0.149</w:t>
+              <w:t xml:space="preserve">0.139</w:t>
             </w:r>
           </w:p>
         </w:tc>
@@ -24640,7 +24640,7 @@
                 <w:sz w:val="17"/>
                 <w:szCs w:val="17"/>
               </w:rPr>
-              <w:t xml:space="preserve">0.167</w:t>
+              <w:t xml:space="preserve">0.157</w:t>
             </w:r>
           </w:p>
         </w:tc>
@@ -24936,7 +24936,7 @@
                 <w:sz w:val="17"/>
                 <w:szCs w:val="17"/>
               </w:rPr>
-              <w:t xml:space="preserve">6.206 (1.586) [&lt;0.001]</w:t>
+              <w:t xml:space="preserve">6.089 (1.594) [&lt;0.001]</w:t>
             </w:r>
           </w:p>
         </w:tc>
@@ -24969,7 +24969,7 @@
                 <w:sz w:val="17"/>
                 <w:szCs w:val="17"/>
               </w:rPr>
-              <w:t xml:space="preserve">-1.118 (1.926) [0.562]</w:t>
+              <w:t xml:space="preserve">-1.175 (1.960) [0.549]</w:t>
             </w:r>
           </w:p>
         </w:tc>
@@ -25002,7 +25002,7 @@
                 <w:sz w:val="17"/>
                 <w:szCs w:val="17"/>
               </w:rPr>
-              <w:t xml:space="preserve">0.941 (1.858) [0.613]</w:t>
+              <w:t xml:space="preserve">0.864 (1.877) [0.645]</w:t>
             </w:r>
           </w:p>
         </w:tc>
@@ -25139,7 +25139,7 @@
                 <w:sz w:val="17"/>
                 <w:szCs w:val="17"/>
               </w:rPr>
-              <w:t xml:space="preserve">0.044 (0.010) [&lt;0.001]</w:t>
+              <w:t xml:space="preserve">0.043 (0.010) [&lt;0.001]</w:t>
             </w:r>
           </w:p>
         </w:tc>
@@ -25172,7 +25172,7 @@
                 <w:sz w:val="17"/>
                 <w:szCs w:val="17"/>
               </w:rPr>
-              <w:t xml:space="preserve">-0.055 (0.022) [0.012]</w:t>
+              <w:t xml:space="preserve">-0.054 (0.022) [0.014]</w:t>
             </w:r>
           </w:p>
         </w:tc>
@@ -25205,7 +25205,7 @@
                 <w:sz w:val="17"/>
                 <w:szCs w:val="17"/>
               </w:rPr>
-              <w:t xml:space="preserve">0.044 (0.029) [0.133]</w:t>
+              <w:t xml:space="preserve">0.045 (0.029) [0.119]</w:t>
             </w:r>
           </w:p>
         </w:tc>
@@ -25342,7 +25342,7 @@
                 <w:sz w:val="17"/>
                 <w:szCs w:val="17"/>
               </w:rPr>
-              <w:t xml:space="preserve">0.0057 (0.0016) [&lt;0.001]</w:t>
+              <w:t xml:space="preserve">0.0056 (0.0016) [&lt;0.001]</w:t>
             </w:r>
           </w:p>
         </w:tc>
@@ -25375,7 +25375,7 @@
                 <w:sz w:val="17"/>
                 <w:szCs w:val="17"/>
               </w:rPr>
-              <w:t xml:space="preserve">0.0059 (0.0016) [&lt;0.001]</w:t>
+              <w:t xml:space="preserve">0.0058 (0.0017) [&lt;0.001]</w:t>
             </w:r>
           </w:p>
         </w:tc>
@@ -25479,7 +25479,7 @@
                 <w:sz w:val="17"/>
                 <w:szCs w:val="17"/>
               </w:rPr>
-              <w:t xml:space="preserve">-0.004 (0.083) [0.958]</w:t>
+              <w:t xml:space="preserve">0.014 (0.024) [0.558]</w:t>
             </w:r>
           </w:p>
         </w:tc>
@@ -25512,7 +25512,7 @@
                 <w:sz w:val="17"/>
                 <w:szCs w:val="17"/>
               </w:rPr>
-              <w:t xml:space="preserve">-0.026 (0.092) [0.781]</w:t>
+              <w:t xml:space="preserve">-0.010 (0.023) [0.650]</w:t>
             </w:r>
           </w:p>
         </w:tc>
@@ -25545,7 +25545,7 @@
                 <w:sz w:val="17"/>
                 <w:szCs w:val="17"/>
               </w:rPr>
-              <w:t xml:space="preserve">-0.007 (0.088) [0.933]</w:t>
+              <w:t xml:space="preserve">0.000 (0.000) [–]</w:t>
             </w:r>
           </w:p>
         </w:tc>
@@ -25956,7 +25956,7 @@
                 <w:sz w:val="17"/>
                 <w:szCs w:val="17"/>
               </w:rPr>
-              <w:t xml:space="preserve">0.024</w:t>
+              <w:t xml:space="preserve">0.018</w:t>
             </w:r>
           </w:p>
         </w:tc>
@@ -25989,7 +25989,7 @@
                 <w:sz w:val="17"/>
                 <w:szCs w:val="17"/>
               </w:rPr>
-              <w:t xml:space="preserve">0.058</w:t>
+              <w:t xml:space="preserve">0.052</w:t>
             </w:r>
           </w:p>
         </w:tc>
@@ -26022,7 +26022,7 @@
                 <w:sz w:val="17"/>
                 <w:szCs w:val="17"/>
               </w:rPr>
-              <w:t xml:space="preserve">0.103</w:t>
+              <w:t xml:space="preserve">0.095</w:t>
             </w:r>
           </w:p>
         </w:tc>
@@ -26055,7 +26055,7 @@
                 <w:sz w:val="17"/>
                 <w:szCs w:val="17"/>
               </w:rPr>
-              <w:t xml:space="preserve">0.114</w:t>
+              <w:t xml:space="preserve">0.107</w:t>
             </w:r>
           </w:p>
         </w:tc>
@@ -26351,7 +26351,7 @@
                 <w:sz w:val="17"/>
                 <w:szCs w:val="17"/>
               </w:rPr>
-              <w:t xml:space="preserve">0.159 (0.338) [0.637]</w:t>
+              <w:t xml:space="preserve">0.107 (0.320) [0.738]</w:t>
             </w:r>
           </w:p>
         </w:tc>
@@ -26384,7 +26384,7 @@
                 <w:sz w:val="17"/>
                 <w:szCs w:val="17"/>
               </w:rPr>
-              <w:t xml:space="preserve">-1.901 (0.679) [0.005]</w:t>
+              <w:t xml:space="preserve">-1.928 (0.694) [0.005]</w:t>
             </w:r>
           </w:p>
         </w:tc>
@@ -26417,7 +26417,7 @@
                 <w:sz w:val="17"/>
                 <w:szCs w:val="17"/>
               </w:rPr>
-              <w:t xml:space="preserve">-0.761 (0.347) [0.028]</w:t>
+              <w:t xml:space="preserve">-0.824 (0.334) [0.014]</w:t>
             </w:r>
           </w:p>
         </w:tc>
@@ -26554,7 +26554,7 @@
                 <w:sz w:val="17"/>
                 <w:szCs w:val="17"/>
               </w:rPr>
-              <w:t xml:space="preserve">0.010 (0.004) [0.014]</w:t>
+              <w:t xml:space="preserve">0.010 (0.004) [0.015]</w:t>
             </w:r>
           </w:p>
         </w:tc>
@@ -26587,7 +26587,7 @@
                 <w:sz w:val="17"/>
                 <w:szCs w:val="17"/>
               </w:rPr>
-              <w:t xml:space="preserve">-0.013 (0.009) [0.153]</w:t>
+              <w:t xml:space="preserve">-0.013 (0.009) [0.170]</w:t>
             </w:r>
           </w:p>
         </w:tc>
@@ -26620,7 +26620,7 @@
                 <w:sz w:val="17"/>
                 <w:szCs w:val="17"/>
               </w:rPr>
-              <w:t xml:space="preserve">-0.016 (0.009) [0.082]</w:t>
+              <w:t xml:space="preserve">-0.016 (0.009) [0.091]</w:t>
             </w:r>
           </w:p>
         </w:tc>
@@ -26757,7 +26757,7 @@
                 <w:sz w:val="17"/>
                 <w:szCs w:val="17"/>
               </w:rPr>
-              <w:t xml:space="preserve">0.0011 (0.0006) [0.071]</w:t>
+              <w:t xml:space="preserve">0.0011 (0.0006) [0.079]</w:t>
             </w:r>
           </w:p>
         </w:tc>
@@ -26790,7 +26790,7 @@
                 <w:sz w:val="17"/>
                 <w:szCs w:val="17"/>
               </w:rPr>
-              <w:t xml:space="preserve">0.0012 (0.0006) [0.056]</w:t>
+              <w:t xml:space="preserve">0.0012 (0.0006) [0.063]</w:t>
             </w:r>
           </w:p>
         </w:tc>
@@ -26894,7 +26894,7 @@
                 <w:sz w:val="17"/>
                 <w:szCs w:val="17"/>
               </w:rPr>
-              <w:t xml:space="preserve">0.029 (0.012) [0.016]</w:t>
+              <w:t xml:space="preserve">0.028 (0.010) [0.006]</w:t>
             </w:r>
           </w:p>
         </w:tc>
@@ -26927,7 +26927,7 @@
                 <w:sz w:val="17"/>
                 <w:szCs w:val="17"/>
               </w:rPr>
-              <w:t xml:space="preserve">0.012 (0.007) [0.100]</w:t>
+              <w:t xml:space="preserve">0.012 (0.005) [0.014]</w:t>
             </w:r>
           </w:p>
         </w:tc>
@@ -26960,7 +26960,7 @@
                 <w:sz w:val="17"/>
                 <w:szCs w:val="17"/>
               </w:rPr>
-              <w:t xml:space="preserve">0.001 (0.005) [0.841]</w:t>
+              <w:t xml:space="preserve">0.000 (0.000) [–]</w:t>
             </w:r>
           </w:p>
         </w:tc>
@@ -27371,7 +27371,7 @@
                 <w:sz w:val="17"/>
                 <w:szCs w:val="17"/>
               </w:rPr>
-              <w:t xml:space="preserve">0.007</w:t>
+              <w:t xml:space="preserve">0.000</w:t>
             </w:r>
           </w:p>
         </w:tc>
@@ -27404,7 +27404,7 @@
                 <w:sz w:val="17"/>
                 <w:szCs w:val="17"/>
               </w:rPr>
-              <w:t xml:space="preserve">0.022</w:t>
+              <w:t xml:space="preserve">0.014</w:t>
             </w:r>
           </w:p>
         </w:tc>
@@ -27437,7 +27437,7 @@
                 <w:sz w:val="17"/>
                 <w:szCs w:val="17"/>
               </w:rPr>
-              <w:t xml:space="preserve">0.044</w:t>
+              <w:t xml:space="preserve">0.035</w:t>
             </w:r>
           </w:p>
         </w:tc>
@@ -27470,7 +27470,7 @@
                 <w:sz w:val="17"/>
                 <w:szCs w:val="17"/>
               </w:rPr>
-              <w:t xml:space="preserve">0.043</w:t>
+              <w:t xml:space="preserve">0.034</w:t>
             </w:r>
           </w:p>
         </w:tc>
@@ -27801,7 +27801,7 @@
                 <w:sz w:val="17"/>
                 <w:szCs w:val="17"/>
               </w:rPr>
-              <w:t xml:space="preserve">-0.377 (0.115) [0.001]</w:t>
+              <w:t xml:space="preserve">-0.365 (0.115) [0.001]</w:t>
             </w:r>
           </w:p>
         </w:tc>
@@ -27834,7 +27834,7 @@
                 <w:sz w:val="17"/>
                 <w:szCs w:val="17"/>
               </w:rPr>
-              <w:t xml:space="preserve">-0.446 (0.106) [&lt;0.001]</w:t>
+              <w:t xml:space="preserve">-0.435 (0.106) [&lt;0.001]</w:t>
             </w:r>
           </w:p>
         </w:tc>
@@ -27867,7 +27867,7 @@
                 <w:sz w:val="17"/>
                 <w:szCs w:val="17"/>
               </w:rPr>
-              <w:t xml:space="preserve">-0.315 (0.096) [0.001]</w:t>
+              <w:t xml:space="preserve">-0.310 (0.096) [0.001]</w:t>
             </w:r>
           </w:p>
         </w:tc>
@@ -27900,7 +27900,7 @@
                 <w:sz w:val="17"/>
                 <w:szCs w:val="17"/>
               </w:rPr>
-              <w:t xml:space="preserve">-0.156 (0.069) [0.024]</w:t>
+              <w:t xml:space="preserve">-0.153 (0.068) [0.024]</w:t>
             </w:r>
           </w:p>
         </w:tc>
@@ -27933,7 +27933,7 @@
                 <w:sz w:val="17"/>
                 <w:szCs w:val="17"/>
               </w:rPr>
-              <w:t xml:space="preserve">0.000 (0.020) [0.994]</w:t>
+              <w:t xml:space="preserve">0.001 (0.019) [0.959]</w:t>
             </w:r>
           </w:p>
         </w:tc>
@@ -28004,7 +28004,7 @@
                 <w:sz w:val="17"/>
                 <w:szCs w:val="17"/>
               </w:rPr>
-              <w:t xml:space="preserve">-0.077 (0.021) [&lt;0.001]</w:t>
+              <w:t xml:space="preserve">-0.075 (0.021) [&lt;0.001]</w:t>
             </w:r>
           </w:p>
         </w:tc>
@@ -28037,7 +28037,7 @@
                 <w:sz w:val="17"/>
                 <w:szCs w:val="17"/>
               </w:rPr>
-              <w:t xml:space="preserve">-0.064 (0.015) [&lt;0.001]</w:t>
+              <w:t xml:space="preserve">-0.063 (0.015) [&lt;0.001]</w:t>
             </w:r>
           </w:p>
         </w:tc>
@@ -28070,7 +28070,7 @@
                 <w:sz w:val="17"/>
                 <w:szCs w:val="17"/>
               </w:rPr>
-              <w:t xml:space="preserve">-0.051 (0.012) [&lt;0.001]</w:t>
+              <w:t xml:space="preserve">-0.050 (0.012) [&lt;0.001]</w:t>
             </w:r>
           </w:p>
         </w:tc>
@@ -28136,7 +28136,7 @@
                 <w:sz w:val="17"/>
                 <w:szCs w:val="17"/>
               </w:rPr>
-              <w:t xml:space="preserve">-0.003 (0.004) [0.421]</w:t>
+              <w:t xml:space="preserve">-0.003 (0.004) [0.412]</w:t>
             </w:r>
           </w:p>
         </w:tc>
@@ -28207,7 +28207,7 @@
                 <w:sz w:val="17"/>
                 <w:szCs w:val="17"/>
               </w:rPr>
-              <w:t xml:space="preserve">0.338 (0.271) [0.211]</w:t>
+              <w:t xml:space="preserve">0.347 (0.273) [0.204]</w:t>
             </w:r>
           </w:p>
         </w:tc>
@@ -28240,7 +28240,7 @@
                 <w:sz w:val="17"/>
                 <w:szCs w:val="17"/>
               </w:rPr>
-              <w:t xml:space="preserve">0.307 (0.279) [0.271]</w:t>
+              <w:t xml:space="preserve">0.321 (0.282) [0.255]</w:t>
             </w:r>
           </w:p>
         </w:tc>
@@ -28273,7 +28273,7 @@
                 <w:sz w:val="17"/>
                 <w:szCs w:val="17"/>
               </w:rPr>
-              <w:t xml:space="preserve">0.565 (0.229) [0.014]</w:t>
+              <w:t xml:space="preserve">0.562 (0.230) [0.015]</w:t>
             </w:r>
           </w:p>
         </w:tc>
@@ -28306,7 +28306,7 @@
                 <w:sz w:val="17"/>
                 <w:szCs w:val="17"/>
               </w:rPr>
-              <w:t xml:space="preserve">0.381 (0.210) [0.069]</w:t>
+              <w:t xml:space="preserve">0.389 (0.211) [0.065]</w:t>
             </w:r>
           </w:p>
         </w:tc>
@@ -28339,7 +28339,7 @@
                 <w:sz w:val="17"/>
                 <w:szCs w:val="17"/>
               </w:rPr>
-              <w:t xml:space="preserve">0.088 (0.089) [0.324]</w:t>
+              <w:t xml:space="preserve">0.094 (0.089) [0.289]</w:t>
             </w:r>
           </w:p>
         </w:tc>
@@ -28410,7 +28410,7 @@
                 <w:sz w:val="17"/>
                 <w:szCs w:val="17"/>
               </w:rPr>
-              <w:t xml:space="preserve">-0.110 (0.043) [0.010]</w:t>
+              <w:t xml:space="preserve">-0.109 (0.043) [0.011]</w:t>
             </w:r>
           </w:p>
         </w:tc>
@@ -28476,7 +28476,7 @@
                 <w:sz w:val="17"/>
                 <w:szCs w:val="17"/>
               </w:rPr>
-              <w:t xml:space="preserve">-0.093 (0.027) [&lt;0.001]</w:t>
+              <w:t xml:space="preserve">-0.092 (0.027) [&lt;0.001]</w:t>
             </w:r>
           </w:p>
         </w:tc>
@@ -28509,7 +28509,7 @@
                 <w:sz w:val="17"/>
                 <w:szCs w:val="17"/>
               </w:rPr>
-              <w:t xml:space="preserve">-0.051 (0.022) [0.018]</w:t>
+              <w:t xml:space="preserve">-0.052 (0.022) [0.018]</w:t>
             </w:r>
           </w:p>
         </w:tc>
@@ -28542,7 +28542,7 @@
                 <w:sz w:val="17"/>
                 <w:szCs w:val="17"/>
               </w:rPr>
-              <w:t xml:space="preserve">-0.009 (0.009) [0.345]</w:t>
+              <w:t xml:space="preserve">-0.009 (0.009) [0.321]</w:t>
             </w:r>
           </w:p>
         </w:tc>

</xml_diff>

<commit_message>
Valuing Prospects v2.6: the model after 2026-10-20 (fit rows inside club control; two verdicts follow today's numbers)
Linear production added to draft position is no longer statistically
significant (p = 0.053); draft position from D+5 is no longer negative
(+$0.07M, p = 0.944). The document now says what today's numbers show.
Two finished tests re-pinned to today's rows; every guard passes.

Co-Authored-By: Claude Opus 5.5 <noreply@anthropic.com>
</commit_message>
<xml_diff>
--- a/40_DOCS/Supervisor_Drafts/Valuing Prospects.docx
+++ b/40_DOCS/Supervisor_Drafts/Valuing Prospects.docx
@@ -47,7 +47,7 @@
         <w:rPr>
           <w:rFonts w:ascii="Calibri" w:cs="Calibri" w:eastAsia="Calibri" w:hAnsi="Calibri"/>
         </w:rPr>
-        <w:t xml:space="preserve">The model learns from 2,316 of the 2,322 players drafted from 2007 to 2017 whose careers are long enough to observe. Seasons are named from the draft: D0 is the draft season, which ends with the draft, and D+1 is the season after it, and so on. The outcome is each player's remaining surplus, measured in each season from D+1 on in which he was still a prospect. Remaining surplus is the surplus he went on to deliver from that season to the end of his club's control. A prospect traded between the draft and the start of D+1 is valued as in D+1.</w:t>
+        <w:t xml:space="preserve">The model learns from 2,316 of the 2,322 players drafted from 2007 to 2017 whose careers are long enough to observe. Seasons are named from the draft: D0 is the draft season, which ends with the draft, and D+1 is the season after it, and so on. The outcome is each player's remaining surplus, measured in each season from D+1 on in which he was still a prospect and his club still controlled him. Remaining surplus is the surplus he went on to deliver from that season to the end of his club's control. A prospect traded between the draft and the start of D+1 is valued as in D+1.</w:t>
       </w:r>
     </w:p>
     <w:p>
@@ -1070,7 +1070,7 @@
           <w:sz w:val="18"/>
           <w:szCs w:val="18"/>
         </w:rPr>
-        <w:t xml:space="preserve">Drafted players of 2007 to 2017 who never played an NHL season and died before their club's control would have ended, from Wikipedia's list of ice hockey players who died during their careers, each matched to the draft records by draft year and overall pick. Leaving them out moves the star value at the draft from $18.03 million to $18.04 million.</w:t>
+        <w:t xml:space="preserve">Drafted players of 2007 to 2017 who never played an NHL season and died before their club's control would have ended, from Wikipedia's list of ice hockey players who died during their careers, each matched to the draft records by draft year and overall pick. Leaving them out moved the star value at the draft from $18.03 million to $18.04 million when it was measured (October 16, 2026).</w:t>
       </w:r>
     </w:p>
     <w:p>
@@ -1105,7 +1105,7 @@
         <w:rPr>
           <w:rFonts w:ascii="Calibri" w:cs="Calibri" w:eastAsia="Calibri" w:hAnsi="Calibri"/>
         </w:rPr>
-        <w:t xml:space="preserve">The answer depends on when drafted players reach the NHL. Of the 2,316 drafted players, 997 (43.0%) played an NHL season of 10 or more games (a goaltender, an NHL game) before their club's control ended; the other 1,319 never did. How many arrive, and when, depends on where they were drafted (Figure 1). Of the 110 top-ten picks, 36.4% had reached the NHL by D+1, 76.4% by D+2 and 90.0% by D+3, and 109 reached it in the end. Of the 1,647 picks from rounds 3 to 7, 6.0% had reached it by D+3 and 12.9% by D+4, and only 29.4% ever did. A top pick who is still a prospect in D+4 is therefore unusual, and later picks who reach the NHL at all reach it later.</w:t>
+        <w:t xml:space="preserve">The answer depends on when drafted players reach the NHL. Of the 2,316 drafted players, 999 (43.1%) played an NHL season of 10 or more games (a goaltender, an NHL game) before their club's control ended; the other 1,317 never did. How many arrive, and when, depends on where they were drafted (Figure 1). Of the 110 top-ten picks, 36.4% had reached the NHL by D+1, 76.4% by D+2 and 90.0% by D+3, and 109 reached it in the end. Of the 1,647 picks from rounds 3 to 7, 6.0% had reached it by D+3 and 12.9% by D+4, and only 29.6% ever did. A top pick who is still a prospect in D+4 is therefore unusual, and later picks who reach the NHL at all reach it later.</w:t>
       </w:r>
     </w:p>
     <w:p>
@@ -1192,7 +1192,7 @@
         <w:rPr>
           <w:rFonts w:ascii="Calibri" w:cs="Calibri" w:eastAsia="Calibri" w:hAnsi="Calibri"/>
         </w:rPr>
-        <w:t xml:space="preserve">To measure how the value of draft position changes, I regressed each prospect's remaining surplus on the star probability for his draft position, interacted with an indicator for each season from D+1 to D+4 and one for D+5 onwards, using every season in which a drafted player was still a prospect. The coefficient for each season is that season's star value, which is what a prospect still unproven in that season would be worth if he were certain to become a star. As in the draft pick curve, the regression has no intercept, so a draft position with no star probability is worth zero.</w:t>
+        <w:t xml:space="preserve">To measure how the value of draft position changes, I regressed each prospect's remaining surplus on the star probability for his draft position, interacted with an indicator for each season from D+1 to D+4 and one for D+5 onwards, using every season in which a drafted player was still a prospect and still under his club's control. The coefficient for each season is that season's star value, which is what a prospect still unproven in that season would be worth if he were certain to become a star. As in the draft pick curve, the regression has no intercept, so a draft position with no star probability is worth zero.</w:t>
       </w:r>
     </w:p>
     <w:p>
@@ -1246,7 +1246,7 @@
         <w:rPr>
           <w:rFonts w:ascii="Calibri" w:cs="Calibri" w:eastAsia="Calibri" w:hAnsi="Calibri"/>
         </w:rPr>
-        <w:t xml:space="preserve">For example, a #10 pick (star probability 21.2%) who is still a prospect in D+3 is worth 0.212 × $15.74 million = $3.34 million.</w:t>
+        <w:t xml:space="preserve">For example, a #10 pick (star probability 21.2%) who is still a prospect in D+3 is worth 0.212 × $16.16 million = $3.43 million.</w:t>
       </w:r>
     </w:p>
     <w:p>
@@ -1663,7 +1663,7 @@
                 <w:sz w:val="17"/>
                 <w:szCs w:val="17"/>
               </w:rPr>
-              <w:t xml:space="preserve">$18.04M (1.75)</w:t>
+              <w:t xml:space="preserve">$18.18M (1.74)</w:t>
             </w:r>
           </w:p>
         </w:tc>
@@ -1729,7 +1729,7 @@
                 <w:sz w:val="17"/>
                 <w:szCs w:val="17"/>
               </w:rPr>
-              <w:t xml:space="preserve">$13.49M</w:t>
+              <w:t xml:space="preserve">$13.59M</w:t>
             </w:r>
           </w:p>
         </w:tc>
@@ -1762,7 +1762,7 @@
                 <w:sz w:val="17"/>
                 <w:szCs w:val="17"/>
               </w:rPr>
-              <w:t xml:space="preserve">$3.83M</w:t>
+              <w:t xml:space="preserve">$3.85M</w:t>
             </w:r>
           </w:p>
         </w:tc>
@@ -1795,7 +1795,7 @@
                 <w:sz w:val="17"/>
                 <w:szCs w:val="17"/>
               </w:rPr>
-              <w:t xml:space="preserve">$1.34M</w:t>
+              <w:t xml:space="preserve">$1.35M</w:t>
             </w:r>
           </w:p>
         </w:tc>
@@ -1932,7 +1932,7 @@
                 <w:sz w:val="17"/>
                 <w:szCs w:val="17"/>
               </w:rPr>
-              <w:t xml:space="preserve">$17.67M (1.79)</w:t>
+              <w:t xml:space="preserve">$17.94M (1.79)</w:t>
             </w:r>
           </w:p>
         </w:tc>
@@ -1998,7 +1998,7 @@
                 <w:sz w:val="17"/>
                 <w:szCs w:val="17"/>
               </w:rPr>
-              <w:t xml:space="preserve">$13.21M</w:t>
+              <w:t xml:space="preserve">$13.41M</w:t>
             </w:r>
           </w:p>
         </w:tc>
@@ -2031,7 +2031,7 @@
                 <w:sz w:val="17"/>
                 <w:szCs w:val="17"/>
               </w:rPr>
-              <w:t xml:space="preserve">$3.75M</w:t>
+              <w:t xml:space="preserve">$3.80M</w:t>
             </w:r>
           </w:p>
         </w:tc>
@@ -2064,7 +2064,7 @@
                 <w:sz w:val="17"/>
                 <w:szCs w:val="17"/>
               </w:rPr>
-              <w:t xml:space="preserve">$1.31M</w:t>
+              <w:t xml:space="preserve">$1.33M</w:t>
             </w:r>
           </w:p>
         </w:tc>
@@ -2201,7 +2201,7 @@
                 <w:sz w:val="17"/>
                 <w:szCs w:val="17"/>
               </w:rPr>
-              <w:t xml:space="preserve">$15.74M (2.20)</w:t>
+              <w:t xml:space="preserve">$16.16M (2.18)</w:t>
             </w:r>
           </w:p>
         </w:tc>
@@ -2267,7 +2267,7 @@
                 <w:sz w:val="17"/>
                 <w:szCs w:val="17"/>
               </w:rPr>
-              <w:t xml:space="preserve">$11.76M</w:t>
+              <w:t xml:space="preserve">$12.08M</w:t>
             </w:r>
           </w:p>
         </w:tc>
@@ -2300,7 +2300,7 @@
                 <w:sz w:val="17"/>
                 <w:szCs w:val="17"/>
               </w:rPr>
-              <w:t xml:space="preserve">$3.34M</w:t>
+              <w:t xml:space="preserve">$3.43M</w:t>
             </w:r>
           </w:p>
         </w:tc>
@@ -2333,7 +2333,7 @@
                 <w:sz w:val="17"/>
                 <w:szCs w:val="17"/>
               </w:rPr>
-              <w:t xml:space="preserve">$1.17M</w:t>
+              <w:t xml:space="preserve">$1.20M</w:t>
             </w:r>
           </w:p>
         </w:tc>
@@ -2470,7 +2470,7 @@
                 <w:sz w:val="17"/>
                 <w:szCs w:val="17"/>
               </w:rPr>
-              <w:t xml:space="preserve">$8.79M (1.72)</w:t>
+              <w:t xml:space="preserve">$9.44M (1.71)</w:t>
             </w:r>
           </w:p>
         </w:tc>
@@ -2536,7 +2536,7 @@
                 <w:sz w:val="17"/>
                 <w:szCs w:val="17"/>
               </w:rPr>
-              <w:t xml:space="preserve">$6.57M</w:t>
+              <w:t xml:space="preserve">$7.05M</w:t>
             </w:r>
           </w:p>
         </w:tc>
@@ -2569,7 +2569,7 @@
                 <w:sz w:val="17"/>
                 <w:szCs w:val="17"/>
               </w:rPr>
-              <w:t xml:space="preserve">$1.86M</w:t>
+              <w:t xml:space="preserve">$2.00M</w:t>
             </w:r>
           </w:p>
         </w:tc>
@@ -2602,7 +2602,7 @@
                 <w:sz w:val="17"/>
                 <w:szCs w:val="17"/>
               </w:rPr>
-              <w:t xml:space="preserve">$0.65M</w:t>
+              <w:t xml:space="preserve">$0.70M</w:t>
             </w:r>
           </w:p>
         </w:tc>
@@ -2706,7 +2706,7 @@
                 <w:sz w:val="17"/>
                 <w:szCs w:val="17"/>
               </w:rPr>
-              <w:t xml:space="preserve">1,759 (6,074 prospect-seasons)</w:t>
+              <w:t xml:space="preserve">1,755 (5,954 prospect-seasons)</w:t>
             </w:r>
           </w:p>
         </w:tc>
@@ -2739,7 +2739,7 @@
                 <w:sz w:val="17"/>
                 <w:szCs w:val="17"/>
               </w:rPr>
-              <w:t xml:space="preserve">$1.94M (0.66)</w:t>
+              <w:t xml:space="preserve">$2.59M (0.77)</w:t>
             </w:r>
           </w:p>
         </w:tc>
@@ -2772,7 +2772,7 @@
                 <w:sz w:val="17"/>
                 <w:szCs w:val="17"/>
               </w:rPr>
-              <w:t xml:space="preserve">0.003</w:t>
+              <w:t xml:space="preserve">&lt;0.001</w:t>
             </w:r>
           </w:p>
         </w:tc>
@@ -2805,7 +2805,7 @@
                 <w:sz w:val="17"/>
                 <w:szCs w:val="17"/>
               </w:rPr>
-              <w:t xml:space="preserve">$1.45M</w:t>
+              <w:t xml:space="preserve">$1.94M</w:t>
             </w:r>
           </w:p>
         </w:tc>
@@ -2838,7 +2838,7 @@
                 <w:sz w:val="17"/>
                 <w:szCs w:val="17"/>
               </w:rPr>
-              <w:t xml:space="preserve">$0.41M</w:t>
+              <w:t xml:space="preserve">$0.55M</w:t>
             </w:r>
           </w:p>
         </w:tc>
@@ -2871,7 +2871,7 @@
                 <w:sz w:val="17"/>
                 <w:szCs w:val="17"/>
               </w:rPr>
-              <w:t xml:space="preserve">$0.14M</w:t>
+              <w:t xml:space="preserve">$0.19M</w:t>
             </w:r>
           </w:p>
         </w:tc>
@@ -2932,7 +2932,7 @@
         <w:rPr>
           <w:rFonts w:ascii="Calibri" w:cs="Calibri" w:eastAsia="Calibri" w:hAnsi="Calibri"/>
         </w:rPr>
-        <w:t xml:space="preserve">A prospect keeps most of his draft position's value through D+3 ($17.67 million in D+2 and $15.74 million in D+3) and loses most of it over the next two seasons ($8.79 million in D+4 and $1.94 million from D+5 on). Each estimate is statistically significant at the 1% level; the largest p-value is 0.003, from D+5 on. The value falls sharply after D+3 because of who is left. By D+4, nearly each top pick who will reach the NHL has done so, so the prospects still unproven are mostly later picks and the top picks who missed: of the 110 top-ten picks of 2007-2017, 26 were still prospects in D+3 and 11 in D+4. Among the prospects left, draft position no longer separates the players who will succeed from those who will not.</w:t>
+        <w:t xml:space="preserve">A prospect keeps most of his draft position's value through D+3 ($17.94 million in D+2 and $16.16 million in D+3) and loses most of it over the next two seasons ($9.44 million in D+4 and $2.59 million from D+5 on). Each estimate is statistically significant at the 1% level; the largest p-value is 0.001, from D+5 on. The value falls sharply after D+3 because of who is left. By D+4, nearly each top pick who will reach the NHL has done so, so the prospects still unproven are mostly later picks and the top picks who missed: of the 110 top-ten picks of 2007-2017, 26 were still prospects in D+3 and 11 in D+4. Among the prospects left, draft position no longer separates the players who will succeed from those who will not.</w:t>
       </w:r>
     </w:p>
     <w:p>
@@ -2972,7 +2972,7 @@
         <w:rPr>
           <w:rFonts w:ascii="Calibri" w:cs="Calibri" w:eastAsia="Calibri" w:hAnsi="Calibri"/>
         </w:rPr>
-        <w:t xml:space="preserve">One value for every season, the draft-day value kept for as long as a player remains a prospect (fitted: $14.83 million).</w:t>
+        <w:t xml:space="preserve">One value for every season, the draft-day value kept for as long as a player remains a prospect (fitted: $15.15 million).</w:t>
       </w:r>
     </w:p>
     <w:p>
@@ -2988,7 +2988,7 @@
         <w:rPr>
           <w:rFonts w:ascii="Calibri" w:cs="Calibri" w:eastAsia="Calibri" w:hAnsi="Calibri"/>
         </w:rPr>
-        <w:t xml:space="preserve">A straight-line decline: the star value equals a starting value plus a fixed change for each season since the draft. This is one regression with a single interaction term, star probability × seasons since the draft. Fitted: $18.92 million in D+1, falling $2.91 million a season.</w:t>
+        <w:t xml:space="preserve">A straight-line decline: the star value equals a starting value plus a fixed change for each season since the draft. This is one regression with a single interaction term, star probability × seasons since the draft. Fitted: $19.12 million in D+1, falling $2.83 million a season.</w:t>
       </w:r>
     </w:p>
     <w:p>
@@ -3004,7 +3004,7 @@
         <w:rPr>
           <w:rFonts w:ascii="Calibri" w:cs="Calibri" w:eastAsia="Calibri" w:hAnsi="Calibri"/>
         </w:rPr>
-        <w:t xml:space="preserve">The same percentage decline each season: the value keeps a fixed share of itself each season. Fitted: $19.16 million in D+1, keeping 79.9% each season.</w:t>
+        <w:t xml:space="preserve">The same percentage decline each season: the value keeps a fixed share of itself each season. Fitted: $19.31 million in D+1, keeping 81.0% each season.</w:t>
       </w:r>
     </w:p>
     <w:p>
@@ -3394,7 +3394,7 @@
                 <w:sz w:val="17"/>
                 <w:szCs w:val="17"/>
               </w:rPr>
-              <w:t xml:space="preserve">2.4116</w:t>
+              <w:t xml:space="preserve">2.4375</w:t>
             </w:r>
           </w:p>
         </w:tc>
@@ -3460,7 +3460,7 @@
                 <w:sz w:val="17"/>
                 <w:szCs w:val="17"/>
               </w:rPr>
-              <w:t xml:space="preserve">1.94</w:t>
+              <w:t xml:space="preserve">2.59</w:t>
             </w:r>
           </w:p>
         </w:tc>
@@ -3493,7 +3493,7 @@
                 <w:sz w:val="17"/>
                 <w:szCs w:val="17"/>
               </w:rPr>
-              <w:t xml:space="preserve">57.99</w:t>
+              <w:t xml:space="preserve">61.78</w:t>
             </w:r>
           </w:p>
         </w:tc>
@@ -3597,7 +3597,7 @@
                 <w:sz w:val="17"/>
                 <w:szCs w:val="17"/>
               </w:rPr>
-              <w:t xml:space="preserve">2.4346</w:t>
+              <w:t xml:space="preserve">2.4586</w:t>
             </w:r>
           </w:p>
         </w:tc>
@@ -3663,7 +3663,7 @@
                 <w:sz w:val="17"/>
                 <w:szCs w:val="17"/>
               </w:rPr>
-              <w:t xml:space="preserve">14.83</w:t>
+              <w:t xml:space="preserve">15.15</w:t>
             </w:r>
           </w:p>
         </w:tc>
@@ -3696,7 +3696,7 @@
                 <w:sz w:val="17"/>
                 <w:szCs w:val="17"/>
               </w:rPr>
-              <w:t xml:space="preserve">107.19</w:t>
+              <w:t xml:space="preserve">109.27</w:t>
             </w:r>
           </w:p>
         </w:tc>
@@ -3800,7 +3800,7 @@
                 <w:sz w:val="17"/>
                 <w:szCs w:val="17"/>
               </w:rPr>
-              <w:t xml:space="preserve">2.4121</w:t>
+              <w:t xml:space="preserve">2.4378</w:t>
             </w:r>
           </w:p>
         </w:tc>
@@ -3833,7 +3833,7 @@
                 <w:sz w:val="17"/>
                 <w:szCs w:val="17"/>
               </w:rPr>
-              <w:t xml:space="preserve">0.339</w:t>
+              <w:t xml:space="preserve">0.414</w:t>
             </w:r>
           </w:p>
         </w:tc>
@@ -3866,7 +3866,7 @@
                 <w:sz w:val="17"/>
                 <w:szCs w:val="17"/>
               </w:rPr>
-              <w:t xml:space="preserve">7.30</w:t>
+              <w:t xml:space="preserve">7.82</w:t>
             </w:r>
           </w:p>
         </w:tc>
@@ -3899,7 +3899,7 @@
                 <w:sz w:val="17"/>
                 <w:szCs w:val="17"/>
               </w:rPr>
-              <w:t xml:space="preserve">66.14</w:t>
+              <w:t xml:space="preserve">69.51</w:t>
             </w:r>
           </w:p>
         </w:tc>
@@ -3932,7 +3932,7 @@
                 <w:sz w:val="17"/>
                 <w:szCs w:val="17"/>
               </w:rPr>
-              <w:t xml:space="preserve">16</w:t>
+              <w:t xml:space="preserve">15</w:t>
             </w:r>
           </w:p>
         </w:tc>
@@ -4003,7 +4003,7 @@
                 <w:sz w:val="17"/>
                 <w:szCs w:val="17"/>
               </w:rPr>
-              <w:t xml:space="preserve">2.4146</w:t>
+              <w:t xml:space="preserve">2.4401</w:t>
             </w:r>
           </w:p>
         </w:tc>
@@ -4036,7 +4036,7 @@
                 <w:sz w:val="17"/>
                 <w:szCs w:val="17"/>
               </w:rPr>
-              <w:t xml:space="preserve">0.107</w:t>
+              <w:t xml:space="preserve">0.139</w:t>
             </w:r>
           </w:p>
         </w:tc>
@@ -4069,7 +4069,7 @@
                 <w:sz w:val="17"/>
                 <w:szCs w:val="17"/>
               </w:rPr>
-              <w:t xml:space="preserve">7.80</w:t>
+              <w:t xml:space="preserve">8.31</w:t>
             </w:r>
           </w:p>
         </w:tc>
@@ -4102,7 +4102,7 @@
                 <w:sz w:val="17"/>
                 <w:szCs w:val="17"/>
               </w:rPr>
-              <w:t xml:space="preserve">71.03</w:t>
+              <w:t xml:space="preserve">74.14</w:t>
             </w:r>
           </w:p>
         </w:tc>
@@ -4152,7 +4152,7 @@
           <w:sz w:val="18"/>
           <w:szCs w:val="18"/>
         </w:rPr>
-        <w:t xml:space="preserve">Held-out error: each draft is predicted from a fit without it, and the error is the root mean squared error in millions of dollars of remaining surplus per prospect-season, over 14,718 prospect-seasons; lower is better, and the lowest is in bold. One-sided p: the 11 drafts are redrawn with replacement 2,000 times, and p is the share of redraws in which the adopted model's total squared error is not lower than the alternative's. It is one-sided because the question is directional: is the adopted model better?</w:t>
+        <w:t xml:space="preserve">Held-out error: each draft is predicted from a fit without it, and the error is the root mean squared error in millions of dollars of remaining surplus per prospect-season, over 14,598 prospect-seasons; lower is better, and the lowest is in bold. One-sided p: the 11 drafts are redrawn with replacement 2,000 times, and p is the share of redraws in which the adopted model's total squared error is not lower than the alternative's. It is one-sided because the question is directional: is the adopted model better?</w:t>
       </w:r>
     </w:p>
     <w:p>
@@ -4163,7 +4163,7 @@
         <w:rPr>
           <w:rFonts w:ascii="Calibri" w:cs="Calibri" w:eastAsia="Calibri" w:hAnsi="Calibri"/>
         </w:rPr>
-        <w:t xml:space="preserve">One value for every season predicts worse than a separate value for each season (p &lt; 0.001). The straight-line and same-percentage declines predict about as well (p = 0.339 and 0.107), so the choice does not rest on prediction. I chose a separate value for each season for two reasons. First, it imposes no shape on the decline, and the estimates hold through D+3 and then fall, which matches when top picks reach the NHL (Figure 1). Second, the straight-line decline keeps falling past zero: from D+8 it values a top pick below a late pick, and it values 16 of the 197 traded prospects below zero.</w:t>
+        <w:t xml:space="preserve">One value for every season predicts worse than a separate value for each season (p &lt; 0.001). The straight-line and same-percentage declines predict about as well (p = 0.414 and 0.139), so the choice does not rest on prediction. I chose a separate value for each season for two reasons. First, it imposes no shape on the decline, and the estimates hold through D+3 and then fall, which matches when top picks reach the NHL (Figure 1). Second, the straight-line decline keeps falling past zero: from D+8 it values a top pick below a late pick, and it values 15 of the 197 traded prospects below zero.</w:t>
       </w:r>
     </w:p>
     <w:p>
@@ -4309,7 +4309,7 @@
         <w:rPr>
           <w:rFonts w:ascii="Calibri" w:cs="Calibri" w:eastAsia="Calibri" w:hAnsi="Calibri"/>
         </w:rPr>
-        <w:t xml:space="preserve">A season's production is the player's points, sourced from Elite Prospects, times his league-season's NHLe factor, per 82 games, counted for seasons of 10 or more games. His production level weights his three seasons before the valuation season 50/30/20, most recent first, rescaled over the seasons he has. A prospect with no eligible season (3.9% of prospect-seasons) gets an indicator for having no record, so missing data is not read as zero scoring. Almost all are in D+1 (88) or from D+5 on (409); only 17 fall in D+2 to D+4, so the indicator's coefficient there rests on very few players. The median production level rises from 5.7 NHLe points per 82 games in D+1 to 9.6 from D+5 on.</w:t>
+        <w:t xml:space="preserve">A season's production is the player's points, sourced from Elite Prospects, times his league-season's NHLe factor, per 82 games, counted for seasons of 10 or more games. His production level weights his three seasons before the valuation season 50/30/20, most recent first, rescaled over the seasons he has. A prospect with no eligible season (3.9% of prospect-seasons) gets an indicator for having no record, so missing data is not read as zero scoring. Almost all are in D+1 (88) or from D+5 on (401); only 17 fall in D+2 to D+4, so the indicator's coefficient there rests on very few players. The median production level rises from 5.7 NHLe points per 82 games in D+1 to 9.6 from D+5 on.</w:t>
       </w:r>
     </w:p>
     <w:p>
@@ -4728,7 +4728,7 @@
                 <w:sz w:val="17"/>
                 <w:szCs w:val="17"/>
               </w:rPr>
-              <w:t xml:space="preserve">2.2451</w:t>
+              <w:t xml:space="preserve">2.2593</w:t>
             </w:r>
           </w:p>
         </w:tc>
@@ -4794,7 +4794,7 @@
                 <w:sz w:val="17"/>
                 <w:szCs w:val="17"/>
               </w:rPr>
-              <w:t xml:space="preserve">3.3314</w:t>
+              <w:t xml:space="preserve">3.3329</w:t>
             </w:r>
           </w:p>
         </w:tc>
@@ -4827,7 +4827,7 @@
                 <w:sz w:val="17"/>
                 <w:szCs w:val="17"/>
               </w:rPr>
-              <w:t xml:space="preserve">3.0448</w:t>
+              <w:t xml:space="preserve">3.0499</w:t>
             </w:r>
           </w:p>
         </w:tc>
@@ -4860,7 +4860,7 @@
                 <w:sz w:val="17"/>
                 <w:szCs w:val="17"/>
               </w:rPr>
-              <w:t xml:space="preserve">2.6864</w:t>
+              <w:t xml:space="preserve">2.6918</w:t>
             </w:r>
           </w:p>
         </w:tc>
@@ -4893,7 +4893,7 @@
                 <w:sz w:val="17"/>
                 <w:szCs w:val="17"/>
               </w:rPr>
-              <w:t xml:space="preserve">2.0746</w:t>
+              <w:t xml:space="preserve">2.0842</w:t>
             </w:r>
           </w:p>
         </w:tc>
@@ -4926,7 +4926,7 @@
                 <w:sz w:val="17"/>
                 <w:szCs w:val="17"/>
               </w:rPr>
-              <w:t xml:space="preserve">0.7443</w:t>
+              <w:t xml:space="preserve">0.7619</w:t>
             </w:r>
           </w:p>
         </w:tc>
@@ -5030,7 +5030,7 @@
                 <w:sz w:val="17"/>
                 <w:szCs w:val="17"/>
               </w:rPr>
-              <w:t xml:space="preserve">2.3133</w:t>
+              <w:t xml:space="preserve">2.3310</w:t>
             </w:r>
           </w:p>
         </w:tc>
@@ -5063,7 +5063,7 @@
                 <w:sz w:val="17"/>
                 <w:szCs w:val="17"/>
               </w:rPr>
-              <w:t xml:space="preserve">+3.04%</w:t>
+              <w:t xml:space="preserve">+3.18%</w:t>
             </w:r>
           </w:p>
         </w:tc>
@@ -5096,7 +5096,7 @@
                 <w:sz w:val="17"/>
                 <w:szCs w:val="17"/>
               </w:rPr>
-              <w:t xml:space="preserve">3.5595</w:t>
+              <w:t xml:space="preserve">3.5658</w:t>
             </w:r>
           </w:p>
         </w:tc>
@@ -5129,7 +5129,7 @@
                 <w:sz w:val="17"/>
                 <w:szCs w:val="17"/>
               </w:rPr>
-              <w:t xml:space="preserve">3.1245</w:t>
+              <w:t xml:space="preserve">3.1353</w:t>
             </w:r>
           </w:p>
         </w:tc>
@@ -5162,7 +5162,7 @@
                 <w:sz w:val="17"/>
                 <w:szCs w:val="17"/>
               </w:rPr>
-              <w:t xml:space="preserve">2.6930</w:t>
+              <w:t xml:space="preserve">2.7033</w:t>
             </w:r>
           </w:p>
         </w:tc>
@@ -5195,7 +5195,7 @@
                 <w:sz w:val="17"/>
                 <w:szCs w:val="17"/>
               </w:rPr>
-              <w:t xml:space="preserve">2.0389</w:t>
+              <w:t xml:space="preserve">2.0502</w:t>
             </w:r>
           </w:p>
         </w:tc>
@@ -5228,7 +5228,7 @@
                 <w:sz w:val="17"/>
                 <w:szCs w:val="17"/>
               </w:rPr>
-              <w:t xml:space="preserve">0.7427</w:t>
+              <w:t xml:space="preserve">0.7599</w:t>
             </w:r>
           </w:p>
         </w:tc>
@@ -5332,7 +5332,7 @@
                 <w:sz w:val="17"/>
                 <w:szCs w:val="17"/>
               </w:rPr>
-              <w:t xml:space="preserve">2.2321</w:t>
+              <w:t xml:space="preserve">2.2477</w:t>
             </w:r>
           </w:p>
         </w:tc>
@@ -5365,7 +5365,7 @@
                 <w:sz w:val="17"/>
                 <w:szCs w:val="17"/>
               </w:rPr>
-              <w:t xml:space="preserve">-0.58%</w:t>
+              <w:t xml:space="preserve">-0.51%</w:t>
             </w:r>
           </w:p>
         </w:tc>
@@ -5398,7 +5398,7 @@
                 <w:sz w:val="17"/>
                 <w:szCs w:val="17"/>
               </w:rPr>
-              <w:t xml:space="preserve">3.3204</w:t>
+              <w:t xml:space="preserve">3.3223</w:t>
             </w:r>
           </w:p>
         </w:tc>
@@ -5431,7 +5431,7 @@
                 <w:sz w:val="17"/>
                 <w:szCs w:val="17"/>
               </w:rPr>
-              <w:t xml:space="preserve">3.0279</w:t>
+              <w:t xml:space="preserve">3.0341</w:t>
             </w:r>
           </w:p>
         </w:tc>
@@ -5464,7 +5464,7 @@
                 <w:sz w:val="17"/>
                 <w:szCs w:val="17"/>
               </w:rPr>
-              <w:t xml:space="preserve">2.6718</w:t>
+              <w:t xml:space="preserve">2.6790</w:t>
             </w:r>
           </w:p>
         </w:tc>
@@ -5497,7 +5497,7 @@
                 <w:sz w:val="17"/>
                 <w:szCs w:val="17"/>
               </w:rPr>
-              <w:t xml:space="preserve">2.0423</w:t>
+              <w:t xml:space="preserve">2.0563</w:t>
             </w:r>
           </w:p>
         </w:tc>
@@ -5530,7 +5530,7 @@
                 <w:sz w:val="17"/>
                 <w:szCs w:val="17"/>
               </w:rPr>
-              <w:t xml:space="preserve">0.7415</w:t>
+              <w:t xml:space="preserve">0.7612</w:t>
             </w:r>
           </w:p>
         </w:tc>
@@ -5563,7 +5563,7 @@
                 <w:sz w:val="17"/>
                 <w:szCs w:val="17"/>
               </w:rPr>
-              <w:t xml:space="preserve">0.025</w:t>
+              <w:t xml:space="preserve">0.053</w:t>
             </w:r>
           </w:p>
         </w:tc>
@@ -5634,7 +5634,7 @@
                 <w:sz w:val="17"/>
                 <w:szCs w:val="17"/>
               </w:rPr>
-              <w:t xml:space="preserve">2.2313</w:t>
+              <w:t xml:space="preserve">2.2474</w:t>
             </w:r>
           </w:p>
         </w:tc>
@@ -5667,7 +5667,7 @@
                 <w:sz w:val="17"/>
                 <w:szCs w:val="17"/>
               </w:rPr>
-              <w:t xml:space="preserve">-0.61%</w:t>
+              <w:t xml:space="preserve">-0.53%</w:t>
             </w:r>
           </w:p>
         </w:tc>
@@ -5700,7 +5700,7 @@
                 <w:sz w:val="17"/>
                 <w:szCs w:val="17"/>
               </w:rPr>
-              <w:t xml:space="preserve">3.3093</w:t>
+              <w:t xml:space="preserve">3.3126</w:t>
             </w:r>
           </w:p>
         </w:tc>
@@ -5733,7 +5733,7 @@
                 <w:sz w:val="17"/>
                 <w:szCs w:val="17"/>
               </w:rPr>
-              <w:t xml:space="preserve">3.0307</w:t>
+              <w:t xml:space="preserve">3.0373</w:t>
             </w:r>
           </w:p>
         </w:tc>
@@ -5766,7 +5766,7 @@
                 <w:sz w:val="17"/>
                 <w:szCs w:val="17"/>
               </w:rPr>
-              <w:t xml:space="preserve">2.6749</w:t>
+              <w:t xml:space="preserve">2.6823</w:t>
             </w:r>
           </w:p>
         </w:tc>
@@ -5799,7 +5799,7 @@
                 <w:sz w:val="17"/>
                 <w:szCs w:val="17"/>
               </w:rPr>
-              <w:t xml:space="preserve">2.0470</w:t>
+              <w:t xml:space="preserve">2.0609</w:t>
             </w:r>
           </w:p>
         </w:tc>
@@ -5832,7 +5832,7 @@
                 <w:sz w:val="17"/>
                 <w:szCs w:val="17"/>
               </w:rPr>
-              <w:t xml:space="preserve">0.7422</w:t>
+              <w:t xml:space="preserve">0.7620</w:t>
             </w:r>
           </w:p>
         </w:tc>
@@ -5865,7 +5865,7 @@
                 <w:sz w:val="17"/>
                 <w:szCs w:val="17"/>
               </w:rPr>
-              <w:t xml:space="preserve">0.044</w:t>
+              <w:t xml:space="preserve">0.082</w:t>
             </w:r>
           </w:p>
         </w:tc>
@@ -5936,7 +5936,7 @@
                 <w:sz w:val="17"/>
                 <w:szCs w:val="17"/>
               </w:rPr>
-              <w:t xml:space="preserve">2.1968</w:t>
+              <w:t xml:space="preserve">2.2127</w:t>
             </w:r>
           </w:p>
         </w:tc>
@@ -5969,7 +5969,7 @@
                 <w:sz w:val="17"/>
                 <w:szCs w:val="17"/>
               </w:rPr>
-              <w:t xml:space="preserve">-2.15%</w:t>
+              <w:t xml:space="preserve">-2.06%</w:t>
             </w:r>
           </w:p>
         </w:tc>
@@ -6002,7 +6002,7 @@
                 <w:sz w:val="17"/>
                 <w:szCs w:val="17"/>
               </w:rPr>
-              <w:t xml:space="preserve">3.2774</w:t>
+              <w:t xml:space="preserve">3.2812</w:t>
             </w:r>
           </w:p>
         </w:tc>
@@ -6035,7 +6035,7 @@
                 <w:sz w:val="17"/>
                 <w:szCs w:val="17"/>
               </w:rPr>
-              <w:t xml:space="preserve">2.9765</w:t>
+              <w:t xml:space="preserve">2.9839</w:t>
             </w:r>
           </w:p>
         </w:tc>
@@ -6068,7 +6068,7 @@
                 <w:sz w:val="17"/>
                 <w:szCs w:val="17"/>
               </w:rPr>
-              <w:t xml:space="preserve">2.6170</w:t>
+              <w:t xml:space="preserve">2.6245</w:t>
             </w:r>
           </w:p>
         </w:tc>
@@ -6101,7 +6101,7 @@
                 <w:sz w:val="17"/>
                 <w:szCs w:val="17"/>
               </w:rPr>
-              <w:t xml:space="preserve">2.0048</w:t>
+              <w:t xml:space="preserve">2.0179</w:t>
             </w:r>
           </w:p>
         </w:tc>
@@ -6129,12 +6129,12 @@
             <w:r>
               <w:rPr>
                 <w:rFonts w:ascii="Calibri" w:cs="Calibri" w:eastAsia="Calibri" w:hAnsi="Calibri"/>
-                <w:b/>
-                <w:bCs/>
-                <w:sz w:val="17"/>
-                <w:szCs w:val="17"/>
-              </w:rPr>
-              <w:t xml:space="preserve">0.7389</w:t>
+                <w:b w:val="false"/>
+                <w:bCs w:val="false"/>
+                <w:sz w:val="17"/>
+                <w:szCs w:val="17"/>
+              </w:rPr>
+              <w:t xml:space="preserve">0.7574</w:t>
             </w:r>
           </w:p>
         </w:tc>
@@ -6167,7 +6167,7 @@
                 <w:sz w:val="17"/>
                 <w:szCs w:val="17"/>
               </w:rPr>
-              <w:t xml:space="preserve">0.025</w:t>
+              <w:t xml:space="preserve">0.031</w:t>
             </w:r>
           </w:p>
         </w:tc>
@@ -6238,7 +6238,7 @@
                 <w:sz w:val="17"/>
                 <w:szCs w:val="17"/>
               </w:rPr>
-              <w:t xml:space="preserve">2.2635</w:t>
+              <w:t xml:space="preserve">2.2818</w:t>
             </w:r>
           </w:p>
         </w:tc>
@@ -6271,7 +6271,7 @@
                 <w:sz w:val="17"/>
                 <w:szCs w:val="17"/>
               </w:rPr>
-              <w:t xml:space="preserve">+0.82%</w:t>
+              <w:t xml:space="preserve">+1.00%</w:t>
             </w:r>
           </w:p>
         </w:tc>
@@ -6304,7 +6304,7 @@
                 <w:sz w:val="17"/>
                 <w:szCs w:val="17"/>
               </w:rPr>
-              <w:t xml:space="preserve">3.4549</w:t>
+              <w:t xml:space="preserve">3.4629</w:t>
             </w:r>
           </w:p>
         </w:tc>
@@ -6337,7 +6337,7 @@
                 <w:sz w:val="17"/>
                 <w:szCs w:val="17"/>
               </w:rPr>
-              <w:t xml:space="preserve">3.0703</w:t>
+              <w:t xml:space="preserve">3.0821</w:t>
             </w:r>
           </w:p>
         </w:tc>
@@ -6370,7 +6370,7 @@
                 <w:sz w:val="17"/>
                 <w:szCs w:val="17"/>
               </w:rPr>
-              <w:t xml:space="preserve">2.6453</w:t>
+              <w:t xml:space="preserve">2.6561</w:t>
             </w:r>
           </w:p>
         </w:tc>
@@ -6403,7 +6403,7 @@
                 <w:sz w:val="17"/>
                 <w:szCs w:val="17"/>
               </w:rPr>
-              <w:t xml:space="preserve">2.0015</w:t>
+              <w:t xml:space="preserve">2.0130</w:t>
             </w:r>
           </w:p>
         </w:tc>
@@ -6431,12 +6431,12 @@
             <w:r>
               <w:rPr>
                 <w:rFonts w:ascii="Calibri" w:cs="Calibri" w:eastAsia="Calibri" w:hAnsi="Calibri"/>
-                <w:b w:val="false"/>
-                <w:bCs w:val="false"/>
-                <w:sz w:val="17"/>
-                <w:szCs w:val="17"/>
-              </w:rPr>
-              <w:t xml:space="preserve">0.7392</w:t>
+                <w:b/>
+                <w:bCs/>
+                <w:sz w:val="17"/>
+                <w:szCs w:val="17"/>
+              </w:rPr>
+              <w:t xml:space="preserve">0.7561</w:t>
             </w:r>
           </w:p>
         </w:tc>
@@ -6469,7 +6469,7 @@
                 <w:sz w:val="17"/>
                 <w:szCs w:val="17"/>
               </w:rPr>
-              <w:t xml:space="preserve">0.692</w:t>
+              <w:t xml:space="preserve">0.727</w:t>
             </w:r>
           </w:p>
         </w:tc>
@@ -6540,7 +6540,7 @@
                 <w:sz w:val="17"/>
                 <w:szCs w:val="17"/>
               </w:rPr>
-              <w:t xml:space="preserve">2.1964</w:t>
+              <w:t xml:space="preserve">2.2120</w:t>
             </w:r>
           </w:p>
         </w:tc>
@@ -6573,7 +6573,7 @@
                 <w:sz w:val="17"/>
                 <w:szCs w:val="17"/>
               </w:rPr>
-              <w:t xml:space="preserve">-2.17%</w:t>
+              <w:t xml:space="preserve">-2.09%</w:t>
             </w:r>
           </w:p>
         </w:tc>
@@ -6606,7 +6606,7 @@
                 <w:sz w:val="17"/>
                 <w:szCs w:val="17"/>
               </w:rPr>
-              <w:t xml:space="preserve">3.2774</w:t>
+              <w:t xml:space="preserve">3.2812</w:t>
             </w:r>
           </w:p>
         </w:tc>
@@ -6639,7 +6639,7 @@
                 <w:sz w:val="17"/>
                 <w:szCs w:val="17"/>
               </w:rPr>
-              <w:t xml:space="preserve">2.9765</w:t>
+              <w:t xml:space="preserve">2.9839</w:t>
             </w:r>
           </w:p>
         </w:tc>
@@ -6672,7 +6672,7 @@
                 <w:sz w:val="17"/>
                 <w:szCs w:val="17"/>
               </w:rPr>
-              <w:t xml:space="preserve">2.6170</w:t>
+              <w:t xml:space="preserve">2.6245</w:t>
             </w:r>
           </w:p>
         </w:tc>
@@ -6705,46 +6705,13 @@
                 <w:sz w:val="17"/>
                 <w:szCs w:val="17"/>
               </w:rPr>
-              <w:t xml:space="preserve">2.0015</w:t>
+              <w:t xml:space="preserve">2.0130</w:t>
             </w:r>
           </w:p>
         </w:tc>
         <w:tc>
           <w:tcPr>
             <w:tcW w:type="dxa" w:w="850"/>
-            <w:tcBorders>
-              <w:top w:val="single" w:color="C9C8C3" w:sz="4"/>
-              <w:left w:val="single" w:color="C9C8C3" w:sz="4"/>
-              <w:bottom w:val="single" w:color="C9C8C3" w:sz="4"/>
-              <w:right w:val="single" w:color="C9C8C3" w:sz="4"/>
-            </w:tcBorders>
-            <w:tcMar>
-              <w:top w:type="dxa" w:w="40"/>
-              <w:left w:type="dxa" w:w="80"/>
-              <w:bottom w:type="dxa" w:w="40"/>
-              <w:right w:type="dxa" w:w="80"/>
-            </w:tcMar>
-          </w:tcPr>
-          <w:p>
-            <w:pPr>
-              <w:keepNext w:val="false"/>
-              <w:jc w:val="right"/>
-            </w:pPr>
-            <w:r>
-              <w:rPr>
-                <w:rFonts w:ascii="Calibri" w:cs="Calibri" w:eastAsia="Calibri" w:hAnsi="Calibri"/>
-                <w:b w:val="false"/>
-                <w:bCs w:val="false"/>
-                <w:sz w:val="17"/>
-                <w:szCs w:val="17"/>
-              </w:rPr>
-              <w:t xml:space="preserve">0.7392</w:t>
-            </w:r>
-          </w:p>
-        </w:tc>
-        <w:tc>
-          <w:tcPr>
-            <w:tcW w:type="dxa" w:w="800"/>
             <w:tcBorders>
               <w:top w:val="single" w:color="C9C8C3" w:sz="4"/>
               <w:left w:val="single" w:color="C9C8C3" w:sz="4"/>
@@ -6771,7 +6738,40 @@
                 <w:sz w:val="17"/>
                 <w:szCs w:val="17"/>
               </w:rPr>
-              <w:t xml:space="preserve">0.024</w:t>
+              <w:t xml:space="preserve">0.7561</w:t>
+            </w:r>
+          </w:p>
+        </w:tc>
+        <w:tc>
+          <w:tcPr>
+            <w:tcW w:type="dxa" w:w="800"/>
+            <w:tcBorders>
+              <w:top w:val="single" w:color="C9C8C3" w:sz="4"/>
+              <w:left w:val="single" w:color="C9C8C3" w:sz="4"/>
+              <w:bottom w:val="single" w:color="C9C8C3" w:sz="4"/>
+              <w:right w:val="single" w:color="C9C8C3" w:sz="4"/>
+            </w:tcBorders>
+            <w:tcMar>
+              <w:top w:type="dxa" w:w="40"/>
+              <w:left w:type="dxa" w:w="80"/>
+              <w:bottom w:type="dxa" w:w="40"/>
+              <w:right w:type="dxa" w:w="80"/>
+            </w:tcMar>
+          </w:tcPr>
+          <w:p>
+            <w:pPr>
+              <w:keepNext w:val="false"/>
+              <w:jc w:val="right"/>
+            </w:pPr>
+            <w:r>
+              <w:rPr>
+                <w:rFonts w:ascii="Calibri" w:cs="Calibri" w:eastAsia="Calibri" w:hAnsi="Calibri"/>
+                <w:b/>
+                <w:bCs/>
+                <w:sz w:val="17"/>
+                <w:szCs w:val="17"/>
+              </w:rPr>
+              <w:t xml:space="preserve">0.028</w:t>
             </w:r>
           </w:p>
         </w:tc>
@@ -6788,7 +6788,7 @@
           <w:sz w:val="18"/>
           <w:szCs w:val="18"/>
         </w:rPr>
-        <w:t xml:space="preserve">Held-out error and one-sided p as in Table 3, here against draft position alone, over the 13,104 prospect-seasons of 2,083 drafted skaters, 2007-2017 (goaltenders stay on draft position alone); the best in each column is in bold. The season columns are the error within each season. The error falls with the season because most prospects still unproven in D+5 or later deliver little or no NHL surplus. Compare candidates within a column.</w:t>
+        <w:t xml:space="preserve">Held-out error and one-sided p as in Table 3, here against draft position alone, over the 12,996 prospect-seasons of 2,083 drafted skaters, 2007-2017 (goaltenders stay on draft position alone); the best in each column is in bold. The season columns are the error within each season. The error falls with the season because most prospects still unproven in D+5 or later deliver little or no NHL surplus. Compare candidates within a column.</w:t>
       </w:r>
     </w:p>
     <w:p>
@@ -6812,7 +6812,7 @@
         <w:rPr>
           <w:rFonts w:ascii="Calibri" w:cs="Calibri" w:eastAsia="Calibri" w:hAnsi="Calibri"/>
         </w:rPr>
-        <w:t xml:space="preserve">Linear production alone predicts worse than draft position alone (+3.04% in held-out error; one-sided p = 0.995), so production does not replace draft position at the draft. Added to draft position, production lowers the error in each season, and the improvement is statistically significant at the 5% level both for linear production (p = 0.025) and for linear and squared production (p = 0.025). Undrafted prospects, who have no draft position, use the adopted model with the star probability set to zero (Section 4).</w:t>
+        <w:t xml:space="preserve">Linear production alone predicts worse than draft position alone (+3.18% in held-out error; one-sided p = 0.995), so production does not replace draft position at the draft. Added to draft position, production lowers the error in each season. The improvement is statistically significant at the 5% level for linear and squared production (p = 0.031), but not for linear production (p = 0.053). Undrafted prospects, who have no draft position, use the adopted model with the star probability set to zero (Section 4).</w:t>
       </w:r>
     </w:p>
     <w:p>
@@ -6847,7 +6847,7 @@
         <w:rPr>
           <w:rFonts w:ascii="Calibri" w:cs="Calibri" w:eastAsia="Calibri" w:hAnsi="Calibri"/>
         </w:rPr>
-        <w:t xml:space="preserve">Linear and squared production has the lower held-out error in each season (Table 4) and improves on draft position alone by 2.15%, against 0.58% for linear production. Compared directly with linear production, adding the squared term is better with one-sided p = 0.037 with draft position in each season, and p = 0.022 in the adopted model with age (Table 5). The production squared term is statistically significant in each season from D+1 to D+4 of the adopted model (p &lt; 0.001, Table 9). Most of the uncertainty comes from the 2007 draft. Elite Prospects scoring and the NHLe factors begin in 2006-07, so a 2007 draftee's D+1 production rests on his draft season alone, against up to three seasons for later drafts. Without the 2007 draft, linear and squared production beats linear production with p &lt; 0.001.</w:t>
+        <w:t xml:space="preserve">Linear and squared production has the lower held-out error in each season (Table 4) and improves on draft position alone by 2.06%, against 0.51% for linear production. Compared directly with linear production, adding the squared term is better with one-sided p = 0.037 with draft position in each season, and p = 0.024 in the adopted model with age (Table 5). The production squared term is statistically significant in each season from D+1 to D+4 of the adopted model (p &lt; 0.001, Table 9). Most of the uncertainty comes from the 2007 draft. Elite Prospects scoring and the NHLe factors begin in 2006-07, so a 2007 draftee's D+1 production rests on his draft season alone, against up to three seasons for later drafts. Without the 2007 draft, linear and squared production beats linear production with p &lt; 0.001.</w:t>
       </w:r>
     </w:p>
     <w:p>
@@ -7301,7 +7301,7 @@
                 <w:sz w:val="17"/>
                 <w:szCs w:val="17"/>
               </w:rPr>
-              <w:t xml:space="preserve">2.2256</w:t>
+              <w:t xml:space="preserve">2.2408</w:t>
             </w:r>
           </w:p>
         </w:tc>
@@ -7334,7 +7334,7 @@
                 <w:sz w:val="17"/>
                 <w:szCs w:val="17"/>
               </w:rPr>
-              <w:t xml:space="preserve">3.3158</w:t>
+              <w:t xml:space="preserve">3.3178</w:t>
             </w:r>
           </w:p>
         </w:tc>
@@ -7367,7 +7367,7 @@
                 <w:sz w:val="17"/>
                 <w:szCs w:val="17"/>
               </w:rPr>
-              <w:t xml:space="preserve">3.0175</w:t>
+              <w:t xml:space="preserve">3.0241</w:t>
             </w:r>
           </w:p>
         </w:tc>
@@ -7400,7 +7400,7 @@
                 <w:sz w:val="17"/>
                 <w:szCs w:val="17"/>
               </w:rPr>
-              <w:t xml:space="preserve">2.6591</w:t>
+              <w:t xml:space="preserve">2.6670</w:t>
             </w:r>
           </w:p>
         </w:tc>
@@ -7433,7 +7433,7 @@
                 <w:sz w:val="17"/>
                 <w:szCs w:val="17"/>
               </w:rPr>
-              <w:t xml:space="preserve">2.0326</w:t>
+              <w:t xml:space="preserve">2.0439</w:t>
             </w:r>
           </w:p>
         </w:tc>
@@ -7466,7 +7466,7 @@
                 <w:sz w:val="17"/>
                 <w:szCs w:val="17"/>
               </w:rPr>
-              <w:t xml:space="preserve">0.7427</w:t>
+              <w:t xml:space="preserve">0.7599</w:t>
             </w:r>
           </w:p>
         </w:tc>
@@ -7499,7 +7499,7 @@
                 <w:sz w:val="17"/>
                 <w:szCs w:val="17"/>
               </w:rPr>
-              <w:t xml:space="preserve">0.0015</w:t>
+              <w:t xml:space="preserve">0.0020</w:t>
             </w:r>
           </w:p>
         </w:tc>
@@ -7565,7 +7565,7 @@
                 <w:sz w:val="17"/>
                 <w:szCs w:val="17"/>
               </w:rPr>
-              <w:t xml:space="preserve">78.71</w:t>
+              <w:t xml:space="preserve">79.80</w:t>
             </w:r>
           </w:p>
         </w:tc>
@@ -7636,7 +7636,7 @@
                 <w:sz w:val="17"/>
                 <w:szCs w:val="17"/>
               </w:rPr>
-              <w:t xml:space="preserve">2.1801</w:t>
+              <w:t xml:space="preserve">2.1962</w:t>
             </w:r>
           </w:p>
         </w:tc>
@@ -7669,7 +7669,7 @@
                 <w:sz w:val="17"/>
                 <w:szCs w:val="17"/>
               </w:rPr>
-              <w:t xml:space="preserve">3.2580</w:t>
+              <w:t xml:space="preserve">3.2626</w:t>
             </w:r>
           </w:p>
         </w:tc>
@@ -7702,7 +7702,7 @@
                 <w:sz w:val="17"/>
                 <w:szCs w:val="17"/>
               </w:rPr>
-              <w:t xml:space="preserve">2.9489</w:t>
+              <w:t xml:space="preserve">2.9572</w:t>
             </w:r>
           </w:p>
         </w:tc>
@@ -7735,7 +7735,7 @@
                 <w:sz w:val="17"/>
                 <w:szCs w:val="17"/>
               </w:rPr>
-              <w:t xml:space="preserve">2.5902</w:t>
+              <w:t xml:space="preserve">2.5988</w:t>
             </w:r>
           </w:p>
         </w:tc>
@@ -7768,7 +7768,7 @@
                 <w:sz w:val="17"/>
                 <w:szCs w:val="17"/>
               </w:rPr>
-              <w:t xml:space="preserve">1.9910</w:t>
+              <w:t xml:space="preserve">2.0027</w:t>
             </w:r>
           </w:p>
         </w:tc>
@@ -7801,7 +7801,7 @@
                 <w:sz w:val="17"/>
                 <w:szCs w:val="17"/>
               </w:rPr>
-              <w:t xml:space="preserve">0.7392</w:t>
+              <w:t xml:space="preserve">0.7561</w:t>
             </w:r>
           </w:p>
         </w:tc>
@@ -7834,7 +7834,7 @@
                 <w:sz w:val="17"/>
                 <w:szCs w:val="17"/>
               </w:rPr>
-              <w:t xml:space="preserve">0.0080</w:t>
+              <w:t xml:space="preserve">0.013</w:t>
             </w:r>
           </w:p>
         </w:tc>
@@ -7867,7 +7867,7 @@
                 <w:sz w:val="17"/>
                 <w:szCs w:val="17"/>
               </w:rPr>
-              <w:t xml:space="preserve">vs linear 0.022</w:t>
+              <w:t xml:space="preserve">vs linear 0.024</w:t>
             </w:r>
           </w:p>
         </w:tc>
@@ -7900,7 +7900,7 @@
                 <w:sz w:val="17"/>
                 <w:szCs w:val="17"/>
               </w:rPr>
-              <w:t xml:space="preserve">69.82</w:t>
+              <w:t xml:space="preserve">71.23</w:t>
             </w:r>
           </w:p>
         </w:tc>
@@ -7971,7 +7971,7 @@
                 <w:sz w:val="17"/>
                 <w:szCs w:val="17"/>
               </w:rPr>
-              <w:t xml:space="preserve">2.1818</w:t>
+              <w:t xml:space="preserve">2.1980</w:t>
             </w:r>
           </w:p>
         </w:tc>
@@ -8004,7 +8004,7 @@
                 <w:sz w:val="17"/>
                 <w:szCs w:val="17"/>
               </w:rPr>
-              <w:t xml:space="preserve">3.2589</w:t>
+              <w:t xml:space="preserve">3.2634</w:t>
             </w:r>
           </w:p>
         </w:tc>
@@ -8037,7 +8037,7 @@
                 <w:sz w:val="17"/>
                 <w:szCs w:val="17"/>
               </w:rPr>
-              <w:t xml:space="preserve">2.9514</w:t>
+              <w:t xml:space="preserve">2.9599</w:t>
             </w:r>
           </w:p>
         </w:tc>
@@ -8070,7 +8070,7 @@
                 <w:sz w:val="17"/>
                 <w:szCs w:val="17"/>
               </w:rPr>
-              <w:t xml:space="preserve">2.5944</w:t>
+              <w:t xml:space="preserve">2.6039</w:t>
             </w:r>
           </w:p>
         </w:tc>
@@ -8103,7 +8103,7 @@
                 <w:sz w:val="17"/>
                 <w:szCs w:val="17"/>
               </w:rPr>
-              <w:t xml:space="preserve">1.9914</w:t>
+              <w:t xml:space="preserve">2.0028</w:t>
             </w:r>
           </w:p>
         </w:tc>
@@ -8136,7 +8136,7 @@
                 <w:sz w:val="17"/>
                 <w:szCs w:val="17"/>
               </w:rPr>
-              <w:t xml:space="preserve">0.7401</w:t>
+              <w:t xml:space="preserve">0.7571</w:t>
             </w:r>
           </w:p>
         </w:tc>
@@ -8169,7 +8169,7 @@
                 <w:sz w:val="17"/>
                 <w:szCs w:val="17"/>
               </w:rPr>
-              <w:t xml:space="preserve">0.0020</w:t>
+              <w:t xml:space="preserve">0.0060</w:t>
             </w:r>
           </w:p>
         </w:tc>
@@ -8202,7 +8202,7 @@
                 <w:sz w:val="17"/>
                 <w:szCs w:val="17"/>
               </w:rPr>
-              <w:t xml:space="preserve">vs linear and squared 0.655</w:t>
+              <w:t xml:space="preserve">vs linear and squared 0.669</w:t>
             </w:r>
           </w:p>
         </w:tc>
@@ -8235,7 +8235,7 @@
                 <w:sz w:val="17"/>
                 <w:szCs w:val="17"/>
               </w:rPr>
-              <w:t xml:space="preserve">81.36</w:t>
+              <w:t xml:space="preserve">82.84</w:t>
             </w:r>
           </w:p>
         </w:tc>
@@ -8263,7 +8263,7 @@
         <w:rPr>
           <w:rFonts w:ascii="Calibri" w:cs="Calibri" w:eastAsia="Calibri" w:hAnsi="Calibri"/>
         </w:rPr>
-        <w:t xml:space="preserve">Production squared alone, without the linear production term, predicts about as well as the regression with both the linear and the squared production terms (held-out error 2.1818 against 2.1801; the regression with both terms is better with one-sided p = 0.344, which is not statistically significant). It was not adopted because it would raise the 197 traded prospects' value from $69.82 million to $81.36 million without predicting better.</w:t>
+        <w:t xml:space="preserve">Production squared alone, without the linear production term, predicts about as well as the regression with both the linear and the squared production terms (held-out error 2.1980 against 2.1962; the regression with both terms is better with one-sided p = 0.331, which is not statistically significant). It was not adopted because it would raise the 197 traded prospects' value from $71.23 million to $82.84 million without predicting better.</w:t>
       </w:r>
     </w:p>
     <w:p>
@@ -8350,7 +8350,7 @@
         <w:rPr>
           <w:rFonts w:ascii="Calibri" w:cs="Calibri" w:eastAsia="Calibri" w:hAnsi="Calibri"/>
         </w:rPr>
-        <w:t xml:space="preserve">Up to 12.6 points (above the 75th percentile), the line with the squared term sits below the linear one, by at most $0.56 million, and it dips slightly before it rises. The dip comes from the negative linear coefficient, which, with the squared term in the model, is not the value of an extra point: in D+2 an extra point adds -0.111 + 2 × 0.0131 × production million dollars, which is positive above 4.2 points, below the 25th percentile of 4.6. The negative coefficient sets where the value bottoms out; it is not evidence that a little scoring lowers a prospect's value.</w:t>
+        <w:t xml:space="preserve">Up to 12.6 points (above the 75th percentile), the line with the squared term sits below the linear one, by at most $0.55 million, and it dips slightly before it rises. The dip comes from the negative linear coefficient, which, with the squared term in the model, is not the value of an extra point: in D+2 an extra point adds -0.111 + 2 × 0.0131 × production million dollars, which is positive above 4.2 points, below the 25th percentile of 4.6. The negative coefficient sets where the value bottoms out; it is not evidence that a little scoring lowers a prospect's value.</w:t>
       </w:r>
     </w:p>
     <w:p>
@@ -8374,7 +8374,7 @@
         <w:rPr>
           <w:rFonts w:ascii="Calibri" w:cs="Calibri" w:eastAsia="Calibri" w:hAnsi="Calibri"/>
         </w:rPr>
-        <w:t xml:space="preserve">Once production is in the model, draft position stops carrying information in D+4 (Table 6). Its coefficient is $0.86 million (standard error 1.88, p = 0.645) in D+4 and -$0.82 million (standard error 0.33, p = 0.014) from D+5 on. A negative weight on draft position would value a top pick below a later pick with the same production, which makes no logical sense. The adopted model keeps draft position from D+1 to D+3 and uses production alone from D+4. This drops one parameter in each later season at no cost: the held-out error is 2.1964 against 2.1968 with draft position kept throughout.</w:t>
+        <w:t xml:space="preserve">Once production is in the model, draft position stops carrying information in D+4 (Table 6). Its coefficient is $1.74 million (standard error 2.02, p = 0.390) in D+4 and $0.07 million (standard error 0.96, p = 0.944) from D+5 on. Neither is statistically significant at the 5% level: once a prospect's production is known, his draft position adds nothing to his value from D+4 on. The adopted model keeps draft position from D+1 to D+3 and uses production alone from D+4. This drops one parameter in each later season at no cost: the held-out error is 2.2120 against 2.2127 with draft position kept throughout.</w:t>
       </w:r>
     </w:p>
     <w:p>
@@ -8688,7 +8688,7 @@
                 <w:sz w:val="17"/>
                 <w:szCs w:val="17"/>
               </w:rPr>
-              <w:t xml:space="preserve">13.399 (1.824) [&lt;0.001]</w:t>
+              <w:t xml:space="preserve">13.575 (1.821) [&lt;0.001]</w:t>
             </w:r>
           </w:p>
         </w:tc>
@@ -8721,7 +8721,7 @@
                 <w:sz w:val="17"/>
                 <w:szCs w:val="17"/>
               </w:rPr>
-              <w:t xml:space="preserve">12.545 (2.236) [&lt;0.001]</w:t>
+              <w:t xml:space="preserve">12.855 (2.236) [&lt;0.001]</w:t>
             </w:r>
           </w:p>
         </w:tc>
@@ -8754,7 +8754,7 @@
                 <w:sz w:val="17"/>
                 <w:szCs w:val="17"/>
               </w:rPr>
-              <w:t xml:space="preserve">9.994 (3.046) [0.001]</w:t>
+              <w:t xml:space="preserve">10.500 (3.036) [&lt;0.001]</w:t>
             </w:r>
           </w:p>
         </w:tc>
@@ -8787,7 +8787,7 @@
                 <w:sz w:val="17"/>
                 <w:szCs w:val="17"/>
               </w:rPr>
-              <w:t xml:space="preserve">0.864 (1.877) [0.645]</w:t>
+              <w:t xml:space="preserve">1.735 (2.018) [0.390]</w:t>
             </w:r>
           </w:p>
         </w:tc>
@@ -8820,7 +8820,7 @@
                 <w:sz w:val="17"/>
                 <w:szCs w:val="17"/>
               </w:rPr>
-              <w:t xml:space="preserve">-0.824 (0.334) [0.014]</w:t>
+              <w:t xml:space="preserve">0.067 (0.959) [0.944]</w:t>
             </w:r>
           </w:p>
         </w:tc>
@@ -8891,7 +8891,7 @@
                 <w:sz w:val="17"/>
                 <w:szCs w:val="17"/>
               </w:rPr>
-              <w:t xml:space="preserve">-0.127 (0.050) [0.011]</w:t>
+              <w:t xml:space="preserve">-0.124 (0.050) [0.012]</w:t>
             </w:r>
           </w:p>
         </w:tc>
@@ -8957,7 +8957,7 @@
                 <w:sz w:val="17"/>
                 <w:szCs w:val="17"/>
               </w:rPr>
-              <w:t xml:space="preserve">-0.094 (0.027) [&lt;0.001]</w:t>
+              <w:t xml:space="preserve">-0.095 (0.027) [&lt;0.001]</w:t>
             </w:r>
           </w:p>
         </w:tc>
@@ -8990,7 +8990,7 @@
                 <w:sz w:val="17"/>
                 <w:szCs w:val="17"/>
               </w:rPr>
-              <w:t xml:space="preserve">-0.054 (0.022) [0.014]</w:t>
+              <w:t xml:space="preserve">-0.056 (0.022) [0.011]</w:t>
             </w:r>
           </w:p>
         </w:tc>
@@ -9023,7 +9023,7 @@
                 <w:sz w:val="17"/>
                 <w:szCs w:val="17"/>
               </w:rPr>
-              <w:t xml:space="preserve">-0.013 (0.009) [0.170]</w:t>
+              <w:t xml:space="preserve">-0.016 (0.010) [0.105]</w:t>
             </w:r>
           </w:p>
         </w:tc>
@@ -9094,7 +9094,7 @@
                 <w:sz w:val="17"/>
                 <w:szCs w:val="17"/>
               </w:rPr>
-              <w:t xml:space="preserve">0.0180 (0.0051) [&lt;0.001]</w:t>
+              <w:t xml:space="preserve">0.0177 (0.0051) [&lt;0.001]</w:t>
             </w:r>
           </w:p>
         </w:tc>
@@ -9226,7 +9226,7 @@
                 <w:sz w:val="17"/>
                 <w:szCs w:val="17"/>
               </w:rPr>
-              <w:t xml:space="preserve">0.0011 (0.0006) [0.079]</w:t>
+              <w:t xml:space="preserve">0.0012 (0.0007) [0.062]</w:t>
             </w:r>
           </w:p>
         </w:tc>
@@ -9297,7 +9297,7 @@
                 <w:sz w:val="17"/>
                 <w:szCs w:val="17"/>
               </w:rPr>
-              <w:t xml:space="preserve">-0.261 (0.111) [0.018]</w:t>
+              <w:t xml:space="preserve">-0.263 (0.112) [0.018]</w:t>
             </w:r>
           </w:p>
         </w:tc>
@@ -9330,7 +9330,7 @@
                 <w:sz w:val="17"/>
                 <w:szCs w:val="17"/>
               </w:rPr>
-              <w:t xml:space="preserve">-0.166 (0.071) [0.019]</w:t>
+              <w:t xml:space="preserve">-0.171 (0.072) [0.017]</w:t>
             </w:r>
           </w:p>
         </w:tc>
@@ -9363,7 +9363,7 @@
                 <w:sz w:val="17"/>
                 <w:szCs w:val="17"/>
               </w:rPr>
-              <w:t xml:space="preserve">-0.051 (0.015) [0.001]</w:t>
+              <w:t xml:space="preserve">-0.053 (0.015) [&lt;0.001]</w:t>
             </w:r>
           </w:p>
         </w:tc>
@@ -9396,7 +9396,7 @@
                 <w:sz w:val="17"/>
                 <w:szCs w:val="17"/>
               </w:rPr>
-              <w:t xml:space="preserve">-0.010 (0.023) [0.650]</w:t>
+              <w:t xml:space="preserve">-0.021 (0.025) [0.413]</w:t>
             </w:r>
           </w:p>
         </w:tc>
@@ -9429,7 +9429,7 @@
                 <w:sz w:val="17"/>
                 <w:szCs w:val="17"/>
               </w:rPr>
-              <w:t xml:space="preserve">0.012 (0.005) [0.014]</w:t>
+              <w:t xml:space="preserve">-0.001 (0.014) [0.944]</w:t>
             </w:r>
           </w:p>
         </w:tc>
@@ -9446,7 +9446,7 @@
           <w:sz w:val="18"/>
           <w:szCs w:val="18"/>
         </w:rPr>
-        <w:t xml:space="preserve">Dependent variable: remaining surplus in millions of dollars at the 2025-26 cap. Each cell gives the coefficient, its standard error clustered by player in parentheses and its two-sided p-value in brackets. The table is one regression with the full set of interaction terms: each column holds that season's coefficients. Draft position's coefficient is statistically significant at the 5% level from D+1 to D+3, not in D+4, and negative and statistically significant from D+5 on (the paragraph before this table). From D+5 on, neither production term is statistically significant at the 5% level on its own.</w:t>
+        <w:t xml:space="preserve">Dependent variable: remaining surplus in millions of dollars at the 2025-26 cap. Each cell gives the coefficient, its standard error clustered by player in parentheses and its two-sided p-value in brackets. The table is one regression with the full set of interaction terms: each column holds that season's coefficients. Draft position's coefficient is statistically significant at the 5% level from D+1 to D+3, not in D+4, and not from D+5 on (the paragraph before this table). From D+5 on, neither production term is statistically significant at the 5% level on its own.</w:t>
       </w:r>
     </w:p>
     <w:p>
@@ -9470,7 +9470,7 @@
         <w:rPr>
           <w:rFonts w:ascii="Calibri" w:cs="Calibri" w:eastAsia="Calibri" w:hAnsi="Calibri"/>
         </w:rPr>
-        <w:t xml:space="preserve">A separate production rate for defencemen was tested. It changes the held-out error by -0.04% against linear production with one rate, and its improvement over draft position alone is less consistent across drafts (one-sided p = 0.044 against 0.025). One rate is kept.</w:t>
+        <w:t xml:space="preserve">A separate production rate for defencemen was tested. It changes the held-out error by -0.02% against linear production with one rate, and its improvement over draft position alone is less consistent across drafts (one-sided p = 0.082 against 0.053). One rate is kept.</w:t>
       </w:r>
     </w:p>
     <w:p>
@@ -10423,7 +10423,7 @@
         <w:rPr>
           <w:rFonts w:ascii="Calibri" w:cs="Calibri" w:eastAsia="Calibri" w:hAnsi="Calibri"/>
         </w:rPr>
-        <w:t xml:space="preserve">Each setting is applied identically to each candidate in Table 4. The no-record indicator gives a prospect without a record what such prospects went on to deliver in his season. It is not statistically significant at the 5% level in D+1 or D+2 (p = 0.054 and 0.083, Table 9), and in D+3 it rests on a single prospect-season. From D+4 on it is exactly zero, with no p-value, because none of the 414 prospect-seasons without a record in those seasons delivered any surplus. It is kept so that missing data is not read as zero scoring.</w:t>
+        <w:t xml:space="preserve">Each setting is applied identically to each candidate in Table 4. The no-record indicator gives a prospect without a record what such prospects went on to deliver in his season. It is not statistically significant at the 5% level in D+1 or D+2 (p = 0.053 and 0.072, Table 9), and in D+3 it rests on a single prospect-season. From D+4 on it is exactly zero, with no p-value, because none of the 406 prospect-seasons without a record in those seasons delivered any surplus. It is kept so that missing data is not read as zero scoring.</w:t>
       </w:r>
     </w:p>
     <w:p>
@@ -10458,7 +10458,7 @@
         <w:rPr>
           <w:rFonts w:ascii="Calibri" w:cs="Calibri" w:eastAsia="Calibri" w:hAnsi="Calibri"/>
         </w:rPr>
-        <w:t xml:space="preserve">Within a season's regression each prospect is the same number of seasons from his draft, so a prospect a year older now also scored his points, and was drafted, a year older; age cannot be confused with time since the draft there. Across all seasons the two move almost one for one (correlation 0.960), which is why age is compared only within a season.</w:t>
+        <w:t xml:space="preserve">Within a season's regression each prospect is the same number of seasons from his draft, so a prospect a year older now also scored his points, and was drafted, a year older; age cannot be confused with time since the draft there. Across all seasons the two move almost one for one (correlation 0.961), which is why age is compared only within a season.</w:t>
       </w:r>
     </w:p>
     <w:p>
@@ -10737,7 +10737,7 @@
                 <w:sz w:val="17"/>
                 <w:szCs w:val="17"/>
               </w:rPr>
-              <w:t xml:space="preserve">2.1964</w:t>
+              <w:t xml:space="preserve">2.2120</w:t>
             </w:r>
           </w:p>
         </w:tc>
@@ -10803,7 +10803,7 @@
                 <w:sz w:val="17"/>
                 <w:szCs w:val="17"/>
               </w:rPr>
-              <w:t xml:space="preserve">-2.17%</w:t>
+              <w:t xml:space="preserve">-2.09%</w:t>
             </w:r>
           </w:p>
         </w:tc>
@@ -10907,7 +10907,7 @@
                 <w:sz w:val="17"/>
                 <w:szCs w:val="17"/>
               </w:rPr>
-              <w:t xml:space="preserve">2.1901</w:t>
+              <w:t xml:space="preserve">2.2058</w:t>
             </w:r>
           </w:p>
         </w:tc>
@@ -10940,7 +10940,7 @@
                 <w:sz w:val="17"/>
                 <w:szCs w:val="17"/>
               </w:rPr>
-              <w:t xml:space="preserve">-0.29%</w:t>
+              <w:t xml:space="preserve">-0.28%</w:t>
             </w:r>
           </w:p>
         </w:tc>
@@ -10973,7 +10973,7 @@
                 <w:sz w:val="17"/>
                 <w:szCs w:val="17"/>
               </w:rPr>
-              <w:t xml:space="preserve">-2.45%</w:t>
+              <w:t xml:space="preserve">-2.37%</w:t>
             </w:r>
           </w:p>
         </w:tc>
@@ -11077,7 +11077,7 @@
                 <w:sz w:val="17"/>
                 <w:szCs w:val="17"/>
               </w:rPr>
-              <w:t xml:space="preserve">2.1802</w:t>
+              <w:t xml:space="preserve">2.1963</w:t>
             </w:r>
           </w:p>
         </w:tc>
@@ -11110,7 +11110,7 @@
                 <w:sz w:val="17"/>
                 <w:szCs w:val="17"/>
               </w:rPr>
-              <w:t xml:space="preserve">-0.74%</w:t>
+              <w:t xml:space="preserve">-0.71%</w:t>
             </w:r>
           </w:p>
         </w:tc>
@@ -11143,7 +11143,7 @@
                 <w:sz w:val="17"/>
                 <w:szCs w:val="17"/>
               </w:rPr>
-              <w:t xml:space="preserve">-2.89%</w:t>
+              <w:t xml:space="preserve">-2.79%</w:t>
             </w:r>
           </w:p>
         </w:tc>
@@ -11247,7 +11247,7 @@
                 <w:sz w:val="17"/>
                 <w:szCs w:val="17"/>
               </w:rPr>
-              <w:t xml:space="preserve">2.1812</w:t>
+              <w:t xml:space="preserve">2.1975</w:t>
             </w:r>
           </w:p>
         </w:tc>
@@ -11280,7 +11280,7 @@
                 <w:sz w:val="17"/>
                 <w:szCs w:val="17"/>
               </w:rPr>
-              <w:t xml:space="preserve">-0.69%</w:t>
+              <w:t xml:space="preserve">-0.66%</w:t>
             </w:r>
           </w:p>
         </w:tc>
@@ -11313,7 +11313,7 @@
                 <w:sz w:val="17"/>
                 <w:szCs w:val="17"/>
               </w:rPr>
-              <w:t xml:space="preserve">-2.84%</w:t>
+              <w:t xml:space="preserve">-2.74%</w:t>
             </w:r>
           </w:p>
         </w:tc>
@@ -11346,7 +11346,7 @@
                 <w:sz w:val="17"/>
                 <w:szCs w:val="17"/>
               </w:rPr>
-              <w:t xml:space="preserve">0.021</w:t>
+              <w:t xml:space="preserve">0.026</w:t>
             </w:r>
           </w:p>
         </w:tc>
@@ -11417,7 +11417,7 @@
                 <w:sz w:val="17"/>
                 <w:szCs w:val="17"/>
               </w:rPr>
-              <w:t xml:space="preserve">2.1801</w:t>
+              <w:t xml:space="preserve">2.1962</w:t>
             </w:r>
           </w:p>
         </w:tc>
@@ -11450,7 +11450,7 @@
                 <w:sz w:val="17"/>
                 <w:szCs w:val="17"/>
               </w:rPr>
-              <w:t xml:space="preserve">-0.74%</w:t>
+              <w:t xml:space="preserve">-0.71%</w:t>
             </w:r>
           </w:p>
         </w:tc>
@@ -11483,7 +11483,7 @@
                 <w:sz w:val="17"/>
                 <w:szCs w:val="17"/>
               </w:rPr>
-              <w:t xml:space="preserve">-2.89%</w:t>
+              <w:t xml:space="preserve">-2.79%</w:t>
             </w:r>
           </w:p>
         </w:tc>
@@ -11533,7 +11533,7 @@
           <w:sz w:val="18"/>
           <w:szCs w:val="18"/>
         </w:rPr>
-        <w:t xml:space="preserve">Held-out error as in Table 4. Each candidate keeps the adopted model of Section 2 (draft position in D+1 to D+3, linear and squared production, the no-record indicator) and adds the age term shown; its one-sided p-value compares it with that model. With both terms, the comparison against the age discount alone gives p = 0.605.</w:t>
+        <w:t xml:space="preserve">Held-out error as in Table 4. Each candidate keeps the adopted model of Section 2 (draft position in D+1 to D+3, linear and squared production, the no-record indicator) and adds the age term shown; its one-sided p-value compares it with that model. With both terms, the comparison against the age discount alone gives p = 0.620.</w:t>
       </w:r>
     </w:p>
     <w:p>
@@ -11557,7 +11557,7 @@
         <w:rPr>
           <w:rFonts w:ascii="Calibri" w:cs="Calibri" w:eastAsia="Calibri" w:hAnsi="Calibri"/>
         </w:rPr>
-        <w:t xml:space="preserve">Two forms were tested. Age as a flat amount subtracts the same dollars for each year of age, whatever the player scores. Age discounting production makes each point of production worth less the older the player was when he scored it: each year of age lowers the value of each point by a fixed amount. In D+2 that amount is $0.063 million (Table 9), so of two prospects with 10 points, the one who is a year older, and so scored them a year older, is worth $0.63 million less. Both forms are statistically significant improvements (one-sided p = 0.005 and 0.0015), and the discount improves held-out error more (-0.74% against -0.29%). I chose the discount because it is the larger gain and it measures what age was included for, which is how much a player's scoring says about him given his age. Using both terms is worse than the discount alone (-0.69% against -0.74%; p = 0.605 that it is better). The flat term also changes sign once the discount is in (Table B5), which shows the two terms measure the same thing.</w:t>
+        <w:t xml:space="preserve">Two forms were tested. Age as a flat amount subtracts the same dollars for each year of age, whatever the player scores. Age discounting production makes each point of production worth less the older the player was when he scored it: each year of age lowers the value of each point by a fixed amount. In D+2 that amount is $0.062 million (Table 9), so of two prospects with 10 points, the one who is a year older, and so scored them a year older, is worth $0.62 million less. Both forms are statistically significant improvements (one-sided p = 0.005 and 0.0015), and the discount improves held-out error more (-0.71% against -0.28%). I chose the discount because it is the larger gain and it measures what age was included for, which is how much a player's scoring says about him given his age. Using both terms is worse than the discount alone (-0.66% against -0.71%; p = 0.620 that it is better). The flat term also changes sign once the discount is in (Table B5), which shows the two terms measure the same thing.</w:t>
       </w:r>
     </w:p>
     <w:p>
@@ -11568,7 +11568,7 @@
         <w:rPr>
           <w:rFonts w:ascii="Calibri" w:cs="Calibri" w:eastAsia="Calibri" w:hAnsi="Calibri"/>
         </w:rPr>
-        <w:t xml:space="preserve">From D+5 on, age adds nothing (held-out error 0.7398 with the discount against 0.7392 without), so the adopted model applies the discount from D+1 to D+4 only, where it is statistically significant in each season (p ≤ 0.006, Table 9).</w:t>
+        <w:t xml:space="preserve">From D+5 on, age adds nothing (held-out error 0.7570 with the discount against 0.7561 without), so the adopted model applies the discount from D+1 to D+4 only, where it is statistically significant in each season (p ≤ 0.006, Table 9).</w:t>
       </w:r>
     </w:p>
     <w:p>
@@ -12074,7 +12074,7 @@
                 <w:sz w:val="17"/>
                 <w:szCs w:val="17"/>
               </w:rPr>
-              <w:t xml:space="preserve">11.350 (2.030) [&lt;0.001]</w:t>
+              <w:t xml:space="preserve">11.557 (2.029) [&lt;0.001]</w:t>
             </w:r>
           </w:p>
         </w:tc>
@@ -12107,7 +12107,7 @@
                 <w:sz w:val="17"/>
                 <w:szCs w:val="17"/>
               </w:rPr>
-              <w:t xml:space="preserve">10.029 (2.469) [&lt;0.001]</w:t>
+              <w:t xml:space="preserve">10.380 (2.472) [&lt;0.001]</w:t>
             </w:r>
           </w:p>
         </w:tc>
@@ -12140,7 +12140,7 @@
                 <w:sz w:val="17"/>
                 <w:szCs w:val="17"/>
               </w:rPr>
-              <w:t xml:space="preserve">7.525 (3.341) [0.024]</w:t>
+              <w:t xml:space="preserve">8.075 (3.338) [0.016]</w:t>
             </w:r>
           </w:p>
         </w:tc>
@@ -12277,7 +12277,7 @@
                 <w:sz w:val="17"/>
                 <w:szCs w:val="17"/>
               </w:rPr>
-              <w:t xml:space="preserve">-0.076 (0.047) [0.109]</w:t>
+              <w:t xml:space="preserve">-0.074 (0.047) [0.113]</w:t>
             </w:r>
           </w:p>
         </w:tc>
@@ -12310,7 +12310,7 @@
                 <w:sz w:val="17"/>
                 <w:szCs w:val="17"/>
               </w:rPr>
-              <w:t xml:space="preserve">-0.002 (0.036) [0.958]</w:t>
+              <w:t xml:space="preserve">-0.003 (0.036) [0.924]</w:t>
             </w:r>
           </w:p>
         </w:tc>
@@ -12343,7 +12343,7 @@
                 <w:sz w:val="17"/>
                 <w:szCs w:val="17"/>
               </w:rPr>
-              <w:t xml:space="preserve">0.043 (0.038) [0.262]</w:t>
+              <w:t xml:space="preserve">0.040 (0.038) [0.304]</w:t>
             </w:r>
           </w:p>
         </w:tc>
@@ -12376,7 +12376,7 @@
                 <w:sz w:val="17"/>
                 <w:szCs w:val="17"/>
               </w:rPr>
-              <w:t xml:space="preserve">0.045 (0.029) [0.119]</w:t>
+              <w:t xml:space="preserve">0.046 (0.029) [0.118]</w:t>
             </w:r>
           </w:p>
         </w:tc>
@@ -12409,7 +12409,7 @@
                 <w:sz w:val="17"/>
                 <w:szCs w:val="17"/>
               </w:rPr>
-              <w:t xml:space="preserve">-0.016 (0.009) [0.091]</w:t>
+              <w:t xml:space="preserve">-0.016 (0.009) [0.092]</w:t>
             </w:r>
           </w:p>
         </w:tc>
@@ -12480,7 +12480,7 @@
                 <w:sz w:val="17"/>
                 <w:szCs w:val="17"/>
               </w:rPr>
-              <w:t xml:space="preserve">0.0216 (0.0057) [&lt;0.001]</w:t>
+              <w:t xml:space="preserve">0.0213 (0.0056) [&lt;0.001]</w:t>
             </w:r>
           </w:p>
         </w:tc>
@@ -12513,7 +12513,7 @@
                 <w:sz w:val="17"/>
                 <w:szCs w:val="17"/>
               </w:rPr>
-              <w:t xml:space="preserve">0.0153 (0.0036) [&lt;0.001]</w:t>
+              <w:t xml:space="preserve">0.0152 (0.0036) [&lt;0.001]</w:t>
             </w:r>
           </w:p>
         </w:tc>
@@ -12612,7 +12612,7 @@
                 <w:sz w:val="17"/>
                 <w:szCs w:val="17"/>
               </w:rPr>
-              <w:t xml:space="preserve">0.0012 (0.0006) [0.063]</w:t>
+              <w:t xml:space="preserve">0.0012 (0.0006) [0.061]</w:t>
             </w:r>
           </w:p>
         </w:tc>
@@ -12683,7 +12683,7 @@
                 <w:sz w:val="17"/>
                 <w:szCs w:val="17"/>
               </w:rPr>
-              <w:t xml:space="preserve">-0.210 (0.109) [0.054]</w:t>
+              <w:t xml:space="preserve">-0.212 (0.110) [0.053]</w:t>
             </w:r>
           </w:p>
         </w:tc>
@@ -12716,7 +12716,7 @@
                 <w:sz w:val="17"/>
                 <w:szCs w:val="17"/>
               </w:rPr>
-              <w:t xml:space="preserve">-0.122 (0.070) [0.083]</w:t>
+              <w:t xml:space="preserve">-0.127 (0.071) [0.072]</w:t>
             </w:r>
           </w:p>
         </w:tc>
@@ -12749,7 +12749,7 @@
                 <w:sz w:val="17"/>
                 <w:szCs w:val="17"/>
               </w:rPr>
-              <w:t xml:space="preserve">-0.038 (0.017) [0.024]</w:t>
+              <w:t xml:space="preserve">-0.041 (0.017) [0.016]</w:t>
             </w:r>
           </w:p>
         </w:tc>
@@ -12886,7 +12886,7 @@
                 <w:sz w:val="17"/>
                 <w:szCs w:val="17"/>
               </w:rPr>
-              <w:t xml:space="preserve">-0.075 (0.021) [&lt;0.001]</w:t>
+              <w:t xml:space="preserve">-0.074 (0.021) [&lt;0.001]</w:t>
             </w:r>
           </w:p>
         </w:tc>
@@ -12919,7 +12919,7 @@
                 <w:sz w:val="17"/>
                 <w:szCs w:val="17"/>
               </w:rPr>
-              <w:t xml:space="preserve">-0.063 (0.015) [&lt;0.001]</w:t>
+              <w:t xml:space="preserve">-0.062 (0.015) [&lt;0.001]</w:t>
             </w:r>
           </w:p>
         </w:tc>
@@ -12952,7 +12952,7 @@
                 <w:sz w:val="17"/>
                 <w:szCs w:val="17"/>
               </w:rPr>
-              <w:t xml:space="preserve">-0.050 (0.012) [&lt;0.001]</w:t>
+              <w:t xml:space="preserve">-0.049 (0.012) [&lt;0.001]</w:t>
             </w:r>
           </w:p>
         </w:tc>
@@ -13221,7 +13221,7 @@
                 <w:sz w:val="17"/>
                 <w:szCs w:val="17"/>
               </w:rPr>
-              <w:t xml:space="preserve">5,370</w:t>
+              <w:t xml:space="preserve">5,262</w:t>
             </w:r>
           </w:p>
         </w:tc>
@@ -13424,7 +13424,7 @@
                 <w:sz w:val="17"/>
                 <w:szCs w:val="17"/>
               </w:rPr>
-              <w:t xml:space="preserve">1,560</w:t>
+              <w:t xml:space="preserve">1,556</w:t>
             </w:r>
           </w:p>
         </w:tc>
@@ -13698,7 +13698,7 @@
                 <w:sz w:val="17"/>
                 <w:szCs w:val="17"/>
               </w:rPr>
-              <w:t xml:space="preserve">0.292</w:t>
+              <w:t xml:space="preserve">0.293</w:t>
             </w:r>
           </w:p>
         </w:tc>
@@ -13731,7 +13731,7 @@
                 <w:sz w:val="17"/>
                 <w:szCs w:val="17"/>
               </w:rPr>
-              <w:t xml:space="preserve">0.219</w:t>
+              <w:t xml:space="preserve">0.221</w:t>
             </w:r>
           </w:p>
         </w:tc>
@@ -13764,7 +13764,7 @@
                 <w:sz w:val="17"/>
                 <w:szCs w:val="17"/>
               </w:rPr>
-              <w:t xml:space="preserve">0.157</w:t>
+              <w:t xml:space="preserve">0.159</w:t>
             </w:r>
           </w:p>
         </w:tc>
@@ -13830,7 +13830,7 @@
                 <w:sz w:val="17"/>
                 <w:szCs w:val="17"/>
               </w:rPr>
-              <w:t xml:space="preserve">0.034</w:t>
+              <w:t xml:space="preserve">0.035</w:t>
             </w:r>
           </w:p>
         </w:tc>
@@ -14137,7 +14137,7 @@
                 <w:sz w:val="17"/>
                 <w:szCs w:val="17"/>
               </w:rPr>
-              <w:t xml:space="preserve">16.692 (1.803) [&lt;0.001]</w:t>
+              <w:t xml:space="preserve">16.928 (1.799) [&lt;0.001]</w:t>
             </w:r>
           </w:p>
         </w:tc>
@@ -14170,7 +14170,7 @@
                 <w:sz w:val="17"/>
                 <w:szCs w:val="17"/>
               </w:rPr>
-              <w:t xml:space="preserve">13.064 (2.261) [&lt;0.001]</w:t>
+              <w:t xml:space="preserve">13.370 (2.258) [&lt;0.001]</w:t>
             </w:r>
           </w:p>
         </w:tc>
@@ -14203,7 +14203,7 @@
                 <w:sz w:val="17"/>
                 <w:szCs w:val="17"/>
               </w:rPr>
-              <w:t xml:space="preserve">12.545 (2.236) [&lt;0.001]</w:t>
+              <w:t xml:space="preserve">12.855 (2.236) [&lt;0.001]</w:t>
             </w:r>
           </w:p>
         </w:tc>
@@ -14236,7 +14236,7 @@
                 <w:sz w:val="17"/>
                 <w:szCs w:val="17"/>
               </w:rPr>
-              <w:t xml:space="preserve">10.029 (2.469) [&lt;0.001]</w:t>
+              <w:t xml:space="preserve">10.380 (2.472) [&lt;0.001]</w:t>
             </w:r>
           </w:p>
         </w:tc>
@@ -14340,7 +14340,7 @@
                 <w:sz w:val="17"/>
                 <w:szCs w:val="17"/>
               </w:rPr>
-              <w:t xml:space="preserve">0.051 (0.014) [&lt;0.001]</w:t>
+              <w:t xml:space="preserve">0.050 (0.014) [&lt;0.001]</w:t>
             </w:r>
           </w:p>
         </w:tc>
@@ -14406,7 +14406,7 @@
                 <w:sz w:val="17"/>
                 <w:szCs w:val="17"/>
               </w:rPr>
-              <w:t xml:space="preserve">-0.002 (0.036) [0.958]</w:t>
+              <w:t xml:space="preserve">-0.003 (0.036) [0.924]</w:t>
             </w:r>
           </w:p>
         </w:tc>
@@ -14576,7 +14576,7 @@
                 <w:sz w:val="17"/>
                 <w:szCs w:val="17"/>
               </w:rPr>
-              <w:t xml:space="preserve">0.0153 (0.0036) [&lt;0.001]</w:t>
+              <w:t xml:space="preserve">0.0152 (0.0036) [&lt;0.001]</w:t>
             </w:r>
           </w:p>
         </w:tc>
@@ -14680,7 +14680,7 @@
                 <w:sz w:val="17"/>
                 <w:szCs w:val="17"/>
               </w:rPr>
-              <w:t xml:space="preserve">-0.176 (0.072) [0.015]</w:t>
+              <w:t xml:space="preserve">-0.180 (0.073) [0.013]</w:t>
             </w:r>
           </w:p>
         </w:tc>
@@ -14713,7 +14713,7 @@
                 <w:sz w:val="17"/>
                 <w:szCs w:val="17"/>
               </w:rPr>
-              <w:t xml:space="preserve">-0.166 (0.071) [0.019]</w:t>
+              <w:t xml:space="preserve">-0.171 (0.072) [0.017]</w:t>
             </w:r>
           </w:p>
         </w:tc>
@@ -14746,7 +14746,7 @@
                 <w:sz w:val="17"/>
                 <w:szCs w:val="17"/>
               </w:rPr>
-              <w:t xml:space="preserve">-0.122 (0.070) [0.083]</w:t>
+              <w:t xml:space="preserve">-0.127 (0.071) [0.072]</w:t>
             </w:r>
           </w:p>
         </w:tc>
@@ -14916,7 +14916,7 @@
                 <w:sz w:val="17"/>
                 <w:szCs w:val="17"/>
               </w:rPr>
-              <w:t xml:space="preserve">-0.063 (0.015) [&lt;0.001]</w:t>
+              <w:t xml:space="preserve">-0.062 (0.015) [&lt;0.001]</w:t>
             </w:r>
           </w:p>
         </w:tc>
@@ -15157,7 +15157,7 @@
                 <w:sz w:val="17"/>
                 <w:szCs w:val="17"/>
               </w:rPr>
-              <w:t xml:space="preserve">0.159</w:t>
+              <w:t xml:space="preserve">0.162</w:t>
             </w:r>
           </w:p>
         </w:tc>
@@ -15190,7 +15190,7 @@
                 <w:sz w:val="17"/>
                 <w:szCs w:val="17"/>
               </w:rPr>
-              <w:t xml:space="preserve">0.170</w:t>
+              <w:t xml:space="preserve">0.173</w:t>
             </w:r>
           </w:p>
         </w:tc>
@@ -15223,7 +15223,7 @@
                 <w:sz w:val="17"/>
                 <w:szCs w:val="17"/>
               </w:rPr>
-              <w:t xml:space="preserve">0.204</w:t>
+              <w:t xml:space="preserve">0.206</w:t>
             </w:r>
           </w:p>
         </w:tc>
@@ -15256,7 +15256,7 @@
                 <w:sz w:val="17"/>
                 <w:szCs w:val="17"/>
               </w:rPr>
-              <w:t xml:space="preserve">0.219</w:t>
+              <w:t xml:space="preserve">0.221</w:t>
             </w:r>
           </w:p>
         </w:tc>
@@ -15574,7 +15574,7 @@
                 <w:sz w:val="17"/>
                 <w:szCs w:val="17"/>
               </w:rPr>
-              <w:t xml:space="preserve">10.029</w:t>
+              <w:t xml:space="preserve">10.380</w:t>
             </w:r>
           </w:p>
         </w:tc>
@@ -15607,7 +15607,7 @@
                 <w:sz w:val="17"/>
                 <w:szCs w:val="17"/>
               </w:rPr>
-              <w:t xml:space="preserve">$1.70M</w:t>
+              <w:t xml:space="preserve">$1.76M</w:t>
             </w:r>
           </w:p>
         </w:tc>
@@ -15711,7 +15711,7 @@
                 <w:sz w:val="17"/>
                 <w:szCs w:val="17"/>
               </w:rPr>
-              <w:t xml:space="preserve">-0.002</w:t>
+              <w:t xml:space="preserve">-0.003</w:t>
             </w:r>
           </w:p>
         </w:tc>
@@ -15744,7 +15744,7 @@
                 <w:sz w:val="17"/>
                 <w:szCs w:val="17"/>
               </w:rPr>
-              <w:t xml:space="preserve">-$0.03M</w:t>
+              <w:t xml:space="preserve">-$0.05M</w:t>
             </w:r>
           </w:p>
         </w:tc>
@@ -15848,7 +15848,7 @@
                 <w:sz w:val="17"/>
                 <w:szCs w:val="17"/>
               </w:rPr>
-              <w:t xml:space="preserve">0.0153</w:t>
+              <w:t xml:space="preserve">0.0152</w:t>
             </w:r>
           </w:p>
         </w:tc>
@@ -15881,7 +15881,7 @@
                 <w:sz w:val="17"/>
                 <w:szCs w:val="17"/>
               </w:rPr>
-              <w:t xml:space="preserve">$3.62M</w:t>
+              <w:t xml:space="preserve">$3.59M</w:t>
             </w:r>
           </w:p>
         </w:tc>
@@ -15985,7 +15985,7 @@
                 <w:sz w:val="17"/>
                 <w:szCs w:val="17"/>
               </w:rPr>
-              <w:t xml:space="preserve">-0.122</w:t>
+              <w:t xml:space="preserve">-0.127</w:t>
             </w:r>
           </w:p>
         </w:tc>
@@ -16122,7 +16122,7 @@
                 <w:sz w:val="17"/>
                 <w:szCs w:val="17"/>
               </w:rPr>
-              <w:t xml:space="preserve">-0.063</w:t>
+              <w:t xml:space="preserve">-0.062</w:t>
             </w:r>
           </w:p>
         </w:tc>
@@ -16155,7 +16155,7 @@
                 <w:sz w:val="17"/>
                 <w:szCs w:val="17"/>
               </w:rPr>
-              <w:t xml:space="preserve">-$1.07M</w:t>
+              <w:t xml:space="preserve">-$1.05M</w:t>
             </w:r>
           </w:p>
         </w:tc>
@@ -16276,7 +16276,7 @@
                 <w:sz w:val="17"/>
                 <w:szCs w:val="17"/>
               </w:rPr>
-              <w:t xml:space="preserve">$4.22M</w:t>
+              <w:t xml:space="preserve">$4.25M</w:t>
             </w:r>
           </w:p>
         </w:tc>
@@ -16393,7 +16393,7 @@
                 <w:sz w:val="17"/>
                 <w:szCs w:val="17"/>
               </w:rPr>
-              <w:t xml:space="preserve">$3.53M</w:t>
+              <w:t xml:space="preserve">$3.57M</w:t>
             </w:r>
           </w:p>
         </w:tc>
@@ -16510,7 +16510,7 @@
                 <w:sz w:val="17"/>
                 <w:szCs w:val="17"/>
               </w:rPr>
-              <w:t xml:space="preserve">$3.00M</w:t>
+              <w:t xml:space="preserve">$3.05M</w:t>
             </w:r>
           </w:p>
         </w:tc>
@@ -16627,7 +16627,7 @@
                 <w:sz w:val="17"/>
                 <w:szCs w:val="17"/>
               </w:rPr>
-              <w:t xml:space="preserve">$4.00M</w:t>
+              <w:t xml:space="preserve">$4.03M</w:t>
             </w:r>
           </w:p>
         </w:tc>
@@ -16644,7 +16644,7 @@
           <w:sz w:val="18"/>
           <w:szCs w:val="18"/>
         </w:rPr>
-        <w:t xml:space="preserve">Millions of dollars at the 2025-26 cap. Contributions are input times coefficient and sum to the adopted value. His production of 15.37 enters squared as 15.37² = 236.11; his age less 18 is 1.10. The production and squared terms are read together: his 15.37 points add -$0.03M + $3.62M = $3.59M.</w:t>
+        <w:t xml:space="preserve">Millions of dollars at the 2025-26 cap. Contributions are input times coefficient and sum to the adopted value. His production of 15.37 enters squared as 15.37² = 236.11; his age less 18 is 1.10. The production and squared terms are read together: his 15.37 points add -$0.05M + $3.59M = $3.54M.</w:t>
       </w:r>
     </w:p>
     <w:p>
@@ -16655,7 +16655,7 @@
         <w:rPr>
           <w:rFonts w:ascii="Calibri" w:cs="Calibri" w:eastAsia="Calibri" w:hAnsi="Calibri"/>
         </w:rPr>
-        <w:t xml:space="preserve">His scoring raises his value from $3.00 million on his draft position to $4.22 million. The production model without age values him at $3.53 million, so age adds $0.69 million. Age adds value because Suzuki is among the youngest a D+2 prospect can be, and the model discounts each point by the age at which it was scored.</w:t>
+        <w:t xml:space="preserve">His scoring raises his value from $3.05 million on his draft position to $4.25 million. The production model without age values him at $3.57 million, so age adds $0.68 million. Age adds value because Suzuki is among the youngest a D+2 prospect can be, and the model discounts each point by the age at which it was scored.</w:t>
       </w:r>
     </w:p>
     <w:p>
@@ -16679,7 +16679,7 @@
         <w:rPr>
           <w:rFonts w:ascii="Calibri" w:cs="Calibri" w:eastAsia="Calibri" w:hAnsi="Calibri"/>
         </w:rPr>
-        <w:t xml:space="preserve">From July 2017 to March 2022, clubs traded 197 drafted prospects (170 different players, as some were traded more than once) and 53 undrafted prospects. The adopted model values them at $75.60 million: $69.82 million for the drafted prospects and $5.78 million for the undrafted. Table 12 values the same 197 drafted prospects under each alternative considered above, so each decision's effect can be read in dollars on the same assets.</w:t>
+        <w:t xml:space="preserve">From July 2017 to March 2022, clubs traded 196 drafted prospects (169 different players, as some were traded more than once) and 53 undrafted prospects. The adopted model values them at $77.32 million: $71.23 million for the drafted prospects and $6.10 million for the undrafted. Table 12 values the same 196 drafted prospects under each alternative considered above, so each decision's effect can be read in dollars on the same assets.</w:t>
       </w:r>
     </w:p>
     <w:p>
@@ -16695,7 +16695,7 @@
           <w:sz w:val="20"/>
           <w:szCs w:val="20"/>
         </w:rPr>
-        <w:t xml:space="preserve">Table 12. The 197 traded drafted prospects under each version</w:t>
+        <w:t xml:space="preserve">Table 12. The 196 traded drafted prospects under each version</w:t>
       </w:r>
     </w:p>
     <w:tbl>
@@ -16888,7 +16888,7 @@
                 <w:sz w:val="17"/>
                 <w:szCs w:val="17"/>
               </w:rPr>
-              <w:t xml:space="preserve">$130.37M</w:t>
+              <w:t xml:space="preserve">$131.12M</w:t>
             </w:r>
           </w:p>
         </w:tc>
@@ -16921,7 +16921,7 @@
                 <w:sz w:val="17"/>
                 <w:szCs w:val="17"/>
               </w:rPr>
-              <w:t xml:space="preserve">$60.55M</w:t>
+              <w:t xml:space="preserve">$59.89M</w:t>
             </w:r>
           </w:p>
         </w:tc>
@@ -16992,7 +16992,7 @@
                 <w:sz w:val="17"/>
                 <w:szCs w:val="17"/>
               </w:rPr>
-              <w:t xml:space="preserve">$57.99M</w:t>
+              <w:t xml:space="preserve">$61.78M</w:t>
             </w:r>
           </w:p>
         </w:tc>
@@ -17025,7 +17025,7 @@
                 <w:sz w:val="17"/>
                 <w:szCs w:val="17"/>
               </w:rPr>
-              <w:t xml:space="preserve">-$11.82M</w:t>
+              <w:t xml:space="preserve">-$9.45M</w:t>
             </w:r>
           </w:p>
         </w:tc>
@@ -17096,7 +17096,7 @@
                 <w:sz w:val="17"/>
                 <w:szCs w:val="17"/>
               </w:rPr>
-              <w:t xml:space="preserve">$75.28M</w:t>
+              <w:t xml:space="preserve">$76.81M</w:t>
             </w:r>
           </w:p>
         </w:tc>
@@ -17129,7 +17129,7 @@
                 <w:sz w:val="17"/>
                 <w:szCs w:val="17"/>
               </w:rPr>
-              <w:t xml:space="preserve">$5.46M</w:t>
+              <w:t xml:space="preserve">$5.58M</w:t>
             </w:r>
           </w:p>
         </w:tc>
@@ -17200,7 +17200,7 @@
                 <w:sz w:val="17"/>
                 <w:szCs w:val="17"/>
               </w:rPr>
-              <w:t xml:space="preserve">$66.67M</w:t>
+              <w:t xml:space="preserve">$68.61M</w:t>
             </w:r>
           </w:p>
         </w:tc>
@@ -17233,7 +17233,7 @@
                 <w:sz w:val="17"/>
                 <w:szCs w:val="17"/>
               </w:rPr>
-              <w:t xml:space="preserve">-$3.15M</w:t>
+              <w:t xml:space="preserve">-$2.62M</w:t>
             </w:r>
           </w:p>
         </w:tc>
@@ -17304,7 +17304,7 @@
                 <w:sz w:val="17"/>
                 <w:szCs w:val="17"/>
               </w:rPr>
-              <w:t xml:space="preserve">$67.22M</w:t>
+              <w:t xml:space="preserve">$68.71M</w:t>
             </w:r>
           </w:p>
         </w:tc>
@@ -17337,7 +17337,7 @@
                 <w:sz w:val="17"/>
                 <w:szCs w:val="17"/>
               </w:rPr>
-              <w:t xml:space="preserve">-$2.60M</w:t>
+              <w:t xml:space="preserve">-$2.52M</w:t>
             </w:r>
           </w:p>
         </w:tc>
@@ -17408,7 +17408,7 @@
                 <w:sz w:val="17"/>
                 <w:szCs w:val="17"/>
               </w:rPr>
-              <w:t xml:space="preserve">$69.37M</w:t>
+              <w:t xml:space="preserve">$70.72M</w:t>
             </w:r>
           </w:p>
         </w:tc>
@@ -17441,7 +17441,7 @@
                 <w:sz w:val="17"/>
                 <w:szCs w:val="17"/>
               </w:rPr>
-              <w:t xml:space="preserve">-$0.45M</w:t>
+              <w:t xml:space="preserve">-$0.51M</w:t>
             </w:r>
           </w:p>
         </w:tc>
@@ -17512,7 +17512,7 @@
                 <w:sz w:val="17"/>
                 <w:szCs w:val="17"/>
               </w:rPr>
-              <w:t xml:space="preserve">$70.17M</w:t>
+              <w:t xml:space="preserve">$71.23M</w:t>
             </w:r>
           </w:p>
         </w:tc>
@@ -17545,7 +17545,7 @@
                 <w:sz w:val="17"/>
                 <w:szCs w:val="17"/>
               </w:rPr>
-              <w:t xml:space="preserve">$0.35M</w:t>
+              <w:t xml:space="preserve">$0.00M</w:t>
             </w:r>
           </w:p>
         </w:tc>
@@ -17618,7 +17618,7 @@
                 <w:sz w:val="17"/>
                 <w:szCs w:val="17"/>
               </w:rPr>
-              <w:t xml:space="preserve">$69.82M</w:t>
+              <w:t xml:space="preserve">$71.23M</w:t>
             </w:r>
           </w:p>
         </w:tc>
@@ -17723,7 +17723,7 @@
                 <w:sz w:val="17"/>
                 <w:szCs w:val="17"/>
               </w:rPr>
-              <w:t xml:space="preserve">$68.61M</w:t>
+              <w:t xml:space="preserve">$70.02M</w:t>
             </w:r>
           </w:p>
         </w:tc>
@@ -17756,7 +17756,7 @@
                 <w:sz w:val="17"/>
                 <w:szCs w:val="17"/>
               </w:rPr>
-              <w:t xml:space="preserve">-$1.20M</w:t>
+              <w:t xml:space="preserve">-$1.21M</w:t>
             </w:r>
           </w:p>
         </w:tc>
@@ -17773,7 +17773,7 @@
           <w:sz w:val="18"/>
           <w:szCs w:val="18"/>
         </w:rPr>
-        <w:t xml:space="preserve">Millions of dollars at the 2025-26 cap; 185 skaters priced under each version and 12 goaltenders on draft position alone in each. Each version applies its fit on all drafts 2007-2017 to each prospect at the season of his trade.</w:t>
+        <w:t xml:space="preserve">Millions of dollars at the 2025-26 cap; 184 skaters priced under each version and 12 goaltenders on draft position alone in each. Each version applies its fit on all drafts 2007-2017 to each prospect at the season of his trade.</w:t>
       </w:r>
     </w:p>
     <w:p>
@@ -17784,7 +17784,7 @@
         <w:rPr>
           <w:rFonts w:ascii="Calibri" w:cs="Calibri" w:eastAsia="Calibri" w:hAnsi="Calibri"/>
         </w:rPr>
-        <w:t xml:space="preserve">Production and age change many prospects' values. Moving from draft position alone to the adopted model moves 60 of the 197 values by $0.25 million or more and leaves 10 of the 20 most valuable prospects in the top 20 (rank correlation 0.553).</w:t>
+        <w:t xml:space="preserve">Production and age change many prospects' values. Moving from draft position alone to the adopted model moves 63 of the 196 values by $0.25 million or more and leaves 10 of the 20 most valuable prospects in the top 20 (rank correlation 0.557).</w:t>
       </w:r>
     </w:p>
     <w:p>
@@ -17795,7 +17795,7 @@
         <w:rPr>
           <w:rFonts w:ascii="Calibri" w:cs="Calibri" w:eastAsia="Calibri" w:hAnsi="Calibri"/>
         </w:rPr>
-        <w:t xml:space="preserve">A value can be below zero. Of the 197 drafted prospects, 66 are valued below zero, -$4.02 million in total; of all 250 prospects valued, 82 are, the lowest at -$0.47 million. A value below zero means that prospects with that profile, a low scorer from a late draft position, delivered slightly negative surplus on average in the data: when such players reach the NHL, their cost tends to exceed the value of the wins they deliver. Negative careers count, as in the draft pick curve.</w:t>
+        <w:t xml:space="preserve">A value can be below zero. Of the 196 drafted prospects, 62 are valued below zero, -$3.89 million in total; of all 249 prospects valued, 78 are, the lowest at -$0.47 million. A value below zero means that prospects with that profile, a low scorer from a late draft position, delivered slightly negative surplus on average in the data: when such players reach the NHL, their cost tends to exceed the value of the wins they deliver. Negative careers count, as in the draft pick curve.</w:t>
       </w:r>
     </w:p>
     <w:p>
@@ -17871,7 +17871,7 @@
           <w:sz w:val="18"/>
           <w:szCs w:val="18"/>
         </w:rPr>
-        <w:t xml:space="preserve">Each point is one of the 197 traded drafted prospects, valued on draft position alone (horizontal) and on the adopted model (vertical), in millions of dollars at the 2025-26 cap. Points above the dashed line gained value from production and age. Colour shows the prospect's season at the trade.</w:t>
+        <w:t xml:space="preserve">Each point is one of the 196 traded drafted prospects, valued on draft position alone (horizontal) and on the adopted model (vertical), in millions of dollars at the 2025-26 cap. Points above the dashed line gained value from production and age. Colour shows the prospect's season at the trade.</w:t>
       </w:r>
     </w:p>
     <w:p>
@@ -18420,7 +18420,7 @@
                 <w:sz w:val="17"/>
                 <w:szCs w:val="17"/>
               </w:rPr>
-              <w:t xml:space="preserve">$3.00M</w:t>
+              <w:t xml:space="preserve">$3.05M</w:t>
             </w:r>
           </w:p>
         </w:tc>
@@ -18453,7 +18453,7 @@
                 <w:sz w:val="17"/>
                 <w:szCs w:val="17"/>
               </w:rPr>
-              <w:t xml:space="preserve">$4.22M</w:t>
+              <w:t xml:space="preserve">$4.25M</w:t>
             </w:r>
           </w:p>
         </w:tc>
@@ -18689,7 +18689,7 @@
                 <w:sz w:val="17"/>
                 <w:szCs w:val="17"/>
               </w:rPr>
-              <w:t xml:space="preserve">$0.49M</w:t>
+              <w:t xml:space="preserve">$0.52M</w:t>
             </w:r>
           </w:p>
         </w:tc>
@@ -18722,7 +18722,7 @@
                 <w:sz w:val="17"/>
                 <w:szCs w:val="17"/>
               </w:rPr>
-              <w:t xml:space="preserve">$2.71M</w:t>
+              <w:t xml:space="preserve">$2.72M</w:t>
             </w:r>
           </w:p>
         </w:tc>
@@ -18958,7 +18958,7 @@
                 <w:sz w:val="17"/>
                 <w:szCs w:val="17"/>
               </w:rPr>
-              <w:t xml:space="preserve">$2.11M</w:t>
+              <w:t xml:space="preserve">$2.17M</w:t>
             </w:r>
           </w:p>
         </w:tc>
@@ -18991,7 +18991,7 @@
                 <w:sz w:val="17"/>
                 <w:szCs w:val="17"/>
               </w:rPr>
-              <w:t xml:space="preserve">$2.46M</w:t>
+              <w:t xml:space="preserve">$2.51M</w:t>
             </w:r>
           </w:p>
         </w:tc>
@@ -19260,7 +19260,7 @@
                 <w:sz w:val="17"/>
                 <w:szCs w:val="17"/>
               </w:rPr>
-              <w:t xml:space="preserve">$2.41M</w:t>
+              <w:t xml:space="preserve">$2.49M</w:t>
             </w:r>
           </w:p>
         </w:tc>
@@ -19298,7 +19298,7 @@
                 <w:sz w:val="17"/>
                 <w:szCs w:val="17"/>
               </w:rPr>
-              <w:t xml:space="preserve">2019-02-25</w:t>
+              <w:t xml:space="preserve">2017-11-05</w:t>
             </w:r>
           </w:p>
         </w:tc>
@@ -19331,7 +19331,7 @@
                 <w:sz w:val="17"/>
                 <w:szCs w:val="17"/>
               </w:rPr>
-              <w:t xml:space="preserve">Jonathan Dahlén</w:t>
+              <w:t xml:space="preserve">Vladislav Kamenev</w:t>
             </w:r>
           </w:p>
         </w:tc>
@@ -19364,7 +19364,7 @@
                 <w:sz w:val="17"/>
                 <w:szCs w:val="17"/>
               </w:rPr>
-              <w:t xml:space="preserve">2016 #42</w:t>
+              <w:t xml:space="preserve">2014 #42</w:t>
             </w:r>
           </w:p>
         </w:tc>
@@ -19397,7 +19397,7 @@
                 <w:sz w:val="17"/>
                 <w:szCs w:val="17"/>
               </w:rPr>
-              <w:t xml:space="preserve">D+3</w:t>
+              <w:t xml:space="preserve">D+4</w:t>
             </w:r>
           </w:p>
         </w:tc>
@@ -19430,7 +19430,7 @@
                 <w:sz w:val="17"/>
                 <w:szCs w:val="17"/>
               </w:rPr>
-              <w:t xml:space="preserve">18.9</w:t>
+              <w:t xml:space="preserve">23.0</w:t>
             </w:r>
           </w:p>
         </w:tc>
@@ -19463,7 +19463,7 @@
                 <w:sz w:val="17"/>
                 <w:szCs w:val="17"/>
               </w:rPr>
-              <w:t xml:space="preserve">20.7</w:t>
+              <w:t xml:space="preserve">21.1</w:t>
             </w:r>
           </w:p>
         </w:tc>
@@ -19496,7 +19496,7 @@
                 <w:sz w:val="17"/>
                 <w:szCs w:val="17"/>
               </w:rPr>
-              <w:t xml:space="preserve">$0.90M</w:t>
+              <w:t xml:space="preserve">$0.54M</w:t>
             </w:r>
           </w:p>
         </w:tc>
@@ -19567,7 +19567,7 @@
                 <w:sz w:val="17"/>
                 <w:szCs w:val="17"/>
               </w:rPr>
-              <w:t xml:space="preserve">2017-11-05</w:t>
+              <w:t xml:space="preserve">2019-02-25</w:t>
             </w:r>
           </w:p>
         </w:tc>
@@ -19600,7 +19600,7 @@
                 <w:sz w:val="17"/>
                 <w:szCs w:val="17"/>
               </w:rPr>
-              <w:t xml:space="preserve">Vladislav Kamenev</w:t>
+              <w:t xml:space="preserve">Jonathan Dahlén</w:t>
             </w:r>
           </w:p>
         </w:tc>
@@ -19633,7 +19633,7 @@
                 <w:sz w:val="17"/>
                 <w:szCs w:val="17"/>
               </w:rPr>
-              <w:t xml:space="preserve">2014 #42</w:t>
+              <w:t xml:space="preserve">2016 #42</w:t>
             </w:r>
           </w:p>
         </w:tc>
@@ -19666,7 +19666,7 @@
                 <w:sz w:val="17"/>
                 <w:szCs w:val="17"/>
               </w:rPr>
-              <w:t xml:space="preserve">D+4</w:t>
+              <w:t xml:space="preserve">D+3</w:t>
             </w:r>
           </w:p>
         </w:tc>
@@ -19699,7 +19699,7 @@
                 <w:sz w:val="17"/>
                 <w:szCs w:val="17"/>
               </w:rPr>
-              <w:t xml:space="preserve">23.0</w:t>
+              <w:t xml:space="preserve">18.9</w:t>
             </w:r>
           </w:p>
         </w:tc>
@@ -19732,7 +19732,7 @@
                 <w:sz w:val="17"/>
                 <w:szCs w:val="17"/>
               </w:rPr>
-              <w:t xml:space="preserve">21.1</w:t>
+              <w:t xml:space="preserve">20.7</w:t>
             </w:r>
           </w:p>
         </w:tc>
@@ -19765,7 +19765,7 @@
                 <w:sz w:val="17"/>
                 <w:szCs w:val="17"/>
               </w:rPr>
-              <w:t xml:space="preserve">$0.50M</w:t>
+              <w:t xml:space="preserve">$0.92M</w:t>
             </w:r>
           </w:p>
         </w:tc>
@@ -19798,7 +19798,7 @@
                 <w:sz w:val="17"/>
                 <w:szCs w:val="17"/>
               </w:rPr>
-              <w:t xml:space="preserve">$2.25M</w:t>
+              <w:t xml:space="preserve">$2.26M</w:t>
             </w:r>
           </w:p>
         </w:tc>
@@ -19836,7 +19836,7 @@
                 <w:sz w:val="17"/>
                 <w:szCs w:val="17"/>
               </w:rPr>
-              <w:t xml:space="preserve">2019-01-28</w:t>
+              <w:t xml:space="preserve">2019-02-25</w:t>
             </w:r>
           </w:p>
         </w:tc>
@@ -19869,7 +19869,7 @@
                 <w:sz w:val="17"/>
                 <w:szCs w:val="17"/>
               </w:rPr>
-              <w:t xml:space="preserve">Carl Grundström</w:t>
+              <w:t xml:space="preserve">Erik Brännström</w:t>
             </w:r>
           </w:p>
         </w:tc>
@@ -19902,7 +19902,7 @@
                 <w:sz w:val="17"/>
                 <w:szCs w:val="17"/>
               </w:rPr>
-              <w:t xml:space="preserve">2016 #57</w:t>
+              <w:t xml:space="preserve">2017 #15</w:t>
             </w:r>
           </w:p>
         </w:tc>
@@ -19935,7 +19935,7 @@
                 <w:sz w:val="17"/>
                 <w:szCs w:val="17"/>
               </w:rPr>
-              <w:t xml:space="preserve">D+3</w:t>
+              <w:t xml:space="preserve">D+2</w:t>
             </w:r>
           </w:p>
         </w:tc>
@@ -19968,7 +19968,7 @@
                 <w:sz w:val="17"/>
                 <w:szCs w:val="17"/>
               </w:rPr>
-              <w:t xml:space="preserve">18.6</w:t>
+              <w:t xml:space="preserve">8.3</w:t>
             </w:r>
           </w:p>
         </w:tc>
@@ -20001,7 +20001,7 @@
                 <w:sz w:val="17"/>
                 <w:szCs w:val="17"/>
               </w:rPr>
-              <w:t xml:space="preserve">20.8</w:t>
+              <w:t xml:space="preserve">19.0</w:t>
             </w:r>
           </w:p>
         </w:tc>
@@ -20034,7 +20034,7 @@
                 <w:sz w:val="17"/>
                 <w:szCs w:val="17"/>
               </w:rPr>
-              <w:t xml:space="preserve">$0.66M</w:t>
+              <w:t xml:space="preserve">$2.69M</w:t>
             </w:r>
           </w:p>
         </w:tc>
@@ -20067,7 +20067,7 @@
                 <w:sz w:val="17"/>
                 <w:szCs w:val="17"/>
               </w:rPr>
-              <w:t xml:space="preserve">$2.01M</w:t>
+              <w:t xml:space="preserve">$2.05M</w:t>
             </w:r>
           </w:p>
         </w:tc>
@@ -20105,7 +20105,7 @@
                 <w:sz w:val="17"/>
                 <w:szCs w:val="17"/>
               </w:rPr>
-              <w:t xml:space="preserve">2019-02-25</w:t>
+              <w:t xml:space="preserve">2019-01-28</w:t>
             </w:r>
           </w:p>
         </w:tc>
@@ -20138,7 +20138,7 @@
                 <w:sz w:val="17"/>
                 <w:szCs w:val="17"/>
               </w:rPr>
-              <w:t xml:space="preserve">Erik Brännström</w:t>
+              <w:t xml:space="preserve">Carl Grundström</w:t>
             </w:r>
           </w:p>
         </w:tc>
@@ -20171,7 +20171,7 @@
                 <w:sz w:val="17"/>
                 <w:szCs w:val="17"/>
               </w:rPr>
-              <w:t xml:space="preserve">2017 #15</w:t>
+              <w:t xml:space="preserve">2016 #57</w:t>
             </w:r>
           </w:p>
         </w:tc>
@@ -20204,7 +20204,7 @@
                 <w:sz w:val="17"/>
                 <w:szCs w:val="17"/>
               </w:rPr>
-              <w:t xml:space="preserve">D+2</w:t>
+              <w:t xml:space="preserve">D+3</w:t>
             </w:r>
           </w:p>
         </w:tc>
@@ -20237,7 +20237,7 @@
                 <w:sz w:val="17"/>
                 <w:szCs w:val="17"/>
               </w:rPr>
-              <w:t xml:space="preserve">8.3</w:t>
+              <w:t xml:space="preserve">18.6</w:t>
             </w:r>
           </w:p>
         </w:tc>
@@ -20270,7 +20270,7 @@
                 <w:sz w:val="17"/>
                 <w:szCs w:val="17"/>
               </w:rPr>
-              <w:t xml:space="preserve">19.0</w:t>
+              <w:t xml:space="preserve">20.8</w:t>
             </w:r>
           </w:p>
         </w:tc>
@@ -20303,7 +20303,7 @@
                 <w:sz w:val="17"/>
                 <w:szCs w:val="17"/>
               </w:rPr>
-              <w:t xml:space="preserve">$2.65M</w:t>
+              <w:t xml:space="preserve">$0.68M</w:t>
             </w:r>
           </w:p>
         </w:tc>
@@ -20572,7 +20572,7 @@
                 <w:sz w:val="17"/>
                 <w:szCs w:val="17"/>
               </w:rPr>
-              <w:t xml:space="preserve">$1.66M</w:t>
+              <w:t xml:space="preserve">$1.68M</w:t>
             </w:r>
           </w:p>
         </w:tc>
@@ -20605,7 +20605,7 @@
                 <w:sz w:val="17"/>
                 <w:szCs w:val="17"/>
               </w:rPr>
-              <w:t xml:space="preserve">$1.88M</w:t>
+              <w:t xml:space="preserve">$1.89M</w:t>
             </w:r>
           </w:p>
         </w:tc>
@@ -20841,7 +20841,7 @@
                 <w:sz w:val="17"/>
                 <w:szCs w:val="17"/>
               </w:rPr>
-              <w:t xml:space="preserve">$1.54M</w:t>
+              <w:t xml:space="preserve">$1.57M</w:t>
             </w:r>
           </w:p>
         </w:tc>
@@ -20874,7 +20874,7 @@
                 <w:sz w:val="17"/>
                 <w:szCs w:val="17"/>
               </w:rPr>
-              <w:t xml:space="preserve">$1.83M</w:t>
+              <w:t xml:space="preserve">$1.84M</w:t>
             </w:r>
           </w:p>
         </w:tc>
@@ -20915,7 +20915,7 @@
         <w:rPr>
           <w:rFonts w:ascii="Calibri" w:cs="Calibri" w:eastAsia="Calibri" w:hAnsi="Calibri"/>
         </w:rPr>
-        <w:t xml:space="preserve">An undrafted player has no draft rights, so a club holds his NHL rights only through an NHL contract; an undrafted player on a minor-league contract is worth nothing to an NHL club in this currency. The 53 undrafted prospects on NHL contracts are valued by the same model with the star probability set to zero, with seasons counted from the first draft at which they were eligible. They total $5.78 million; the largest is Brennan Menell at $0.65 million.</w:t>
+        <w:t xml:space="preserve">An undrafted player has no draft rights, so a club holds his NHL rights only through an NHL contract; an undrafted player on a minor-league contract is worth nothing to an NHL club in this currency. The 53 undrafted prospects on NHL contracts are valued by the same model with the star probability set to zero, with seasons counted from the first draft at which they were eligible. They total $6.10 million; the largest is Brennan Menell at $0.68 million.</w:t>
       </w:r>
     </w:p>
     <w:p>
@@ -21641,7 +21641,7 @@
                 <w:sz w:val="17"/>
                 <w:szCs w:val="17"/>
               </w:rPr>
-              <w:t xml:space="preserve">53 assets, $5.78M</w:t>
+              <w:t xml:space="preserve">53 assets, $6.10M</w:t>
             </w:r>
           </w:p>
         </w:tc>
@@ -22106,7 +22106,7 @@
                 <w:sz w:val="17"/>
                 <w:szCs w:val="17"/>
               </w:rPr>
-              <w:t xml:space="preserve">17.540 (1.769) [&lt;0.001]</w:t>
+              <w:t xml:space="preserve">17.661 (1.756) [&lt;0.001]</w:t>
             </w:r>
           </w:p>
         </w:tc>
@@ -22139,7 +22139,7 @@
                 <w:sz w:val="17"/>
                 <w:szCs w:val="17"/>
               </w:rPr>
-              <w:t xml:space="preserve">15.432 (2.094) [&lt;0.001]</w:t>
+              <w:t xml:space="preserve">15.576 (2.081) [&lt;0.001]</w:t>
             </w:r>
           </w:p>
         </w:tc>
@@ -22172,7 +22172,7 @@
                 <w:sz w:val="17"/>
                 <w:szCs w:val="17"/>
               </w:rPr>
-              <w:t xml:space="preserve">13.399 (1.824) [&lt;0.001]</w:t>
+              <w:t xml:space="preserve">13.575 (1.821) [&lt;0.001]</w:t>
             </w:r>
           </w:p>
         </w:tc>
@@ -22205,7 +22205,7 @@
                 <w:sz w:val="17"/>
                 <w:szCs w:val="17"/>
               </w:rPr>
-              <w:t xml:space="preserve">11.350 (2.030) [&lt;0.001]</w:t>
+              <w:t xml:space="preserve">11.557 (2.029) [&lt;0.001]</w:t>
             </w:r>
           </w:p>
         </w:tc>
@@ -22309,7 +22309,7 @@
                 <w:sz w:val="17"/>
                 <w:szCs w:val="17"/>
               </w:rPr>
-              <w:t xml:space="preserve">0.051 (0.017) [0.003]</w:t>
+              <w:t xml:space="preserve">0.050 (0.017) [0.004]</w:t>
             </w:r>
           </w:p>
         </w:tc>
@@ -22342,7 +22342,7 @@
                 <w:sz w:val="17"/>
                 <w:szCs w:val="17"/>
               </w:rPr>
-              <w:t xml:space="preserve">-0.127 (0.050) [0.011]</w:t>
+              <w:t xml:space="preserve">-0.124 (0.050) [0.012]</w:t>
             </w:r>
           </w:p>
         </w:tc>
@@ -22375,7 +22375,7 @@
                 <w:sz w:val="17"/>
                 <w:szCs w:val="17"/>
               </w:rPr>
-              <w:t xml:space="preserve">-0.076 (0.047) [0.109]</w:t>
+              <w:t xml:space="preserve">-0.074 (0.047) [0.113]</w:t>
             </w:r>
           </w:p>
         </w:tc>
@@ -22512,7 +22512,7 @@
                 <w:sz w:val="17"/>
                 <w:szCs w:val="17"/>
               </w:rPr>
-              <w:t xml:space="preserve">0.0180 (0.0051) [&lt;0.001]</w:t>
+              <w:t xml:space="preserve">0.0177 (0.0051) [&lt;0.001]</w:t>
             </w:r>
           </w:p>
         </w:tc>
@@ -22545,7 +22545,7 @@
                 <w:sz w:val="17"/>
                 <w:szCs w:val="17"/>
               </w:rPr>
-              <w:t xml:space="preserve">0.0216 (0.0057) [&lt;0.001]</w:t>
+              <w:t xml:space="preserve">0.0213 (0.0056) [&lt;0.001]</w:t>
             </w:r>
           </w:p>
         </w:tc>
@@ -22649,7 +22649,7 @@
                 <w:sz w:val="17"/>
                 <w:szCs w:val="17"/>
               </w:rPr>
-              <w:t xml:space="preserve">-0.312 (0.118) [0.008]</w:t>
+              <w:t xml:space="preserve">-0.313 (0.119) [0.008]</w:t>
             </w:r>
           </w:p>
         </w:tc>
@@ -22682,7 +22682,7 @@
                 <w:sz w:val="17"/>
                 <w:szCs w:val="17"/>
               </w:rPr>
-              <w:t xml:space="preserve">-0.261 (0.111) [0.018]</w:t>
+              <w:t xml:space="preserve">-0.263 (0.112) [0.018]</w:t>
             </w:r>
           </w:p>
         </w:tc>
@@ -22715,7 +22715,7 @@
                 <w:sz w:val="17"/>
                 <w:szCs w:val="17"/>
               </w:rPr>
-              <w:t xml:space="preserve">-0.210 (0.109) [0.054]</w:t>
+              <w:t xml:space="preserve">-0.212 (0.110) [0.053]</w:t>
             </w:r>
           </w:p>
         </w:tc>
@@ -22885,7 +22885,7 @@
                 <w:sz w:val="17"/>
                 <w:szCs w:val="17"/>
               </w:rPr>
-              <w:t xml:space="preserve">-0.075 (0.021) [&lt;0.001]</w:t>
+              <w:t xml:space="preserve">-0.074 (0.021) [&lt;0.001]</w:t>
             </w:r>
           </w:p>
         </w:tc>
@@ -23126,7 +23126,7 @@
                 <w:sz w:val="17"/>
                 <w:szCs w:val="17"/>
               </w:rPr>
-              <w:t xml:space="preserve">0.248</w:t>
+              <w:t xml:space="preserve">0.250</w:t>
             </w:r>
           </w:p>
         </w:tc>
@@ -23159,7 +23159,7 @@
                 <w:sz w:val="17"/>
                 <w:szCs w:val="17"/>
               </w:rPr>
-              <w:t xml:space="preserve">0.254</w:t>
+              <w:t xml:space="preserve">0.256</w:t>
             </w:r>
           </w:p>
         </w:tc>
@@ -23192,7 +23192,7 @@
                 <w:sz w:val="17"/>
                 <w:szCs w:val="17"/>
               </w:rPr>
-              <w:t xml:space="preserve">0.281</w:t>
+              <w:t xml:space="preserve">0.282</w:t>
             </w:r>
           </w:p>
         </w:tc>
@@ -23225,7 +23225,7 @@
                 <w:sz w:val="17"/>
                 <w:szCs w:val="17"/>
               </w:rPr>
-              <w:t xml:space="preserve">0.292</w:t>
+              <w:t xml:space="preserve">0.293</w:t>
             </w:r>
           </w:p>
         </w:tc>
@@ -23521,7 +23521,7 @@
                 <w:sz w:val="17"/>
                 <w:szCs w:val="17"/>
               </w:rPr>
-              <w:t xml:space="preserve">13.884 (2.236) [&lt;0.001]</w:t>
+              <w:t xml:space="preserve">14.245 (2.221) [&lt;0.001]</w:t>
             </w:r>
           </w:p>
         </w:tc>
@@ -23554,7 +23554,7 @@
                 <w:sz w:val="17"/>
                 <w:szCs w:val="17"/>
               </w:rPr>
-              <w:t xml:space="preserve">9.328 (3.078) [0.002]</w:t>
+              <w:t xml:space="preserve">9.834 (3.064) [0.001]</w:t>
             </w:r>
           </w:p>
         </w:tc>
@@ -23587,7 +23587,7 @@
                 <w:sz w:val="17"/>
                 <w:szCs w:val="17"/>
               </w:rPr>
-              <w:t xml:space="preserve">9.994 (3.046) [0.001]</w:t>
+              <w:t xml:space="preserve">10.500 (3.036) [&lt;0.001]</w:t>
             </w:r>
           </w:p>
         </w:tc>
@@ -23620,7 +23620,7 @@
                 <w:sz w:val="17"/>
                 <w:szCs w:val="17"/>
               </w:rPr>
-              <w:t xml:space="preserve">7.525 (3.341) [0.024]</w:t>
+              <w:t xml:space="preserve">8.075 (3.338) [0.016]</w:t>
             </w:r>
           </w:p>
         </w:tc>
@@ -23724,7 +23724,7 @@
                 <w:sz w:val="17"/>
                 <w:szCs w:val="17"/>
               </w:rPr>
-              <w:t xml:space="preserve">0.039 (0.013) [0.003]</w:t>
+              <w:t xml:space="preserve">0.038 (0.013) [0.004]</w:t>
             </w:r>
           </w:p>
         </w:tc>
@@ -23757,7 +23757,7 @@
                 <w:sz w:val="17"/>
                 <w:szCs w:val="17"/>
               </w:rPr>
-              <w:t xml:space="preserve">-0.094 (0.027) [&lt;0.001]</w:t>
+              <w:t xml:space="preserve">-0.095 (0.027) [&lt;0.001]</w:t>
             </w:r>
           </w:p>
         </w:tc>
@@ -23790,7 +23790,7 @@
                 <w:sz w:val="17"/>
                 <w:szCs w:val="17"/>
               </w:rPr>
-              <w:t xml:space="preserve">0.043 (0.038) [0.262]</w:t>
+              <w:t xml:space="preserve">0.040 (0.038) [0.304]</w:t>
             </w:r>
           </w:p>
         </w:tc>
@@ -24064,7 +24064,7 @@
                 <w:sz w:val="17"/>
                 <w:szCs w:val="17"/>
               </w:rPr>
-              <w:t xml:space="preserve">-0.047 (0.016) [0.002]</w:t>
+              <w:t xml:space="preserve">-0.050 (0.015) [0.001]</w:t>
             </w:r>
           </w:p>
         </w:tc>
@@ -24097,7 +24097,7 @@
                 <w:sz w:val="17"/>
                 <w:szCs w:val="17"/>
               </w:rPr>
-              <w:t xml:space="preserve">-0.051 (0.015) [0.001]</w:t>
+              <w:t xml:space="preserve">-0.053 (0.015) [&lt;0.001]</w:t>
             </w:r>
           </w:p>
         </w:tc>
@@ -24130,7 +24130,7 @@
                 <w:sz w:val="17"/>
                 <w:szCs w:val="17"/>
               </w:rPr>
-              <w:t xml:space="preserve">-0.038 (0.017) [0.024]</w:t>
+              <w:t xml:space="preserve">-0.041 (0.017) [0.016]</w:t>
             </w:r>
           </w:p>
         </w:tc>
@@ -24300,7 +24300,7 @@
                 <w:sz w:val="17"/>
                 <w:szCs w:val="17"/>
               </w:rPr>
-              <w:t xml:space="preserve">-0.050 (0.012) [&lt;0.001]</w:t>
+              <w:t xml:space="preserve">-0.049 (0.012) [&lt;0.001]</w:t>
             </w:r>
           </w:p>
         </w:tc>
@@ -24541,7 +24541,7 @@
                 <w:sz w:val="17"/>
                 <w:szCs w:val="17"/>
               </w:rPr>
-              <w:t xml:space="preserve">0.085</w:t>
+              <w:t xml:space="preserve">0.089</w:t>
             </w:r>
           </w:p>
         </w:tc>
@@ -24574,7 +24574,7 @@
                 <w:sz w:val="17"/>
                 <w:szCs w:val="17"/>
               </w:rPr>
-              <w:t xml:space="preserve">0.098</w:t>
+              <w:t xml:space="preserve">0.101</w:t>
             </w:r>
           </w:p>
         </w:tc>
@@ -24607,7 +24607,7 @@
                 <w:sz w:val="17"/>
                 <w:szCs w:val="17"/>
               </w:rPr>
-              <w:t xml:space="preserve">0.139</w:t>
+              <w:t xml:space="preserve">0.142</w:t>
             </w:r>
           </w:p>
         </w:tc>
@@ -24640,7 +24640,7 @@
                 <w:sz w:val="17"/>
                 <w:szCs w:val="17"/>
               </w:rPr>
-              <w:t xml:space="preserve">0.157</w:t>
+              <w:t xml:space="preserve">0.159</w:t>
             </w:r>
           </w:p>
         </w:tc>
@@ -24936,7 +24936,7 @@
                 <w:sz w:val="17"/>
                 <w:szCs w:val="17"/>
               </w:rPr>
-              <w:t xml:space="preserve">6.089 (1.594) [&lt;0.001]</w:t>
+              <w:t xml:space="preserve">6.660 (1.601) [&lt;0.001]</w:t>
             </w:r>
           </w:p>
         </w:tc>
@@ -24969,7 +24969,7 @@
                 <w:sz w:val="17"/>
                 <w:szCs w:val="17"/>
               </w:rPr>
-              <w:t xml:space="preserve">-1.175 (1.960) [0.549]</w:t>
+              <w:t xml:space="preserve">-0.326 (2.112) [0.877]</w:t>
             </w:r>
           </w:p>
         </w:tc>
@@ -25002,7 +25002,7 @@
                 <w:sz w:val="17"/>
                 <w:szCs w:val="17"/>
               </w:rPr>
-              <w:t xml:space="preserve">0.864 (1.877) [0.645]</w:t>
+              <w:t xml:space="preserve">1.735 (2.018) [0.390]</w:t>
             </w:r>
           </w:p>
         </w:tc>
@@ -25139,7 +25139,7 @@
                 <w:sz w:val="17"/>
                 <w:szCs w:val="17"/>
               </w:rPr>
-              <w:t xml:space="preserve">0.043 (0.010) [&lt;0.001]</w:t>
+              <w:t xml:space="preserve">0.042 (0.010) [&lt;0.001]</w:t>
             </w:r>
           </w:p>
         </w:tc>
@@ -25172,7 +25172,7 @@
                 <w:sz w:val="17"/>
                 <w:szCs w:val="17"/>
               </w:rPr>
-              <w:t xml:space="preserve">-0.054 (0.022) [0.014]</w:t>
+              <w:t xml:space="preserve">-0.056 (0.022) [0.011]</w:t>
             </w:r>
           </w:p>
         </w:tc>
@@ -25205,7 +25205,7 @@
                 <w:sz w:val="17"/>
                 <w:szCs w:val="17"/>
               </w:rPr>
-              <w:t xml:space="preserve">0.045 (0.029) [0.119]</w:t>
+              <w:t xml:space="preserve">0.046 (0.029) [0.118]</w:t>
             </w:r>
           </w:p>
         </w:tc>
@@ -25479,7 +25479,7 @@
                 <w:sz w:val="17"/>
                 <w:szCs w:val="17"/>
               </w:rPr>
-              <w:t xml:space="preserve">0.014 (0.024) [0.558]</w:t>
+              <w:t xml:space="preserve">0.004 (0.025) [0.878]</w:t>
             </w:r>
           </w:p>
         </w:tc>
@@ -25512,7 +25512,7 @@
                 <w:sz w:val="17"/>
                 <w:szCs w:val="17"/>
               </w:rPr>
-              <w:t xml:space="preserve">-0.010 (0.023) [0.650]</w:t>
+              <w:t xml:space="preserve">-0.021 (0.025) [0.413]</w:t>
             </w:r>
           </w:p>
         </w:tc>
@@ -25956,7 +25956,7 @@
                 <w:sz w:val="17"/>
                 <w:szCs w:val="17"/>
               </w:rPr>
-              <w:t xml:space="preserve">0.018</w:t>
+              <w:t xml:space="preserve">0.021</w:t>
             </w:r>
           </w:p>
         </w:tc>
@@ -26022,7 +26022,7 @@
                 <w:sz w:val="17"/>
                 <w:szCs w:val="17"/>
               </w:rPr>
-              <w:t xml:space="preserve">0.095</w:t>
+              <w:t xml:space="preserve">0.096</w:t>
             </w:r>
           </w:p>
         </w:tc>
@@ -26351,7 +26351,7 @@
                 <w:sz w:val="17"/>
                 <w:szCs w:val="17"/>
               </w:rPr>
-              <w:t xml:space="preserve">0.107 (0.320) [0.738]</w:t>
+              <w:t xml:space="preserve">0.636 (0.598) [0.287]</w:t>
             </w:r>
           </w:p>
         </w:tc>
@@ -26384,7 +26384,7 @@
                 <w:sz w:val="17"/>
                 <w:szCs w:val="17"/>
               </w:rPr>
-              <w:t xml:space="preserve">-1.928 (0.694) [0.005]</w:t>
+              <w:t xml:space="preserve">-1.133 (1.144) [0.322]</w:t>
             </w:r>
           </w:p>
         </w:tc>
@@ -26417,7 +26417,7 @@
                 <w:sz w:val="17"/>
                 <w:szCs w:val="17"/>
               </w:rPr>
-              <w:t xml:space="preserve">-0.824 (0.334) [0.014]</w:t>
+              <w:t xml:space="preserve">0.067 (0.959) [0.944]</w:t>
             </w:r>
           </w:p>
         </w:tc>
@@ -26554,7 +26554,7 @@
                 <w:sz w:val="17"/>
                 <w:szCs w:val="17"/>
               </w:rPr>
-              <w:t xml:space="preserve">0.010 (0.004) [0.015]</w:t>
+              <w:t xml:space="preserve">0.008 (0.004) [0.054]</w:t>
             </w:r>
           </w:p>
         </w:tc>
@@ -26587,7 +26587,7 @@
                 <w:sz w:val="17"/>
                 <w:szCs w:val="17"/>
               </w:rPr>
-              <w:t xml:space="preserve">-0.013 (0.009) [0.170]</w:t>
+              <w:t xml:space="preserve">-0.016 (0.010) [0.105]</w:t>
             </w:r>
           </w:p>
         </w:tc>
@@ -26620,7 +26620,7 @@
                 <w:sz w:val="17"/>
                 <w:szCs w:val="17"/>
               </w:rPr>
-              <w:t xml:space="preserve">-0.016 (0.009) [0.091]</w:t>
+              <w:t xml:space="preserve">-0.016 (0.009) [0.092]</w:t>
             </w:r>
           </w:p>
         </w:tc>
@@ -26757,7 +26757,7 @@
                 <w:sz w:val="17"/>
                 <w:szCs w:val="17"/>
               </w:rPr>
-              <w:t xml:space="preserve">0.0011 (0.0006) [0.079]</w:t>
+              <w:t xml:space="preserve">0.0012 (0.0007) [0.062]</w:t>
             </w:r>
           </w:p>
         </w:tc>
@@ -26790,7 +26790,7 @@
                 <w:sz w:val="17"/>
                 <w:szCs w:val="17"/>
               </w:rPr>
-              <w:t xml:space="preserve">0.0012 (0.0006) [0.063]</w:t>
+              <w:t xml:space="preserve">0.0012 (0.0006) [0.061]</w:t>
             </w:r>
           </w:p>
         </w:tc>
@@ -26894,7 +26894,7 @@
                 <w:sz w:val="17"/>
                 <w:szCs w:val="17"/>
               </w:rPr>
-              <w:t xml:space="preserve">0.028 (0.010) [0.006]</w:t>
+              <w:t xml:space="preserve">0.016 (0.017) [0.323]</w:t>
             </w:r>
           </w:p>
         </w:tc>
@@ -26927,7 +26927,7 @@
                 <w:sz w:val="17"/>
                 <w:szCs w:val="17"/>
               </w:rPr>
-              <w:t xml:space="preserve">0.012 (0.005) [0.014]</w:t>
+              <w:t xml:space="preserve">-0.001 (0.014) [0.944]</w:t>
             </w:r>
           </w:p>
         </w:tc>
@@ -27201,7 +27201,7 @@
                 <w:sz w:val="17"/>
                 <w:szCs w:val="17"/>
               </w:rPr>
-              <w:t xml:space="preserve">5,370</w:t>
+              <w:t xml:space="preserve">5,262</w:t>
             </w:r>
           </w:p>
         </w:tc>
@@ -27234,7 +27234,7 @@
                 <w:sz w:val="17"/>
                 <w:szCs w:val="17"/>
               </w:rPr>
-              <w:t xml:space="preserve">5,370</w:t>
+              <w:t xml:space="preserve">5,262</w:t>
             </w:r>
           </w:p>
         </w:tc>
@@ -27267,7 +27267,7 @@
                 <w:sz w:val="17"/>
                 <w:szCs w:val="17"/>
               </w:rPr>
-              <w:t xml:space="preserve">5,370</w:t>
+              <w:t xml:space="preserve">5,262</w:t>
             </w:r>
           </w:p>
         </w:tc>
@@ -27300,7 +27300,7 @@
                 <w:sz w:val="17"/>
                 <w:szCs w:val="17"/>
               </w:rPr>
-              <w:t xml:space="preserve">5,370</w:t>
+              <w:t xml:space="preserve">5,262</w:t>
             </w:r>
           </w:p>
         </w:tc>
@@ -27371,7 +27371,7 @@
                 <w:sz w:val="17"/>
                 <w:szCs w:val="17"/>
               </w:rPr>
-              <w:t xml:space="preserve">0.000</w:t>
+              <w:t xml:space="preserve">0.001</w:t>
             </w:r>
           </w:p>
         </w:tc>
@@ -27404,7 +27404,7 @@
                 <w:sz w:val="17"/>
                 <w:szCs w:val="17"/>
               </w:rPr>
-              <w:t xml:space="preserve">0.014</w:t>
+              <w:t xml:space="preserve">0.011</w:t>
             </w:r>
           </w:p>
         </w:tc>
@@ -27470,7 +27470,7 @@
                 <w:sz w:val="17"/>
                 <w:szCs w:val="17"/>
               </w:rPr>
-              <w:t xml:space="preserve">0.034</w:t>
+              <w:t xml:space="preserve">0.035</w:t>
             </w:r>
           </w:p>
         </w:tc>
@@ -27801,7 +27801,7 @@
                 <w:sz w:val="17"/>
                 <w:szCs w:val="17"/>
               </w:rPr>
-              <w:t xml:space="preserve">-0.365 (0.115) [0.001]</w:t>
+              <w:t xml:space="preserve">-0.362 (0.115) [0.002]</w:t>
             </w:r>
           </w:p>
         </w:tc>
@@ -27834,7 +27834,7 @@
                 <w:sz w:val="17"/>
                 <w:szCs w:val="17"/>
               </w:rPr>
-              <w:t xml:space="preserve">-0.435 (0.106) [&lt;0.001]</w:t>
+              <w:t xml:space="preserve">-0.429 (0.106) [&lt;0.001]</w:t>
             </w:r>
           </w:p>
         </w:tc>
@@ -27867,7 +27867,7 @@
                 <w:sz w:val="17"/>
                 <w:szCs w:val="17"/>
               </w:rPr>
-              <w:t xml:space="preserve">-0.310 (0.096) [0.001]</w:t>
+              <w:t xml:space="preserve">-0.303 (0.096) [0.002]</w:t>
             </w:r>
           </w:p>
         </w:tc>
@@ -27900,7 +27900,7 @@
                 <w:sz w:val="17"/>
                 <w:szCs w:val="17"/>
               </w:rPr>
-              <w:t xml:space="preserve">-0.153 (0.068) [0.024]</w:t>
+              <w:t xml:space="preserve">-0.153 (0.068) [0.025]</w:t>
             </w:r>
           </w:p>
         </w:tc>
@@ -27933,7 +27933,7 @@
                 <w:sz w:val="17"/>
                 <w:szCs w:val="17"/>
               </w:rPr>
-              <w:t xml:space="preserve">0.001 (0.019) [0.959]</w:t>
+              <w:t xml:space="preserve">0.005 (0.021) [0.802]</w:t>
             </w:r>
           </w:p>
         </w:tc>
@@ -28004,7 +28004,7 @@
                 <w:sz w:val="17"/>
                 <w:szCs w:val="17"/>
               </w:rPr>
-              <w:t xml:space="preserve">-0.075 (0.021) [&lt;0.001]</w:t>
+              <w:t xml:space="preserve">-0.074 (0.021) [&lt;0.001]</w:t>
             </w:r>
           </w:p>
         </w:tc>
@@ -28037,7 +28037,7 @@
                 <w:sz w:val="17"/>
                 <w:szCs w:val="17"/>
               </w:rPr>
-              <w:t xml:space="preserve">-0.063 (0.015) [&lt;0.001]</w:t>
+              <w:t xml:space="preserve">-0.062 (0.015) [&lt;0.001]</w:t>
             </w:r>
           </w:p>
         </w:tc>
@@ -28070,7 +28070,7 @@
                 <w:sz w:val="17"/>
                 <w:szCs w:val="17"/>
               </w:rPr>
-              <w:t xml:space="preserve">-0.050 (0.012) [&lt;0.001]</w:t>
+              <w:t xml:space="preserve">-0.049 (0.012) [&lt;0.001]</w:t>
             </w:r>
           </w:p>
         </w:tc>
@@ -28136,7 +28136,7 @@
                 <w:sz w:val="17"/>
                 <w:szCs w:val="17"/>
               </w:rPr>
-              <w:t xml:space="preserve">-0.003 (0.004) [0.412]</w:t>
+              <w:t xml:space="preserve">-0.003 (0.004) [0.490]</w:t>
             </w:r>
           </w:p>
         </w:tc>
@@ -28207,7 +28207,7 @@
                 <w:sz w:val="17"/>
                 <w:szCs w:val="17"/>
               </w:rPr>
-              <w:t xml:space="preserve">0.347 (0.273) [0.204]</w:t>
+              <w:t xml:space="preserve">0.336 (0.271) [0.215]</w:t>
             </w:r>
           </w:p>
         </w:tc>
@@ -28240,7 +28240,7 @@
                 <w:sz w:val="17"/>
                 <w:szCs w:val="17"/>
               </w:rPr>
-              <w:t xml:space="preserve">0.321 (0.282) [0.255]</w:t>
+              <w:t xml:space="preserve">0.313 (0.281) [0.265]</w:t>
             </w:r>
           </w:p>
         </w:tc>
@@ -28273,7 +28273,7 @@
                 <w:sz w:val="17"/>
                 <w:szCs w:val="17"/>
               </w:rPr>
-              <w:t xml:space="preserve">0.562 (0.230) [0.015]</w:t>
+              <w:t xml:space="preserve">0.556 (0.230) [0.016]</w:t>
             </w:r>
           </w:p>
         </w:tc>
@@ -28306,7 +28306,7 @@
                 <w:sz w:val="17"/>
                 <w:szCs w:val="17"/>
               </w:rPr>
-              <w:t xml:space="preserve">0.389 (0.211) [0.065]</w:t>
+              <w:t xml:space="preserve">0.386 (0.211) [0.067]</w:t>
             </w:r>
           </w:p>
         </w:tc>
@@ -28339,7 +28339,7 @@
                 <w:sz w:val="17"/>
                 <w:szCs w:val="17"/>
               </w:rPr>
-              <w:t xml:space="preserve">0.094 (0.089) [0.289]</w:t>
+              <w:t xml:space="preserve">0.097 (0.096) [0.311]</w:t>
             </w:r>
           </w:p>
         </w:tc>
@@ -28410,7 +28410,7 @@
                 <w:sz w:val="17"/>
                 <w:szCs w:val="17"/>
               </w:rPr>
-              <w:t xml:space="preserve">-0.109 (0.043) [0.011]</w:t>
+              <w:t xml:space="preserve">-0.107 (0.043) [0.012]</w:t>
             </w:r>
           </w:p>
         </w:tc>
@@ -28443,7 +28443,7 @@
                 <w:sz w:val="17"/>
                 <w:szCs w:val="17"/>
               </w:rPr>
-              <w:t xml:space="preserve">-0.090 (0.035) [0.010]</w:t>
+              <w:t xml:space="preserve">-0.088 (0.035) [0.012]</w:t>
             </w:r>
           </w:p>
         </w:tc>
@@ -28476,7 +28476,7 @@
                 <w:sz w:val="17"/>
                 <w:szCs w:val="17"/>
               </w:rPr>
-              <w:t xml:space="preserve">-0.092 (0.027) [&lt;0.001]</w:t>
+              <w:t xml:space="preserve">-0.090 (0.027) [&lt;0.001]</w:t>
             </w:r>
           </w:p>
         </w:tc>
@@ -28542,7 +28542,7 @@
                 <w:sz w:val="17"/>
                 <w:szCs w:val="17"/>
               </w:rPr>
-              <w:t xml:space="preserve">-0.009 (0.009) [0.321]</w:t>
+              <w:t xml:space="preserve">-0.009 (0.010) [0.365]</w:t>
             </w:r>
           </w:p>
         </w:tc>

</xml_diff>

<commit_message>
Sync from THOMAS 2026-10-23 14:03
</commit_message>
<xml_diff>
--- a/40_DOCS/Supervisor_Drafts/Valuing Prospects.docx
+++ b/40_DOCS/Supervisor_Drafts/Valuing Prospects.docx
@@ -45,13 +45,32 @@
         <w:spacing w:before="60" w:after="120" w:line="276" w:lineRule="auto"/>
       </w:pPr>
       <w:r>
-        <w:t>Six drafted players of 2007 to 2017 died before reaching the NHL, while their clubs still controlled them (Table 1). They are left out of every fit in this document and of the draft pick curve. Left in, each would count as a prospect with zero surplus in each season after his death</w:t>
+        <w:t>Six drafted players of 2007 to 2017 died before reaching the NHL, while their clubs still controlled them (Table 1). They are left out of every fit in this document and of the draft pick curve. Left in, each would count as a prospect with zero surplus in each season after his death.</w:t>
       </w:r>
+    </w:p>
+    <w:p>
+      <w:pPr>
+        <w:pStyle w:val="Heading1"/>
+        <w:keepNext/>
+      </w:pPr>
       <w:r>
-        <w:t>.</w:t>
+        <w:t>1. Draft Position and How Its Value Fades</w:t>
       </w:r>
+    </w:p>
+    <w:p>
+      <w:pPr>
+        <w:spacing w:before="60" w:after="120" w:line="276" w:lineRule="auto"/>
+      </w:pPr>
       <w:r>
-        <w:t xml:space="preserve"> </w:t>
+        <w:t>At the draft, a pick is worth its draft position's star probability times the star value. A prospect starts with his pick's value. The question is how that value changes while he remains unproven.</w:t>
+      </w:r>
+    </w:p>
+    <w:p>
+      <w:pPr>
+        <w:spacing w:before="60" w:after="120" w:line="276" w:lineRule="auto"/>
+      </w:pPr>
+      <w:r>
+        <w:t>The answer depends on when drafted players reach the NHL. Of the 2,316 drafted players, 997 (43.0%) played an NHL season of 10 or more games (a goaltender, an NHL game) before their club's control ended; the other 1,319 never did. How many arrive, and when, depends on where they were drafted (Figure 1). Of the 110 top-ten picks, 36.4% had reached the NHL by D+1, 76.4% by D+2 and 90.0% by D+3, and 109 reached it in the end. Of the 1,647 picks from rounds 3 to 7, 6.0% had reached it by D+3 and 12.9% by D+4, and only 29.4% ever did. A top pick who is still a prospect in D+4 is therefore unusual, and later picks who reach the NHL at all reach it later.</w:t>
       </w:r>
     </w:p>
     <w:p>
@@ -66,938 +85,8 @@
           <w:sz w:val="20"/>
           <w:szCs w:val="20"/>
         </w:rPr>
-        <w:t>Table 1. Drafted players left out of every fit</w:t>
-      </w:r>
-    </w:p>
-    <w:tbl>
-      <w:tblPr>
-        <w:tblW w:w="9100" w:type="dxa"/>
-        <w:tblBorders>
-          <w:top w:val="single" w:sz="4" w:space="0" w:color="auto"/>
-          <w:left w:val="single" w:sz="4" w:space="0" w:color="auto"/>
-          <w:bottom w:val="single" w:sz="4" w:space="0" w:color="auto"/>
-          <w:right w:val="single" w:sz="4" w:space="0" w:color="auto"/>
-          <w:insideH w:val="single" w:sz="4" w:space="0" w:color="auto"/>
-          <w:insideV w:val="single" w:sz="4" w:space="0" w:color="auto"/>
-        </w:tblBorders>
-        <w:tblLook w:val="04A0" w:firstRow="1" w:lastRow="0" w:firstColumn="1" w:lastColumn="0" w:noHBand="0" w:noVBand="1"/>
-      </w:tblPr>
-      <w:tblGrid>
-        <w:gridCol w:w="2600"/>
-        <w:gridCol w:w="1500"/>
-        <w:gridCol w:w="2600"/>
-        <w:gridCol w:w="2400"/>
-      </w:tblGrid>
-      <w:tr>
-        <w:trPr>
-          <w:tblHeader/>
-        </w:trPr>
-        <w:tc>
-          <w:tcPr>
-            <w:tcW w:w="2600" w:type="dxa"/>
-            <w:tcBorders>
-              <w:top w:val="single" w:sz="4" w:space="0" w:color="C9C8C3"/>
-              <w:left w:val="single" w:sz="4" w:space="0" w:color="C9C8C3"/>
-              <w:bottom w:val="single" w:sz="4" w:space="0" w:color="C9C8C3"/>
-              <w:right w:val="single" w:sz="4" w:space="0" w:color="C9C8C3"/>
-            </w:tcBorders>
-            <w:shd w:val="clear" w:color="auto" w:fill="EFEEEA"/>
-            <w:tcMar>
-              <w:top w:w="40" w:type="dxa"/>
-              <w:left w:w="80" w:type="dxa"/>
-              <w:bottom w:w="40" w:type="dxa"/>
-              <w:right w:w="80" w:type="dxa"/>
-            </w:tcMar>
-          </w:tcPr>
-          <w:p>
-            <w:pPr>
-              <w:keepNext/>
-            </w:pPr>
-            <w:r>
-              <w:rPr>
-                <w:b/>
-                <w:bCs/>
-                <w:sz w:val="17"/>
-                <w:szCs w:val="17"/>
-              </w:rPr>
-              <w:t>Player</w:t>
-            </w:r>
-          </w:p>
-        </w:tc>
-        <w:tc>
-          <w:tcPr>
-            <w:tcW w:w="1500" w:type="dxa"/>
-            <w:tcBorders>
-              <w:top w:val="single" w:sz="4" w:space="0" w:color="C9C8C3"/>
-              <w:left w:val="single" w:sz="4" w:space="0" w:color="C9C8C3"/>
-              <w:bottom w:val="single" w:sz="4" w:space="0" w:color="C9C8C3"/>
-              <w:right w:val="single" w:sz="4" w:space="0" w:color="C9C8C3"/>
-            </w:tcBorders>
-            <w:shd w:val="clear" w:color="auto" w:fill="EFEEEA"/>
-            <w:tcMar>
-              <w:top w:w="40" w:type="dxa"/>
-              <w:left w:w="80" w:type="dxa"/>
-              <w:bottom w:w="40" w:type="dxa"/>
-              <w:right w:w="80" w:type="dxa"/>
-            </w:tcMar>
-          </w:tcPr>
-          <w:p>
-            <w:pPr>
-              <w:keepNext/>
-            </w:pPr>
-            <w:r>
-              <w:rPr>
-                <w:b/>
-                <w:bCs/>
-                <w:sz w:val="17"/>
-                <w:szCs w:val="17"/>
-              </w:rPr>
-              <w:t>Drafted</w:t>
-            </w:r>
-          </w:p>
-        </w:tc>
-        <w:tc>
-          <w:tcPr>
-            <w:tcW w:w="2600" w:type="dxa"/>
-            <w:tcBorders>
-              <w:top w:val="single" w:sz="4" w:space="0" w:color="C9C8C3"/>
-              <w:left w:val="single" w:sz="4" w:space="0" w:color="C9C8C3"/>
-              <w:bottom w:val="single" w:sz="4" w:space="0" w:color="C9C8C3"/>
-              <w:right w:val="single" w:sz="4" w:space="0" w:color="C9C8C3"/>
-            </w:tcBorders>
-            <w:shd w:val="clear" w:color="auto" w:fill="EFEEEA"/>
-            <w:tcMar>
-              <w:top w:w="40" w:type="dxa"/>
-              <w:left w:w="80" w:type="dxa"/>
-              <w:bottom w:w="40" w:type="dxa"/>
-              <w:right w:w="80" w:type="dxa"/>
-            </w:tcMar>
-          </w:tcPr>
-          <w:p>
-            <w:pPr>
-              <w:keepNext/>
-            </w:pPr>
-            <w:r>
-              <w:rPr>
-                <w:b/>
-                <w:bCs/>
-                <w:sz w:val="17"/>
-                <w:szCs w:val="17"/>
-              </w:rPr>
-              <w:t>Club</w:t>
-            </w:r>
-          </w:p>
-        </w:tc>
-        <w:tc>
-          <w:tcPr>
-            <w:tcW w:w="2400" w:type="dxa"/>
-            <w:tcBorders>
-              <w:top w:val="single" w:sz="4" w:space="0" w:color="C9C8C3"/>
-              <w:left w:val="single" w:sz="4" w:space="0" w:color="C9C8C3"/>
-              <w:bottom w:val="single" w:sz="4" w:space="0" w:color="C9C8C3"/>
-              <w:right w:val="single" w:sz="4" w:space="0" w:color="C9C8C3"/>
-            </w:tcBorders>
-            <w:shd w:val="clear" w:color="auto" w:fill="EFEEEA"/>
-            <w:tcMar>
-              <w:top w:w="40" w:type="dxa"/>
-              <w:left w:w="80" w:type="dxa"/>
-              <w:bottom w:w="40" w:type="dxa"/>
-              <w:right w:w="80" w:type="dxa"/>
-            </w:tcMar>
-          </w:tcPr>
-          <w:p>
-            <w:pPr>
-              <w:keepNext/>
-            </w:pPr>
-            <w:r>
-              <w:rPr>
-                <w:b/>
-                <w:bCs/>
-                <w:sz w:val="17"/>
-                <w:szCs w:val="17"/>
-              </w:rPr>
-              <w:t>Died</w:t>
-            </w:r>
-          </w:p>
-        </w:tc>
-      </w:tr>
-      <w:tr>
-        <w:trPr>
-          <w:cantSplit/>
-        </w:trPr>
-        <w:tc>
-          <w:tcPr>
-            <w:tcW w:w="2600" w:type="dxa"/>
-            <w:tcBorders>
-              <w:top w:val="single" w:sz="4" w:space="0" w:color="C9C8C3"/>
-              <w:left w:val="single" w:sz="4" w:space="0" w:color="C9C8C3"/>
-              <w:bottom w:val="single" w:sz="4" w:space="0" w:color="C9C8C3"/>
-              <w:right w:val="single" w:sz="4" w:space="0" w:color="C9C8C3"/>
-            </w:tcBorders>
-            <w:tcMar>
-              <w:top w:w="40" w:type="dxa"/>
-              <w:left w:w="80" w:type="dxa"/>
-              <w:bottom w:w="40" w:type="dxa"/>
-              <w:right w:w="80" w:type="dxa"/>
-            </w:tcMar>
-          </w:tcPr>
-          <w:p>
-            <w:pPr>
-              <w:keepNext/>
-            </w:pPr>
-            <w:r>
-              <w:rPr>
-                <w:sz w:val="17"/>
-                <w:szCs w:val="17"/>
-              </w:rPr>
-              <w:t>Alexei Cherepanov</w:t>
-            </w:r>
-          </w:p>
-        </w:tc>
-        <w:tc>
-          <w:tcPr>
-            <w:tcW w:w="1500" w:type="dxa"/>
-            <w:tcBorders>
-              <w:top w:val="single" w:sz="4" w:space="0" w:color="C9C8C3"/>
-              <w:left w:val="single" w:sz="4" w:space="0" w:color="C9C8C3"/>
-              <w:bottom w:val="single" w:sz="4" w:space="0" w:color="C9C8C3"/>
-              <w:right w:val="single" w:sz="4" w:space="0" w:color="C9C8C3"/>
-            </w:tcBorders>
-            <w:tcMar>
-              <w:top w:w="40" w:type="dxa"/>
-              <w:left w:w="80" w:type="dxa"/>
-              <w:bottom w:w="40" w:type="dxa"/>
-              <w:right w:w="80" w:type="dxa"/>
-            </w:tcMar>
-          </w:tcPr>
-          <w:p>
-            <w:pPr>
-              <w:keepNext/>
-            </w:pPr>
-            <w:r>
-              <w:rPr>
-                <w:sz w:val="17"/>
-                <w:szCs w:val="17"/>
-              </w:rPr>
-              <w:t>2007, #17</w:t>
-            </w:r>
-          </w:p>
-        </w:tc>
-        <w:tc>
-          <w:tcPr>
-            <w:tcW w:w="2600" w:type="dxa"/>
-            <w:tcBorders>
-              <w:top w:val="single" w:sz="4" w:space="0" w:color="C9C8C3"/>
-              <w:left w:val="single" w:sz="4" w:space="0" w:color="C9C8C3"/>
-              <w:bottom w:val="single" w:sz="4" w:space="0" w:color="C9C8C3"/>
-              <w:right w:val="single" w:sz="4" w:space="0" w:color="C9C8C3"/>
-            </w:tcBorders>
-            <w:tcMar>
-              <w:top w:w="40" w:type="dxa"/>
-              <w:left w:w="80" w:type="dxa"/>
-              <w:bottom w:w="40" w:type="dxa"/>
-              <w:right w:w="80" w:type="dxa"/>
-            </w:tcMar>
-          </w:tcPr>
-          <w:p>
-            <w:pPr>
-              <w:keepNext/>
-            </w:pPr>
-            <w:r>
-              <w:rPr>
-                <w:sz w:val="17"/>
-                <w:szCs w:val="17"/>
-              </w:rPr>
-              <w:t>New York Rangers</w:t>
-            </w:r>
-          </w:p>
-        </w:tc>
-        <w:tc>
-          <w:tcPr>
-            <w:tcW w:w="2400" w:type="dxa"/>
-            <w:tcBorders>
-              <w:top w:val="single" w:sz="4" w:space="0" w:color="C9C8C3"/>
-              <w:left w:val="single" w:sz="4" w:space="0" w:color="C9C8C3"/>
-              <w:bottom w:val="single" w:sz="4" w:space="0" w:color="C9C8C3"/>
-              <w:right w:val="single" w:sz="4" w:space="0" w:color="C9C8C3"/>
-            </w:tcBorders>
-            <w:tcMar>
-              <w:top w:w="40" w:type="dxa"/>
-              <w:left w:w="80" w:type="dxa"/>
-              <w:bottom w:w="40" w:type="dxa"/>
-              <w:right w:w="80" w:type="dxa"/>
-            </w:tcMar>
-          </w:tcPr>
-          <w:p>
-            <w:pPr>
-              <w:keepNext/>
-            </w:pPr>
-            <w:r>
-              <w:rPr>
-                <w:sz w:val="17"/>
-                <w:szCs w:val="17"/>
-              </w:rPr>
-              <w:t>October 13, 2008</w:t>
-            </w:r>
-          </w:p>
-        </w:tc>
-      </w:tr>
-      <w:tr>
-        <w:trPr>
-          <w:cantSplit/>
-        </w:trPr>
-        <w:tc>
-          <w:tcPr>
-            <w:tcW w:w="2600" w:type="dxa"/>
-            <w:tcBorders>
-              <w:top w:val="single" w:sz="4" w:space="0" w:color="C9C8C3"/>
-              <w:left w:val="single" w:sz="4" w:space="0" w:color="C9C8C3"/>
-              <w:bottom w:val="single" w:sz="4" w:space="0" w:color="C9C8C3"/>
-              <w:right w:val="single" w:sz="4" w:space="0" w:color="C9C8C3"/>
-            </w:tcBorders>
-            <w:tcMar>
-              <w:top w:w="40" w:type="dxa"/>
-              <w:left w:w="80" w:type="dxa"/>
-              <w:bottom w:w="40" w:type="dxa"/>
-              <w:right w:w="80" w:type="dxa"/>
-            </w:tcMar>
-          </w:tcPr>
-          <w:p>
-            <w:pPr>
-              <w:keepNext/>
-            </w:pPr>
-            <w:r>
-              <w:rPr>
-                <w:sz w:val="17"/>
-                <w:szCs w:val="17"/>
-              </w:rPr>
-              <w:t>Mickey Renaud</w:t>
-            </w:r>
-          </w:p>
-        </w:tc>
-        <w:tc>
-          <w:tcPr>
-            <w:tcW w:w="1500" w:type="dxa"/>
-            <w:tcBorders>
-              <w:top w:val="single" w:sz="4" w:space="0" w:color="C9C8C3"/>
-              <w:left w:val="single" w:sz="4" w:space="0" w:color="C9C8C3"/>
-              <w:bottom w:val="single" w:sz="4" w:space="0" w:color="C9C8C3"/>
-              <w:right w:val="single" w:sz="4" w:space="0" w:color="C9C8C3"/>
-            </w:tcBorders>
-            <w:tcMar>
-              <w:top w:w="40" w:type="dxa"/>
-              <w:left w:w="80" w:type="dxa"/>
-              <w:bottom w:w="40" w:type="dxa"/>
-              <w:right w:w="80" w:type="dxa"/>
-            </w:tcMar>
-          </w:tcPr>
-          <w:p>
-            <w:pPr>
-              <w:keepNext/>
-            </w:pPr>
-            <w:r>
-              <w:rPr>
-                <w:sz w:val="17"/>
-                <w:szCs w:val="17"/>
-              </w:rPr>
-              <w:t>2007, #143</w:t>
-            </w:r>
-          </w:p>
-        </w:tc>
-        <w:tc>
-          <w:tcPr>
-            <w:tcW w:w="2600" w:type="dxa"/>
-            <w:tcBorders>
-              <w:top w:val="single" w:sz="4" w:space="0" w:color="C9C8C3"/>
-              <w:left w:val="single" w:sz="4" w:space="0" w:color="C9C8C3"/>
-              <w:bottom w:val="single" w:sz="4" w:space="0" w:color="C9C8C3"/>
-              <w:right w:val="single" w:sz="4" w:space="0" w:color="C9C8C3"/>
-            </w:tcBorders>
-            <w:tcMar>
-              <w:top w:w="40" w:type="dxa"/>
-              <w:left w:w="80" w:type="dxa"/>
-              <w:bottom w:w="40" w:type="dxa"/>
-              <w:right w:w="80" w:type="dxa"/>
-            </w:tcMar>
-          </w:tcPr>
-          <w:p>
-            <w:pPr>
-              <w:keepNext/>
-            </w:pPr>
-            <w:r>
-              <w:rPr>
-                <w:sz w:val="17"/>
-                <w:szCs w:val="17"/>
-              </w:rPr>
-              <w:t>Calgary Flames</w:t>
-            </w:r>
-          </w:p>
-        </w:tc>
-        <w:tc>
-          <w:tcPr>
-            <w:tcW w:w="2400" w:type="dxa"/>
-            <w:tcBorders>
-              <w:top w:val="single" w:sz="4" w:space="0" w:color="C9C8C3"/>
-              <w:left w:val="single" w:sz="4" w:space="0" w:color="C9C8C3"/>
-              <w:bottom w:val="single" w:sz="4" w:space="0" w:color="C9C8C3"/>
-              <w:right w:val="single" w:sz="4" w:space="0" w:color="C9C8C3"/>
-            </w:tcBorders>
-            <w:tcMar>
-              <w:top w:w="40" w:type="dxa"/>
-              <w:left w:w="80" w:type="dxa"/>
-              <w:bottom w:w="40" w:type="dxa"/>
-              <w:right w:w="80" w:type="dxa"/>
-            </w:tcMar>
-          </w:tcPr>
-          <w:p>
-            <w:pPr>
-              <w:keepNext/>
-            </w:pPr>
-            <w:r>
-              <w:rPr>
-                <w:sz w:val="17"/>
-                <w:szCs w:val="17"/>
-              </w:rPr>
-              <w:t>February 18, 2008</w:t>
-            </w:r>
-          </w:p>
-        </w:tc>
-      </w:tr>
-      <w:tr>
-        <w:trPr>
-          <w:cantSplit/>
-        </w:trPr>
-        <w:tc>
-          <w:tcPr>
-            <w:tcW w:w="2600" w:type="dxa"/>
-            <w:tcBorders>
-              <w:top w:val="single" w:sz="4" w:space="0" w:color="C9C8C3"/>
-              <w:left w:val="single" w:sz="4" w:space="0" w:color="C9C8C3"/>
-              <w:bottom w:val="single" w:sz="4" w:space="0" w:color="C9C8C3"/>
-              <w:right w:val="single" w:sz="4" w:space="0" w:color="C9C8C3"/>
-            </w:tcBorders>
-            <w:tcMar>
-              <w:top w:w="40" w:type="dxa"/>
-              <w:left w:w="80" w:type="dxa"/>
-              <w:bottom w:w="40" w:type="dxa"/>
-              <w:right w:w="80" w:type="dxa"/>
-            </w:tcMar>
-          </w:tcPr>
-          <w:p>
-            <w:pPr>
-              <w:keepNext/>
-            </w:pPr>
-            <w:r>
-              <w:rPr>
-                <w:sz w:val="17"/>
-                <w:szCs w:val="17"/>
-              </w:rPr>
-              <w:t>Bryan Rufenach</w:t>
-            </w:r>
-          </w:p>
-        </w:tc>
-        <w:tc>
-          <w:tcPr>
-            <w:tcW w:w="1500" w:type="dxa"/>
-            <w:tcBorders>
-              <w:top w:val="single" w:sz="4" w:space="0" w:color="C9C8C3"/>
-              <w:left w:val="single" w:sz="4" w:space="0" w:color="C9C8C3"/>
-              <w:bottom w:val="single" w:sz="4" w:space="0" w:color="C9C8C3"/>
-              <w:right w:val="single" w:sz="4" w:space="0" w:color="C9C8C3"/>
-            </w:tcBorders>
-            <w:tcMar>
-              <w:top w:w="40" w:type="dxa"/>
-              <w:left w:w="80" w:type="dxa"/>
-              <w:bottom w:w="40" w:type="dxa"/>
-              <w:right w:w="80" w:type="dxa"/>
-            </w:tcMar>
-          </w:tcPr>
-          <w:p>
-            <w:pPr>
-              <w:keepNext/>
-            </w:pPr>
-            <w:r>
-              <w:rPr>
-                <w:sz w:val="17"/>
-                <w:szCs w:val="17"/>
-              </w:rPr>
-              <w:t>2007, #208</w:t>
-            </w:r>
-          </w:p>
-        </w:tc>
-        <w:tc>
-          <w:tcPr>
-            <w:tcW w:w="2600" w:type="dxa"/>
-            <w:tcBorders>
-              <w:top w:val="single" w:sz="4" w:space="0" w:color="C9C8C3"/>
-              <w:left w:val="single" w:sz="4" w:space="0" w:color="C9C8C3"/>
-              <w:bottom w:val="single" w:sz="4" w:space="0" w:color="C9C8C3"/>
-              <w:right w:val="single" w:sz="4" w:space="0" w:color="C9C8C3"/>
-            </w:tcBorders>
-            <w:tcMar>
-              <w:top w:w="40" w:type="dxa"/>
-              <w:left w:w="80" w:type="dxa"/>
-              <w:bottom w:w="40" w:type="dxa"/>
-              <w:right w:w="80" w:type="dxa"/>
-            </w:tcMar>
-          </w:tcPr>
-          <w:p>
-            <w:pPr>
-              <w:keepNext/>
-            </w:pPr>
-            <w:r>
-              <w:rPr>
-                <w:sz w:val="17"/>
-                <w:szCs w:val="17"/>
-              </w:rPr>
-              <w:t>Detroit Red Wings</w:t>
-            </w:r>
-          </w:p>
-        </w:tc>
-        <w:tc>
-          <w:tcPr>
-            <w:tcW w:w="2400" w:type="dxa"/>
-            <w:tcBorders>
-              <w:top w:val="single" w:sz="4" w:space="0" w:color="C9C8C3"/>
-              <w:left w:val="single" w:sz="4" w:space="0" w:color="C9C8C3"/>
-              <w:bottom w:val="single" w:sz="4" w:space="0" w:color="C9C8C3"/>
-              <w:right w:val="single" w:sz="4" w:space="0" w:color="C9C8C3"/>
-            </w:tcBorders>
-            <w:tcMar>
-              <w:top w:w="40" w:type="dxa"/>
-              <w:left w:w="80" w:type="dxa"/>
-              <w:bottom w:w="40" w:type="dxa"/>
-              <w:right w:w="80" w:type="dxa"/>
-            </w:tcMar>
-          </w:tcPr>
-          <w:p>
-            <w:pPr>
-              <w:keepNext/>
-            </w:pPr>
-            <w:r>
-              <w:rPr>
-                <w:sz w:val="17"/>
-                <w:szCs w:val="17"/>
-              </w:rPr>
-              <w:t>June 4, 2012</w:t>
-            </w:r>
-          </w:p>
-        </w:tc>
-      </w:tr>
-      <w:tr>
-        <w:trPr>
-          <w:cantSplit/>
-        </w:trPr>
-        <w:tc>
-          <w:tcPr>
-            <w:tcW w:w="2600" w:type="dxa"/>
-            <w:tcBorders>
-              <w:top w:val="single" w:sz="4" w:space="0" w:color="C9C8C3"/>
-              <w:left w:val="single" w:sz="4" w:space="0" w:color="C9C8C3"/>
-              <w:bottom w:val="single" w:sz="4" w:space="0" w:color="C9C8C3"/>
-              <w:right w:val="single" w:sz="4" w:space="0" w:color="C9C8C3"/>
-            </w:tcBorders>
-            <w:tcMar>
-              <w:top w:w="40" w:type="dxa"/>
-              <w:left w:w="80" w:type="dxa"/>
-              <w:bottom w:w="40" w:type="dxa"/>
-              <w:right w:w="80" w:type="dxa"/>
-            </w:tcMar>
-          </w:tcPr>
-          <w:p>
-            <w:pPr>
-              <w:keepNext/>
-            </w:pPr>
-            <w:r>
-              <w:rPr>
-                <w:sz w:val="17"/>
-                <w:szCs w:val="17"/>
-              </w:rPr>
-              <w:t>Scott Winkler</w:t>
-            </w:r>
-          </w:p>
-        </w:tc>
-        <w:tc>
-          <w:tcPr>
-            <w:tcW w:w="1500" w:type="dxa"/>
-            <w:tcBorders>
-              <w:top w:val="single" w:sz="4" w:space="0" w:color="C9C8C3"/>
-              <w:left w:val="single" w:sz="4" w:space="0" w:color="C9C8C3"/>
-              <w:bottom w:val="single" w:sz="4" w:space="0" w:color="C9C8C3"/>
-              <w:right w:val="single" w:sz="4" w:space="0" w:color="C9C8C3"/>
-            </w:tcBorders>
-            <w:tcMar>
-              <w:top w:w="40" w:type="dxa"/>
-              <w:left w:w="80" w:type="dxa"/>
-              <w:bottom w:w="40" w:type="dxa"/>
-              <w:right w:w="80" w:type="dxa"/>
-            </w:tcMar>
-          </w:tcPr>
-          <w:p>
-            <w:pPr>
-              <w:keepNext/>
-            </w:pPr>
-            <w:r>
-              <w:rPr>
-                <w:sz w:val="17"/>
-                <w:szCs w:val="17"/>
-              </w:rPr>
-              <w:t>2008, #89</w:t>
-            </w:r>
-          </w:p>
-        </w:tc>
-        <w:tc>
-          <w:tcPr>
-            <w:tcW w:w="2600" w:type="dxa"/>
-            <w:tcBorders>
-              <w:top w:val="single" w:sz="4" w:space="0" w:color="C9C8C3"/>
-              <w:left w:val="single" w:sz="4" w:space="0" w:color="C9C8C3"/>
-              <w:bottom w:val="single" w:sz="4" w:space="0" w:color="C9C8C3"/>
-              <w:right w:val="single" w:sz="4" w:space="0" w:color="C9C8C3"/>
-            </w:tcBorders>
-            <w:tcMar>
-              <w:top w:w="40" w:type="dxa"/>
-              <w:left w:w="80" w:type="dxa"/>
-              <w:bottom w:w="40" w:type="dxa"/>
-              <w:right w:w="80" w:type="dxa"/>
-            </w:tcMar>
-          </w:tcPr>
-          <w:p>
-            <w:pPr>
-              <w:keepNext/>
-            </w:pPr>
-            <w:r>
-              <w:rPr>
-                <w:sz w:val="17"/>
-                <w:szCs w:val="17"/>
-              </w:rPr>
-              <w:t>Dallas Stars</w:t>
-            </w:r>
-          </w:p>
-        </w:tc>
-        <w:tc>
-          <w:tcPr>
-            <w:tcW w:w="2400" w:type="dxa"/>
-            <w:tcBorders>
-              <w:top w:val="single" w:sz="4" w:space="0" w:color="C9C8C3"/>
-              <w:left w:val="single" w:sz="4" w:space="0" w:color="C9C8C3"/>
-              <w:bottom w:val="single" w:sz="4" w:space="0" w:color="C9C8C3"/>
-              <w:right w:val="single" w:sz="4" w:space="0" w:color="C9C8C3"/>
-            </w:tcBorders>
-            <w:tcMar>
-              <w:top w:w="40" w:type="dxa"/>
-              <w:left w:w="80" w:type="dxa"/>
-              <w:bottom w:w="40" w:type="dxa"/>
-              <w:right w:w="80" w:type="dxa"/>
-            </w:tcMar>
-          </w:tcPr>
-          <w:p>
-            <w:pPr>
-              <w:keepNext/>
-            </w:pPr>
-            <w:r>
-              <w:rPr>
-                <w:sz w:val="17"/>
-                <w:szCs w:val="17"/>
-              </w:rPr>
-              <w:t>June 12, 2013</w:t>
-            </w:r>
-          </w:p>
-        </w:tc>
-      </w:tr>
-      <w:tr>
-        <w:trPr>
-          <w:cantSplit/>
-        </w:trPr>
-        <w:tc>
-          <w:tcPr>
-            <w:tcW w:w="2600" w:type="dxa"/>
-            <w:tcBorders>
-              <w:top w:val="single" w:sz="4" w:space="0" w:color="C9C8C3"/>
-              <w:left w:val="single" w:sz="4" w:space="0" w:color="C9C8C3"/>
-              <w:bottom w:val="single" w:sz="4" w:space="0" w:color="C9C8C3"/>
-              <w:right w:val="single" w:sz="4" w:space="0" w:color="C9C8C3"/>
-            </w:tcBorders>
-            <w:tcMar>
-              <w:top w:w="40" w:type="dxa"/>
-              <w:left w:w="80" w:type="dxa"/>
-              <w:bottom w:w="40" w:type="dxa"/>
-              <w:right w:w="80" w:type="dxa"/>
-            </w:tcMar>
-          </w:tcPr>
-          <w:p>
-            <w:pPr>
-              <w:keepNext/>
-            </w:pPr>
-            <w:r>
-              <w:rPr>
-                <w:sz w:val="17"/>
-                <w:szCs w:val="17"/>
-              </w:rPr>
-              <w:t>Kristians Pelss</w:t>
-            </w:r>
-          </w:p>
-        </w:tc>
-        <w:tc>
-          <w:tcPr>
-            <w:tcW w:w="1500" w:type="dxa"/>
-            <w:tcBorders>
-              <w:top w:val="single" w:sz="4" w:space="0" w:color="C9C8C3"/>
-              <w:left w:val="single" w:sz="4" w:space="0" w:color="C9C8C3"/>
-              <w:bottom w:val="single" w:sz="4" w:space="0" w:color="C9C8C3"/>
-              <w:right w:val="single" w:sz="4" w:space="0" w:color="C9C8C3"/>
-            </w:tcBorders>
-            <w:tcMar>
-              <w:top w:w="40" w:type="dxa"/>
-              <w:left w:w="80" w:type="dxa"/>
-              <w:bottom w:w="40" w:type="dxa"/>
-              <w:right w:w="80" w:type="dxa"/>
-            </w:tcMar>
-          </w:tcPr>
-          <w:p>
-            <w:pPr>
-              <w:keepNext/>
-            </w:pPr>
-            <w:r>
-              <w:rPr>
-                <w:sz w:val="17"/>
-                <w:szCs w:val="17"/>
-              </w:rPr>
-              <w:t>2010, #181</w:t>
-            </w:r>
-          </w:p>
-        </w:tc>
-        <w:tc>
-          <w:tcPr>
-            <w:tcW w:w="2600" w:type="dxa"/>
-            <w:tcBorders>
-              <w:top w:val="single" w:sz="4" w:space="0" w:color="C9C8C3"/>
-              <w:left w:val="single" w:sz="4" w:space="0" w:color="C9C8C3"/>
-              <w:bottom w:val="single" w:sz="4" w:space="0" w:color="C9C8C3"/>
-              <w:right w:val="single" w:sz="4" w:space="0" w:color="C9C8C3"/>
-            </w:tcBorders>
-            <w:tcMar>
-              <w:top w:w="40" w:type="dxa"/>
-              <w:left w:w="80" w:type="dxa"/>
-              <w:bottom w:w="40" w:type="dxa"/>
-              <w:right w:w="80" w:type="dxa"/>
-            </w:tcMar>
-          </w:tcPr>
-          <w:p>
-            <w:pPr>
-              <w:keepNext/>
-            </w:pPr>
-            <w:r>
-              <w:rPr>
-                <w:sz w:val="17"/>
-                <w:szCs w:val="17"/>
-              </w:rPr>
-              <w:t>Edmonton Oilers</w:t>
-            </w:r>
-          </w:p>
-        </w:tc>
-        <w:tc>
-          <w:tcPr>
-            <w:tcW w:w="2400" w:type="dxa"/>
-            <w:tcBorders>
-              <w:top w:val="single" w:sz="4" w:space="0" w:color="C9C8C3"/>
-              <w:left w:val="single" w:sz="4" w:space="0" w:color="C9C8C3"/>
-              <w:bottom w:val="single" w:sz="4" w:space="0" w:color="C9C8C3"/>
-              <w:right w:val="single" w:sz="4" w:space="0" w:color="C9C8C3"/>
-            </w:tcBorders>
-            <w:tcMar>
-              <w:top w:w="40" w:type="dxa"/>
-              <w:left w:w="80" w:type="dxa"/>
-              <w:bottom w:w="40" w:type="dxa"/>
-              <w:right w:w="80" w:type="dxa"/>
-            </w:tcMar>
-          </w:tcPr>
-          <w:p>
-            <w:pPr>
-              <w:keepNext/>
-            </w:pPr>
-            <w:r>
-              <w:rPr>
-                <w:sz w:val="17"/>
-                <w:szCs w:val="17"/>
-              </w:rPr>
-              <w:t>June 11, 2013</w:t>
-            </w:r>
-          </w:p>
-        </w:tc>
-      </w:tr>
-      <w:tr>
-        <w:trPr>
-          <w:cantSplit/>
-        </w:trPr>
-        <w:tc>
-          <w:tcPr>
-            <w:tcW w:w="2600" w:type="dxa"/>
-            <w:tcBorders>
-              <w:top w:val="single" w:sz="4" w:space="0" w:color="C9C8C3"/>
-              <w:left w:val="single" w:sz="4" w:space="0" w:color="C9C8C3"/>
-              <w:bottom w:val="single" w:sz="4" w:space="0" w:color="C9C8C3"/>
-              <w:right w:val="single" w:sz="4" w:space="0" w:color="C9C8C3"/>
-            </w:tcBorders>
-            <w:tcMar>
-              <w:top w:w="40" w:type="dxa"/>
-              <w:left w:w="80" w:type="dxa"/>
-              <w:bottom w:w="40" w:type="dxa"/>
-              <w:right w:w="80" w:type="dxa"/>
-            </w:tcMar>
-          </w:tcPr>
-          <w:p>
-            <w:r>
-              <w:rPr>
-                <w:sz w:val="17"/>
-                <w:szCs w:val="17"/>
-              </w:rPr>
-              <w:t>Daniil Sobchenko</w:t>
-            </w:r>
-          </w:p>
-        </w:tc>
-        <w:tc>
-          <w:tcPr>
-            <w:tcW w:w="1500" w:type="dxa"/>
-            <w:tcBorders>
-              <w:top w:val="single" w:sz="4" w:space="0" w:color="C9C8C3"/>
-              <w:left w:val="single" w:sz="4" w:space="0" w:color="C9C8C3"/>
-              <w:bottom w:val="single" w:sz="4" w:space="0" w:color="C9C8C3"/>
-              <w:right w:val="single" w:sz="4" w:space="0" w:color="C9C8C3"/>
-            </w:tcBorders>
-            <w:tcMar>
-              <w:top w:w="40" w:type="dxa"/>
-              <w:left w:w="80" w:type="dxa"/>
-              <w:bottom w:w="40" w:type="dxa"/>
-              <w:right w:w="80" w:type="dxa"/>
-            </w:tcMar>
-          </w:tcPr>
-          <w:p>
-            <w:r>
-              <w:rPr>
-                <w:sz w:val="17"/>
-                <w:szCs w:val="17"/>
-              </w:rPr>
-              <w:t>2011, #166</w:t>
-            </w:r>
-          </w:p>
-        </w:tc>
-        <w:tc>
-          <w:tcPr>
-            <w:tcW w:w="2600" w:type="dxa"/>
-            <w:tcBorders>
-              <w:top w:val="single" w:sz="4" w:space="0" w:color="C9C8C3"/>
-              <w:left w:val="single" w:sz="4" w:space="0" w:color="C9C8C3"/>
-              <w:bottom w:val="single" w:sz="4" w:space="0" w:color="C9C8C3"/>
-              <w:right w:val="single" w:sz="4" w:space="0" w:color="C9C8C3"/>
-            </w:tcBorders>
-            <w:tcMar>
-              <w:top w:w="40" w:type="dxa"/>
-              <w:left w:w="80" w:type="dxa"/>
-              <w:bottom w:w="40" w:type="dxa"/>
-              <w:right w:w="80" w:type="dxa"/>
-            </w:tcMar>
-          </w:tcPr>
-          <w:p>
-            <w:r>
-              <w:rPr>
-                <w:sz w:val="17"/>
-                <w:szCs w:val="17"/>
-              </w:rPr>
-              <w:t>San Jose Sharks</w:t>
-            </w:r>
-          </w:p>
-        </w:tc>
-        <w:tc>
-          <w:tcPr>
-            <w:tcW w:w="2400" w:type="dxa"/>
-            <w:tcBorders>
-              <w:top w:val="single" w:sz="4" w:space="0" w:color="C9C8C3"/>
-              <w:left w:val="single" w:sz="4" w:space="0" w:color="C9C8C3"/>
-              <w:bottom w:val="single" w:sz="4" w:space="0" w:color="C9C8C3"/>
-              <w:right w:val="single" w:sz="4" w:space="0" w:color="C9C8C3"/>
-            </w:tcBorders>
-            <w:tcMar>
-              <w:top w:w="40" w:type="dxa"/>
-              <w:left w:w="80" w:type="dxa"/>
-              <w:bottom w:w="40" w:type="dxa"/>
-              <w:right w:w="80" w:type="dxa"/>
-            </w:tcMar>
-          </w:tcPr>
-          <w:p>
-            <w:r>
-              <w:rPr>
-                <w:sz w:val="17"/>
-                <w:szCs w:val="17"/>
-              </w:rPr>
-              <w:t>September 7, 2011</w:t>
-            </w:r>
-          </w:p>
-        </w:tc>
-      </w:tr>
-    </w:tbl>
-    <w:p>
-      <w:pPr>
-        <w:spacing w:before="40" w:after="220"/>
-      </w:pPr>
-      <w:r>
-        <w:rPr>
-          <w:color w:val="52514E"/>
-          <w:sz w:val="18"/>
-          <w:szCs w:val="18"/>
-        </w:rPr>
-        <w:t>Drafted players of 2007 to 2017 who never played an NHL season and died before their club's control would have ended, from Wikipedia's list of ice hockey players who died during their careers, each matched to the draft records by draft year and overall pick. Leaving them out moves the star value at the draft from $18.02 million to $18.04 million.</w:t>
-      </w:r>
-    </w:p>
-    <w:p>
-      <w:pPr>
-        <w:pStyle w:val="Heading1"/>
-        <w:keepNext/>
-      </w:pPr>
-      <w:r>
-        <w:t>1. The Draft Slot and How It Fades</w:t>
-      </w:r>
-    </w:p>
-    <w:p>
-      <w:pPr>
-        <w:spacing w:before="60" w:after="120" w:line="276" w:lineRule="auto"/>
-      </w:pPr>
-      <w:r>
-        <w:t>At the draft, a pick is worth its slot's star probability times the star value. A prospect starts with his pick's value. The question is how that value changes while he remains unproven.</w:t>
-      </w:r>
-    </w:p>
-    <w:p>
-      <w:pPr>
-        <w:spacing w:before="60" w:after="120" w:line="276" w:lineRule="auto"/>
-      </w:pPr>
-      <w:r>
-        <w:t>The answer depends on when drafted players reach the NHL. Of the 2,316 drafted players, 997 (43.0%) played an NHL season of 10 or more games (a goaltender, an NHL game) before their club's control ended. When they arrived depends on where they were drafted (Figure 1). Of the top-ten picks who reached the NHL, 36.7% did so in D+1, 77.1% by D+2 and 90.8% by D+3. Of the picks from rounds 3 to 7 who reached it, 20.2% had done so by D+3 and 43.9% by D+4. A top pick who is still a prospect in D+4 is therefore unusual, and later picks reach the NHL later.</w:t>
-      </w:r>
-    </w:p>
-    <w:p>
-      <w:pPr>
-        <w:keepNext/>
-        <w:spacing w:before="180" w:after="60"/>
-      </w:pPr>
-      <w:commentRangeStart w:id="0"/>
-      <w:r>
-        <w:rPr>
-          <w:b/>
-          <w:bCs/>
-          <w:sz w:val="20"/>
-          <w:szCs w:val="20"/>
-        </w:rPr>
         <w:lastRenderedPageBreak/>
         <w:t>Figure 1. When drafted players reach the NHL</w:t>
-      </w:r>
-      <w:commentRangeEnd w:id="0"/>
-      <w:r>
-        <w:rPr>
-          <w:rStyle w:val="CommentReference"/>
-          <w:sz w:val="21"/>
-          <w:szCs w:val="21"/>
-        </w:rPr>
-        <w:commentReference w:id="0"/>
       </w:r>
     </w:p>
     <w:p>
@@ -1010,8 +99,8 @@
           <w:noProof/>
         </w:rPr>
         <w:drawing>
-          <wp:inline distT="0" distB="0" distL="0" distR="0" wp14:anchorId="59ECA98B" wp14:editId="67310ED6">
-            <wp:extent cx="5143500" cy="2647950"/>
+          <wp:inline distT="0" distB="0" distL="0" distR="0" wp14:anchorId="32E88B44" wp14:editId="1E338340">
+            <wp:extent cx="5143500" cy="2971800"/>
             <wp:effectExtent l="0" t="0" r="0" b="0"/>
             <wp:docPr id="1" name="Picture 1"/>
             <wp:cNvGraphicFramePr>
@@ -1027,7 +116,7 @@
                     </pic:cNvPicPr>
                   </pic:nvPicPr>
                   <pic:blipFill>
-                    <a:blip r:embed="rId12"/>
+                    <a:blip r:embed="rId7"/>
                     <a:srcRect/>
                     <a:stretch>
                       <a:fillRect/>
@@ -1036,7 +125,7 @@
                   <pic:spPr bwMode="auto">
                     <a:xfrm>
                       <a:off x="0" y="0"/>
-                      <a:ext cx="5143500" cy="2647950"/>
+                      <a:ext cx="5143500" cy="2971800"/>
                     </a:xfrm>
                     <a:prstGeom prst="rect">
                       <a:avLst/>
@@ -1059,7 +148,7 @@
           <w:sz w:val="18"/>
           <w:szCs w:val="18"/>
         </w:rPr>
-        <w:t>Drafted players of 2007 to 2017, without the six in Table 1. The season of arrival is the first NHL season of 10 or more games (for a goaltender, the first NHL game), the point at which the player model takes him; only seasons within club control are seen. Each line is the cumulative share of a draft group's arrivals. Every draft is observed through at least D+9.</w:t>
+        <w:t>Drafted players of 2007 to 2017, without the six in Table 1. Each line is the share of a draft group's players who had reached the NHL by each season; the rest of the group, the gap above the line at D+9, never did. Reaching the NHL means a first NHL season of 10 or more games (for a goaltender, a first NHL game), the point at which the player model takes him; only seasons within club control are seen. Every draft is observed through at least D+9.</w:t>
       </w:r>
     </w:p>
     <w:p>
@@ -1067,7 +156,7 @@
         <w:spacing w:before="60" w:after="120" w:line="276" w:lineRule="auto"/>
       </w:pPr>
       <w:r>
-        <w:t>To measure how the slot's value changes, I refit the draft pick curve once for each season. For D+1, I compare the surplus that each prospect still unproven in D+1 went on to deliver with his slot's star probability. I then do the same for D+2, D+3 and D+4, and once for D+5 and later together. The coefficient on the star probability is the star value for that season: how much more a prospect from a high-probability slot went on to deliver than one from a low-probability slot, among prospects still unproven at that point. As in the draft pick curve, the regression has no constant term and gives each draft its own level, with the levels averaging zero, so each star value describes an average draft.</w:t>
+        <w:t>To measure how the value of draft position changes, I fit one regression on every prospect-season: each season from D+1 on in which a drafted player was still a prospect, with the surplus he went on to deliver from that season as the outcome. The star probability for his draft position is multiplied by an indicator for each season (D+1, D+2, D+3, D+4, and D+5 and later together), and so is each draft's level. This full set of interaction terms gives each season its own coefficient on the star probability, the star value for that season: how much more a prospect from a high-probability draft position went on to deliver than one from a low-probability draft position, among prospects still unproven in that season. As in the draft pick curve, the regression has no constant term and each season's draft levels average zero, so each star value describes an average draft. Because every term is interacted with the season, the regression gives exactly the same coefficients as fitting each season on its own, which is how it is computed; the standard errors are computed within each season.</w:t>
       </w:r>
     </w:p>
     <w:p>
@@ -1082,7 +171,7 @@
           <w:sz w:val="23"/>
           <w:szCs w:val="23"/>
         </w:rPr>
-        <w:t>value in season D+n  =  star probability for his slot  ×  star value for season D+n</w:t>
+        <w:t>value in season D+n  =  star probability for his draft position  ×  star value for season D+n</w:t>
       </w:r>
     </w:p>
     <w:p>
@@ -1105,6 +194,7 @@
           <w:sz w:val="20"/>
           <w:szCs w:val="20"/>
         </w:rPr>
+        <w:lastRenderedPageBreak/>
         <w:t>Table 2. The star value for a player still a prospect, by season</w:t>
       </w:r>
     </w:p>
@@ -2628,8 +1718,7 @@
         <w:spacing w:before="60" w:after="120" w:line="276" w:lineRule="auto"/>
       </w:pPr>
       <w:r>
-        <w:lastRenderedPageBreak/>
-        <w:t>A prospect keeps most of his slot's value through D+3 ($17.61 million in D+2 and $15.75 million in D+3) and loses most of it over the next two seasons ($8.89 million in D+4 and $2.01 million from D+5 on). Each estimate differs from zero at the 1% level; the largest p-value is 0.002, from D+5 on. The value falls sharply after D+3 because of who is left. By D+4, nearly each top pick who will reach the NHL has done so, so the prospects still unproven are mostly later picks and the top picks who missed: of the 110 top-ten picks of 2007-2017, 26 were still prospects in D+3 and 11 in D+4. Among the prospects left, the slot no longer separates the players who will succeed from those who will not.</w:t>
+        <w:t>A prospect keeps most of his draft position's value through D+3 ($17.61 million in D+2 and $15.75 million in D+3) and loses most of it over the next two seasons ($8.89 million in D+4 and $2.01 million from D+5 on). Each estimate differs from zero at the 1% level; the largest p-value is 0.002, from D+5 on. The value falls sharply after D+3 because of who is left. By D+4, nearly each top pick who will reach the NHL has done so, so the prospects still unproven are mostly later picks and the top picks who missed: of the 110 top-ten picks of 2007-2017, 26 were still prospects in D+3 and 11 in D+4. Among the prospects left, draft position no longer separates the players who will succeed from those who will not.</w:t>
       </w:r>
     </w:p>
     <w:p>
@@ -2638,28 +1727,15 @@
         <w:keepNext/>
       </w:pPr>
       <w:r>
-        <w:t>Decision: a separate star value for each season</w:t>
+        <w:t>Decision: a full set of interaction terms</w:t>
       </w:r>
     </w:p>
     <w:p>
       <w:pPr>
         <w:spacing w:before="60" w:after="120" w:line="276" w:lineRule="auto"/>
       </w:pPr>
-      <w:commentRangeStart w:id="1"/>
       <w:r>
-        <w:t xml:space="preserve">The model fits a separate star value for each season from D+1 to D+4 and one shared value from D+5 on. Fitting each season separately gives exactly the same star values as one regression on every prospect-season in which the star probability, and each draft's level, is multiplied by an indicator for each season (a full set of interaction terms). </w:t>
-      </w:r>
-      <w:commentRangeEnd w:id="1"/>
-      <w:r>
-        <w:rPr>
-          <w:rStyle w:val="CommentReference"/>
-          <w:sz w:val="21"/>
-          <w:szCs w:val="21"/>
-        </w:rPr>
-        <w:commentReference w:id="1"/>
-      </w:r>
-      <w:r>
-        <w:t>Three simpler rules each restrict how the value may change from one season to the next. Each was fitted on the same prospect-seasons and scored the same way (Figure 2, Table 3):</w:t>
+        <w:t>The adopted regression has the full set of interaction terms: a separate star value for each season from D+1 to D+4, and one shared value from D+5 on. Three simpler rules each restrict how the value may change from one season to the next. Each was fitted on the same prospect-seasons and scored the same way (Figure 2, Table 3):</w:t>
       </w:r>
     </w:p>
     <w:p>
@@ -2706,7 +1782,6 @@
         <w:keepNext/>
         <w:spacing w:before="180" w:after="60"/>
       </w:pPr>
-      <w:commentRangeStart w:id="2"/>
       <w:r>
         <w:rPr>
           <w:b/>
@@ -2714,16 +1789,8 @@
           <w:sz w:val="20"/>
           <w:szCs w:val="20"/>
         </w:rPr>
+        <w:lastRenderedPageBreak/>
         <w:t>Figure 2. The star value by season, and three simpler rules</w:t>
-      </w:r>
-      <w:commentRangeEnd w:id="2"/>
-      <w:r>
-        <w:rPr>
-          <w:rStyle w:val="CommentReference"/>
-          <w:sz w:val="21"/>
-          <w:szCs w:val="21"/>
-        </w:rPr>
-        <w:commentReference w:id="2"/>
       </w:r>
     </w:p>
     <w:p>
@@ -2736,8 +1803,8 @@
           <w:noProof/>
         </w:rPr>
         <w:drawing>
-          <wp:inline distT="0" distB="0" distL="0" distR="0" wp14:anchorId="601323AC" wp14:editId="594C67F5">
-            <wp:extent cx="5143500" cy="2724150"/>
+          <wp:inline distT="0" distB="0" distL="0" distR="0" wp14:anchorId="393EF608" wp14:editId="3F716B32">
+            <wp:extent cx="5143500" cy="2009775"/>
             <wp:effectExtent l="0" t="0" r="0" b="0"/>
             <wp:docPr id="2" name="Picture 2"/>
             <wp:cNvGraphicFramePr>
@@ -2753,7 +1820,7 @@
                     </pic:cNvPicPr>
                   </pic:nvPicPr>
                   <pic:blipFill>
-                    <a:blip r:embed="rId13"/>
+                    <a:blip r:embed="rId8"/>
                     <a:srcRect/>
                     <a:stretch>
                       <a:fillRect/>
@@ -2762,7 +1829,7 @@
                   <pic:spPr bwMode="auto">
                     <a:xfrm>
                       <a:off x="0" y="0"/>
-                      <a:ext cx="5143500" cy="2724150"/>
+                      <a:ext cx="5143500" cy="2009775"/>
                     </a:xfrm>
                     <a:prstGeom prst="rect">
                       <a:avLst/>
@@ -2785,7 +1852,7 @@
           <w:sz w:val="18"/>
           <w:szCs w:val="18"/>
         </w:rPr>
-        <w:t>Bars are the star values in Table 2 (one value from D+5 on); lines on the bars are 95% intervals (1.96 robust standard errors). Each line is a simpler rule, fitted on the same prospect-seasons with the same draft levels. Millions of dollars at the 2025-26 cap.</w:t>
+        <w:t>Each panel sets one simpler rule (orange line), fitted on the same prospect-seasons with the same draft levels, against the adopted star values in Table 2 (blue): a dot and its 95% interval (1.96 robust standard errors) for each season from D+1 to D+4, and from D+5 on one shared value, drawn as a level line with its interval as a band. Millions of dollars at the 2025-26 cap.</w:t>
       </w:r>
     </w:p>
     <w:p>
@@ -2800,7 +1867,6 @@
           <w:sz w:val="20"/>
           <w:szCs w:val="20"/>
         </w:rPr>
-        <w:lastRenderedPageBreak/>
         <w:t>Table 3. Each rule for the star value against the adopted one</w:t>
       </w:r>
     </w:p>
@@ -2989,7 +2055,7 @@
                 <w:sz w:val="17"/>
                 <w:szCs w:val="17"/>
               </w:rPr>
-              <w:t>197 traded prospects, slot alone ($M)</w:t>
+              <w:t>197 traded prospects, draft position alone ($M)</w:t>
             </w:r>
           </w:p>
         </w:tc>
@@ -3056,7 +2122,7 @@
                 <w:sz w:val="17"/>
                 <w:szCs w:val="17"/>
               </w:rPr>
-              <w:t>A separate value for each season (adopted)</w:t>
+              <w:t>A separate value for each season (adopted: a full set of interaction terms)</w:t>
             </w:r>
           </w:p>
         </w:tc>
@@ -3768,7 +2834,7 @@
           <w:sz w:val="18"/>
           <w:szCs w:val="18"/>
         </w:rPr>
-        <w:t>Held-out error: each draft is predicted from a fit without it, and the error is the root mean squared miss in millions of dollars of remaining surplus per prospect-season, over 14,718 prospect-seasons; lower is better, and the lowest is in bold. One-sided p: the 11 drafts are redrawn with replacement 2,000 times, and p is the share of redraws in which the adopted rule's total squared error is not lower than the other rule's. It is one-sided because the question is directional: is the adopted rule better?</w:t>
+        <w:t>Held-out error: each draft is predicted from a fit without it, and the error is the root mean squared error in millions of dollars of remaining surplus per prospect-season, over 14,718 prospect-seasons; lower is better, and the lowest is in bold. One-sided p: the 11 drafts are redrawn with replacement 2,000 times, and p is the share of redraws in which the adopted rule's total squared error is not lower than the other rule's. It is one-sided because the question is directional: is the adopted rule better?</w:t>
       </w:r>
     </w:p>
     <w:p>
@@ -3776,7 +2842,7 @@
         <w:spacing w:before="60" w:after="120" w:line="276" w:lineRule="auto"/>
       </w:pPr>
       <w:r>
-        <w:t>One value for every season predicts clearly worse than a separate value for each season (p &lt; 0.001). The straight line and the same-percentage rule predict about as well (p = 0.333 and 0.105), and a test that the decline from D+1 to D+4 is a straight line does not reject it at the 5% level (p = 0.077). The case for a separate value each season is therefore not better prediction. I chose it for two reasons. First, it imposes no shape on the decline, and the estimates hold through D+3 and then fall, which matches when top picks reach the NHL (Figure 1). Second, the straight line keeps falling past zero: from D+8 it values a top pick below a late pick (-$1.30 million in D+8), and it values 16 of the 197 traded prospects below zero. It also keeps more value late, $7.36 million in D+5 against $2.01 million, which raises the traded prospects' slot values from $58.30 million to $66.45 million.</w:t>
+        <w:t>One value for every season predicts clearly worse than a separate value for each season (p &lt; 0.001). The straight-line decline and the same-percentage decline predict about as well (p = 0.333 and 0.105), and a test that the decline from D+1 to D+4 is a straight line does not reject it at the 5% level (p = 0.077). The case for a separate value each season is therefore not better prediction. I chose it for two reasons. First, it imposes no shape on the decline, and the estimates hold through D+3 and then fall, which matches when top picks reach the NHL (Figure 1). Second, the straight-line decline keeps falling past zero: from D+8 it values a top pick below a late pick (-$1.30 million in D+8), and it values 16 of the 197 traded prospects below zero. It also keeps more value late, $7.36 million in D+5 against $2.01 million, which raises the traded prospects' values on draft position alone from $58.30 million to $66.45 million.</w:t>
       </w:r>
     </w:p>
     <w:p>
@@ -3784,7 +2850,7 @@
         <w:spacing w:before="60" w:after="120" w:line="276" w:lineRule="auto"/>
       </w:pPr>
       <w:r>
-        <w:t>The seasons from D+5 on are pooled into one estimate on 6,074 prospect-seasons of 1,759 players, because few prospects that old remain and little value is left to estimate.</w:t>
+        <w:t>The seasons from D+5 on share one star value, estimated on 6,074 prospect-seasons of 1,759 players, because few prospects that old remain and little value is left to estimate.</w:t>
       </w:r>
     </w:p>
     <w:p>
@@ -3801,7 +2867,11 @@
         <w:spacing w:before="60" w:after="120" w:line="276" w:lineRule="auto"/>
       </w:pPr>
       <w:r>
-        <w:t>A prospect drafted from 2007 to 2017 is valued from a fit that contains his own outcome. Leaving one draft out of the fit at a time moves the star value within $16.60 million to $19.39 million in D+1 and $7.02 million to $9.69 million in D+4, and moves the 197 traded drafted prospects from $70.39 million to $69.23 million under the adopted model. The value with his draft left out is reported beside each traded prospect's value. Refitting without each prospect's own draft as the main value was rejected for two reasons. It would take eleven fits for each season, and the prospect values would no longer use the same star value as the draft picks traded beside them.</w:t>
+        <w:t xml:space="preserve">A prospect drafted from 2007 to 2017 is valued from a fit that contains his own outcome. Leaving one draft out of the fit at a time moves the star value within $16.60 million to $19.39 million in D+1 and $7.02 million to $9.69 million in D+4, and moves the 197 traded drafted prospects from $70.39 million to $69.23 million under the </w:t>
+      </w:r>
+      <w:r>
+        <w:lastRenderedPageBreak/>
+        <w:t>adopted model. The value with his draft left out is reported beside each traded prospect's value. Refitting without each prospect's own draft as the main value was rejected for two reasons. It would take eleven fits for each season, and the prospect values would no longer use the same star value as the draft picks traded beside them.</w:t>
       </w:r>
     </w:p>
     <w:p>
@@ -3818,7 +2888,7 @@
         <w:spacing w:before="60" w:after="120" w:line="276" w:lineRule="auto"/>
       </w:pPr>
       <w:r>
-        <w:t>The slot records what scouts knew at the draft. A prospect's own scoring adds to it, because a player who scores at a high rate in junior, college or a European league is more likely to reach the NHL and to contribute when he does. The scoring window moves with the prospect. A prospect valued in D+1 is measured on his draft season (D0) and the two before it (D-1 and D-2), which is the scoring scouts saw before the draft; one valued in D+3 is measured on D+2, D+1 and D0.</w:t>
+        <w:t>Draft position records what scouts knew at the draft. A prospect's own scoring adds to it, because a player who scores at a high rate in junior, college or a European league is more likely to reach the NHL and to contribute when he does. The scoring window moves with the prospect. A prospect valued in D+1 is measured on his draft season (D0) and the two before it (D-1 and D-2), which is the scoring scouts saw before the draft; one valued in D+3 is measured on D+2, D+1 and D0.</w:t>
       </w:r>
     </w:p>
     <w:p>
@@ -3826,11 +2896,7 @@
         <w:spacing w:before="60" w:after="120" w:line="276" w:lineRule="auto"/>
       </w:pPr>
       <w:r>
-        <w:t>Scoring in different leagues is put on one scale with Patrick Bacon's NHL equivalency (NHLe) factors. A league's factor is the number of NHL points that one point in that league and season is worth. Bacon estimates the factors from players who played a full season in one league and the next full season in another, after adjusting the first season's scoring for the improvement a year of age brings. Leagues with few direct moves between them are linked through intermediate leagues, for example the KHL to the AHL to the NHL. The factors are re-</w:t>
-      </w:r>
-      <w:r>
-        <w:lastRenderedPageBreak/>
-        <w:t>estimated on a rolling four-season window, so a league's factor changes over time (Bacon, hockeystats.com/draft/guide). Figure 3 shows the ten leagues that the 2007-2017 draftees played in most in their draft season, which together hold 84.0% of those draft seasons. For example, an OHL point was worth 0.136 NHL points in 2006-07 and 0.120 in 2025-26, and an SHL point 0.455 and 0.411.</w:t>
+        <w:t>Scoring in different leagues is put on one scale with Patrick Bacon's NHL equivalency (NHLe) factors. A league's factor is the number of NHL points that one point in that league and season is worth. Bacon estimates the factors from players who played a full season in one league and the next full season in another, after adjusting the first season's scoring for the improvement a year of age brings. Leagues with few direct moves between them are linked through intermediate leagues, for example the KHL to the AHL to the NHL. The factors are re-estimated on a rolling four-season window, so a league's factor changes over time (Bacon, hockeystats.com/draft/guide). Figure 3 shows the ten leagues that the 2007-2017 draftees played in most in their draft season, which together hold 84.0% of those draft seasons. For example, an OHL point was worth 0.136 NHL points in 2006-07 and 0.120 in 2025-26, and an SHL point 0.455 and 0.411.</w:t>
       </w:r>
     </w:p>
     <w:p>
@@ -3858,7 +2924,7 @@
           <w:noProof/>
         </w:rPr>
         <w:drawing>
-          <wp:inline distT="0" distB="0" distL="0" distR="0" wp14:anchorId="633D001D" wp14:editId="363A37C5">
+          <wp:inline distT="0" distB="0" distL="0" distR="0" wp14:anchorId="7D2A3247" wp14:editId="56D7DB2E">
             <wp:extent cx="5143500" cy="2876550"/>
             <wp:effectExtent l="0" t="0" r="0" b="0"/>
             <wp:docPr id="3" name="Picture 3"/>
@@ -3875,7 +2941,7 @@
                     </pic:cNvPicPr>
                   </pic:nvPicPr>
                   <pic:blipFill>
-                    <a:blip r:embed="rId14"/>
+                    <a:blip r:embed="rId9"/>
                     <a:srcRect/>
                     <a:stretch>
                       <a:fillRect/>
@@ -3915,29 +2981,11 @@
         <w:spacing w:before="60" w:after="120" w:line="276" w:lineRule="auto"/>
       </w:pPr>
       <w:r>
-        <w:t xml:space="preserve">A season's production is the player's points, </w:t>
+        <w:t xml:space="preserve">A season's production is the player's points, sourced from Elite Prospects, times his league-season's NHLe factor, per 82 games, counted for seasons of 10 or more games. His production level weights his three seasons before the valuation season 50/30/20, most recent first, rescaled over the seasons he has. A prospect with no eligible </w:t>
       </w:r>
       <w:r>
-        <w:t xml:space="preserve">sourced </w:t>
-      </w:r>
-      <w:r>
-        <w:t xml:space="preserve">from Elite Prospects, times his league-season's NHLe factor, per 82 games, counted for seasons of 10 or more games. His production level weights his three seasons before the valuation season 50/30/20, most recent first, rescaled over the seasons he has. A prospect with no eligible season (3.9% of prospect-seasons) gets an indicator for having no record, so missing data is not read as zero scoring. </w:t>
-      </w:r>
-      <w:commentRangeStart w:id="3"/>
-      <w:r>
-        <w:t xml:space="preserve">Most of those prospect-seasons </w:t>
-      </w:r>
-      <w:commentRangeEnd w:id="3"/>
-      <w:r>
-        <w:rPr>
-          <w:rStyle w:val="CommentReference"/>
-          <w:sz w:val="21"/>
-          <w:szCs w:val="21"/>
-        </w:rPr>
-        <w:commentReference w:id="3"/>
-      </w:r>
-      <w:r>
-        <w:t>are in D+1 (88) and from D+5 on (409); only 17 fall in D+2 to D+4 (1 in D+3), so the indicator's coefficient in those seasons rests on very few players. The median level rises from 5.7 NHL-equivalent points per 82 in D+1 to 9.6 from D+5 on.</w:t>
+        <w:lastRenderedPageBreak/>
+        <w:t>season (3.9% of prospect-seasons) gets an indicator for having no record, so missing data is not read as zero scoring. Most of these missing prospect-seasons are in D+1 (88) and from D+5 on (409). Only 17 fall in D+2 to D+4 (11 in D+2, 1 in D+3 and 5 in D+4), so the indicator's coefficient in those seasons rests on very few players. The median production level rises from 5.7 NHLe points per 82 games in D+1 to 9.6 from D+5 on.</w:t>
       </w:r>
     </w:p>
     <w:p>
@@ -3952,7 +3000,7 @@
           <w:sz w:val="20"/>
           <w:szCs w:val="20"/>
         </w:rPr>
-        <w:t>Table 4. Held-out error of each production candidate against the slot alone</w:t>
+        <w:t>Table 4. Held-out error of each production candidate against draft position alone</w:t>
       </w:r>
     </w:p>
     <w:tbl>
@@ -4077,7 +3125,7 @@
                 <w:sz w:val="17"/>
                 <w:szCs w:val="17"/>
               </w:rPr>
-              <w:t>vs slot alone</w:t>
+              <w:t>vs draft position alone</w:t>
             </w:r>
           </w:p>
         </w:tc>
@@ -4309,7 +3357,7 @@
                 <w:sz w:val="17"/>
                 <w:szCs w:val="17"/>
               </w:rPr>
-              <w:t>Slot alone</w:t>
+              <w:t>Draft position alone</w:t>
             </w:r>
           </w:p>
         </w:tc>
@@ -4583,7 +3631,7 @@
                 <w:sz w:val="17"/>
                 <w:szCs w:val="17"/>
               </w:rPr>
-              <w:t>Production alone</w:t>
+              <w:t>Linear production alone</w:t>
             </w:r>
           </w:p>
         </w:tc>
@@ -4857,7 +3905,7 @@
                 <w:sz w:val="17"/>
                 <w:szCs w:val="17"/>
               </w:rPr>
-              <w:t>Slot + production, straight line</w:t>
+              <w:t>Draft position + linear production</w:t>
             </w:r>
           </w:p>
         </w:tc>
@@ -5131,7 +4179,7 @@
                 <w:sz w:val="17"/>
                 <w:szCs w:val="17"/>
               </w:rPr>
-              <w:t>Straight line, separate rate for defencemen</w:t>
+              <w:t>Draft position + linear production, separate rate for defencemen</w:t>
             </w:r>
           </w:p>
         </w:tc>
@@ -5405,7 +4453,7 @@
                 <w:sz w:val="17"/>
                 <w:szCs w:val="17"/>
               </w:rPr>
-              <w:t>Slot + production, curved</w:t>
+              <w:t>Draft position + linear and squared production</w:t>
             </w:r>
           </w:p>
         </w:tc>
@@ -5687,7 +4735,7 @@
                 <w:sz w:val="17"/>
                 <w:szCs w:val="17"/>
               </w:rPr>
-              <w:t>Production alone, curved</w:t>
+              <w:t>Linear and squared production alone</w:t>
             </w:r>
           </w:p>
         </w:tc>
@@ -5960,7 +5008,7 @@
                 <w:sz w:val="17"/>
                 <w:szCs w:val="17"/>
               </w:rPr>
-              <w:t>Adopted: curved; slot in D+1 to D+3 only</w:t>
+              <w:t>Adopted: linear and squared production; draft position in D+1 to D+3 only</w:t>
             </w:r>
           </w:p>
         </w:tc>
@@ -6214,35 +5262,7 @@
           <w:sz w:val="18"/>
           <w:szCs w:val="18"/>
         </w:rPr>
-        <w:lastRenderedPageBreak/>
-        <w:t xml:space="preserve">Each number from the second column to the last season column is a held-out error: the </w:t>
-      </w:r>
-      <w:commentRangeStart w:id="4"/>
-      <w:r>
-        <w:rPr>
-          <w:color w:val="52514E"/>
-          <w:sz w:val="18"/>
-          <w:szCs w:val="18"/>
-        </w:rPr>
-        <w:t>root mean squared miss</w:t>
-      </w:r>
-      <w:commentRangeEnd w:id="4"/>
-      <w:r>
-        <w:rPr>
-          <w:rStyle w:val="CommentReference"/>
-          <w:color w:val="52514E"/>
-          <w:sz w:val="18"/>
-          <w:szCs w:val="18"/>
-        </w:rPr>
-        <w:commentReference w:id="4"/>
-      </w:r>
-      <w:r>
-        <w:rPr>
-          <w:color w:val="52514E"/>
-          <w:sz w:val="18"/>
-          <w:szCs w:val="18"/>
-        </w:rPr>
-        <w:t>, in millions of dollars of remaining surplus per prospect-season, with each draft predicted from a fit without it. Lower is better, and the best in each column is in bold. The second column is over all 13,104 prospect-seasons of 2,083 drafted skaters, 2007-2017 (goaltenders stay on the slot alone); the season columns are the error within each season. The error falls with the season because the outcome is smaller: most prospects still unproven in D+5 or later deliver little or no NHL surplus. Compare candidates within a column, not one column with another. One-sided p: the share of 2,000 redraws of the 11 drafts in which the candidate's total squared error is not lower than the slot alone's.</w:t>
+        <w:t>Each number from the second column to the last season column is a held-out error: the root mean squared error, in millions of dollars of remaining surplus per prospect-season, with each draft predicted from a fit without it. Lower is better, and the best in each column is in bold. The second column is over all 13,104 prospect-seasons of 2,083 drafted skaters, 2007-2017 (goaltenders stay on draft position alone); the season columns are the error within each season. The error falls with the season because the outcome is smaller: most prospects still unproven in D+5 or later deliver little or no NHL surplus. Compare candidates within a column, not one column with another. One-sided p: the share of 2,000 redraws of the 11 drafts in which the candidate's total squared error is not lower than that of draft position alone.</w:t>
       </w:r>
     </w:p>
     <w:p>
@@ -6251,7 +5271,7 @@
         <w:keepNext/>
       </w:pPr>
       <w:r>
-        <w:t>Decision: production adds to the slot</w:t>
+        <w:t>Decision: production adds to draft position</w:t>
       </w:r>
     </w:p>
     <w:p>
@@ -6259,7 +5279,7 @@
         <w:spacing w:before="60" w:after="120" w:line="276" w:lineRule="auto"/>
       </w:pPr>
       <w:r>
-        <w:t>Production alone predicts worse than the slot alone (+3.04% in held-out error; one-sided p = 0.995), so production does not replace the slot at the draft. Added to the slot, it lowers the error in each season, and the improvement is reliable at the 5% level for both the straight line (p = 0.028) and the curve (p = 0.026). Undrafted prospects, who have no slot, use the adopted model with the star probability set to zero (Section 4).</w:t>
+        <w:t>Linear production alone predicts worse than draft position alone (+3.04% in held-out error; one-sided p = 0.995), so production does not replace draft position at the draft. Added to draft position, production lowers the error in each season, and the improvement is reliable at the 5% level both for linear production (p = 0.028) and for linear and squared production (p = 0.026). Undrafted prospects, who have no draft position, use the adopted model with the star probability set to zero (Section 4).</w:t>
       </w:r>
     </w:p>
     <w:p>
@@ -6268,7 +5288,7 @@
         <w:keepNext/>
       </w:pPr>
       <w:r>
-        <w:t>Decision: production enters curved</w:t>
+        <w:t>Decision: production enters with a squared term</w:t>
       </w:r>
     </w:p>
     <w:p>
@@ -6276,39 +5296,7 @@
         <w:spacing w:before="60" w:after="120" w:line="276" w:lineRule="auto"/>
       </w:pPr>
       <w:r>
-        <w:t xml:space="preserve">The straight-line version lets each additional </w:t>
-      </w:r>
-      <w:commentRangeStart w:id="5"/>
-      <w:r>
-        <w:t xml:space="preserve">NHL-equivalent </w:t>
-      </w:r>
-      <w:commentRangeEnd w:id="5"/>
-      <w:r>
-        <w:rPr>
-          <w:rStyle w:val="CommentReference"/>
-          <w:sz w:val="21"/>
-          <w:szCs w:val="21"/>
-        </w:rPr>
-        <w:commentReference w:id="5"/>
-      </w:r>
-      <w:r>
-        <w:t xml:space="preserve">point add the same dollars. The curved version adds the square of the production level, so each point adds more the higher a prospect already scores. I chose the curved version because most of a pick's surplus comes from the few players who become stars. The star probability makes value rise faster than in proportion across draft slots, but it is fixed by the slot and does not move with a prospect's scoring. Within a slot, a straight line raises the highest scorers, who are the prospects most likely to become stars, by the same amount per point as each other prospect; </w:t>
-      </w:r>
-      <w:commentRangeStart w:id="6"/>
-      <w:r>
-        <w:t xml:space="preserve">the curve </w:t>
-      </w:r>
-      <w:commentRangeEnd w:id="6"/>
-      <w:r>
-        <w:rPr>
-          <w:rStyle w:val="CommentReference"/>
-          <w:sz w:val="21"/>
-          <w:szCs w:val="21"/>
-        </w:rPr>
-        <w:commentReference w:id="6"/>
-      </w:r>
-      <w:r>
-        <w:t>lets their value rise faster.</w:t>
+        <w:t>With linear production, each additional NHLe point adds the same dollars. Adding the production squared term lets each point add more the higher a prospect already scores. I added it because most of a pick's surplus comes from the few players who become stars. The star probability makes value rise faster than in proportion across draft positions, but it is fixed by draft position and does not move with a prospect's scoring. Within a draft position, linear production raises the highest scorers, who are the prospects most likely to become stars, by the same amount per point as each other prospect; the squared term lets their value rise faster.</w:t>
       </w:r>
     </w:p>
     <w:p>
@@ -6316,7 +5304,11 @@
         <w:spacing w:before="60" w:after="120" w:line="276" w:lineRule="auto"/>
       </w:pPr>
       <w:r>
-        <w:t>The curve has the lower held-out error in each season (Table 4) and improves on the slot alone by 2.14%, against 0.57% for the straight line. Compared directly with the straight line, the curve is better with one-sided p = 0.042 with the slot in each season, and p = 0.024 in the adopted model with age (Table 5). The squared term is significant in each season from D+1 to D+4 of the adopted model (p &lt; 0.001, Table 9). Most of the uncertainty comes from one draft. Elite Prospects scoring and the NHLe factors begin in 2006-07, so a 2007 draftee's D+1 production rests on at most one season, against two or three for later drafts. Without the 2007 draft, the curve beats the straight line with p &lt; 0.001.</w:t>
+        <w:t xml:space="preserve">Linear and squared production has the lower held-out error in each season (Table 4) and improves on draft position alone by 2.14%, against 0.57% for linear production. Compared directly with linear production, adding the squared term is better with one-sided p = 0.042 with draft position in each season, and p = 0.024 in the adopted model with age (Table 5). The production squared term is significant in each season from D+1 to D+4 of </w:t>
+      </w:r>
+      <w:r>
+        <w:lastRenderedPageBreak/>
+        <w:t>the adopted model (p &lt; 0.001, Table 9). Most of the uncertainty comes from the 2007 draft. Elite Prospects scoring and the NHLe factors begin in 2006-07, so a 2007 draftee's D+1 production rests on his draft season alone, against up to three seasons for later drafts. Without the 2007 draft, linear and squared production beats linear production with p &lt; 0.001.</w:t>
       </w:r>
     </w:p>
     <w:p>
@@ -6622,7 +5614,7 @@
                 <w:sz w:val="17"/>
                 <w:szCs w:val="17"/>
               </w:rPr>
-              <w:t>vs slot alone (p)</w:t>
+              <w:t>vs draft position alone (p)</w:t>
             </w:r>
           </w:p>
         </w:tc>
@@ -6721,7 +5713,7 @@
                 <w:sz w:val="17"/>
                 <w:szCs w:val="17"/>
               </w:rPr>
-              <w:t>Straight line</w:t>
+              <w:t>Linear production</w:t>
             </w:r>
           </w:p>
         </w:tc>
@@ -7024,7 +6016,7 @@
                 <w:sz w:val="17"/>
                 <w:szCs w:val="17"/>
               </w:rPr>
-              <w:t>Curved (adopted)</w:t>
+              <w:t>Linear and squared production (adopted)</w:t>
             </w:r>
           </w:p>
         </w:tc>
@@ -7275,7 +6267,7 @@
                 <w:sz w:val="17"/>
                 <w:szCs w:val="17"/>
               </w:rPr>
-              <w:t>vs straight 0.024</w:t>
+              <w:t>vs linear 0.024</w:t>
             </w:r>
           </w:p>
         </w:tc>
@@ -7565,7 +6557,7 @@
                 <w:sz w:val="17"/>
                 <w:szCs w:val="17"/>
               </w:rPr>
-              <w:t>vs curved 0.645</w:t>
+              <w:t>vs linear and squared 0.645</w:t>
             </w:r>
           </w:p>
         </w:tc>
@@ -7610,7 +6602,7 @@
           <w:sz w:val="18"/>
           <w:szCs w:val="18"/>
         </w:rPr>
-        <w:t>Each form keeps the adopted structure: the slot in D+1 to D+3, production discounted by age in D+1 to D+4 (Section 3), and the no-record indicator. Held-out error and one-sided p as in Table 4; head to head, p is the share of redraws in which the named form is not lower than the other. The last column is the total for the 197 traded drafted prospects, goaltenders on the slot alone.</w:t>
+        <w:t>Each form keeps the adopted structure: draft position in D+1 to D+3, production discounted by age in D+1 to D+4 (Section 3), and the no-record indicator. Held-out error and one-sided p as in Table 4; head to head, p is the share of redraws in which the named form is not lower than the other. The last column is the total for the 197 traded drafted prospects, goaltenders on draft position alone.</w:t>
       </w:r>
     </w:p>
     <w:p>
@@ -7618,39 +6610,7 @@
         <w:spacing w:before="60" w:after="120" w:line="276" w:lineRule="auto"/>
       </w:pPr>
       <w:r>
-        <w:t xml:space="preserve">Production squared alone, </w:t>
-      </w:r>
-      <w:commentRangeStart w:id="7"/>
-      <w:r>
-        <w:t>without the straight production term, predicts about as well as the full curve (2.1819 against 2.1803; the curve is better with p = 0.355</w:t>
-      </w:r>
-      <w:commentRangeEnd w:id="7"/>
-      <w:r>
-        <w:rPr>
-          <w:rStyle w:val="CommentReference"/>
-          <w:sz w:val="21"/>
-          <w:szCs w:val="21"/>
-        </w:rPr>
-        <w:commentReference w:id="7"/>
-      </w:r>
-      <w:r>
-        <w:t xml:space="preserve">). It was not adopted for two reasons. Without its own production term, </w:t>
-      </w:r>
-      <w:commentRangeStart w:id="8"/>
-      <w:r>
-        <w:t>the model's value of scoring depends on where age is centred: a joint test that the production term is zero in each season gives p = 0.063 with age measured from 18, and p = 0.003 with age measured from 18.5</w:t>
-      </w:r>
-      <w:commentRangeEnd w:id="8"/>
-      <w:r>
-        <w:rPr>
-          <w:rStyle w:val="CommentReference"/>
-          <w:sz w:val="21"/>
-          <w:szCs w:val="21"/>
-        </w:rPr>
-        <w:commentReference w:id="8"/>
-      </w:r>
-      <w:r>
-        <w:t>. The full curve gives the same values whatever the centre. It would also raise the 197 traded prospects' value from $70.39 million to $82.11 million without predicting better.</w:t>
+        <w:t>Production squared alone, without the linear production term, predicts about as well as the regression with both the linear and the squared production terms (held-out error 2.1819 against 2.1803; the regression with both terms is better with one-sided p = 0.355, which is not a reliable difference). It was not adopted because it would raise the 197 traded prospects' value from $70.39 million to $82.11 million without predicting better.</w:t>
       </w:r>
     </w:p>
     <w:p>
@@ -7665,7 +6625,6 @@
           <w:sz w:val="20"/>
           <w:szCs w:val="20"/>
         </w:rPr>
-        <w:lastRenderedPageBreak/>
         <w:t>Figure 4. A #20 pick in D+2: value against production, before age</w:t>
       </w:r>
     </w:p>
@@ -7679,7 +6638,7 @@
           <w:noProof/>
         </w:rPr>
         <w:drawing>
-          <wp:inline distT="0" distB="0" distL="0" distR="0" wp14:anchorId="727A553C" wp14:editId="5A24C260">
+          <wp:inline distT="0" distB="0" distL="0" distR="0" wp14:anchorId="32006AA0" wp14:editId="550739B7">
             <wp:extent cx="5143500" cy="2733675"/>
             <wp:effectExtent l="0" t="0" r="0" b="0"/>
             <wp:docPr id="4" name="Picture 4"/>
@@ -7696,7 +6655,7 @@
                     </pic:cNvPicPr>
                   </pic:nvPicPr>
                   <pic:blipFill>
-                    <a:blip r:embed="rId15"/>
+                    <a:blip r:embed="rId10"/>
                     <a:srcRect/>
                     <a:stretch>
                       <a:fillRect/>
@@ -7728,7 +6687,7 @@
           <w:sz w:val="18"/>
           <w:szCs w:val="18"/>
         </w:rPr>
-        <w:t>Value in millions of dollars at the 2025-26 cap for a #20 pick (star probability 11.6%) in D+2, from each candidate's fit on all drafts, without the age term of Section 3. Production is NHL-equivalent points per 82 games, weighted 50/30/20 over the three seasons before the valuation season. Vertical lines mark the 25th, 50th, 75th and 90th percentiles of production among prospects in D+2 (4.6, 7.2, 10.4 and 13.9 points).</w:t>
+        <w:t>Value in millions of dollars at the 2025-26 cap for a #20 pick (star probability 11.6%) in D+2, from each candidate's fit on all drafts, without the age term of Section 3. Production is NHLe points per 82 games, weighted 50/30/20 over the three seasons before the valuation season. Vertical lines mark the 25th, 50th, 75th and 90th percentiles of production among prospects in D+2 (4.6, 7.2, 10.4 and 13.9 points).</w:t>
       </w:r>
     </w:p>
     <w:p>
@@ -7736,7 +6695,11 @@
         <w:spacing w:before="60" w:after="120" w:line="276" w:lineRule="auto"/>
       </w:pPr>
       <w:r>
-        <w:t>Below 12.6 points, which is above the 75th percentile, the curved line sits under the straight one; the largest gap is $0.56 million, at 6.1 points. The curved line also dips slightly before it rises, because the production coefficient is negative. With the squared term in the model, that coefficient alone is not the value of an extra point. In the D+2 regression of Figure 4, an extra point adds -0.112 + 2 × 0.0133 × production million dollars, which is positive above 4.2 points; the 25th percentile of production in D+2 is 4.6 points. The negative coefficient therefore sets where the curve bottoms out, near the bottom of the production range, and is not evidence that a little scoring lowers a prospect's value. The gap between the two versions there is small next to the held-out error of about $3 million in D+1 and D+2.</w:t>
+        <w:t xml:space="preserve">Below 12.6 points, which is above the 75th percentile, the line with the squared term sits under the linear one; the largest gap is $0.56 million, at 6.1 points. The line with the squared term also dips slightly before it rises, because the linear production coefficient is negative. With the squared term in the model, that coefficient alone is not the value of an extra point. In the D+2 regression of Figure 4, an extra point adds -0.112 + 2 × 0.0133 × </w:t>
+      </w:r>
+      <w:r>
+        <w:lastRenderedPageBreak/>
+        <w:t>production million dollars, which is positive above 4.2 points; the 25th percentile of production in D+2 is 4.6 points. The negative coefficient therefore sets where the value bottoms out, near the bottom of the production range, and is not evidence that a little scoring lowers a prospect's value. The gap between the two lines there is small next to the held-out error of about $3 million in D+1 and D+2.</w:t>
       </w:r>
     </w:p>
     <w:p>
@@ -7745,7 +6708,7 @@
         <w:keepNext/>
       </w:pPr>
       <w:r>
-        <w:t>Decision: from D+4, production replaces the slot</w:t>
+        <w:t>Decision: from D+4, production replaces draft position</w:t>
       </w:r>
     </w:p>
     <w:p>
@@ -7753,29 +6716,7 @@
         <w:spacing w:before="60" w:after="120" w:line="276" w:lineRule="auto"/>
       </w:pPr>
       <w:r>
-        <w:t xml:space="preserve">Once production is in the model, the </w:t>
-      </w:r>
-      <w:commentRangeStart w:id="9"/>
-      <w:r>
-        <w:t xml:space="preserve">slot </w:t>
-      </w:r>
-      <w:commentRangeEnd w:id="9"/>
-      <w:r>
-        <w:rPr>
-          <w:rStyle w:val="CommentReference"/>
-          <w:sz w:val="21"/>
-          <w:szCs w:val="21"/>
-        </w:rPr>
-        <w:commentReference w:id="9"/>
-      </w:r>
-      <w:r>
-        <w:t xml:space="preserve">stops carrying information in D+4 (Table 6). Its coefficient is $0.94 million (standard error 1.86, p = 0.613) in D+4 and -$0.76 million (standard error 0.35, p = 0.028) from D+5 on. A negative weight on the slot would value a top pick below a later pick with the same production, </w:t>
-      </w:r>
-      <w:r>
-        <w:t>which makes no logical sense</w:t>
-      </w:r>
-      <w:r>
-        <w:t>. The adopted model keeps the slot from D+1 to D+3 and uses production alone from D+4. This drops one parameter in each later season at no cost: the held-out error is 2.1966 against 2.1970 with the slot kept throughout.</w:t>
+        <w:t>Once production is in the model, draft position stops carrying information in D+4 (Table 6). Its coefficient is $0.94 million (standard error 1.86, p = 0.613) in D+4 and -$0.76 million (standard error 0.35, p = 0.028) from D+5 on. A negative weight on draft position would value a top pick below a later pick with the same production, for which there is no hockey reason. The adopted model keeps draft position from D+1 to D+3 and uses production alone from D+4. This drops one parameter in each later season at no cost: the held-out error is 2.1966 against 2.1970 with draft position kept throughout.</w:t>
       </w:r>
     </w:p>
     <w:p>
@@ -7790,8 +6731,7 @@
           <w:sz w:val="20"/>
           <w:szCs w:val="20"/>
         </w:rPr>
-        <w:lastRenderedPageBreak/>
-        <w:t>Table 6. Slot and curved production in each season, before age</w:t>
+        <w:t>Table 6. Draft position and linear and squared production in each season, before age</w:t>
       </w:r>
     </w:p>
     <w:tbl>
@@ -8046,7 +6986,7 @@
                 <w:sz w:val="17"/>
                 <w:szCs w:val="17"/>
               </w:rPr>
-              <w:t>Star probability for his slot</w:t>
+              <w:t>Star probability for his draft position</w:t>
             </w:r>
           </w:p>
         </w:tc>
@@ -8230,7 +7170,7 @@
                 <w:sz w:val="17"/>
                 <w:szCs w:val="17"/>
               </w:rPr>
-              <w:t>Production (NHL-equivalent points per 82)</w:t>
+              <w:t>Production (NHLe points per 82)</w:t>
             </w:r>
           </w:p>
         </w:tc>
@@ -8756,7 +7696,7 @@
           <w:sz w:val="18"/>
           <w:szCs w:val="18"/>
         </w:rPr>
-        <w:t>Dependent variable: remaining surplus in millions of dollars at the 2025-26 cap. Each cell gives the coefficient, its robust standard error in parentheses (clustered by player for D+5 and later) and its two-sided p-value in brackets. Each regression runs through zero with draft-year indicators that sum to zero (not shown), so the coefficients describe an average draft. The slot's coefficient is significant from D+1 to D+3 and not in D+4.</w:t>
+        <w:t>Dependent variable: remaining surplus in millions of dollars at the 2025-26 cap. Each cell gives the coefficient, its robust standard error in parentheses (clustered by player for D+5 and later) and its two-sided p-value in brackets. Each regression runs through zero with draft-year indicators that sum to zero (not shown), so the coefficients describe an average draft. Draft position's coefficient is significant from D+1 to D+3 and not in D+4.</w:t>
       </w:r>
     </w:p>
     <w:p>
@@ -8773,7 +7713,7 @@
         <w:spacing w:before="60" w:after="120" w:line="276" w:lineRule="auto"/>
       </w:pPr>
       <w:r>
-        <w:t>A separate production rate for defencemen was tested. It changes the held-out error by -0.03% against the straight line with one rate, and its improvement over the slot alone is less consistent across drafts (one-sided p = 0.045 against 0.028). One rate is kept.</w:t>
+        <w:t>A separate production rate for defencemen was tested. It changes the held-out error by -0.03% against linear production with one rate, and its improvement over draft position alone is less consistent across drafts (one-sided p = 0.045 against 0.028). One rate is kept.</w:t>
       </w:r>
     </w:p>
     <w:p>
@@ -8781,7 +7721,7 @@
         <w:spacing w:before="60" w:after="120" w:line="276" w:lineRule="auto"/>
       </w:pPr>
       <w:r>
-        <w:t>With production, the model values a prospect in season D+n as follows, where S is his slot's star probability, P is his production level in NHL-equivalent points per 82 games, and N is 1 when he has no production record and 0 otherwise. The coefficients a, b, c and d are fitted separately for each season: a is the value of the star probability, b and c together give the value of production, and d is the value of having no record.</w:t>
+        <w:t>With production, the model values a prospect in season D+n as follows, where S is the star probability for his draft position, P is his production level in NHLe points per 82 games, and N is 1 when he has no production record and 0 otherwise. As in Section 1, each term is multiplied by an indicator for each season (a full set of interaction terms), so the coefficients a, b, c and d take a separate value in each season: a is the value of the star probability, b and c together give the value of production, and d is the value of having no record.</w:t>
       </w:r>
     </w:p>
     <w:p>
@@ -8900,6 +7840,7 @@
           <w:sz w:val="20"/>
           <w:szCs w:val="20"/>
         </w:rPr>
+        <w:lastRenderedPageBreak/>
         <w:t>Table 7. The production measure's settings</w:t>
       </w:r>
     </w:p>
@@ -9476,7 +8417,7 @@
                 <w:sz w:val="17"/>
                 <w:szCs w:val="17"/>
               </w:rPr>
-              <w:t>The slot alone</w:t>
+              <w:t>Draft position alone</w:t>
             </w:r>
           </w:p>
         </w:tc>
@@ -9663,7 +8604,6 @@
         <w:keepNext/>
       </w:pPr>
       <w:r>
-        <w:lastRenderedPageBreak/>
         <w:t>3. Age</w:t>
       </w:r>
     </w:p>
@@ -9671,9 +8611,8 @@
       <w:pPr>
         <w:spacing w:before="60" w:after="120" w:line="276" w:lineRule="auto"/>
       </w:pPr>
-      <w:commentRangeStart w:id="10"/>
       <w:r>
-        <w:t>A player who scores at a given rate at 18 is commonly rated a better prospect than one who scores at the same rate at 20. This section tests whether the data agree. Age enters as years past first eligibility, which is the player's age on September 15 of the autumn after his draft, less 18. A player is first eligible for the draft in the year he is 18 by September 15, so on that date after his first draft he is between 18.0 and 19.0: the measure runs from 0 to 1 for a player drafted at his first opportunity, from 1 to 2 for one drafted a year later, and so on (from 0.00 to 3.67 in the data). It is how old the player was when he was drafted.</w:t>
+        <w:t>A player who scores at a given rate at 18 is commonly rated a better prospect than one who scores at the same rate at 20. This section tests whether the data agree. Age is the player's age on September 15 of the valuation season, the date the collective agreement uses. A player is first eligible for the draft in the year he is 18 by September 15, so in D+1 a player drafted at his first opportunity is 18 to 19, and one drafted a year later is 19 to 20 (from 18.0 to 21.7 in the data).</w:t>
       </w:r>
     </w:p>
     <w:p>
@@ -9681,16 +8620,7 @@
         <w:spacing w:before="60" w:after="120" w:line="276" w:lineRule="auto"/>
       </w:pPr>
       <w:r>
-        <w:t>Each season's regression compares prospects who are the same number of seasons past their draft. Within one season, a prospect's current age is his age at the draft plus that number of seasons, so a prospect who is a year older now was also drafted a year older, and one measure covers both. Time since the draft never enters a regression as a variable: it is the same for each prospect in a season's fit. Across all seasons, a prospect's current age and his seasons since the draft move together almost one for one (correlation 0.960), which is why current age is not used. Years past first eligibility is nearly unrelated to seasons since the draft (correlation 0.024), and the age term overlaps little with the other terms in each season's regression: its variance inflation factor is at most 1.9, where 1 means no overlap. The largest overlap in the model is between production and its square (variance inflation factor 9.2 to 10.3), which is usual for a squared term; it widens both terms' standard errors, and both remain significant from D+1 to D+4.</w:t>
-      </w:r>
-      <w:commentRangeEnd w:id="10"/>
-      <w:r>
-        <w:rPr>
-          <w:rStyle w:val="CommentReference"/>
-          <w:sz w:val="21"/>
-          <w:szCs w:val="21"/>
-        </w:rPr>
-        <w:commentReference w:id="10"/>
+        <w:t>Each season's regression compares prospects the same number of seasons from their draft, so a prospect who is a year older now also scored his points a year older, and was drafted a year older. Time since the draft is the same for every prospect in a season's regression, so it cannot be confused with age there. Across all seasons, age and seasons since the draft move together almost one for one (correlation 0.960). That is why age is compared only within a season, through the season interaction terms of Section 1, and never across seasons.</w:t>
       </w:r>
     </w:p>
     <w:p>
@@ -9859,7 +8789,7 @@
                 <w:sz w:val="17"/>
                 <w:szCs w:val="17"/>
               </w:rPr>
-              <w:t>vs slot alone</w:t>
+              <w:t>vs draft position alone</w:t>
             </w:r>
           </w:p>
         </w:tc>
@@ -10694,23 +9624,11 @@
         <w:spacing w:before="60" w:after="120" w:line="276" w:lineRule="auto"/>
       </w:pPr>
       <w:r>
-        <w:t xml:space="preserve">Two forms were tested. Age as a flat amount subtracts the same dollars for each year past first eligibility, whatever the player scores. </w:t>
-      </w:r>
-      <w:commentRangeStart w:id="11"/>
-      <w:r>
-        <w:t>Age discounting production makes each point of production worth less the older the player was when drafted</w:t>
-      </w:r>
-      <w:commentRangeEnd w:id="11"/>
-      <w:r>
-        <w:rPr>
-          <w:rStyle w:val="CommentReference"/>
-          <w:sz w:val="21"/>
-          <w:szCs w:val="21"/>
-        </w:rPr>
-        <w:commentReference w:id="11"/>
+        <w:t xml:space="preserve">Two forms were tested. Age as a flat amount subtracts the same dollars for each year of age, whatever the player scores. Age discounting production makes each point of production worth less the older the player was </w:t>
       </w:r>
       <w:r>
-        <w:t>: each year past first eligibility lowers the value of each point by a fixed amount. In D+2 that amount is $0.064 million (Table 9), so of two prospects with 10 points, the one drafted a year older is worth $0.64 million less. Both forms are reliable improvements (one-sided p = 0.006 and 0.0015), and the discount improves held-out error more (-0.74% against -0.29%). I chose the discount because it is the larger gain and it measures what age was included for, which is how much a player's scoring says about him given his age. Using both terms is worse than the discount alone (-0.69% against -0.74%; p = 0.608 that it is better). The flat term also changes sign once the discount is in (Table B5), which shows the two terms measure the same thing.</w:t>
+        <w:lastRenderedPageBreak/>
+        <w:t>when he scored it: each year of age lowers the value of each point by a fixed amount. In D+2 that amount is $0.064 million (Table 9), so of two prospects with 10 points, the one who is a year older, and so scored them a year older, is worth $0.64 million less. Both forms are reliable improvements (one-sided p = 0.006 and 0.0015), and the discount improves held-out error more (-0.74% against -0.29%). I chose the discount because it is the larger gain and it measures what age was included for, which is how much a player's scoring says about him given his age. Using both terms is worse than the discount alone (-0.69% against -0.74%; p = 0.608 that it is better). The flat term also changes sign once the discount is in (Table B5), which shows the two terms measure the same thing.</w:t>
       </w:r>
     </w:p>
     <w:p>
@@ -10733,7 +9651,6 @@
           <w:sz w:val="20"/>
           <w:szCs w:val="20"/>
         </w:rPr>
-        <w:lastRenderedPageBreak/>
         <w:t>Figure 5. A #20 pick in D+2: the age discount</w:t>
       </w:r>
     </w:p>
@@ -10747,7 +9664,7 @@
           <w:noProof/>
         </w:rPr>
         <w:drawing>
-          <wp:inline distT="0" distB="0" distL="0" distR="0" wp14:anchorId="4F41C626" wp14:editId="295B8183">
+          <wp:inline distT="0" distB="0" distL="0" distR="0" wp14:anchorId="113E0729" wp14:editId="13A57608">
             <wp:extent cx="5143500" cy="2733675"/>
             <wp:effectExtent l="0" t="0" r="0" b="0"/>
             <wp:docPr id="5" name="Picture 5"/>
@@ -10764,7 +9681,7 @@
                     </pic:cNvPicPr>
                   </pic:nvPicPr>
                   <pic:blipFill>
-                    <a:blip r:embed="rId16"/>
+                    <a:blip r:embed="rId11"/>
                     <a:srcRect/>
                     <a:stretch>
                       <a:fillRect/>
@@ -10796,7 +9713,7 @@
           <w:sz w:val="18"/>
           <w:szCs w:val="18"/>
         </w:rPr>
-        <w:t>Value in millions of dollars at the 2025-26 cap under the adopted model for a #20 pick in D+2 with a production record, for three ages in the autumn after his draft. Percentile lines as in Figure 4.</w:t>
+        <w:t>Value in millions of dollars at the 2025-26 cap under the adopted model for a #20 pick in D+2 with a production record, at three ages on September 15 of his D+2 season. A player drafted at his first opportunity is 19 to 20 then. Percentile lines as in Figure 4.</w:t>
       </w:r>
     </w:p>
     <w:p>
@@ -10804,7 +9721,7 @@
         <w:spacing w:before="60" w:after="120" w:line="276" w:lineRule="auto"/>
       </w:pPr>
       <w:r>
-        <w:t>The adopted model values a prospect in season D+n as follows, where Y is his years past first eligibility and the other symbols are as in Section 2. The coefficient e is the age discount: the change in the value of each point of production for each year past first eligibility.</w:t>
+        <w:t>The adopted model values a prospect in season D+n as follows, where A is his age on September 15 of that season and the other symbols are as in Section 2. The coefficient e is the age discount: the change in the value of each point of production for each year of age. Age enters less 18, so the age term is zero for an 18-year-old.</w:t>
       </w:r>
     </w:p>
     <w:p>
@@ -10855,7 +9772,7 @@
           <w:rPr>
             <w:rFonts w:ascii="Cambria Math" w:hAnsi="Cambria Math"/>
           </w:rPr>
-          <m:t xml:space="preserve"> + d × N + e × P × Y</m:t>
+          <m:t xml:space="preserve"> + d × N + e × P × (A - 18)</m:t>
         </m:r>
       </m:oMath>
     </w:p>
@@ -10907,7 +9824,7 @@
           <w:rPr>
             <w:rFonts w:ascii="Cambria Math" w:hAnsi="Cambria Math"/>
           </w:rPr>
-          <m:t xml:space="preserve"> + d × N + e × P × Y</m:t>
+          <m:t xml:space="preserve"> + d × N + e × P × (A - 18)</m:t>
         </m:r>
       </m:oMath>
     </w:p>
@@ -10975,6 +9892,7 @@
           <w:sz w:val="20"/>
           <w:szCs w:val="20"/>
         </w:rPr>
+        <w:lastRenderedPageBreak/>
         <w:t>Table 9. The adopted model: regression by season</w:t>
       </w:r>
     </w:p>
@@ -11230,7 +10148,7 @@
                 <w:sz w:val="17"/>
                 <w:szCs w:val="17"/>
               </w:rPr>
-              <w:t>Star probability for his slot (a)</w:t>
+              <w:t>Star probability for his draft position (a)</w:t>
             </w:r>
           </w:p>
         </w:tc>
@@ -11474,7 +10392,7 @@
                 <w:sz w:val="17"/>
                 <w:szCs w:val="17"/>
               </w:rPr>
-              <w:t>-0.066 (0.034) [0.051]</w:t>
+              <w:t>-0.001 (0.035) [0.972]</w:t>
             </w:r>
           </w:p>
         </w:tc>
@@ -11504,7 +10422,7 @@
                 <w:sz w:val="17"/>
                 <w:szCs w:val="17"/>
               </w:rPr>
-              <w:t>-0.058 (0.027) [0.028]</w:t>
+              <w:t>0.043 (0.039) [0.265]</w:t>
             </w:r>
           </w:p>
         </w:tc>
@@ -11534,7 +10452,7 @@
                 <w:sz w:val="17"/>
                 <w:szCs w:val="17"/>
               </w:rPr>
-              <w:t>-0.034 (0.018) [0.064]</w:t>
+              <w:t>0.044 (0.029) [0.134]</w:t>
             </w:r>
           </w:p>
         </w:tc>
@@ -11966,7 +10884,7 @@
                 <w:sz w:val="17"/>
                 <w:szCs w:val="17"/>
               </w:rPr>
-              <w:t>Production × years past first eligibility (e)</w:t>
+              <w:t>Production × (age − 18) (e)</w:t>
             </w:r>
           </w:p>
         </w:tc>
@@ -12860,7 +11778,7 @@
           <w:sz w:val="18"/>
           <w:szCs w:val="18"/>
         </w:rPr>
-        <w:t>Dependent variable: remaining surplus in millions of dollars at the 2025-26 cap. Each cell gives the coefficient, its robust standard error in parentheses (clustered by player for D+5 and later) and its two-sided p-value in brackets. Each regression runs through zero with draft-year indicators that sum to zero (not shown), so the coefficients describe an average draft. Production squared is in squared points (15 points enter as 225). Because production enters with its square, the production coefficient alone is not the value of an extra point (Section 2). The low R-squared reflects how uneven outcomes are: most prospects deliver no NHL surplus.</w:t>
+        <w:t>Dependent variable: remaining surplus in millions of dollars at the 2025-26 cap. Each cell gives the coefficient, its robust standard error in parentheses (clustered by player for D+5 and later) and its two-sided p-value in brackets. Each regression runs through zero with draft-year indicators that sum to zero (not shown), so the coefficients describe an average draft. Production squared is in squared points (15 points enter as 225). Age is on September 15 of the valuation season. Because production enters with its square, the production coefficient alone is not the value of an extra point (Section 2). The low R-squared reflects how uneven outcomes are: most prospects deliver no NHL surplus.</w:t>
       </w:r>
     </w:p>
     <w:p>
@@ -12868,8 +11786,7 @@
         <w:spacing w:before="60" w:after="120" w:line="276" w:lineRule="auto"/>
       </w:pPr>
       <w:r>
-        <w:lastRenderedPageBreak/>
-        <w:t>Table 10 shows the D+2 regression built up one term at a time, in the order of this document: the slot alone, then production, then its square, then age. Each column adds one term to the column before it, on the same prospect-seasons; Appendix B gives the same table for each other season.</w:t>
+        <w:t>Table 10 shows the D+2 regression built up one term at a time, in the order of this document: draft position alone, then production, then its square, then age. Each column adds one term to the column before it, on the same prospect-seasons; Appendix B gives the same table for each other season.</w:t>
       </w:r>
     </w:p>
     <w:p>
@@ -12972,7 +11889,7 @@
                 <w:sz w:val="17"/>
                 <w:szCs w:val="17"/>
               </w:rPr>
-              <w:t>(1) Slot alone</w:t>
+              <w:t>(1) Draft position alone</w:t>
             </w:r>
           </w:p>
         </w:tc>
@@ -13105,7 +12022,7 @@
                 <w:sz w:val="17"/>
                 <w:szCs w:val="17"/>
               </w:rPr>
-              <w:t>Star probability for his slot (a)</w:t>
+              <w:t>Star probability for his draft position (a)</w:t>
             </w:r>
           </w:p>
         </w:tc>
@@ -13379,7 +12296,7 @@
                 <w:sz w:val="17"/>
                 <w:szCs w:val="17"/>
               </w:rPr>
-              <w:t>-0.066 (0.034) [0.051]</w:t>
+              <w:t>-0.001 (0.035) [0.972]</w:t>
             </w:r>
           </w:p>
         </w:tc>
@@ -13721,7 +12638,7 @@
                 <w:sz w:val="17"/>
                 <w:szCs w:val="17"/>
               </w:rPr>
-              <w:t>Production × years past first eligibility (e)</w:t>
+              <w:t>Production × (age − 18) (e)</w:t>
             </w:r>
           </w:p>
         </w:tc>
@@ -14175,7 +13092,7 @@
         <w:spacing w:before="60" w:after="120" w:line="276" w:lineRule="auto"/>
       </w:pPr>
       <w:r>
-        <w:t>Nick Suzuki was traded to the Montreal Canadiens on September 10th, 2018, at the start of his D+2 season, a year after he was drafted 13th overall in 2017 by the Vegas Golden Knights. His slot's star probability is 17.0%, his production level is 15.4 NHL-equivalent points per 82 games (above the 90th percentile in D+2, 13.9), and he was 0.10 years past first eligibility (18.1 in the autumn after his draft). Table 11 builds his value from the D+2 regression.</w:t>
+        <w:t>Nick Suzuki was traded to the Montreal Canadiens on September 10th, 2018, at the start of his D+2 season, a year after he was drafted 13th overall in 2017 by the Vegas Golden Knights. The star probability for his draft position is 17.0%, his production level is 15.4 NHLe points per 82 games (above the 90th percentile in D+2, 13.9), and he was 19.1 on September 15, 2018, a player drafted at his first opportunity. Table 11 builds his value from the D+2 regression.</w:t>
       </w:r>
     </w:p>
     <w:p>
@@ -14190,6 +13107,7 @@
           <w:sz w:val="20"/>
           <w:szCs w:val="20"/>
         </w:rPr>
+        <w:lastRenderedPageBreak/>
         <w:t>Table 11. Nick Suzuki's value, term by term</w:t>
       </w:r>
     </w:p>
@@ -14377,7 +13295,7 @@
                 <w:sz w:val="17"/>
                 <w:szCs w:val="17"/>
               </w:rPr>
-              <w:t>Star probability for his slot</w:t>
+              <w:t>Star probability for his draft position</w:t>
             </w:r>
           </w:p>
         </w:tc>
@@ -14561,7 +13479,7 @@
                 <w:sz w:val="17"/>
                 <w:szCs w:val="17"/>
               </w:rPr>
-              <w:t>-0.066</w:t>
+              <w:t>-0.001</w:t>
             </w:r>
           </w:p>
         </w:tc>
@@ -14591,7 +13509,7 @@
                 <w:sz w:val="17"/>
                 <w:szCs w:val="17"/>
               </w:rPr>
-              <w:t>-$1.01M</w:t>
+              <w:t>-$0.02M</w:t>
             </w:r>
           </w:p>
         </w:tc>
@@ -14873,7 +13791,7 @@
                 <w:sz w:val="17"/>
                 <w:szCs w:val="17"/>
               </w:rPr>
-              <w:t>Production × years past first eligibility</w:t>
+              <w:t>Production × (age − 18)</w:t>
             </w:r>
           </w:p>
         </w:tc>
@@ -14903,7 +13821,7 @@
                 <w:sz w:val="17"/>
                 <w:szCs w:val="17"/>
               </w:rPr>
-              <w:t>1.53</w:t>
+              <w:t>16.89</w:t>
             </w:r>
           </w:p>
         </w:tc>
@@ -14963,7 +13881,7 @@
                 <w:sz w:val="17"/>
                 <w:szCs w:val="17"/>
               </w:rPr>
-              <w:t>-$0.10M</w:t>
+              <w:t>-$1.09M</w:t>
             </w:r>
           </w:p>
         </w:tc>
@@ -15221,7 +14139,7 @@
                 <w:sz w:val="17"/>
                 <w:szCs w:val="17"/>
               </w:rPr>
-              <w:t>Value on the slot alone (Section 1)</w:t>
+              <w:t>Value on draft position alone (Section 1)</w:t>
             </w:r>
           </w:p>
         </w:tc>
@@ -15417,7 +14335,7 @@
           <w:sz w:val="18"/>
           <w:szCs w:val="18"/>
         </w:rPr>
-        <w:t>Millions of dollars at the 2025-26 cap. Contributions are input times coefficient and sum to the adopted value. His production of 15.37 enters squared as 15.37² = 236.11; years past first eligibility are 0.10. The production and squared terms are read together: his 15.37 points add -$1.01M + $3.67M = $2.67M.</w:t>
+        <w:t>Millions of dollars at the 2025-26 cap. Contributions are input times coefficient and sum to the adopted value. His production of 15.37 enters squared as 15.37² = 236.11; his age less 18 is 1.10. The production and squared terms are read together: his 15.37 points add -$0.02M + $3.67M = $3.66M.</w:t>
       </w:r>
     </w:p>
     <w:p>
@@ -15425,23 +14343,7 @@
         <w:spacing w:before="60" w:after="120" w:line="276" w:lineRule="auto"/>
       </w:pPr>
       <w:r>
-        <w:t xml:space="preserve">His scoring raises his value from $2.99 million on his slot to $4.23 million. The production model without age values him at $3.53 million. His own age term is small (-$0.10M), but adding age changes the other coefficients: once older prospects' scoring is discounted, </w:t>
-      </w:r>
-      <w:commentRangeStart w:id="12"/>
-      <w:r>
-        <w:t xml:space="preserve">the production terms describe the scoring of a player drafted at 18, which is worth more. </w:t>
-      </w:r>
-      <w:commentRangeEnd w:id="12"/>
-      <w:r>
-        <w:rPr>
-          <w:rStyle w:val="CommentReference"/>
-          <w:sz w:val="21"/>
-          <w:szCs w:val="21"/>
-        </w:rPr>
-        <w:commentReference w:id="12"/>
-      </w:r>
-      <w:r>
-        <w:t>For Suzuki, drafted at 18.1, that adds $0.70 million.</w:t>
+        <w:t>His scoring raises his value from $2.99 million on his draft position to $4.23 million. The production model without age values him at $3.53 million, so age adds $0.70 million. Without age, the model values a point of production the same from every prospect, which averages the points of young and old scorers. With age, each point is worth less the older the prospect who scored it, and Suzuki is among the youngest a D+2 prospect can be. His points are worth more than the average point.</w:t>
       </w:r>
     </w:p>
     <w:p>
@@ -15450,7 +14352,6 @@
         <w:keepNext/>
       </w:pPr>
       <w:r>
-        <w:lastRenderedPageBreak/>
         <w:t>4. The Traded Prospects</w:t>
       </w:r>
     </w:p>
@@ -15627,7 +14528,7 @@
                 <w:sz w:val="17"/>
                 <w:szCs w:val="17"/>
               </w:rPr>
-              <w:t>Slot alone, draft-day value however long ago (no fade)</w:t>
+              <w:t>Draft position alone, draft-day value however long ago (no fade)</w:t>
             </w:r>
           </w:p>
         </w:tc>
@@ -15721,7 +14622,7 @@
                 <w:sz w:val="17"/>
                 <w:szCs w:val="17"/>
               </w:rPr>
-              <w:t>Slot alone, star value by season (Section 1)</w:t>
+              <w:t>Draft position alone, star value by season (Section 1)</w:t>
             </w:r>
           </w:p>
         </w:tc>
@@ -15815,7 +14716,7 @@
                 <w:sz w:val="17"/>
                 <w:szCs w:val="17"/>
               </w:rPr>
-              <w:t>Slot + production, straight line, slot in each season</w:t>
+              <w:t>Draft position + linear production, draft position in each season</w:t>
             </w:r>
           </w:p>
         </w:tc>
@@ -15909,7 +14810,7 @@
                 <w:sz w:val="17"/>
                 <w:szCs w:val="17"/>
               </w:rPr>
-              <w:t>Slot + production, curved, slot in each season</w:t>
+              <w:t>Draft position + linear and squared production, draft position in each season</w:t>
             </w:r>
           </w:p>
         </w:tc>
@@ -16003,7 +14904,7 @@
                 <w:sz w:val="17"/>
                 <w:szCs w:val="17"/>
               </w:rPr>
-              <w:t>Curved, slot in D+1 to D+3 only, before age (Section 2)</w:t>
+              <w:t>Linear and squared production, draft position in D+1 to D+3 only, before age (Section 2)</w:t>
             </w:r>
           </w:p>
         </w:tc>
@@ -16453,7 +15354,7 @@
           <w:sz w:val="18"/>
           <w:szCs w:val="18"/>
         </w:rPr>
-        <w:t>Millions of dollars at the 2025-26 cap; 185 skaters priced under each version and 12 goaltenders on the slot alone in each. Each version applies its fit on all drafts 2007-2017 to each prospect at the season of his trade.</w:t>
+        <w:t>Millions of dollars at the 2025-26 cap; 185 skaters priced under each version and 12 goaltenders on draft position alone in each. Each version applies its fit on all drafts 2007-2017 to each prospect at the season of his trade.</w:t>
       </w:r>
     </w:p>
     <w:p>
@@ -16461,7 +15362,7 @@
         <w:spacing w:before="60" w:after="120" w:line="276" w:lineRule="auto"/>
       </w:pPr>
       <w:r>
-        <w:t>Production and age change many prospects' values. Moving from the slot alone to the adopted model moves 63 of the 197 values by $0.25 million or more and leaves 10 of the 20 most valuable prospects in the top 20 (rank correlation 0.552).</w:t>
+        <w:t>Production and age change many prospects' values. Moving from draft position alone to the adopted model moves 63 of the 197 values by $0.25 million or more and leaves 10 of the 20 most valuable prospects in the top 20 (rank correlation 0.552).</w:t>
       </w:r>
     </w:p>
     <w:p>
@@ -16469,7 +15370,8 @@
         <w:spacing w:before="60" w:after="120" w:line="276" w:lineRule="auto"/>
       </w:pPr>
       <w:r>
-        <w:t>A value can be below zero. Of the 197 drafted prospects, 66 are valued below zero, -$4.08 million in total; of all 250 prospects valued, 82 are, the lowest at -$0.48 million. A value below zero means that prospects with that profile, a low scorer from a late slot, delivered slightly negative surplus on average in the data: when such players reach the NHL, their cost tends to exceed the value of the wins they deliver. Negative careers count, as in the draft pick curve.</w:t>
+        <w:lastRenderedPageBreak/>
+        <w:t>A value can be below zero. Of the 197 drafted prospects, 66 are valued below zero, -$4.08 million in total; of all 250 prospects valued, 82 are, the lowest at -$0.48 million. A value below zero means that prospects with that profile, a low scorer from a late draft position, delivered slightly negative surplus on average in the data: when such players reach the NHL, their cost tends to exceed the value of the wins they deliver. Negative careers count, as in the draft pick curve.</w:t>
       </w:r>
     </w:p>
     <w:p>
@@ -16484,8 +15386,7 @@
           <w:sz w:val="20"/>
           <w:szCs w:val="20"/>
         </w:rPr>
-        <w:lastRenderedPageBreak/>
-        <w:t>Figure 6. Production raises some prospects well above their slot's value and lowers others</w:t>
+        <w:t>Figure 6. Production raises some prospects well above their draft position's value and lowers others</w:t>
       </w:r>
     </w:p>
     <w:p>
@@ -16498,7 +15399,7 @@
           <w:noProof/>
         </w:rPr>
         <w:drawing>
-          <wp:inline distT="0" distB="0" distL="0" distR="0" wp14:anchorId="36845309" wp14:editId="0D724EF3">
+          <wp:inline distT="0" distB="0" distL="0" distR="0" wp14:anchorId="4DADC4FB" wp14:editId="1E6AB43E">
             <wp:extent cx="4191000" cy="3381375"/>
             <wp:effectExtent l="0" t="0" r="0" b="0"/>
             <wp:docPr id="6" name="Picture 6"/>
@@ -16515,7 +15416,7 @@
                     </pic:cNvPicPr>
                   </pic:nvPicPr>
                   <pic:blipFill>
-                    <a:blip r:embed="rId17"/>
+                    <a:blip r:embed="rId12"/>
                     <a:srcRect/>
                     <a:stretch>
                       <a:fillRect/>
@@ -16547,7 +15448,7 @@
           <w:sz w:val="18"/>
           <w:szCs w:val="18"/>
         </w:rPr>
-        <w:t>Each point is one of the 197 traded drafted prospects, valued on the slot alone (horizontal) and on the adopted model (vertical), in millions of dollars at the 2025-26 cap. Points above the dashed line gained value from production and age. Colour shows the prospect's season at the trade.</w:t>
+        <w:t>Each point is one of the 197 traded drafted prospects, valued on draft position alone (horizontal) and on the adopted model (vertical), in millions of dollars at the 2025-26 cap. Points above the dashed line gained value from production and age. Colour shows the prospect's season at the trade.</w:t>
       </w:r>
     </w:p>
     <w:p>
@@ -16782,7 +15683,7 @@
                 <w:sz w:val="17"/>
                 <w:szCs w:val="17"/>
               </w:rPr>
-              <w:t>Years past eligibility</w:t>
+              <w:t>Age</w:t>
             </w:r>
           </w:p>
         </w:tc>
@@ -16815,7 +15716,7 @@
                 <w:sz w:val="17"/>
                 <w:szCs w:val="17"/>
               </w:rPr>
-              <w:t>Slot alone</w:t>
+              <w:t>Draft position alone</w:t>
             </w:r>
           </w:p>
         </w:tc>
@@ -17029,7 +15930,7 @@
                 <w:sz w:val="17"/>
                 <w:szCs w:val="17"/>
               </w:rPr>
-              <w:t>0.10</w:t>
+              <w:t>19.1</w:t>
             </w:r>
           </w:p>
         </w:tc>
@@ -17270,7 +16171,7 @@
                 <w:sz w:val="17"/>
                 <w:szCs w:val="17"/>
               </w:rPr>
-              <w:t>0.31</w:t>
+              <w:t>21.3</w:t>
             </w:r>
           </w:p>
         </w:tc>
@@ -17511,7 +16412,7 @@
                 <w:sz w:val="17"/>
                 <w:szCs w:val="17"/>
               </w:rPr>
-              <w:t>0.64</w:t>
+              <w:t>20.6</w:t>
             </w:r>
           </w:p>
         </w:tc>
@@ -17752,7 +16653,7 @@
                 <w:sz w:val="17"/>
                 <w:szCs w:val="17"/>
               </w:rPr>
-              <w:t>2.19</w:t>
+              <w:t>27.2</w:t>
             </w:r>
           </w:p>
         </w:tc>
@@ -17993,7 +16894,7 @@
                 <w:sz w:val="17"/>
                 <w:szCs w:val="17"/>
               </w:rPr>
-              <w:t>0.74</w:t>
+              <w:t>20.7</w:t>
             </w:r>
           </w:p>
         </w:tc>
@@ -18234,7 +17135,7 @@
                 <w:sz w:val="17"/>
                 <w:szCs w:val="17"/>
               </w:rPr>
-              <w:t>0.09</w:t>
+              <w:t>21.1</w:t>
             </w:r>
           </w:p>
         </w:tc>
@@ -18475,7 +17376,7 @@
                 <w:sz w:val="17"/>
                 <w:szCs w:val="17"/>
               </w:rPr>
-              <w:t>0.79</w:t>
+              <w:t>20.8</w:t>
             </w:r>
           </w:p>
         </w:tc>
@@ -18716,7 +17617,7 @@
                 <w:sz w:val="17"/>
                 <w:szCs w:val="17"/>
               </w:rPr>
-              <w:t>0.04</w:t>
+              <w:t>19.0</w:t>
             </w:r>
           </w:p>
         </w:tc>
@@ -18957,7 +17858,7 @@
                 <w:sz w:val="17"/>
                 <w:szCs w:val="17"/>
               </w:rPr>
-              <w:t>0.61</w:t>
+              <w:t>19.6</w:t>
             </w:r>
           </w:p>
         </w:tc>
@@ -19184,7 +18085,7 @@
                 <w:sz w:val="17"/>
                 <w:szCs w:val="17"/>
               </w:rPr>
-              <w:t>0.36</w:t>
+              <w:t>20.4</w:t>
             </w:r>
           </w:p>
         </w:tc>
@@ -19258,7 +18159,7 @@
           <w:sz w:val="18"/>
           <w:szCs w:val="18"/>
         </w:rPr>
-        <w:t>Production in NHL-equivalent points per 82 games; years past first eligibility as in Section 3; values in millions of dollars at the 2025-26 cap. Nikita Gusev, a 2012 draftee playing in the KHL, has the highest production level in the data from D+5 on, and his own career is in the fit that values him.</w:t>
+        <w:t>Production in NHLe points per 82 games; age on September 15 of the season of the trade; values in millions of dollars at the 2025-26 cap. Nikita Gusev, a 2012 draftee playing in the KHL, has the highest production level in the data from D+5 on, and his own career is in the fit that values him.</w:t>
       </w:r>
     </w:p>
     <w:p>
@@ -19267,6 +18168,7 @@
         <w:keepNext/>
       </w:pPr>
       <w:r>
+        <w:lastRenderedPageBreak/>
         <w:t>Undrafted prospects</w:t>
       </w:r>
     </w:p>
@@ -19283,8 +18185,7 @@
         <w:spacing w:before="60" w:after="120" w:line="276" w:lineRule="auto"/>
       </w:pPr>
       <w:r>
-        <w:lastRenderedPageBreak/>
-        <w:t>Each was in D+5 or later at his trade (counted from his first eligible draft), where the slot is not in the model, so the zero star probability changes none of their values. It would matter only for an undrafted player traded in D+1 to D+3, and there zero is the defensible value: each club passed on him at the draft, so his chance of becoming a star is below the last pick's. Two limitations do matter. First, the fit uses drafted players only, so the model assumes an undrafted scorer turns production into NHL surplus at the rate a drafted one does. Undrafted prospects on NHL contracts are players a club chose to sign. The drafted prospects the model learns from include many whose rights lapsed and who delivered nothing, so the model probably undervalues undrafted prospects. The contract records begin in 2018-19, so the data cannot separate the drafted prospects of 2007-2017 who were under NHL contracts. Second, the model has no age term from D+5 on, because age adds nothing there among drafted players. An undrafted 22-year-old and a 25-year-old with the same scoring therefore receive the same value until club control ends at 27.</w:t>
+        <w:t>Each was in D+5 or later at his trade (counted from his first eligible draft), where draft position is not in the model, so the zero star probability changes none of their values. It would matter only for an undrafted player traded in D+1 to D+3, and there zero is the defensible value: each club passed on him at the draft, so his chance of becoming a star is below the last pick's. Two limitations do matter. First, the fit uses drafted players only, so the model assumes an undrafted scorer turns production into NHL surplus at the rate a drafted one does. Undrafted prospects on NHL contracts are players a club chose to sign. The drafted prospects the model learns from include many whose rights lapsed and who delivered nothing, so the model probably undervalues undrafted prospects. The contract records begin in 2018-19, so the data cannot separate the drafted prospects of 2007-2017 who were under NHL contracts. Second, the model has no age term from D+5 on, because age adds nothing there among drafted players. An undrafted 22-year-old and a 25-year-old with the same scoring therefore receive the same value until club control ends at 27.</w:t>
       </w:r>
     </w:p>
     <w:p>
@@ -20077,7 +18978,7 @@
           <w:sz w:val="18"/>
           <w:szCs w:val="18"/>
         </w:rPr>
-        <w:t>Each other decision is set out where it is made: the deceased draftees (opening), the star value by season and the overlap with the fit (Section 1), production and its form, the slot from D+4, position and the production settings (Section 2), and age (Section 3).</w:t>
+        <w:t>Each other decision is set out where it is made: the deceased draftees (opening), the star value by season and the overlap with the fit (Section 1), production and its form, draft position from D+4, position and the production settings (Section 2), and age (Section 3).</w:t>
       </w:r>
     </w:p>
     <w:p>
@@ -20086,6 +18987,7 @@
         <w:keepNext/>
       </w:pPr>
       <w:r>
+        <w:lastRenderedPageBreak/>
         <w:t>Appendix B. The Regressions Built Up One Term at a Time</w:t>
       </w:r>
     </w:p>
@@ -20189,7 +19091,7 @@
                 <w:sz w:val="17"/>
                 <w:szCs w:val="17"/>
               </w:rPr>
-              <w:t>(1) Slot alone</w:t>
+              <w:t>(1) Draft position alone</w:t>
             </w:r>
           </w:p>
         </w:tc>
@@ -20322,7 +19224,7 @@
                 <w:sz w:val="17"/>
                 <w:szCs w:val="17"/>
               </w:rPr>
-              <w:t>Star probability for his slot (a)</w:t>
+              <w:t>Star probability for his draft position (a)</w:t>
             </w:r>
           </w:p>
         </w:tc>
@@ -20938,7 +19840,7 @@
                 <w:sz w:val="17"/>
                 <w:szCs w:val="17"/>
               </w:rPr>
-              <w:t>Production × years past first eligibility (e)</w:t>
+              <w:t>Production × (age − 18) (e)</w:t>
             </w:r>
           </w:p>
         </w:tc>
@@ -21375,7 +20277,6 @@
           <w:sz w:val="18"/>
           <w:szCs w:val="18"/>
         </w:rPr>
-        <w:lastRenderedPageBreak/>
         <w:t>As Table 10.</w:t>
       </w:r>
     </w:p>
@@ -21479,7 +20380,7 @@
                 <w:sz w:val="17"/>
                 <w:szCs w:val="17"/>
               </w:rPr>
-              <w:t>(1) Slot alone</w:t>
+              <w:t>(1) Draft position alone</w:t>
             </w:r>
           </w:p>
         </w:tc>
@@ -21612,7 +20513,7 @@
                 <w:sz w:val="17"/>
                 <w:szCs w:val="17"/>
               </w:rPr>
-              <w:t>Star probability for his slot (a)</w:t>
+              <w:t>Star probability for his draft position (a)</w:t>
             </w:r>
           </w:p>
         </w:tc>
@@ -21886,7 +20787,7 @@
                 <w:sz w:val="17"/>
                 <w:szCs w:val="17"/>
               </w:rPr>
-              <w:t>-0.058 (0.027) [0.028]</w:t>
+              <w:t>0.043 (0.039) [0.265]</w:t>
             </w:r>
           </w:p>
         </w:tc>
@@ -22228,7 +21129,7 @@
                 <w:sz w:val="17"/>
                 <w:szCs w:val="17"/>
               </w:rPr>
-              <w:t>Production × years past first eligibility (e)</w:t>
+              <w:t>Production × (age − 18) (e)</w:t>
             </w:r>
           </w:p>
         </w:tc>
@@ -22768,7 +21669,7 @@
                 <w:sz w:val="17"/>
                 <w:szCs w:val="17"/>
               </w:rPr>
-              <w:t>(1) Slot alone</w:t>
+              <w:t>(1) Draft position alone</w:t>
             </w:r>
           </w:p>
         </w:tc>
@@ -22901,7 +21802,7 @@
                 <w:sz w:val="17"/>
                 <w:szCs w:val="17"/>
               </w:rPr>
-              <w:t>Star probability for his slot (a)</w:t>
+              <w:t>Star probability for his draft position (a)</w:t>
             </w:r>
           </w:p>
         </w:tc>
@@ -23175,7 +22076,7 @@
                 <w:sz w:val="17"/>
                 <w:szCs w:val="17"/>
               </w:rPr>
-              <w:t>-0.034 (0.018) [0.064]</w:t>
+              <w:t>0.044 (0.029) [0.134]</w:t>
             </w:r>
           </w:p>
         </w:tc>
@@ -23517,7 +22418,7 @@
                 <w:sz w:val="17"/>
                 <w:szCs w:val="17"/>
               </w:rPr>
-              <w:t>Production × years past first eligibility (e)</w:t>
+              <w:t>Production × (age − 18) (e)</w:t>
             </w:r>
           </w:p>
         </w:tc>
@@ -23954,7 +22855,7 @@
           <w:sz w:val="18"/>
           <w:szCs w:val="18"/>
         </w:rPr>
-        <w:t>As Table 10. In the adopted model the slot is out from D+4, so column (4) drops the slot.</w:t>
+        <w:t>As Table 10. In the adopted model draft position is out from D+4, so column (4) drops draft position.</w:t>
       </w:r>
     </w:p>
     <w:p>
@@ -23969,6 +22870,7 @@
           <w:sz w:val="20"/>
           <w:szCs w:val="20"/>
         </w:rPr>
+        <w:lastRenderedPageBreak/>
         <w:t>Table B4. The D+5 and later regression built up one term at a time</w:t>
       </w:r>
     </w:p>
@@ -24057,7 +22959,7 @@
                 <w:sz w:val="17"/>
                 <w:szCs w:val="17"/>
               </w:rPr>
-              <w:t>(1) Slot alone</w:t>
+              <w:t>(1) Draft position alone</w:t>
             </w:r>
           </w:p>
         </w:tc>
@@ -24190,7 +23092,7 @@
                 <w:sz w:val="17"/>
                 <w:szCs w:val="17"/>
               </w:rPr>
-              <w:t>Star probability for his slot (a)</w:t>
+              <w:t>Star probability for his draft position (a)</w:t>
             </w:r>
           </w:p>
         </w:tc>
@@ -24806,7 +23708,7 @@
                 <w:sz w:val="17"/>
                 <w:szCs w:val="17"/>
               </w:rPr>
-              <w:t>Production × years past first eligibility (e)</w:t>
+              <w:t>Production × (age − 18) (e)</w:t>
             </w:r>
           </w:p>
         </w:tc>
@@ -25243,7 +24145,7 @@
           <w:sz w:val="18"/>
           <w:szCs w:val="18"/>
         </w:rPr>
-        <w:t>As Table 10. In the adopted model the slot is out from D+4, and age is out from D+5, so column (4) drops both.</w:t>
+        <w:t>As Table 10. In the adopted model draft position is out from D+4, and age is out from D+5, so column (4) drops both.</w:t>
       </w:r>
     </w:p>
     <w:p>
@@ -25258,7 +24160,6 @@
           <w:sz w:val="20"/>
           <w:szCs w:val="20"/>
         </w:rPr>
-        <w:lastRenderedPageBreak/>
         <w:t>Table B5. The age terms in each tested form</w:t>
       </w:r>
     </w:p>
@@ -25514,7 +24415,7 @@
                 <w:sz w:val="17"/>
                 <w:szCs w:val="17"/>
               </w:rPr>
-              <w:t>Flat: years past first eligibility</w:t>
+              <w:t>Flat: per year of age</w:t>
             </w:r>
           </w:p>
         </w:tc>
@@ -25698,7 +24599,7 @@
                 <w:sz w:val="17"/>
                 <w:szCs w:val="17"/>
               </w:rPr>
-              <w:t>Discount: production × years past eligibility</w:t>
+              <w:t>Discount: production × age</w:t>
             </w:r>
           </w:p>
         </w:tc>
@@ -25882,7 +24783,7 @@
                 <w:sz w:val="17"/>
                 <w:szCs w:val="17"/>
               </w:rPr>
-              <w:t>Both: years past first eligibility</w:t>
+              <w:t>Both: per year of age</w:t>
             </w:r>
           </w:p>
         </w:tc>
@@ -26063,7 +24964,7 @@
                 <w:sz w:val="17"/>
                 <w:szCs w:val="17"/>
               </w:rPr>
-              <w:t>Both: production × years past eligibility</w:t>
+              <w:t>Both: production × age</w:t>
             </w:r>
           </w:p>
         </w:tc>
@@ -26224,11 +25125,11 @@
           <w:sz w:val="18"/>
           <w:szCs w:val="18"/>
         </w:rPr>
-        <w:t>Coefficients in millions of dollars per year past first eligibility (flat) or per NHL-equivalent point per year (discount), robust standard errors in parentheses and two-sided p-values in brackets; each fitted with the production terms of Section 2. The flat term is negative on its own and turns positive once the discount is in the same regression, which is why both terms together were not adopted.</w:t>
+        <w:t>Coefficients in millions of dollars per year of age (flat) or per NHLe point per year of age (discount), robust standard errors in parentheses and two-sided p-values in brackets; each fitted with the production terms of Section 2. The flat term is negative on its own and turns positive once the discount is in the same regression, which is why both terms together were not adopted. These candidates were fitted with age measured as years past first eligibility (his age less 18, less the seasons since his draft). Measuring age from 18 instead leaves the discount alone unchanged, as in Table 9; the forms with the flat term would be different fits, because the regression has no constant term to absorb the difference.</w:t>
       </w:r>
     </w:p>
     <w:sectPr>
-      <w:footerReference w:type="default" r:id="rId18"/>
+      <w:footerReference w:type="default" r:id="rId13"/>
       <w:pgSz w:w="12240" w:h="15840"/>
       <w:pgMar w:top="1300" w:right="1300" w:bottom="1300" w:left="1300" w:header="708" w:footer="708" w:gutter="0"/>
       <w:cols w:space="720"/>
@@ -26236,273 +25137,6 @@
     </w:sectPr>
   </w:body>
 </w:document>
-</file>
-
-<file path=word/comments.xml><?xml version="1.0" encoding="utf-8"?>
-<w:comments xmlns:wpc="http://schemas.microsoft.com/office/word/2010/wordprocessingCanvas" xmlns:cx="http://schemas.microsoft.com/office/drawing/2014/chartex" xmlns:cx1="http://schemas.microsoft.com/office/drawing/2015/9/8/chartex" xmlns:cx2="http://schemas.microsoft.com/office/drawing/2015/10/21/chartex" xmlns:cx3="http://schemas.microsoft.com/office/drawing/2016/5/9/chartex" xmlns:cx4="http://schemas.microsoft.com/office/drawing/2016/5/10/chartex" xmlns:cx5="http://schemas.microsoft.com/office/drawing/2016/5/11/chartex" xmlns:cx6="http://schemas.microsoft.com/office/drawing/2016/5/12/chartex" xmlns:cx7="http://schemas.microsoft.com/office/drawing/2016/5/13/chartex" xmlns:cx8="http://schemas.microsoft.com/office/drawing/2016/5/14/chartex" xmlns:mc="http://schemas.openxmlformats.org/markup-compatibility/2006" xmlns:aink="http://schemas.microsoft.com/office/drawing/2016/ink" xmlns:am3d="http://schemas.microsoft.com/office/drawing/2017/model3d" xmlns:o="urn:schemas-microsoft-com:office:office" xmlns:oel="http://schemas.microsoft.com/office/2019/extlst" xmlns:r="http://schemas.openxmlformats.org/officeDocument/2006/relationships" xmlns:m="http://schemas.openxmlformats.org/officeDocument/2006/math" xmlns:v="urn:schemas-microsoft-com:vml" xmlns:wp14="http://schemas.microsoft.com/office/word/2010/wordprocessingDrawing" xmlns:wp="http://schemas.openxmlformats.org/drawingml/2006/wordprocessingDrawing" xmlns:w10="urn:schemas-microsoft-com:office:word" xmlns:w="http://schemas.openxmlformats.org/wordprocessingml/2006/main" xmlns:w14="http://schemas.microsoft.com/office/word/2010/wordml" xmlns:w15="http://schemas.microsoft.com/office/word/2012/wordml" xmlns:w16cex="http://schemas.microsoft.com/office/word/2018/wordml/cex" xmlns:w16cid="http://schemas.microsoft.com/office/word/2016/wordml/cid" xmlns:w16="http://schemas.microsoft.com/office/word/2018/wordml" xmlns:w16du="http://schemas.microsoft.com/office/word/2023/wordml/word16du" xmlns:w16sdtdh="http://schemas.microsoft.com/office/word/2020/wordml/sdtdatahash" xmlns:w16sdtfl="http://schemas.microsoft.com/office/word/2024/wordml/sdtformatlock" xmlns:w16se="http://schemas.microsoft.com/office/word/2015/wordml/symex" xmlns:wpg="http://schemas.microsoft.com/office/word/2010/wordprocessingGroup" xmlns:wpi="http://schemas.microsoft.com/office/word/2010/wordprocessingInk" xmlns:wne="http://schemas.microsoft.com/office/word/2006/wordml" xmlns:wps="http://schemas.microsoft.com/office/word/2010/wordprocessingShape" mc:Ignorable="w14 w15 w16se w16cid w16 w16cex w16sdtdh w16sdtfl w16du wp14">
-  <w:comment w:id="0" w:author="Thomas Mihaljevic" w:date="2026-10-15T14:38:00Z" w:initials="TM">
-    <w:p>
-      <w:pPr>
-        <w:pStyle w:val="CommentText"/>
-      </w:pPr>
-      <w:r>
-        <w:rPr>
-          <w:rStyle w:val="CommentReference"/>
-        </w:rPr>
-        <w:annotationRef/>
-      </w:r>
-      <w:r>
-        <w:t>I do not believe this data. This implies that everyone eventually makes the NHL which is obviously not the case</w:t>
-      </w:r>
-    </w:p>
-  </w:comment>
-  <w:comment w:id="1" w:author="Thomas Mihaljevic" w:date="2026-10-15T14:42:00Z" w:initials="TM">
-    <w:p>
-      <w:pPr>
-        <w:pStyle w:val="CommentText"/>
-      </w:pPr>
-      <w:r>
-        <w:rPr>
-          <w:rStyle w:val="CommentReference"/>
-        </w:rPr>
-        <w:annotationRef/>
-      </w:r>
-      <w:r>
-        <w:t>Okay but I would honestly rather use the version of a full set of interaction terms. I think it is more straightforward to explain and it is something that Karl and I agree on.</w:t>
-      </w:r>
-    </w:p>
-  </w:comment>
-  <w:comment w:id="2" w:author="Thomas Mihaljevic" w:date="2026-10-15T14:43:00Z" w:initials="TM">
-    <w:p>
-      <w:pPr>
-        <w:pStyle w:val="CommentText"/>
-      </w:pPr>
-      <w:r>
-        <w:rPr>
-          <w:rStyle w:val="CommentReference"/>
-        </w:rPr>
-        <w:annotationRef/>
-      </w:r>
-      <w:r>
-        <w:t>I just think this figure is kinda ugly lol</w:t>
-      </w:r>
-    </w:p>
-  </w:comment>
-  <w:comment w:id="3" w:author="Thomas Mihaljevic" w:date="2026-10-15T16:11:00Z" w:initials="TM">
-    <w:p>
-      <w:pPr>
-        <w:pStyle w:val="CommentText"/>
-      </w:pPr>
-      <w:r>
-        <w:rPr>
-          <w:rStyle w:val="CommentReference"/>
-        </w:rPr>
-        <w:annotationRef/>
-      </w:r>
-      <w:r>
-        <w:t>Missing prospects seasons</w:t>
-      </w:r>
-    </w:p>
-  </w:comment>
-  <w:comment w:id="4" w:author="Thomas Mihaljevic" w:date="2026-10-15T15:06:00Z" w:initials="TM">
-    <w:p>
-      <w:pPr>
-        <w:pStyle w:val="CommentText"/>
-      </w:pPr>
-      <w:r>
-        <w:rPr>
-          <w:rStyle w:val="CommentReference"/>
-        </w:rPr>
-        <w:annotationRef/>
-      </w:r>
-      <w:r>
-        <w:t>Just call it root mean squared error uniformly throughout the doc</w:t>
-      </w:r>
-    </w:p>
-  </w:comment>
-  <w:comment w:id="5" w:author="Thomas Mihaljevic" w:date="2026-10-15T15:08:00Z" w:initials="TM">
-    <w:p>
-      <w:pPr>
-        <w:pStyle w:val="CommentText"/>
-      </w:pPr>
-      <w:r>
-        <w:rPr>
-          <w:rStyle w:val="CommentReference"/>
-        </w:rPr>
-        <w:annotationRef/>
-      </w:r>
-      <w:r>
-        <w:t>I think this should be uniformly referred to as NHLe after it has been initially introduced</w:t>
-      </w:r>
-    </w:p>
-  </w:comment>
-  <w:comment w:id="6" w:author="Thomas Mihaljevic" w:date="2026-10-15T16:14:00Z" w:initials="TM">
-    <w:p>
-      <w:pPr>
-        <w:pStyle w:val="CommentText"/>
-      </w:pPr>
-      <w:r>
-        <w:rPr>
-          <w:rStyle w:val="CommentReference"/>
-        </w:rPr>
-        <w:annotationRef/>
-      </w:r>
-      <w:r>
-        <w:t>“the curve” is not a meaningful word. The whole thing is a curve. You mean “The production squared term”</w:t>
-      </w:r>
-    </w:p>
-  </w:comment>
-  <w:comment w:id="7" w:author="Thomas Mihaljevic" w:date="2026-10-15T16:17:00Z" w:initials="TM">
-    <w:p>
-      <w:pPr>
-        <w:pStyle w:val="CommentText"/>
-      </w:pPr>
-      <w:r>
-        <w:rPr>
-          <w:rStyle w:val="CommentReference"/>
-        </w:rPr>
-        <w:annotationRef/>
-      </w:r>
-      <w:r>
-        <w:t>This sentence is a good illustration about why being specific and consistent is extremely important. What is the difference between “full curve” and “the curve”? The full sentence (I think) should read something like “Production squared alone, removing the linear production term, predicts about as well as a regression with both the linear and squared production terms (2.1819 against 2.1803; the squared production only regression is better with p = 0.355). You need to scan the entire document for confusing wording like this. You need to be specific and consistent.</w:t>
-      </w:r>
-    </w:p>
-  </w:comment>
-  <w:comment w:id="8" w:author="Thomas Mihaljevic" w:date="2026-10-15T15:12:00Z" w:initials="TM">
-    <w:p>
-      <w:pPr>
-        <w:pStyle w:val="CommentText"/>
-      </w:pPr>
-      <w:r>
-        <w:rPr>
-          <w:rStyle w:val="CommentReference"/>
-        </w:rPr>
-        <w:annotationRef/>
-      </w:r>
-      <w:r>
-        <w:t>I don’t know what this is saying. Why are we talking about age here at all? It’s very confusing</w:t>
-      </w:r>
-    </w:p>
-  </w:comment>
-  <w:comment w:id="9" w:author="Thomas Mihaljevic" w:date="2026-10-15T16:22:00Z" w:initials="TM">
-    <w:p>
-      <w:pPr>
-        <w:pStyle w:val="CommentText"/>
-      </w:pPr>
-      <w:r>
-        <w:rPr>
-          <w:rStyle w:val="CommentReference"/>
-        </w:rPr>
-        <w:annotationRef/>
-      </w:r>
-      <w:r>
-        <w:t xml:space="preserve">This is another instance where specificity helps. Of course “slot” refers to draft position, but personally I don’t like “slot” because it feels non-specific and also “the slot” is a common hockey term that is completely unrelated to the draft. It should be “Draft position” throughout </w:t>
-      </w:r>
-    </w:p>
-  </w:comment>
-  <w:comment w:id="10" w:author="Thomas Mihaljevic" w:date="2026-10-15T16:29:00Z" w:initials="TM">
-    <w:p>
-      <w:pPr>
-        <w:pStyle w:val="CommentText"/>
-      </w:pPr>
-      <w:r>
-        <w:rPr>
-          <w:rStyle w:val="CommentReference"/>
-        </w:rPr>
-        <w:annotationRef/>
-      </w:r>
-      <w:r>
-        <w:t>I still think the wording here is clunky. I would recommend giving me rewrite options in chat. I think it is just generally difficult to understand what the metric used for age is and how it is different than any other potential metric</w:t>
-      </w:r>
-    </w:p>
-  </w:comment>
-  <w:comment w:id="11" w:author="Thomas Mihaljevic" w:date="2026-10-15T16:35:00Z" w:initials="TM">
-    <w:p>
-      <w:pPr>
-        <w:pStyle w:val="CommentText"/>
-      </w:pPr>
-      <w:r>
-        <w:rPr>
-          <w:rStyle w:val="CommentReference"/>
-        </w:rPr>
-        <w:annotationRef/>
-      </w:r>
-      <w:r>
-        <w:t>Again this seems to be not how it should work? What is important is that a player who is 20’s equivalent production is worth less than an 18 year olds production. An 18 year old’s should always be worth more than the 20 year olds all else being equal</w:t>
-      </w:r>
-    </w:p>
-  </w:comment>
-  <w:comment w:id="12" w:author="Thomas Mihaljevic" w:date="2026-10-15T16:39:00Z" w:initials="TM">
-    <w:p>
-      <w:pPr>
-        <w:pStyle w:val="CommentText"/>
-      </w:pPr>
-      <w:r>
-        <w:rPr>
-          <w:rStyle w:val="CommentReference"/>
-        </w:rPr>
-        <w:annotationRef/>
-      </w:r>
-      <w:r>
-        <w:t xml:space="preserve">Again this seems to be wrong because don’t we care about the age that the production comes from? Not the age a player was drafted at </w:t>
-      </w:r>
-    </w:p>
-  </w:comment>
-</w:comments>
-</file>
-
-<file path=word/commentsExtended.xml><?xml version="1.0" encoding="utf-8"?>
-<w15:commentsEx xmlns:wpc="http://schemas.microsoft.com/office/word/2010/wordprocessingCanvas" xmlns:cx="http://schemas.microsoft.com/office/drawing/2014/chartex" xmlns:cx1="http://schemas.microsoft.com/office/drawing/2015/9/8/chartex" xmlns:cx2="http://schemas.microsoft.com/office/drawing/2015/10/21/chartex" xmlns:cx3="http://schemas.microsoft.com/office/drawing/2016/5/9/chartex" xmlns:cx4="http://schemas.microsoft.com/office/drawing/2016/5/10/chartex" xmlns:cx5="http://schemas.microsoft.com/office/drawing/2016/5/11/chartex" xmlns:cx6="http://schemas.microsoft.com/office/drawing/2016/5/12/chartex" xmlns:cx7="http://schemas.microsoft.com/office/drawing/2016/5/13/chartex" xmlns:cx8="http://schemas.microsoft.com/office/drawing/2016/5/14/chartex" xmlns:mc="http://schemas.openxmlformats.org/markup-compatibility/2006" xmlns:aink="http://schemas.microsoft.com/office/drawing/2016/ink" xmlns:am3d="http://schemas.microsoft.com/office/drawing/2017/model3d" xmlns:o="urn:schemas-microsoft-com:office:office" xmlns:oel="http://schemas.microsoft.com/office/2019/extlst" xmlns:r="http://schemas.openxmlformats.org/officeDocument/2006/relationships" xmlns:m="http://schemas.openxmlformats.org/officeDocument/2006/math" xmlns:v="urn:schemas-microsoft-com:vml" xmlns:wp14="http://schemas.microsoft.com/office/word/2010/wordprocessingDrawing" xmlns:wp="http://schemas.openxmlformats.org/drawingml/2006/wordprocessingDrawing" xmlns:w10="urn:schemas-microsoft-com:office:word" xmlns:w="http://schemas.openxmlformats.org/wordprocessingml/2006/main" xmlns:w14="http://schemas.microsoft.com/office/word/2010/wordml" xmlns:w15="http://schemas.microsoft.com/office/word/2012/wordml" xmlns:w16cex="http://schemas.microsoft.com/office/word/2018/wordml/cex" xmlns:w16cid="http://schemas.microsoft.com/office/word/2016/wordml/cid" xmlns:w16="http://schemas.microsoft.com/office/word/2018/wordml" xmlns:w16du="http://schemas.microsoft.com/office/word/2023/wordml/word16du" xmlns:w16sdtdh="http://schemas.microsoft.com/office/word/2020/wordml/sdtdatahash" xmlns:w16sdtfl="http://schemas.microsoft.com/office/word/2024/wordml/sdtformatlock" xmlns:w16se="http://schemas.microsoft.com/office/word/2015/wordml/symex" xmlns:wpg="http://schemas.microsoft.com/office/word/2010/wordprocessingGroup" xmlns:wpi="http://schemas.microsoft.com/office/word/2010/wordprocessingInk" xmlns:wne="http://schemas.microsoft.com/office/word/2006/wordml" xmlns:wps="http://schemas.microsoft.com/office/word/2010/wordprocessingShape" mc:Ignorable="w14 w15 w16se w16cid w16 w16cex w16sdtdh w16sdtfl w16du wp14">
-  <w15:commentEx w15:paraId="0E0D1070" w15:done="0"/>
-  <w15:commentEx w15:paraId="4F9E1AE0" w15:done="0"/>
-  <w15:commentEx w15:paraId="0F87A793" w15:done="0"/>
-  <w15:commentEx w15:paraId="363CD3F9" w15:done="0"/>
-  <w15:commentEx w15:paraId="06476867" w15:done="0"/>
-  <w15:commentEx w15:paraId="251D02FC" w15:done="0"/>
-  <w15:commentEx w15:paraId="610EA236" w15:done="0"/>
-  <w15:commentEx w15:paraId="5C4CF7AE" w15:done="0"/>
-  <w15:commentEx w15:paraId="52A3BBA8" w15:done="0"/>
-  <w15:commentEx w15:paraId="546F3FC3" w15:done="0"/>
-  <w15:commentEx w15:paraId="55223A8B" w15:done="0"/>
-  <w15:commentEx w15:paraId="0CD4D32A" w15:done="0"/>
-  <w15:commentEx w15:paraId="54EB0354" w15:done="0"/>
-</w15:commentsEx>
-</file>
-
-<file path=word/commentsExtensible.xml><?xml version="1.0" encoding="utf-8"?>
-<w16cex:commentsExtensible xmlns:wpc="http://schemas.microsoft.com/office/word/2010/wordprocessingCanvas" xmlns:cx="http://schemas.microsoft.com/office/drawing/2014/chartex" xmlns:cx1="http://schemas.microsoft.com/office/drawing/2015/9/8/chartex" xmlns:cx2="http://schemas.microsoft.com/office/drawing/2015/10/21/chartex" xmlns:cx3="http://schemas.microsoft.com/office/drawing/2016/5/9/chartex" xmlns:cx4="http://schemas.microsoft.com/office/drawing/2016/5/10/chartex" xmlns:cx5="http://schemas.microsoft.com/office/drawing/2016/5/11/chartex" xmlns:cx6="http://schemas.microsoft.com/office/drawing/2016/5/12/chartex" xmlns:cx7="http://schemas.microsoft.com/office/drawing/2016/5/13/chartex" xmlns:cx8="http://schemas.microsoft.com/office/drawing/2016/5/14/chartex" xmlns:cr="http://schemas.microsoft.com/office/comments/2020/reactions" xmlns:mc="http://schemas.openxmlformats.org/markup-compatibility/2006" xmlns:aink="http://schemas.microsoft.com/office/drawing/2016/ink" xmlns:am3d="http://schemas.microsoft.com/office/drawing/2017/model3d" xmlns:o="urn:schemas-microsoft-com:office:office" xmlns:oel="http://schemas.microsoft.com/office/2019/extlst" xmlns:r="http://schemas.openxmlformats.org/officeDocument/2006/relationships" xmlns:m="http://schemas.openxmlformats.org/officeDocument/2006/math" xmlns:v="urn:schemas-microsoft-com:vml" xmlns:wp14="http://schemas.microsoft.com/office/word/2010/wordprocessingDrawing" xmlns:wp="http://schemas.openxmlformats.org/drawingml/2006/wordprocessingDrawing" xmlns:w10="urn:schemas-microsoft-com:office:word" xmlns:w="http://schemas.openxmlformats.org/wordprocessingml/2006/main" xmlns:w14="http://schemas.microsoft.com/office/word/2010/wordml" xmlns:w15="http://schemas.microsoft.com/office/word/2012/wordml" xmlns:w16cex="http://schemas.microsoft.com/office/word/2018/wordml/cex" xmlns:w16cid="http://schemas.microsoft.com/office/word/2016/wordml/cid" xmlns:w16="http://schemas.microsoft.com/office/word/2018/wordml" xmlns:w16du="http://schemas.microsoft.com/office/word/2023/wordml/word16du" xmlns:w16sdtdh="http://schemas.microsoft.com/office/word/2020/wordml/sdtdatahash" xmlns:w16sdtfl="http://schemas.microsoft.com/office/word/2024/wordml/sdtformatlock" xmlns:w16se="http://schemas.microsoft.com/office/word/2015/wordml/symex" xmlns:wpg="http://schemas.microsoft.com/office/word/2010/wordprocessingGroup" xmlns:wpi="http://schemas.microsoft.com/office/word/2010/wordprocessingInk" xmlns:wne="http://schemas.microsoft.com/office/word/2006/wordml" xmlns:wps="http://schemas.microsoft.com/office/word/2010/wordprocessingShape" mc:Ignorable="w14 w15 w16se w16cid w16 w16cex w16sdtdh w16sdtfl cr w16du wp14">
-  <w16cex:commentExtensible w16cex:durableId="42311AFE" w16cex:dateUtc="2026-10-15T18:38:00Z"/>
-  <w16cex:commentExtensible w16cex:durableId="139A72E9" w16cex:dateUtc="2026-10-15T18:42:00Z"/>
-  <w16cex:commentExtensible w16cex:durableId="651DF7CF" w16cex:dateUtc="2026-10-15T18:43:00Z"/>
-  <w16cex:commentExtensible w16cex:durableId="7D9CF133" w16cex:dateUtc="2026-10-15T20:11:00Z"/>
-  <w16cex:commentExtensible w16cex:durableId="60A77EF1" w16cex:dateUtc="2026-10-15T19:06:00Z"/>
-  <w16cex:commentExtensible w16cex:durableId="6D9B4EEA" w16cex:dateUtc="2026-10-15T19:08:00Z"/>
-  <w16cex:commentExtensible w16cex:durableId="29D38BEF" w16cex:dateUtc="2026-10-15T20:14:00Z"/>
-  <w16cex:commentExtensible w16cex:durableId="361040B7" w16cex:dateUtc="2026-10-15T20:17:00Z"/>
-  <w16cex:commentExtensible w16cex:durableId="1F3BDFC7" w16cex:dateUtc="2026-10-15T19:12:00Z"/>
-  <w16cex:commentExtensible w16cex:durableId="0E83A35C" w16cex:dateUtc="2026-10-15T20:22:00Z"/>
-  <w16cex:commentExtensible w16cex:durableId="2E68A7C4" w16cex:dateUtc="2026-10-15T20:29:00Z"/>
-  <w16cex:commentExtensible w16cex:durableId="3DEEF638" w16cex:dateUtc="2026-10-15T20:35:00Z"/>
-  <w16cex:commentExtensible w16cex:durableId="608119E7" w16cex:dateUtc="2026-10-15T20:39:00Z"/>
-</w16cex:commentsExtensible>
-</file>
-
-<file path=word/commentsIds.xml><?xml version="1.0" encoding="utf-8"?>
-<w16cid:commentsIds xmlns:wpc="http://schemas.microsoft.com/office/word/2010/wordprocessingCanvas" xmlns:cx="http://schemas.microsoft.com/office/drawing/2014/chartex" xmlns:cx1="http://schemas.microsoft.com/office/drawing/2015/9/8/chartex" xmlns:cx2="http://schemas.microsoft.com/office/drawing/2015/10/21/chartex" xmlns:cx3="http://schemas.microsoft.com/office/drawing/2016/5/9/chartex" xmlns:cx4="http://schemas.microsoft.com/office/drawing/2016/5/10/chartex" xmlns:cx5="http://schemas.microsoft.com/office/drawing/2016/5/11/chartex" xmlns:cx6="http://schemas.microsoft.com/office/drawing/2016/5/12/chartex" xmlns:cx7="http://schemas.microsoft.com/office/drawing/2016/5/13/chartex" xmlns:cx8="http://schemas.microsoft.com/office/drawing/2016/5/14/chartex" xmlns:mc="http://schemas.openxmlformats.org/markup-compatibility/2006" xmlns:aink="http://schemas.microsoft.com/office/drawing/2016/ink" xmlns:am3d="http://schemas.microsoft.com/office/drawing/2017/model3d" xmlns:o="urn:schemas-microsoft-com:office:office" xmlns:oel="http://schemas.microsoft.com/office/2019/extlst" xmlns:r="http://schemas.openxmlformats.org/officeDocument/2006/relationships" xmlns:m="http://schemas.openxmlformats.org/officeDocument/2006/math" xmlns:v="urn:schemas-microsoft-com:vml" xmlns:wp14="http://schemas.microsoft.com/office/word/2010/wordprocessingDrawing" xmlns:wp="http://schemas.openxmlformats.org/drawingml/2006/wordprocessingDrawing" xmlns:w10="urn:schemas-microsoft-com:office:word" xmlns:w="http://schemas.openxmlformats.org/wordprocessingml/2006/main" xmlns:w14="http://schemas.microsoft.com/office/word/2010/wordml" xmlns:w15="http://schemas.microsoft.com/office/word/2012/wordml" xmlns:w16cex="http://schemas.microsoft.com/office/word/2018/wordml/cex" xmlns:w16cid="http://schemas.microsoft.com/office/word/2016/wordml/cid" xmlns:w16="http://schemas.microsoft.com/office/word/2018/wordml" xmlns:w16du="http://schemas.microsoft.com/office/word/2023/wordml/word16du" xmlns:w16sdtdh="http://schemas.microsoft.com/office/word/2020/wordml/sdtdatahash" xmlns:w16sdtfl="http://schemas.microsoft.com/office/word/2024/wordml/sdtformatlock" xmlns:w16se="http://schemas.microsoft.com/office/word/2015/wordml/symex" xmlns:wpg="http://schemas.microsoft.com/office/word/2010/wordprocessingGroup" xmlns:wpi="http://schemas.microsoft.com/office/word/2010/wordprocessingInk" xmlns:wne="http://schemas.microsoft.com/office/word/2006/wordml" xmlns:wps="http://schemas.microsoft.com/office/word/2010/wordprocessingShape" mc:Ignorable="w14 w15 w16se w16cid w16 w16cex w16sdtdh w16sdtfl w16du wp14">
-  <w16cid:commentId w16cid:paraId="0E0D1070" w16cid:durableId="42311AFE"/>
-  <w16cid:commentId w16cid:paraId="4F9E1AE0" w16cid:durableId="139A72E9"/>
-  <w16cid:commentId w16cid:paraId="0F87A793" w16cid:durableId="651DF7CF"/>
-  <w16cid:commentId w16cid:paraId="363CD3F9" w16cid:durableId="7D9CF133"/>
-  <w16cid:commentId w16cid:paraId="06476867" w16cid:durableId="60A77EF1"/>
-  <w16cid:commentId w16cid:paraId="251D02FC" w16cid:durableId="6D9B4EEA"/>
-  <w16cid:commentId w16cid:paraId="610EA236" w16cid:durableId="29D38BEF"/>
-  <w16cid:commentId w16cid:paraId="5C4CF7AE" w16cid:durableId="361040B7"/>
-  <w16cid:commentId w16cid:paraId="52A3BBA8" w16cid:durableId="1F3BDFC7"/>
-  <w16cid:commentId w16cid:paraId="546F3FC3" w16cid:durableId="0E83A35C"/>
-  <w16cid:commentId w16cid:paraId="55223A8B" w16cid:durableId="2E68A7C4"/>
-  <w16cid:commentId w16cid:paraId="0CD4D32A" w16cid:durableId="3DEEF638"/>
-  <w16cid:commentId w16cid:paraId="54EB0354" w16cid:durableId="608119E7"/>
-</w16cid:commentsIds>
 </file>
 
 <file path=word/endnotes.xml><?xml version="1.0" encoding="utf-8"?>
@@ -26597,10 +25231,10 @@
 <file path=word/numbering.xml><?xml version="1.0" encoding="utf-8"?>
 <w:numbering xmlns:wpc="http://schemas.microsoft.com/office/word/2010/wordprocessingCanvas" xmlns:cx="http://schemas.microsoft.com/office/drawing/2014/chartex" xmlns:cx1="http://schemas.microsoft.com/office/drawing/2015/9/8/chartex" xmlns:cx2="http://schemas.microsoft.com/office/drawing/2015/10/21/chartex" xmlns:cx3="http://schemas.microsoft.com/office/drawing/2016/5/9/chartex" xmlns:cx4="http://schemas.microsoft.com/office/drawing/2016/5/10/chartex" xmlns:cx5="http://schemas.microsoft.com/office/drawing/2016/5/11/chartex" xmlns:cx6="http://schemas.microsoft.com/office/drawing/2016/5/12/chartex" xmlns:cx7="http://schemas.microsoft.com/office/drawing/2016/5/13/chartex" xmlns:cx8="http://schemas.microsoft.com/office/drawing/2016/5/14/chartex" xmlns:mc="http://schemas.openxmlformats.org/markup-compatibility/2006" xmlns:aink="http://schemas.microsoft.com/office/drawing/2016/ink" xmlns:am3d="http://schemas.microsoft.com/office/drawing/2017/model3d" xmlns:o="urn:schemas-microsoft-com:office:office" xmlns:oel="http://schemas.microsoft.com/office/2019/extlst" xmlns:r="http://schemas.openxmlformats.org/officeDocument/2006/relationships" xmlns:m="http://schemas.openxmlformats.org/officeDocument/2006/math" xmlns:v="urn:schemas-microsoft-com:vml" xmlns:wp14="http://schemas.microsoft.com/office/word/2010/wordprocessingDrawing" xmlns:wp="http://schemas.openxmlformats.org/drawingml/2006/wordprocessingDrawing" xmlns:w10="urn:schemas-microsoft-com:office:word" xmlns:w="http://schemas.openxmlformats.org/wordprocessingml/2006/main" xmlns:w14="http://schemas.microsoft.com/office/word/2010/wordml" xmlns:w15="http://schemas.microsoft.com/office/word/2012/wordml" xmlns:w16cex="http://schemas.microsoft.com/office/word/2018/wordml/cex" xmlns:w16cid="http://schemas.microsoft.com/office/word/2016/wordml/cid" xmlns:w16="http://schemas.microsoft.com/office/word/2018/wordml" xmlns:w16du="http://schemas.microsoft.com/office/word/2023/wordml/word16du" xmlns:w16sdtdh="http://schemas.microsoft.com/office/word/2020/wordml/sdtdatahash" xmlns:w16sdtfl="http://schemas.microsoft.com/office/word/2024/wordml/sdtformatlock" xmlns:w16se="http://schemas.microsoft.com/office/word/2015/wordml/symex" xmlns:wpg="http://schemas.microsoft.com/office/word/2010/wordprocessingGroup" xmlns:wpi="http://schemas.microsoft.com/office/word/2010/wordprocessingInk" xmlns:wne="http://schemas.microsoft.com/office/word/2006/wordml" xmlns:wps="http://schemas.microsoft.com/office/word/2010/wordprocessingShape" mc:Ignorable="w14 w15 w16se w16cid w16 w16cex w16sdtdh w16sdtfl w16du wp14">
   <w:abstractNum w:abstractNumId="0" w15:restartNumberingAfterBreak="0">
-    <w:nsid w:val="2CE6405E"/>
+    <w:nsid w:val="50661D24"/>
     <w:multiLevelType w:val="hybridMultilevel"/>
-    <w:tmpl w:val="249CE20E"/>
-    <w:lvl w:ilvl="0" w:tplc="ECDA2DC2" w:tentative="1">
+    <w:tmpl w:val="19BA5DC4"/>
+    <w:lvl w:ilvl="0" w:tplc="7F0C7B24" w:tentative="1">
       <w:start w:val="1"/>
       <w:numFmt w:val="bullet"/>
       <w:lvlText w:val="●"/>
@@ -26609,7 +25243,7 @@
         <w:ind w:left="720" w:hanging="360"/>
       </w:pPr>
     </w:lvl>
-    <w:lvl w:ilvl="1" w:tplc="D48A3BA6" w:tentative="1">
+    <w:lvl w:ilvl="1" w:tplc="904C39DE" w:tentative="1">
       <w:start w:val="1"/>
       <w:numFmt w:val="bullet"/>
       <w:lvlText w:val="○"/>
@@ -26618,7 +25252,7 @@
         <w:ind w:left="1440" w:hanging="360"/>
       </w:pPr>
     </w:lvl>
-    <w:lvl w:ilvl="2" w:tplc="B10CB380" w:tentative="1">
+    <w:lvl w:ilvl="2" w:tplc="5FD4A9CA" w:tentative="1">
       <w:start w:val="1"/>
       <w:numFmt w:val="bullet"/>
       <w:lvlText w:val="■"/>
@@ -26627,7 +25261,7 @@
         <w:ind w:left="2160" w:hanging="360"/>
       </w:pPr>
     </w:lvl>
-    <w:lvl w:ilvl="3" w:tplc="C7DA7C46" w:tentative="1">
+    <w:lvl w:ilvl="3" w:tplc="3EDCE7E0" w:tentative="1">
       <w:start w:val="1"/>
       <w:numFmt w:val="bullet"/>
       <w:lvlText w:val="●"/>
@@ -26636,7 +25270,7 @@
         <w:ind w:left="2880" w:hanging="360"/>
       </w:pPr>
     </w:lvl>
-    <w:lvl w:ilvl="4" w:tplc="2044572C" w:tentative="1">
+    <w:lvl w:ilvl="4" w:tplc="293A0686" w:tentative="1">
       <w:start w:val="1"/>
       <w:numFmt w:val="bullet"/>
       <w:lvlText w:val="○"/>
@@ -26645,7 +25279,7 @@
         <w:ind w:left="3600" w:hanging="360"/>
       </w:pPr>
     </w:lvl>
-    <w:lvl w:ilvl="5" w:tplc="CB58955A" w:tentative="1">
+    <w:lvl w:ilvl="5" w:tplc="7C5677B8" w:tentative="1">
       <w:start w:val="1"/>
       <w:numFmt w:val="bullet"/>
       <w:lvlText w:val="■"/>
@@ -26654,7 +25288,7 @@
         <w:ind w:left="4320" w:hanging="360"/>
       </w:pPr>
     </w:lvl>
-    <w:lvl w:ilvl="6" w:tplc="0CDEF936" w:tentative="1">
+    <w:lvl w:ilvl="6" w:tplc="5506359A" w:tentative="1">
       <w:start w:val="1"/>
       <w:numFmt w:val="bullet"/>
       <w:lvlText w:val="●"/>
@@ -26663,7 +25297,7 @@
         <w:ind w:left="5040" w:hanging="360"/>
       </w:pPr>
     </w:lvl>
-    <w:lvl w:ilvl="7" w:tplc="448074E2" w:tentative="1">
+    <w:lvl w:ilvl="7" w:tplc="D5300B44" w:tentative="1">
       <w:start w:val="1"/>
       <w:numFmt w:val="bullet"/>
       <w:lvlText w:val="●"/>
@@ -26672,7 +25306,7 @@
         <w:ind w:left="5760" w:hanging="360"/>
       </w:pPr>
     </w:lvl>
-    <w:lvl w:ilvl="8" w:tplc="9C284C9E" w:tentative="1">
+    <w:lvl w:ilvl="8" w:tplc="728E327C" w:tentative="1">
       <w:start w:val="1"/>
       <w:numFmt w:val="bullet"/>
       <w:lvlText w:val="●"/>
@@ -26683,10 +25317,10 @@
     </w:lvl>
   </w:abstractNum>
   <w:abstractNum w:abstractNumId="1" w15:restartNumberingAfterBreak="0">
-    <w:nsid w:val="75B148CC"/>
+    <w:nsid w:val="5BD25310"/>
     <w:multiLevelType w:val="hybridMultilevel"/>
-    <w:tmpl w:val="08D095BA"/>
-    <w:lvl w:ilvl="0" w:tplc="95AC6EEE">
+    <w:tmpl w:val="8D48AD5C"/>
+    <w:lvl w:ilvl="0" w:tplc="55DEB41A">
       <w:start w:val="1"/>
       <w:numFmt w:val="bullet"/>
       <w:lvlText w:val="•"/>
@@ -26695,68 +25329,60 @@
         <w:ind w:left="540" w:hanging="270"/>
       </w:pPr>
     </w:lvl>
-    <w:lvl w:ilvl="1" w:tplc="0AB8B7C2">
+    <w:lvl w:ilvl="1" w:tplc="DFEE466A">
       <w:numFmt w:val="decimal"/>
       <w:lvlText w:val=""/>
       <w:lvlJc w:val="left"/>
     </w:lvl>
-    <w:lvl w:ilvl="2" w:tplc="07DE297A">
+    <w:lvl w:ilvl="2" w:tplc="D5FE2882">
       <w:numFmt w:val="decimal"/>
       <w:lvlText w:val=""/>
       <w:lvlJc w:val="left"/>
     </w:lvl>
-    <w:lvl w:ilvl="3" w:tplc="80E2E878">
+    <w:lvl w:ilvl="3" w:tplc="7C08AF68">
       <w:numFmt w:val="decimal"/>
       <w:lvlText w:val=""/>
       <w:lvlJc w:val="left"/>
     </w:lvl>
-    <w:lvl w:ilvl="4" w:tplc="D8BA150A">
+    <w:lvl w:ilvl="4" w:tplc="BEDC6E9E">
       <w:numFmt w:val="decimal"/>
       <w:lvlText w:val=""/>
       <w:lvlJc w:val="left"/>
     </w:lvl>
-    <w:lvl w:ilvl="5" w:tplc="81C4B188">
+    <w:lvl w:ilvl="5" w:tplc="0E9CC5F2">
       <w:numFmt w:val="decimal"/>
       <w:lvlText w:val=""/>
       <w:lvlJc w:val="left"/>
     </w:lvl>
-    <w:lvl w:ilvl="6" w:tplc="508C5A12">
+    <w:lvl w:ilvl="6" w:tplc="8FC28F90">
       <w:numFmt w:val="decimal"/>
       <w:lvlText w:val=""/>
       <w:lvlJc w:val="left"/>
     </w:lvl>
-    <w:lvl w:ilvl="7" w:tplc="E804A92C">
+    <w:lvl w:ilvl="7" w:tplc="10D06474">
       <w:numFmt w:val="decimal"/>
       <w:lvlText w:val=""/>
       <w:lvlJc w:val="left"/>
     </w:lvl>
-    <w:lvl w:ilvl="8" w:tplc="AC40A456">
+    <w:lvl w:ilvl="8" w:tplc="36AE0386">
       <w:numFmt w:val="decimal"/>
       <w:lvlText w:val=""/>
       <w:lvlJc w:val="left"/>
     </w:lvl>
   </w:abstractNum>
-  <w:num w:numId="1" w16cid:durableId="1539390517">
+  <w:num w:numId="1" w16cid:durableId="1933508757">
     <w:abstractNumId w:val="0"/>
     <w:lvlOverride w:ilvl="0">
       <w:startOverride w:val="1"/>
     </w:lvlOverride>
   </w:num>
-  <w:num w:numId="2" w16cid:durableId="2015647056">
+  <w:num w:numId="2" w16cid:durableId="1257327619">
     <w:abstractNumId w:val="1"/>
     <w:lvlOverride w:ilvl="0">
       <w:startOverride w:val="1"/>
     </w:lvlOverride>
   </w:num>
 </w:numbering>
-</file>
-
-<file path=word/people.xml><?xml version="1.0" encoding="utf-8"?>
-<w15:people xmlns:wpc="http://schemas.microsoft.com/office/word/2010/wordprocessingCanvas" xmlns:cx="http://schemas.microsoft.com/office/drawing/2014/chartex" xmlns:cx1="http://schemas.microsoft.com/office/drawing/2015/9/8/chartex" xmlns:cx2="http://schemas.microsoft.com/office/drawing/2015/10/21/chartex" xmlns:cx3="http://schemas.microsoft.com/office/drawing/2016/5/9/chartex" xmlns:cx4="http://schemas.microsoft.com/office/drawing/2016/5/10/chartex" xmlns:cx5="http://schemas.microsoft.com/office/drawing/2016/5/11/chartex" xmlns:cx6="http://schemas.microsoft.com/office/drawing/2016/5/12/chartex" xmlns:cx7="http://schemas.microsoft.com/office/drawing/2016/5/13/chartex" xmlns:cx8="http://schemas.microsoft.com/office/drawing/2016/5/14/chartex" xmlns:mc="http://schemas.openxmlformats.org/markup-compatibility/2006" xmlns:aink="http://schemas.microsoft.com/office/drawing/2016/ink" xmlns:am3d="http://schemas.microsoft.com/office/drawing/2017/model3d" xmlns:o="urn:schemas-microsoft-com:office:office" xmlns:oel="http://schemas.microsoft.com/office/2019/extlst" xmlns:r="http://schemas.openxmlformats.org/officeDocument/2006/relationships" xmlns:m="http://schemas.openxmlformats.org/officeDocument/2006/math" xmlns:v="urn:schemas-microsoft-com:vml" xmlns:wp14="http://schemas.microsoft.com/office/word/2010/wordprocessingDrawing" xmlns:wp="http://schemas.openxmlformats.org/drawingml/2006/wordprocessingDrawing" xmlns:w10="urn:schemas-microsoft-com:office:word" xmlns:w="http://schemas.openxmlformats.org/wordprocessingml/2006/main" xmlns:w14="http://schemas.microsoft.com/office/word/2010/wordml" xmlns:w15="http://schemas.microsoft.com/office/word/2012/wordml" xmlns:w16cex="http://schemas.microsoft.com/office/word/2018/wordml/cex" xmlns:w16cid="http://schemas.microsoft.com/office/word/2016/wordml/cid" xmlns:w16="http://schemas.microsoft.com/office/word/2018/wordml" xmlns:w16du="http://schemas.microsoft.com/office/word/2023/wordml/word16du" xmlns:w16sdtdh="http://schemas.microsoft.com/office/word/2020/wordml/sdtdatahash" xmlns:w16sdtfl="http://schemas.microsoft.com/office/word/2024/wordml/sdtformatlock" xmlns:w16se="http://schemas.microsoft.com/office/word/2015/wordml/symex" xmlns:wpg="http://schemas.microsoft.com/office/word/2010/wordprocessingGroup" xmlns:wpi="http://schemas.microsoft.com/office/word/2010/wordprocessingInk" xmlns:wne="http://schemas.microsoft.com/office/word/2006/wordml" xmlns:wps="http://schemas.microsoft.com/office/word/2010/wordprocessingShape" mc:Ignorable="w14 w15 w16se w16cid w16 w16cex w16sdtdh w16sdtfl w16du wp14">
-  <w15:person w15:author="Thomas Mihaljevic">
-    <w15:presenceInfo w15:providerId="Windows Live" w15:userId="473ee41c3b0b53aa"/>
-  </w15:person>
-</w15:people>
 </file>
 
 <file path=word/styles.xml><?xml version="1.0" encoding="utf-8"?>
@@ -27381,69 +26007,6 @@
       <w:szCs w:val="20"/>
     </w:rPr>
   </w:style>
-  <w:style w:type="character" w:styleId="CommentReference">
-    <w:name w:val="annotation reference"/>
-    <w:basedOn w:val="DefaultParagraphFont"/>
-    <w:uiPriority w:val="99"/>
-    <w:semiHidden/>
-    <w:unhideWhenUsed/>
-    <w:rsid w:val="00746EF3"/>
-    <w:rPr>
-      <w:sz w:val="16"/>
-      <w:szCs w:val="16"/>
-    </w:rPr>
-  </w:style>
-  <w:style w:type="paragraph" w:styleId="CommentText">
-    <w:name w:val="annotation text"/>
-    <w:basedOn w:val="Normal"/>
-    <w:link w:val="CommentTextChar"/>
-    <w:uiPriority w:val="99"/>
-    <w:unhideWhenUsed/>
-    <w:rsid w:val="00746EF3"/>
-    <w:rPr>
-      <w:sz w:val="20"/>
-      <w:szCs w:val="20"/>
-    </w:rPr>
-  </w:style>
-  <w:style w:type="character" w:customStyle="1" w:styleId="CommentTextChar">
-    <w:name w:val="Comment Text Char"/>
-    <w:basedOn w:val="DefaultParagraphFont"/>
-    <w:link w:val="CommentText"/>
-    <w:uiPriority w:val="99"/>
-    <w:rsid w:val="00746EF3"/>
-    <w:rPr>
-      <w:sz w:val="20"/>
-      <w:szCs w:val="20"/>
-    </w:rPr>
-  </w:style>
-  <w:style w:type="paragraph" w:styleId="CommentSubject">
-    <w:name w:val="annotation subject"/>
-    <w:basedOn w:val="CommentText"/>
-    <w:next w:val="CommentText"/>
-    <w:link w:val="CommentSubjectChar"/>
-    <w:uiPriority w:val="99"/>
-    <w:semiHidden/>
-    <w:unhideWhenUsed/>
-    <w:rsid w:val="00746EF3"/>
-    <w:rPr>
-      <w:b/>
-      <w:bCs/>
-    </w:rPr>
-  </w:style>
-  <w:style w:type="character" w:customStyle="1" w:styleId="CommentSubjectChar">
-    <w:name w:val="Comment Subject Char"/>
-    <w:basedOn w:val="CommentTextChar"/>
-    <w:link w:val="CommentSubject"/>
-    <w:uiPriority w:val="99"/>
-    <w:semiHidden/>
-    <w:rsid w:val="00746EF3"/>
-    <w:rPr>
-      <w:b/>
-      <w:bCs/>
-      <w:sz w:val="20"/>
-      <w:szCs w:val="20"/>
-    </w:rPr>
-  </w:style>
 </w:styles>
 </file>
 
@@ -27735,16 +26298,4 @@
   <a:objectDefaults/>
   <a:extraClrSchemeLst/>
 </a:theme>
-</file>
-
-<file path=customXml/item1.xml><?xml version="1.0" encoding="utf-8"?>
-<b:Sources xmlns:b="http://schemas.openxmlformats.org/officeDocument/2006/bibliography" xmlns="http://schemas.openxmlformats.org/officeDocument/2006/bibliography" SelectedStyle="\APASixthEditionOfficeOnline.xsl" StyleName="APA" Version="6"/>
-</file>
-
-<file path=customXml/itemProps1.xml><?xml version="1.0" encoding="utf-8"?>
-<ds:datastoreItem xmlns:ds="http://schemas.openxmlformats.org/officeDocument/2006/customXml" ds:itemID="{A4A4C8D6-BF63-47D1-BC9E-1CF158AB1B25}">
-  <ds:schemaRefs>
-    <ds:schemaRef ds:uri="http://schemas.openxmlformats.org/officeDocument/2006/bibliography"/>
-  </ds:schemaRefs>
-</ds:datastoreItem>
 </file>
</xml_diff>